<commit_message>
chore: update DEA Formato_Documento_de_Arquitectura.docx
</commit_message>
<xml_diff>
--- a/DEA Formato_Documento_de_Arquitectura.docx
+++ b/DEA Formato_Documento_de_Arquitectura.docx
@@ -1583,2823 +1583,755 @@
       </w:r>
     </w:p>
     <w:p>
-      <w:r>
-        <w:rPr>
-          <w:rFonts w:ascii="Arial" w:hAnsi="Arial" w:cs="Arial"/>
+      <w:pPr>
+        <w:widowControl w:val="1"/>
+        <w:spacing w:after="40" w:before="0" w:line="240" w:lineRule="auto"/>
+        <w:ind w:left="0" w:right="0" w:firstLine="0"/>
+        <w:jc w:val="left"/>
+        <w:rPr>
+          <w:rFonts w:ascii="Arial" w:cs="Arial" w:hAnsi="Arial" w:eastAsia="Arial"/>
           <w:b w:val="1"/>
+          <w:color w:val="000000"/>
           <w:sz w:val="22"/>
           <w:szCs w:val="22"/>
         </w:rPr>
-        <w:t>1. Documento de Arquitectura de Software</w:t>
-      </w:r>
-      <w:r>
-        <w:br/>
-      </w:r>
-      <w:r>
-        <w:rPr>
-          <w:rFonts w:ascii="Arial" w:hAnsi="Arial" w:cs="Arial"/>
-          <w:b w:val="0"/>
+      </w:pPr>
+      <w:r>
+        <w:rPr>
+          <w:rFonts w:ascii="Arial" w:cs="Arial" w:hAnsi="Arial" w:eastAsia="Arial"/>
+          <w:b w:val="1"/>
+          <w:color w:val="000000"/>
           <w:sz w:val="22"/>
           <w:szCs w:val="22"/>
         </w:rPr>
-        <w:t xml:space="preserve">   1.1 Introducción · 1.2 Propósito · 1.3 Alcance</w:t>
-      </w:r>
-      <w:r>
-        <w:br/>
-      </w:r>
-      <w:r>
-        <w:rPr>
-          <w:rFonts w:ascii="Arial" w:hAnsi="Arial" w:cs="Arial"/>
-          <w:b w:val="0"/>
+        <w:t xml:space="preserve">1. Documento de Arquitectura de Software</w:t>
+      </w:r>
+    </w:p>
+    <w:p>
+      <w:pPr>
+        <w:widowControl w:val="1"/>
+        <w:spacing w:after="40" w:before="0" w:line="240" w:lineRule="auto"/>
+        <w:ind w:left="397" w:right="0" w:firstLine="0"/>
+        <w:jc w:val="left"/>
+        <w:rPr>
+          <w:rFonts w:ascii="Arial" w:cs="Arial" w:hAnsi="Arial" w:eastAsia="Arial"/>
+          <w:b w:val="0"/>
+          <w:color w:val="000000"/>
           <w:sz w:val="22"/>
           <w:szCs w:val="22"/>
         </w:rPr>
-        <w:t xml:space="preserve">   1.4 Requerimientos no funcionales · 1.5 Definiciones y acrónimos</w:t>
-      </w:r>
-      <w:r>
-        <w:br/>
-      </w:r>
-      <w:r>
-        <w:rPr>
-          <w:rFonts w:ascii="Arial" w:hAnsi="Arial" w:cs="Arial"/>
-          <w:b w:val="1"/>
+      </w:pPr>
+      <w:r>
+        <w:rPr>
+          <w:rFonts w:ascii="Arial" w:cs="Arial" w:hAnsi="Arial" w:eastAsia="Arial"/>
+          <w:b w:val="0"/>
+          <w:color w:val="000000"/>
           <w:sz w:val="22"/>
           <w:szCs w:val="22"/>
         </w:rPr>
-        <w:t>2. Generalidades del proyecto</w:t>
-      </w:r>
-      <w:r>
-        <w:br/>
-      </w:r>
-      <w:r>
-        <w:rPr>
-          <w:rFonts w:ascii="Arial" w:hAnsi="Arial" w:cs="Arial"/>
-          <w:b w:val="0"/>
+        <w:t xml:space="preserve">1.1 Introducción</w:t>
+      </w:r>
+    </w:p>
+    <w:p>
+      <w:pPr>
+        <w:widowControl w:val="1"/>
+        <w:spacing w:after="40" w:before="0" w:line="240" w:lineRule="auto"/>
+        <w:ind w:left="397" w:right="0" w:firstLine="0"/>
+        <w:jc w:val="left"/>
+        <w:rPr>
+          <w:rFonts w:ascii="Arial" w:cs="Arial" w:hAnsi="Arial" w:eastAsia="Arial"/>
+          <w:b w:val="0"/>
+          <w:color w:val="000000"/>
           <w:sz w:val="22"/>
           <w:szCs w:val="22"/>
         </w:rPr>
-        <w:t xml:space="preserve">   2.1 Justificación · 2.2 Problema a resolver · 2.3 Objetivos</w:t>
-      </w:r>
-      <w:r>
-        <w:br/>
-      </w:r>
-      <w:r>
-        <w:rPr>
-          <w:rFonts w:ascii="Arial" w:hAnsi="Arial" w:cs="Arial"/>
-          <w:b w:val="0"/>
+      </w:pPr>
+      <w:r>
+        <w:rPr>
+          <w:rFonts w:ascii="Arial" w:cs="Arial" w:hAnsi="Arial" w:eastAsia="Arial"/>
+          <w:b w:val="0"/>
+          <w:color w:val="000000"/>
           <w:sz w:val="22"/>
           <w:szCs w:val="22"/>
         </w:rPr>
-        <w:t xml:space="preserve">   2.4 Descripción general del sistema · 2.5 Stakeholders</w:t>
-      </w:r>
-      <w:r>
-        <w:br/>
-      </w:r>
-      <w:r>
-        <w:rPr>
-          <w:rFonts w:ascii="Arial" w:hAnsi="Arial" w:cs="Arial"/>
-          <w:b w:val="1"/>
+        <w:t xml:space="preserve">1.2 Propósito</w:t>
+      </w:r>
+    </w:p>
+    <w:p>
+      <w:pPr>
+        <w:widowControl w:val="1"/>
+        <w:spacing w:after="40" w:before="0" w:line="240" w:lineRule="auto"/>
+        <w:ind w:left="397" w:right="0" w:firstLine="0"/>
+        <w:jc w:val="left"/>
+        <w:rPr>
+          <w:rFonts w:ascii="Arial" w:cs="Arial" w:hAnsi="Arial" w:eastAsia="Arial"/>
+          <w:b w:val="0"/>
+          <w:color w:val="000000"/>
           <w:sz w:val="22"/>
           <w:szCs w:val="22"/>
         </w:rPr>
-        <w:t>3. Vistas de la arquitectura</w:t>
-      </w:r>
-      <w:r>
-        <w:br/>
-      </w:r>
-      <w:r>
-        <w:rPr>
-          <w:rFonts w:ascii="Arial" w:hAnsi="Arial" w:cs="Arial"/>
-          <w:b w:val="0"/>
+      </w:pPr>
+      <w:r>
+        <w:rPr>
+          <w:rFonts w:ascii="Arial" w:cs="Arial" w:hAnsi="Arial" w:eastAsia="Arial"/>
+          <w:b w:val="0"/>
+          <w:color w:val="000000"/>
           <w:sz w:val="22"/>
           <w:szCs w:val="22"/>
         </w:rPr>
-        <w:t xml:space="preserve">   3.1 Vista de casos de uso · 3.2 Vista de procesos · 3.3 Vista lógica</w:t>
-      </w:r>
-      <w:r>
-        <w:br/>
-      </w:r>
-      <w:r>
-        <w:rPr>
-          <w:rFonts w:ascii="Arial" w:hAnsi="Arial" w:cs="Arial"/>
-          <w:b w:val="0"/>
+        <w:t xml:space="preserve">1.3 Alcance</w:t>
+      </w:r>
+    </w:p>
+    <w:p>
+      <w:pPr>
+        <w:widowControl w:val="1"/>
+        <w:spacing w:after="40" w:before="0" w:line="240" w:lineRule="auto"/>
+        <w:ind w:left="397" w:right="0" w:firstLine="0"/>
+        <w:jc w:val="left"/>
+        <w:rPr>
+          <w:rFonts w:ascii="Arial" w:cs="Arial" w:hAnsi="Arial" w:eastAsia="Arial"/>
+          <w:b w:val="0"/>
+          <w:color w:val="000000"/>
           <w:sz w:val="22"/>
           <w:szCs w:val="22"/>
         </w:rPr>
-        <w:t xml:space="preserve">   3.4 Vista de implementación · 3.5 Vista de despliegue</w:t>
-      </w:r>
-      <w:r>
-        <w:br/>
-      </w:r>
-      <w:r>
-        <w:rPr>
-          <w:rFonts w:ascii="Arial" w:hAnsi="Arial" w:cs="Arial"/>
-          <w:b w:val="0"/>
+      </w:pPr>
+      <w:r>
+        <w:rPr>
+          <w:rFonts w:ascii="Arial" w:cs="Arial" w:hAnsi="Arial" w:eastAsia="Arial"/>
+          <w:b w:val="0"/>
+          <w:color w:val="000000"/>
           <w:sz w:val="22"/>
           <w:szCs w:val="22"/>
         </w:rPr>
-        <w:t xml:space="preserve">   3.6 Arquitectura en capas · 3.7 Vista de datos</w:t>
-      </w:r>
-      <w:r>
-        <w:br/>
-      </w:r>
-      <w:r>
-        <w:rPr>
-          <w:rFonts w:ascii="Arial" w:hAnsi="Arial" w:cs="Arial"/>
-          <w:b w:val="1"/>
+        <w:t xml:space="preserve">1.4 Requerimientos no funcionales</w:t>
+      </w:r>
+    </w:p>
+    <w:p>
+      <w:pPr>
+        <w:widowControl w:val="1"/>
+        <w:spacing w:after="40" w:before="0" w:line="240" w:lineRule="auto"/>
+        <w:ind w:left="397" w:right="0" w:firstLine="0"/>
+        <w:jc w:val="left"/>
+        <w:rPr>
+          <w:rFonts w:ascii="Arial" w:cs="Arial" w:hAnsi="Arial" w:eastAsia="Arial"/>
+          <w:b w:val="0"/>
+          <w:color w:val="000000"/>
           <w:sz w:val="22"/>
           <w:szCs w:val="22"/>
         </w:rPr>
-        <w:t>4. Definición de interfaces de usuario</w:t>
-      </w:r>
-      <w:r>
-        <w:br/>
-      </w:r>
-      <w:r>
-        <w:rPr>
-          <w:rFonts w:ascii="Arial" w:hAnsi="Arial" w:cs="Arial"/>
-          <w:b w:val="1"/>
+      </w:pPr>
+      <w:r>
+        <w:rPr>
+          <w:rFonts w:ascii="Arial" w:cs="Arial" w:hAnsi="Arial" w:eastAsia="Arial"/>
+          <w:b w:val="0"/>
+          <w:color w:val="000000"/>
           <w:sz w:val="22"/>
           <w:szCs w:val="22"/>
         </w:rPr>
-        <w:t>5. Características generales de calidad</w:t>
-      </w:r>
-    </w:p>
-    <w:sdt>
-      <w:sdtPr>
-        <w:docPartObj>
-          <w:docPartGallery w:val="Table of Contents"/>
-          <w:docPartUnique w:val="1"/>
-        </w:docPartObj>
-      </w:sdtPr>
-      <w:sdtContent>
-        <w:p>
-          <w:pPr>
-            <w:widowControl w:val="0"/>
-            <w:tabs>
-              <w:tab w:val="right" w:leader="none" w:pos="12000"/>
-            </w:tabs>
-            <w:spacing w:before="60" w:lineRule="auto"/>
-            <w:jc w:val="left"/>
-            <w:rPr>
-              <w:rFonts w:ascii="Arial" w:cs="Arial" w:eastAsia="Arial" w:hAnsi="Arial"/>
-              <w:b w:val="1"/>
-              <w:i w:val="0"/>
-              <w:smallCaps w:val="0"/>
-              <w:strike w:val="0"/>
-              <w:color w:val="000000"/>
-              <w:sz w:val="22"/>
-              <w:szCs w:val="22"/>
-              <w:u w:val="none"/>
-              <w:shd w:fill="auto" w:val="clear"/>
-              <w:vertAlign w:val="baseline"/>
-            </w:rPr>
-          </w:pPr>
-          <w:r>
-            <w:fldChar w:fldCharType="begin"/>
-            <w:instrText xml:space="preserve"> TOC \h \u \z \t "Heading 1,1,Heading 2,2,"</w:instrText>
-            <w:fldChar w:fldCharType="separate"/>
-          </w:r>
-          <w:hyperlink w:anchor="_heading=h.3znysh7">
-            <w:r>
-              <w:rPr>
-                <w:b w:val="1"/>
-                <w:i w:val="0"/>
-                <w:smallCaps w:val="0"/>
-                <w:strike w:val="0"/>
-                <w:color w:val="000000"/>
-                <w:sz w:val="24"/>
-                <w:szCs w:val="24"/>
-                <w:u w:val="none"/>
-                <w:shd w:fill="auto" w:val="clear"/>
-                <w:vertAlign w:val="baseline"/>
-                <w:rtl w:val="0"/>
-              </w:rPr>
-              <w:t xml:space="preserve">1. Documento de Arquitectura de Software</w:t>
-            </w:r>
-          </w:hyperlink>
-          <w:hyperlink w:anchor="_heading=h.3znysh7">
-            <w:r>
-              <w:rPr>
-                <w:rFonts w:ascii="Arial" w:cs="Arial" w:eastAsia="Arial" w:hAnsi="Arial"/>
-                <w:b w:val="0"/>
-                <w:i w:val="0"/>
-                <w:smallCaps w:val="0"/>
-                <w:strike w:val="0"/>
-                <w:color w:val="000000"/>
-                <w:sz w:val="24"/>
-                <w:szCs w:val="24"/>
-                <w:u w:val="none"/>
-                <w:shd w:fill="auto" w:val="clear"/>
-                <w:vertAlign w:val="baseline"/>
-                <w:rtl w:val="0"/>
-              </w:rPr>
-              <w:tab/>
-              <w:t xml:space="preserve">4</w:t>
-            </w:r>
-          </w:hyperlink>
-          <w:r>
-            <w:rPr>
-              <w:rtl w:val="0"/>
-            </w:rPr>
-          </w:r>
-        </w:p>
-        <w:p>
-          <w:pPr>
-            <w:widowControl w:val="0"/>
-            <w:tabs>
-              <w:tab w:val="right" w:leader="none" w:pos="12000"/>
-            </w:tabs>
-            <w:spacing w:before="60" w:lineRule="auto"/>
-            <w:ind w:left="360" w:firstLine="0"/>
-            <w:jc w:val="left"/>
-            <w:rPr>
-              <w:rFonts w:ascii="Arial" w:cs="Arial" w:eastAsia="Arial" w:hAnsi="Arial"/>
-              <w:b w:val="0"/>
-              <w:i w:val="0"/>
-              <w:smallCaps w:val="0"/>
-              <w:strike w:val="0"/>
-              <w:color w:val="000000"/>
-              <w:sz w:val="22"/>
-              <w:szCs w:val="22"/>
-              <w:u w:val="none"/>
-              <w:shd w:fill="auto" w:val="clear"/>
-              <w:vertAlign w:val="baseline"/>
-            </w:rPr>
-          </w:pPr>
-          <w:hyperlink w:anchor="_heading=h.2et92p0">
-            <w:r>
-              <w:rPr>
-                <w:rFonts w:ascii="Arial" w:cs="Arial" w:eastAsia="Arial" w:hAnsi="Arial"/>
-                <w:b w:val="0"/>
-                <w:i w:val="0"/>
-                <w:smallCaps w:val="0"/>
-                <w:strike w:val="0"/>
-                <w:color w:val="000000"/>
-                <w:sz w:val="24"/>
-                <w:szCs w:val="24"/>
-                <w:u w:val="none"/>
-                <w:shd w:fill="auto" w:val="clear"/>
-                <w:vertAlign w:val="baseline"/>
-                <w:rtl w:val="0"/>
-              </w:rPr>
-              <w:t xml:space="preserve">1.1. Introducción</w:t>
-              <w:tab/>
-              <w:t xml:space="preserve">4</w:t>
-            </w:r>
-          </w:hyperlink>
-          <w:r>
-            <w:rPr>
-              <w:rtl w:val="0"/>
-            </w:rPr>
-          </w:r>
-        </w:p>
-        <w:p>
-          <w:pPr>
-            <w:widowControl w:val="0"/>
-            <w:tabs>
-              <w:tab w:val="right" w:leader="none" w:pos="12000"/>
-            </w:tabs>
-            <w:spacing w:before="60" w:lineRule="auto"/>
-            <w:ind w:left="360" w:firstLine="0"/>
-            <w:jc w:val="left"/>
-            <w:rPr>
-              <w:rFonts w:ascii="Arial" w:cs="Arial" w:eastAsia="Arial" w:hAnsi="Arial"/>
-              <w:b w:val="0"/>
-              <w:i w:val="0"/>
-              <w:smallCaps w:val="0"/>
-              <w:strike w:val="0"/>
-              <w:color w:val="000000"/>
-              <w:sz w:val="22"/>
-              <w:szCs w:val="22"/>
-              <w:u w:val="none"/>
-              <w:shd w:fill="auto" w:val="clear"/>
-              <w:vertAlign w:val="baseline"/>
-            </w:rPr>
-          </w:pPr>
-          <w:hyperlink w:anchor="_heading=h.tyjcwt">
-            <w:r>
-              <w:rPr>
-                <w:rFonts w:ascii="Arial" w:cs="Arial" w:eastAsia="Arial" w:hAnsi="Arial"/>
-                <w:b w:val="0"/>
-                <w:i w:val="0"/>
-                <w:smallCaps w:val="0"/>
-                <w:strike w:val="0"/>
-                <w:color w:val="000000"/>
-                <w:sz w:val="24"/>
-                <w:szCs w:val="24"/>
-                <w:u w:val="none"/>
-                <w:shd w:fill="auto" w:val="clear"/>
-                <w:vertAlign w:val="baseline"/>
-                <w:rtl w:val="0"/>
-              </w:rPr>
-              <w:t xml:space="preserve">1.2. Propósito</w:t>
-              <w:tab/>
-              <w:t xml:space="preserve">5</w:t>
-            </w:r>
-          </w:hyperlink>
-          <w:r>
-            <w:rPr>
-              <w:rtl w:val="0"/>
-            </w:rPr>
-          </w:r>
-        </w:p>
-        <w:p>
-          <w:pPr>
-            <w:widowControl w:val="0"/>
-            <w:tabs>
-              <w:tab w:val="right" w:leader="none" w:pos="12000"/>
-            </w:tabs>
-            <w:spacing w:before="60" w:lineRule="auto"/>
-            <w:ind w:left="360" w:firstLine="0"/>
-            <w:jc w:val="left"/>
-            <w:rPr>
-              <w:rFonts w:ascii="Arial" w:cs="Arial" w:eastAsia="Arial" w:hAnsi="Arial"/>
-              <w:b w:val="0"/>
-              <w:i w:val="0"/>
-              <w:smallCaps w:val="0"/>
-              <w:strike w:val="0"/>
-              <w:color w:val="000000"/>
-              <w:sz w:val="22"/>
-              <w:szCs w:val="22"/>
-              <w:u w:val="none"/>
-              <w:shd w:fill="auto" w:val="clear"/>
-              <w:vertAlign w:val="baseline"/>
-            </w:rPr>
-          </w:pPr>
-          <w:hyperlink w:anchor="_heading=h.3dy6vkm">
-            <w:r>
-              <w:rPr>
-                <w:rFonts w:ascii="Arial" w:cs="Arial" w:eastAsia="Arial" w:hAnsi="Arial"/>
-                <w:b w:val="0"/>
-                <w:i w:val="0"/>
-                <w:smallCaps w:val="0"/>
-                <w:strike w:val="0"/>
-                <w:color w:val="000000"/>
-                <w:sz w:val="24"/>
-                <w:szCs w:val="24"/>
-                <w:u w:val="none"/>
-                <w:shd w:fill="auto" w:val="clear"/>
-                <w:vertAlign w:val="baseline"/>
-                <w:rtl w:val="0"/>
-              </w:rPr>
-              <w:t xml:space="preserve">1.3. Alcance</w:t>
-              <w:tab/>
-              <w:t xml:space="preserve">5</w:t>
-            </w:r>
-          </w:hyperlink>
-          <w:r>
-            <w:rPr>
-              <w:rtl w:val="0"/>
-            </w:rPr>
-          </w:r>
-        </w:p>
-        <w:p>
-          <w:pPr>
-            <w:widowControl w:val="0"/>
-            <w:tabs>
-              <w:tab w:val="right" w:leader="none" w:pos="12000"/>
-            </w:tabs>
-            <w:spacing w:before="60" w:lineRule="auto"/>
-            <w:ind w:left="360" w:firstLine="0"/>
-            <w:jc w:val="left"/>
-            <w:rPr>
-              <w:rFonts w:ascii="Arial" w:cs="Arial" w:eastAsia="Arial" w:hAnsi="Arial"/>
-              <w:b w:val="0"/>
-              <w:i w:val="0"/>
-              <w:smallCaps w:val="0"/>
-              <w:strike w:val="0"/>
-              <w:color w:val="000000"/>
-              <w:sz w:val="22"/>
-              <w:szCs w:val="22"/>
-              <w:u w:val="none"/>
-              <w:shd w:fill="auto" w:val="clear"/>
-              <w:vertAlign w:val="baseline"/>
-            </w:rPr>
-          </w:pPr>
-          <w:hyperlink w:anchor="_heading=h.1t3h5sf">
-            <w:r>
-              <w:rPr>
-                <w:rFonts w:ascii="Arial" w:cs="Arial" w:eastAsia="Arial" w:hAnsi="Arial"/>
-                <w:b w:val="0"/>
-                <w:i w:val="0"/>
-                <w:smallCaps w:val="0"/>
-                <w:strike w:val="0"/>
-                <w:color w:val="000000"/>
-                <w:sz w:val="24"/>
-                <w:szCs w:val="24"/>
-                <w:u w:val="none"/>
-                <w:shd w:fill="auto" w:val="clear"/>
-                <w:vertAlign w:val="baseline"/>
-                <w:rtl w:val="0"/>
-              </w:rPr>
-              <w:t xml:space="preserve">1.4. Referencias</w:t>
-              <w:tab/>
-              <w:t xml:space="preserve">6</w:t>
-            </w:r>
-          </w:hyperlink>
-          <w:r>
-            <w:rPr>
-              <w:rtl w:val="0"/>
-            </w:rPr>
-          </w:r>
-        </w:p>
-        <w:p>
-          <w:pPr>
-            <w:widowControl w:val="0"/>
-            <w:tabs>
-              <w:tab w:val="right" w:leader="none" w:pos="12000"/>
-            </w:tabs>
-            <w:spacing w:before="60" w:lineRule="auto"/>
-            <w:ind w:left="360" w:firstLine="0"/>
-            <w:jc w:val="left"/>
-            <w:rPr>
-              <w:rFonts w:ascii="Arial" w:cs="Arial" w:eastAsia="Arial" w:hAnsi="Arial"/>
-              <w:b w:val="0"/>
-              <w:i w:val="0"/>
-              <w:smallCaps w:val="0"/>
-              <w:strike w:val="0"/>
-              <w:color w:val="000000"/>
-              <w:sz w:val="22"/>
-              <w:szCs w:val="22"/>
-              <w:u w:val="none"/>
-              <w:shd w:fill="auto" w:val="clear"/>
-              <w:vertAlign w:val="baseline"/>
-            </w:rPr>
-          </w:pPr>
-          <w:hyperlink w:anchor="_heading=h.4d34og8">
-            <w:r>
-              <w:rPr>
-                <w:rFonts w:ascii="Arial" w:cs="Arial" w:eastAsia="Arial" w:hAnsi="Arial"/>
-                <w:b w:val="0"/>
-                <w:i w:val="0"/>
-                <w:smallCaps w:val="0"/>
-                <w:strike w:val="0"/>
-                <w:color w:val="000000"/>
-                <w:sz w:val="24"/>
-                <w:szCs w:val="24"/>
-                <w:u w:val="none"/>
-                <w:shd w:fill="auto" w:val="clear"/>
-                <w:vertAlign w:val="baseline"/>
-                <w:rtl w:val="0"/>
-              </w:rPr>
-              <w:t xml:space="preserve">1.5. Definiciones acrónimos y abreviaciones</w:t>
-              <w:tab/>
-              <w:t xml:space="preserve">8</w:t>
-            </w:r>
-          </w:hyperlink>
-          <w:r>
-            <w:rPr>
-              <w:rtl w:val="0"/>
-            </w:rPr>
-          </w:r>
-        </w:p>
-        <w:p>
-          <w:pPr>
-            <w:widowControl w:val="0"/>
-            <w:tabs>
-              <w:tab w:val="right" w:leader="none" w:pos="12000"/>
-            </w:tabs>
-            <w:spacing w:before="60" w:lineRule="auto"/>
-            <w:jc w:val="left"/>
-            <w:rPr>
-              <w:rFonts w:ascii="Arial" w:cs="Arial" w:eastAsia="Arial" w:hAnsi="Arial"/>
-              <w:b w:val="1"/>
-              <w:i w:val="0"/>
-              <w:smallCaps w:val="0"/>
-              <w:strike w:val="0"/>
-              <w:color w:val="000000"/>
-              <w:sz w:val="22"/>
-              <w:szCs w:val="22"/>
-              <w:u w:val="none"/>
-              <w:shd w:fill="auto" w:val="clear"/>
-              <w:vertAlign w:val="baseline"/>
-            </w:rPr>
-          </w:pPr>
-          <w:hyperlink w:anchor="_heading=h.2s8eyo1">
-            <w:r>
-              <w:rPr>
-                <w:b w:val="1"/>
-                <w:i w:val="0"/>
-                <w:smallCaps w:val="0"/>
-                <w:strike w:val="0"/>
-                <w:color w:val="000000"/>
-                <w:sz w:val="24"/>
-                <w:szCs w:val="24"/>
-                <w:u w:val="none"/>
-                <w:shd w:fill="auto" w:val="clear"/>
-                <w:vertAlign w:val="baseline"/>
-                <w:rtl w:val="0"/>
-              </w:rPr>
-              <w:t xml:space="preserve">2. Generalidades del Proyecto</w:t>
-            </w:r>
-          </w:hyperlink>
-          <w:hyperlink w:anchor="_heading=h.2s8eyo1">
-            <w:r>
-              <w:rPr>
-                <w:rFonts w:ascii="Arial" w:cs="Arial" w:eastAsia="Arial" w:hAnsi="Arial"/>
-                <w:b w:val="0"/>
-                <w:i w:val="0"/>
-                <w:smallCaps w:val="0"/>
-                <w:strike w:val="0"/>
-                <w:color w:val="000000"/>
-                <w:sz w:val="24"/>
-                <w:szCs w:val="24"/>
-                <w:u w:val="none"/>
-                <w:shd w:fill="auto" w:val="clear"/>
-                <w:vertAlign w:val="baseline"/>
-                <w:rtl w:val="0"/>
-              </w:rPr>
-              <w:tab/>
-              <w:t xml:space="preserve">8</w:t>
-            </w:r>
-          </w:hyperlink>
-          <w:r>
-            <w:rPr>
-              <w:rtl w:val="0"/>
-            </w:rPr>
-          </w:r>
-        </w:p>
-        <w:p>
-          <w:pPr>
-            <w:widowControl w:val="0"/>
-            <w:tabs>
-              <w:tab w:val="right" w:leader="none" w:pos="12000"/>
-            </w:tabs>
-            <w:spacing w:before="60" w:lineRule="auto"/>
-            <w:ind w:left="360" w:firstLine="0"/>
-            <w:jc w:val="left"/>
-            <w:rPr>
-              <w:rFonts w:ascii="Arial" w:cs="Arial" w:eastAsia="Arial" w:hAnsi="Arial"/>
-              <w:b w:val="0"/>
-              <w:i w:val="0"/>
-              <w:smallCaps w:val="0"/>
-              <w:strike w:val="0"/>
-              <w:color w:val="000000"/>
-              <w:sz w:val="22"/>
-              <w:szCs w:val="22"/>
-              <w:u w:val="none"/>
-              <w:shd w:fill="auto" w:val="clear"/>
-              <w:vertAlign w:val="baseline"/>
-            </w:rPr>
-          </w:pPr>
-          <w:hyperlink w:anchor="_heading=h.17dp8vu">
-            <w:r>
-              <w:rPr>
-                <w:rFonts w:ascii="Arial" w:cs="Arial" w:eastAsia="Arial" w:hAnsi="Arial"/>
-                <w:b w:val="0"/>
-                <w:i w:val="0"/>
-                <w:smallCaps w:val="0"/>
-                <w:strike w:val="0"/>
-                <w:color w:val="000000"/>
-                <w:sz w:val="24"/>
-                <w:szCs w:val="24"/>
-                <w:u w:val="none"/>
-                <w:shd w:fill="auto" w:val="clear"/>
-                <w:vertAlign w:val="baseline"/>
-                <w:rtl w:val="0"/>
-              </w:rPr>
-              <w:t xml:space="preserve">2.1. Justificación:</w:t>
-              <w:tab/>
-              <w:t xml:space="preserve">8</w:t>
-            </w:r>
-          </w:hyperlink>
-          <w:r>
-            <w:rPr>
-              <w:rtl w:val="0"/>
-            </w:rPr>
-          </w:r>
-        </w:p>
-        <w:p>
-          <w:pPr>
-            <w:widowControl w:val="0"/>
-            <w:tabs>
-              <w:tab w:val="right" w:leader="none" w:pos="12000"/>
-            </w:tabs>
-            <w:spacing w:before="60" w:lineRule="auto"/>
-            <w:ind w:left="360" w:firstLine="0"/>
-            <w:jc w:val="left"/>
-            <w:rPr>
-              <w:rFonts w:ascii="Arial" w:cs="Arial" w:eastAsia="Arial" w:hAnsi="Arial"/>
-              <w:b w:val="0"/>
-              <w:i w:val="0"/>
-              <w:smallCaps w:val="0"/>
-              <w:strike w:val="0"/>
-              <w:color w:val="000000"/>
-              <w:sz w:val="22"/>
-              <w:szCs w:val="22"/>
-              <w:u w:val="none"/>
-              <w:shd w:fill="auto" w:val="clear"/>
-              <w:vertAlign w:val="baseline"/>
-            </w:rPr>
-          </w:pPr>
-          <w:hyperlink w:anchor="_heading=h.3rdcrjn">
-            <w:r>
-              <w:rPr>
-                <w:rFonts w:ascii="Arial" w:cs="Arial" w:eastAsia="Arial" w:hAnsi="Arial"/>
-                <w:b w:val="0"/>
-                <w:i w:val="0"/>
-                <w:smallCaps w:val="0"/>
-                <w:strike w:val="0"/>
-                <w:color w:val="000000"/>
-                <w:sz w:val="24"/>
-                <w:szCs w:val="24"/>
-                <w:u w:val="none"/>
-                <w:shd w:fill="auto" w:val="clear"/>
-                <w:vertAlign w:val="baseline"/>
-                <w:rtl w:val="0"/>
-              </w:rPr>
-              <w:t xml:space="preserve">2.2. Problema a Resolver</w:t>
-              <w:tab/>
-              <w:t xml:space="preserve">9</w:t>
-            </w:r>
-          </w:hyperlink>
-          <w:r>
-            <w:rPr>
-              <w:rtl w:val="0"/>
-            </w:rPr>
-          </w:r>
-        </w:p>
-        <w:p>
-          <w:pPr>
-            <w:widowControl w:val="0"/>
-            <w:tabs>
-              <w:tab w:val="right" w:leader="none" w:pos="12000"/>
-            </w:tabs>
-            <w:spacing w:before="60" w:lineRule="auto"/>
-            <w:ind w:left="360" w:firstLine="0"/>
-            <w:jc w:val="left"/>
-            <w:rPr>
-              <w:rFonts w:ascii="Arial" w:cs="Arial" w:eastAsia="Arial" w:hAnsi="Arial"/>
-              <w:b w:val="0"/>
-              <w:i w:val="0"/>
-              <w:smallCaps w:val="0"/>
-              <w:strike w:val="0"/>
-              <w:color w:val="000000"/>
-              <w:sz w:val="22"/>
-              <w:szCs w:val="22"/>
-              <w:u w:val="none"/>
-              <w:shd w:fill="auto" w:val="clear"/>
-              <w:vertAlign w:val="baseline"/>
-            </w:rPr>
-          </w:pPr>
-          <w:hyperlink w:anchor="_heading=h.26in1rg">
-            <w:r>
-              <w:rPr>
-                <w:rFonts w:ascii="Arial" w:cs="Arial" w:eastAsia="Arial" w:hAnsi="Arial"/>
-                <w:b w:val="0"/>
-                <w:i w:val="0"/>
-                <w:smallCaps w:val="0"/>
-                <w:strike w:val="0"/>
-                <w:color w:val="000000"/>
-                <w:sz w:val="24"/>
-                <w:szCs w:val="24"/>
-                <w:u w:val="none"/>
-                <w:shd w:fill="auto" w:val="clear"/>
-                <w:vertAlign w:val="baseline"/>
-                <w:rtl w:val="0"/>
-              </w:rPr>
-              <w:t xml:space="preserve">2.3. Objetivos (General y específicos)</w:t>
-              <w:tab/>
-              <w:t xml:space="preserve">9</w:t>
-            </w:r>
-          </w:hyperlink>
-          <w:r>
-            <w:rPr>
-              <w:rtl w:val="0"/>
-            </w:rPr>
-          </w:r>
-        </w:p>
-        <w:p>
-          <w:pPr>
-            <w:widowControl w:val="0"/>
-            <w:tabs>
-              <w:tab w:val="right" w:leader="none" w:pos="12000"/>
-            </w:tabs>
-            <w:spacing w:before="60" w:lineRule="auto"/>
-            <w:ind w:left="360" w:firstLine="0"/>
-            <w:jc w:val="left"/>
-            <w:rPr>
-              <w:rFonts w:ascii="Arial" w:cs="Arial" w:eastAsia="Arial" w:hAnsi="Arial"/>
-              <w:b w:val="0"/>
-              <w:i w:val="0"/>
-              <w:smallCaps w:val="0"/>
-              <w:strike w:val="0"/>
-              <w:color w:val="000000"/>
-              <w:sz w:val="22"/>
-              <w:szCs w:val="22"/>
-              <w:u w:val="none"/>
-              <w:shd w:fill="auto" w:val="clear"/>
-              <w:vertAlign w:val="baseline"/>
-            </w:rPr>
-          </w:pPr>
-          <w:hyperlink w:anchor="_heading=h.lnxbz9">
-            <w:r>
-              <w:rPr>
-                <w:rFonts w:ascii="Arial" w:cs="Arial" w:eastAsia="Arial" w:hAnsi="Arial"/>
-                <w:b w:val="0"/>
-                <w:i w:val="0"/>
-                <w:smallCaps w:val="0"/>
-                <w:strike w:val="0"/>
-                <w:color w:val="000000"/>
-                <w:sz w:val="24"/>
-                <w:szCs w:val="24"/>
-                <w:u w:val="none"/>
-                <w:shd w:fill="auto" w:val="clear"/>
-                <w:vertAlign w:val="baseline"/>
-                <w:rtl w:val="0"/>
-              </w:rPr>
-              <w:t xml:space="preserve">2.4. Descripción General del Sistema a Desarrollar</w:t>
-              <w:tab/>
-              <w:t xml:space="preserve">10</w:t>
-            </w:r>
-          </w:hyperlink>
-          <w:r>
-            <w:rPr>
-              <w:rtl w:val="0"/>
-            </w:rPr>
-          </w:r>
-        </w:p>
-        <w:p>
-          <w:pPr>
-            <w:widowControl w:val="0"/>
-            <w:tabs>
-              <w:tab w:val="right" w:leader="none" w:pos="12000"/>
-            </w:tabs>
-            <w:spacing w:before="60" w:lineRule="auto"/>
-            <w:ind w:left="360" w:firstLine="0"/>
-            <w:jc w:val="left"/>
-            <w:rPr>
-              <w:rFonts w:ascii="Arial" w:cs="Arial" w:eastAsia="Arial" w:hAnsi="Arial"/>
-              <w:b w:val="0"/>
-              <w:i w:val="0"/>
-              <w:smallCaps w:val="0"/>
-              <w:strike w:val="0"/>
-              <w:color w:val="000000"/>
-              <w:sz w:val="22"/>
-              <w:szCs w:val="22"/>
-              <w:u w:val="none"/>
-              <w:shd w:fill="auto" w:val="clear"/>
-              <w:vertAlign w:val="baseline"/>
-            </w:rPr>
-          </w:pPr>
-          <w:hyperlink w:anchor="_heading=h.35nkun2">
-            <w:r>
-              <w:rPr>
-                <w:rFonts w:ascii="Arial" w:cs="Arial" w:eastAsia="Arial" w:hAnsi="Arial"/>
-                <w:b w:val="0"/>
-                <w:i w:val="0"/>
-                <w:smallCaps w:val="0"/>
-                <w:strike w:val="0"/>
-                <w:color w:val="000000"/>
-                <w:sz w:val="24"/>
-                <w:szCs w:val="24"/>
-                <w:u w:val="none"/>
-                <w:shd w:fill="auto" w:val="clear"/>
-                <w:vertAlign w:val="baseline"/>
-                <w:rtl w:val="0"/>
-              </w:rPr>
-              <w:t xml:space="preserve">2.5. Identificación de los Stakeholders y sus responsabilidades</w:t>
-              <w:tab/>
-              <w:t xml:space="preserve">11</w:t>
-            </w:r>
-          </w:hyperlink>
-          <w:r>
-            <w:rPr>
-              <w:rtl w:val="0"/>
-            </w:rPr>
-          </w:r>
-        </w:p>
-        <w:p>
-          <w:pPr>
-            <w:widowControl w:val="0"/>
-            <w:tabs>
-              <w:tab w:val="right" w:leader="none" w:pos="12000"/>
-            </w:tabs>
-            <w:spacing w:before="60" w:lineRule="auto"/>
-            <w:jc w:val="left"/>
-            <w:rPr>
-              <w:rFonts w:ascii="Arial" w:cs="Arial" w:eastAsia="Arial" w:hAnsi="Arial"/>
-              <w:b w:val="1"/>
-              <w:i w:val="0"/>
-              <w:smallCaps w:val="0"/>
-              <w:strike w:val="0"/>
-              <w:color w:val="000000"/>
-              <w:sz w:val="22"/>
-              <w:szCs w:val="22"/>
-              <w:u w:val="none"/>
-              <w:shd w:fill="auto" w:val="clear"/>
-              <w:vertAlign w:val="baseline"/>
-            </w:rPr>
-          </w:pPr>
-          <w:hyperlink w:anchor="_heading=h.1ksv4uv">
-            <w:r>
-              <w:rPr>
-                <w:b w:val="1"/>
-                <w:i w:val="0"/>
-                <w:smallCaps w:val="0"/>
-                <w:strike w:val="0"/>
-                <w:color w:val="000000"/>
-                <w:sz w:val="24"/>
-                <w:szCs w:val="24"/>
-                <w:u w:val="none"/>
-                <w:shd w:fill="auto" w:val="clear"/>
-                <w:vertAlign w:val="baseline"/>
-                <w:rtl w:val="0"/>
-              </w:rPr>
-              <w:t xml:space="preserve">3. Vistas de la arquitectura</w:t>
-            </w:r>
-          </w:hyperlink>
-          <w:hyperlink w:anchor="_heading=h.1ksv4uv">
-            <w:r>
-              <w:rPr>
-                <w:rFonts w:ascii="Arial" w:cs="Arial" w:eastAsia="Arial" w:hAnsi="Arial"/>
-                <w:b w:val="0"/>
-                <w:i w:val="0"/>
-                <w:smallCaps w:val="0"/>
-                <w:strike w:val="0"/>
-                <w:color w:val="000000"/>
-                <w:sz w:val="24"/>
-                <w:szCs w:val="24"/>
-                <w:u w:val="none"/>
-                <w:shd w:fill="auto" w:val="clear"/>
-                <w:vertAlign w:val="baseline"/>
-                <w:rtl w:val="0"/>
-              </w:rPr>
-              <w:tab/>
-              <w:t xml:space="preserve">11</w:t>
-            </w:r>
-          </w:hyperlink>
-          <w:r>
-            <w:rPr>
-              <w:rtl w:val="0"/>
-            </w:rPr>
-          </w:r>
-        </w:p>
-        <w:p>
-          <w:pPr>
-            <w:widowControl w:val="0"/>
-            <w:tabs>
-              <w:tab w:val="right" w:leader="none" w:pos="12000"/>
-            </w:tabs>
-            <w:spacing w:before="60" w:lineRule="auto"/>
-            <w:ind w:left="360" w:firstLine="0"/>
-            <w:jc w:val="left"/>
-            <w:rPr>
-              <w:rFonts w:ascii="Arial" w:cs="Arial" w:eastAsia="Arial" w:hAnsi="Arial"/>
-              <w:b w:val="0"/>
-              <w:i w:val="0"/>
-              <w:smallCaps w:val="0"/>
-              <w:strike w:val="0"/>
-              <w:color w:val="000000"/>
-              <w:sz w:val="22"/>
-              <w:szCs w:val="22"/>
-              <w:u w:val="none"/>
-              <w:shd w:fill="auto" w:val="clear"/>
-              <w:vertAlign w:val="baseline"/>
-            </w:rPr>
-          </w:pPr>
-          <w:hyperlink w:anchor="_heading=h.44sinio">
-            <w:r>
-              <w:rPr>
-                <w:rFonts w:ascii="Arial" w:cs="Arial" w:eastAsia="Arial" w:hAnsi="Arial"/>
-                <w:b w:val="0"/>
-                <w:i w:val="0"/>
-                <w:smallCaps w:val="0"/>
-                <w:strike w:val="0"/>
-                <w:color w:val="000000"/>
-                <w:sz w:val="24"/>
-                <w:szCs w:val="24"/>
-                <w:u w:val="none"/>
-                <w:shd w:fill="auto" w:val="clear"/>
-                <w:vertAlign w:val="baseline"/>
-                <w:rtl w:val="0"/>
-              </w:rPr>
-              <w:t xml:space="preserve">3.1. Vista de Casos de Uso (Se debe colocar cada uno de los casos de uso que han sido elaborados y requeridos para el S.I.)</w:t>
-              <w:tab/>
-              <w:t xml:space="preserve">11</w:t>
-            </w:r>
-          </w:hyperlink>
-          <w:r>
-            <w:rPr>
-              <w:rtl w:val="0"/>
-            </w:rPr>
-          </w:r>
-        </w:p>
-        <w:p>
-          <w:pPr>
-            <w:widowControl w:val="0"/>
-            <w:tabs>
-              <w:tab w:val="right" w:leader="none" w:pos="12000"/>
-            </w:tabs>
-            <w:spacing w:before="60" w:lineRule="auto"/>
-            <w:jc w:val="left"/>
-            <w:rPr>
-              <w:rFonts w:ascii="Arial" w:cs="Arial" w:eastAsia="Arial" w:hAnsi="Arial"/>
-              <w:b w:val="1"/>
-              <w:i w:val="0"/>
-              <w:smallCaps w:val="0"/>
-              <w:strike w:val="0"/>
-              <w:color w:val="000000"/>
-              <w:sz w:val="22"/>
-              <w:szCs w:val="22"/>
-              <w:u w:val="none"/>
-              <w:shd w:fill="auto" w:val="clear"/>
-              <w:vertAlign w:val="baseline"/>
-            </w:rPr>
-          </w:pPr>
-          <w:hyperlink w:anchor="_heading=h.8xrb2id5y996">
-            <w:r>
-              <w:rPr>
-                <w:i w:val="0"/>
-                <w:smallCaps w:val="0"/>
-                <w:strike w:val="0"/>
-                <w:color w:val="000000"/>
-                <w:sz w:val="22"/>
-                <w:szCs w:val="22"/>
-                <w:u w:val="none"/>
-                <w:shd w:fill="auto" w:val="clear"/>
-                <w:vertAlign w:val="baseline"/>
-                <w:rtl w:val="0"/>
-              </w:rPr>
-              <w:t xml:space="preserve">3.1.1 Caso de uso Medicamentos</w:t>
-            </w:r>
-          </w:hyperlink>
-          <w:hyperlink w:anchor="_heading=h.8xrb2id5y996">
-            <w:r>
-              <w:rPr>
-                <w:rFonts w:ascii="Arial" w:cs="Arial" w:eastAsia="Arial" w:hAnsi="Arial"/>
-                <w:b w:val="1"/>
-                <w:i w:val="0"/>
-                <w:smallCaps w:val="0"/>
-                <w:strike w:val="0"/>
-                <w:color w:val="000000"/>
-                <w:sz w:val="22"/>
-                <w:szCs w:val="22"/>
-                <w:u w:val="none"/>
-                <w:shd w:fill="auto" w:val="clear"/>
-                <w:vertAlign w:val="baseline"/>
-                <w:rtl w:val="0"/>
-              </w:rPr>
-              <w:t xml:space="preserve">:</w:t>
-              <w:tab/>
-              <w:t xml:space="preserve">12</w:t>
-            </w:r>
-          </w:hyperlink>
-          <w:r>
-            <w:rPr>
-              <w:rtl w:val="0"/>
-            </w:rPr>
-          </w:r>
-        </w:p>
-        <w:p>
-          <w:pPr>
-            <w:widowControl w:val="0"/>
-            <w:tabs>
-              <w:tab w:val="right" w:leader="none" w:pos="12000"/>
-            </w:tabs>
-            <w:spacing w:before="60" w:lineRule="auto"/>
-            <w:jc w:val="left"/>
-            <w:rPr>
-              <w:i w:val="0"/>
-              <w:smallCaps w:val="0"/>
-              <w:strike w:val="0"/>
-              <w:color w:val="000000"/>
-              <w:sz w:val="22"/>
-              <w:szCs w:val="22"/>
-              <w:u w:val="none"/>
-              <w:shd w:fill="auto" w:val="clear"/>
-              <w:vertAlign w:val="baseline"/>
-            </w:rPr>
-          </w:pPr>
-          <w:hyperlink w:anchor="_heading=h.gnu6iya1ysps">
-            <w:r>
-              <w:rPr>
-                <w:i w:val="0"/>
-                <w:smallCaps w:val="0"/>
-                <w:strike w:val="0"/>
-                <w:color w:val="000000"/>
-                <w:sz w:val="22"/>
-                <w:szCs w:val="22"/>
-                <w:u w:val="none"/>
-                <w:shd w:fill="auto" w:val="clear"/>
-                <w:vertAlign w:val="baseline"/>
-                <w:rtl w:val="0"/>
-              </w:rPr>
-              <w:t xml:space="preserve">3.1.2.Caso de uso cita y laboratorio.</w:t>
-              <w:tab/>
-              <w:t xml:space="preserve">13</w:t>
-            </w:r>
-          </w:hyperlink>
-          <w:r>
-            <w:rPr>
-              <w:rtl w:val="0"/>
-            </w:rPr>
-          </w:r>
-        </w:p>
-        <w:p>
-          <w:pPr>
-            <w:widowControl w:val="0"/>
-            <w:tabs>
-              <w:tab w:val="right" w:leader="none" w:pos="12000"/>
-            </w:tabs>
-            <w:spacing w:before="60" w:lineRule="auto"/>
-            <w:jc w:val="left"/>
-            <w:rPr>
-              <w:i w:val="0"/>
-              <w:smallCaps w:val="0"/>
-              <w:strike w:val="0"/>
-              <w:color w:val="000000"/>
-              <w:sz w:val="22"/>
-              <w:szCs w:val="22"/>
-              <w:u w:val="none"/>
-              <w:shd w:fill="auto" w:val="clear"/>
-              <w:vertAlign w:val="baseline"/>
-            </w:rPr>
-          </w:pPr>
-          <w:hyperlink w:anchor="_heading=h.8wsw5799ml7i">
-            <w:r>
-              <w:rPr>
-                <w:i w:val="0"/>
-                <w:smallCaps w:val="0"/>
-                <w:strike w:val="0"/>
-                <w:color w:val="000000"/>
-                <w:sz w:val="22"/>
-                <w:szCs w:val="22"/>
-                <w:u w:val="none"/>
-                <w:shd w:fill="auto" w:val="clear"/>
-                <w:vertAlign w:val="baseline"/>
-                <w:rtl w:val="0"/>
-              </w:rPr>
-              <w:t xml:space="preserve">3.1.3 Caso de uso control de paciente:</w:t>
-              <w:tab/>
-              <w:t xml:space="preserve">15</w:t>
-            </w:r>
-          </w:hyperlink>
-          <w:r>
-            <w:rPr>
-              <w:rtl w:val="0"/>
-            </w:rPr>
-          </w:r>
-        </w:p>
-        <w:p>
-          <w:pPr>
-            <w:widowControl w:val="0"/>
-            <w:tabs>
-              <w:tab w:val="right" w:leader="none" w:pos="12000"/>
-            </w:tabs>
-            <w:spacing w:before="60" w:lineRule="auto"/>
-            <w:jc w:val="left"/>
-            <w:rPr>
-              <w:i w:val="0"/>
-              <w:smallCaps w:val="0"/>
-              <w:strike w:val="0"/>
-              <w:color w:val="000000"/>
-              <w:sz w:val="22"/>
-              <w:szCs w:val="22"/>
-              <w:u w:val="none"/>
-              <w:shd w:fill="auto" w:val="clear"/>
-              <w:vertAlign w:val="baseline"/>
-            </w:rPr>
-          </w:pPr>
-          <w:hyperlink w:anchor="_heading=h.x8zqfrb6dgyj">
-            <w:r>
-              <w:rPr>
-                <w:i w:val="0"/>
-                <w:smallCaps w:val="0"/>
-                <w:strike w:val="0"/>
-                <w:color w:val="000000"/>
-                <w:sz w:val="22"/>
-                <w:szCs w:val="22"/>
-                <w:u w:val="none"/>
-                <w:shd w:fill="auto" w:val="clear"/>
-                <w:vertAlign w:val="baseline"/>
-                <w:rtl w:val="0"/>
-              </w:rPr>
-              <w:t xml:space="preserve">3.1.4 Caso de uso Aprobación orden médica:</w:t>
-              <w:tab/>
-              <w:t xml:space="preserve">16</w:t>
-            </w:r>
-          </w:hyperlink>
-          <w:r>
-            <w:rPr>
-              <w:rtl w:val="0"/>
-            </w:rPr>
-          </w:r>
-        </w:p>
-        <w:p>
-          <w:pPr>
-            <w:widowControl w:val="0"/>
-            <w:tabs>
-              <w:tab w:val="right" w:leader="none" w:pos="12000"/>
-            </w:tabs>
-            <w:spacing w:before="60" w:lineRule="auto"/>
-            <w:jc w:val="left"/>
-            <w:rPr>
-              <w:i w:val="0"/>
-              <w:smallCaps w:val="0"/>
-              <w:strike w:val="0"/>
-              <w:color w:val="000000"/>
-              <w:sz w:val="22"/>
-              <w:szCs w:val="22"/>
-              <w:u w:val="none"/>
-              <w:shd w:fill="auto" w:val="clear"/>
-              <w:vertAlign w:val="baseline"/>
-            </w:rPr>
-          </w:pPr>
-          <w:hyperlink w:anchor="_heading=h.ue2fyuasdqem">
-            <w:r>
-              <w:rPr>
-                <w:i w:val="0"/>
-                <w:smallCaps w:val="0"/>
-                <w:strike w:val="0"/>
-                <w:color w:val="000000"/>
-                <w:sz w:val="22"/>
-                <w:szCs w:val="22"/>
-                <w:u w:val="none"/>
-                <w:shd w:fill="auto" w:val="clear"/>
-                <w:vertAlign w:val="baseline"/>
-                <w:rtl w:val="0"/>
-              </w:rPr>
-              <w:t xml:space="preserve">3.1.5 Caso de uso Información y notificaciones.</w:t>
-              <w:tab/>
-              <w:t xml:space="preserve">18</w:t>
-            </w:r>
-          </w:hyperlink>
-          <w:r>
-            <w:rPr>
-              <w:rtl w:val="0"/>
-            </w:rPr>
-          </w:r>
-        </w:p>
-        <w:p>
-          <w:pPr>
-            <w:widowControl w:val="0"/>
-            <w:tabs>
-              <w:tab w:val="right" w:leader="none" w:pos="12000"/>
-            </w:tabs>
-            <w:spacing w:before="60" w:lineRule="auto"/>
-            <w:jc w:val="left"/>
-            <w:rPr>
-              <w:i w:val="0"/>
-              <w:smallCaps w:val="0"/>
-              <w:strike w:val="0"/>
-              <w:color w:val="000000"/>
-              <w:sz w:val="22"/>
-              <w:szCs w:val="22"/>
-              <w:u w:val="none"/>
-              <w:shd w:fill="auto" w:val="clear"/>
-              <w:vertAlign w:val="baseline"/>
-            </w:rPr>
-          </w:pPr>
-          <w:hyperlink w:anchor="_heading=h.z7yxlxikify1">
-            <w:r>
-              <w:rPr>
-                <w:i w:val="0"/>
-                <w:smallCaps w:val="0"/>
-                <w:strike w:val="0"/>
-                <w:color w:val="000000"/>
-                <w:sz w:val="22"/>
-                <w:szCs w:val="22"/>
-                <w:u w:val="none"/>
-                <w:shd w:fill="auto" w:val="clear"/>
-                <w:vertAlign w:val="baseline"/>
-                <w:rtl w:val="0"/>
-              </w:rPr>
-              <w:t xml:space="preserve">3.1.6 Caso de uso Tratamiento.</w:t>
-              <w:tab/>
-              <w:t xml:space="preserve">19</w:t>
-            </w:r>
-          </w:hyperlink>
-          <w:r>
-            <w:rPr>
-              <w:rtl w:val="0"/>
-            </w:rPr>
-          </w:r>
-        </w:p>
-        <w:p>
-          <w:pPr>
-            <w:widowControl w:val="0"/>
-            <w:tabs>
-              <w:tab w:val="right" w:leader="none" w:pos="12000"/>
-            </w:tabs>
-            <w:spacing w:before="60" w:lineRule="auto"/>
-            <w:jc w:val="left"/>
-            <w:rPr>
-              <w:i w:val="0"/>
-              <w:smallCaps w:val="0"/>
-              <w:strike w:val="0"/>
-              <w:color w:val="000000"/>
-              <w:sz w:val="22"/>
-              <w:szCs w:val="22"/>
-              <w:u w:val="none"/>
-              <w:shd w:fill="auto" w:val="clear"/>
-              <w:vertAlign w:val="baseline"/>
-            </w:rPr>
-          </w:pPr>
-          <w:hyperlink w:anchor="_heading=h.g69jl3t2pr88">
-            <w:r>
-              <w:rPr>
-                <w:i w:val="0"/>
-                <w:smallCaps w:val="0"/>
-                <w:strike w:val="0"/>
-                <w:color w:val="000000"/>
-                <w:sz w:val="22"/>
-                <w:szCs w:val="22"/>
-                <w:u w:val="none"/>
-                <w:shd w:fill="auto" w:val="clear"/>
-                <w:vertAlign w:val="baseline"/>
-                <w:rtl w:val="0"/>
-              </w:rPr>
-              <w:t xml:space="preserve">3.1.7 Caso de uso Gestión de orden  examen médico o laboratorio</w:t>
-              <w:tab/>
-              <w:t xml:space="preserve">21</w:t>
-            </w:r>
-          </w:hyperlink>
-          <w:r>
-            <w:rPr>
-              <w:rtl w:val="0"/>
-            </w:rPr>
-          </w:r>
-        </w:p>
-        <w:p>
-          <w:pPr>
-            <w:widowControl w:val="0"/>
-            <w:tabs>
-              <w:tab w:val="right" w:leader="none" w:pos="12000"/>
-            </w:tabs>
-            <w:spacing w:before="60" w:lineRule="auto"/>
-            <w:jc w:val="left"/>
-            <w:rPr>
-              <w:rFonts w:ascii="Arial" w:cs="Arial" w:eastAsia="Arial" w:hAnsi="Arial"/>
-              <w:b w:val="1"/>
-              <w:i w:val="0"/>
-              <w:smallCaps w:val="0"/>
-              <w:strike w:val="0"/>
-              <w:color w:val="000000"/>
-              <w:sz w:val="22"/>
-              <w:szCs w:val="22"/>
-              <w:u w:val="none"/>
-              <w:shd w:fill="auto" w:val="clear"/>
-              <w:vertAlign w:val="baseline"/>
-            </w:rPr>
-          </w:pPr>
-          <w:hyperlink w:anchor="_heading=h.z3shc7790l3p">
-            <w:r>
-              <w:rPr>
-                <w:i w:val="0"/>
-                <w:smallCaps w:val="0"/>
-                <w:strike w:val="0"/>
-                <w:color w:val="000000"/>
-                <w:sz w:val="22"/>
-                <w:szCs w:val="22"/>
-                <w:u w:val="none"/>
-                <w:shd w:fill="auto" w:val="clear"/>
-                <w:vertAlign w:val="baseline"/>
-                <w:rtl w:val="0"/>
-              </w:rPr>
-              <w:t xml:space="preserve">3.1.8 Caso de uso Seguimiento.</w:t>
-            </w:r>
-          </w:hyperlink>
-          <w:hyperlink w:anchor="_heading=h.z3shc7790l3p">
-            <w:r>
-              <w:rPr>
-                <w:rFonts w:ascii="Arial" w:cs="Arial" w:eastAsia="Arial" w:hAnsi="Arial"/>
-                <w:b w:val="1"/>
-                <w:i w:val="0"/>
-                <w:smallCaps w:val="0"/>
-                <w:strike w:val="0"/>
-                <w:color w:val="000000"/>
-                <w:sz w:val="22"/>
-                <w:szCs w:val="22"/>
-                <w:u w:val="none"/>
-                <w:shd w:fill="auto" w:val="clear"/>
-                <w:vertAlign w:val="baseline"/>
-                <w:rtl w:val="0"/>
-              </w:rPr>
-              <w:tab/>
-              <w:t xml:space="preserve">22</w:t>
-            </w:r>
-          </w:hyperlink>
-          <w:r>
-            <w:rPr>
-              <w:rtl w:val="0"/>
-            </w:rPr>
-          </w:r>
-        </w:p>
-        <w:p>
-          <w:pPr>
-            <w:widowControl w:val="0"/>
-            <w:tabs>
-              <w:tab w:val="right" w:leader="none" w:pos="12000"/>
-            </w:tabs>
-            <w:spacing w:before="60" w:lineRule="auto"/>
-            <w:jc w:val="left"/>
-            <w:rPr>
-              <w:i w:val="0"/>
-              <w:smallCaps w:val="0"/>
-              <w:strike w:val="0"/>
-              <w:color w:val="000000"/>
-              <w:sz w:val="22"/>
-              <w:szCs w:val="22"/>
-              <w:u w:val="none"/>
-              <w:shd w:fill="auto" w:val="clear"/>
-              <w:vertAlign w:val="baseline"/>
-            </w:rPr>
-          </w:pPr>
-          <w:hyperlink w:anchor="_heading=h.ljze6szcguka">
-            <w:r>
-              <w:rPr>
-                <w:i w:val="0"/>
-                <w:smallCaps w:val="0"/>
-                <w:strike w:val="0"/>
-                <w:color w:val="000000"/>
-                <w:sz w:val="22"/>
-                <w:szCs w:val="22"/>
-                <w:u w:val="none"/>
-                <w:shd w:fill="auto" w:val="clear"/>
-                <w:vertAlign w:val="baseline"/>
-                <w:rtl w:val="0"/>
-              </w:rPr>
-              <w:t xml:space="preserve">3.1.9 Caso de uso Recomendaciones.</w:t>
-              <w:tab/>
-              <w:t xml:space="preserve">23</w:t>
-            </w:r>
-          </w:hyperlink>
-          <w:r>
-            <w:rPr>
-              <w:rtl w:val="0"/>
-            </w:rPr>
-          </w:r>
-        </w:p>
-        <w:p>
-          <w:pPr>
-            <w:widowControl w:val="0"/>
-            <w:tabs>
-              <w:tab w:val="right" w:leader="none" w:pos="12000"/>
-            </w:tabs>
-            <w:spacing w:before="60" w:lineRule="auto"/>
-            <w:jc w:val="left"/>
-            <w:rPr>
-              <w:i w:val="0"/>
-              <w:smallCaps w:val="0"/>
-              <w:strike w:val="0"/>
-              <w:color w:val="000000"/>
-              <w:sz w:val="22"/>
-              <w:szCs w:val="22"/>
-              <w:u w:val="none"/>
-              <w:shd w:fill="auto" w:val="clear"/>
-              <w:vertAlign w:val="baseline"/>
-            </w:rPr>
-          </w:pPr>
-          <w:hyperlink w:anchor="_heading=h.upjy9nw4xb1s">
-            <w:r>
-              <w:rPr>
-                <w:i w:val="0"/>
-                <w:smallCaps w:val="0"/>
-                <w:strike w:val="0"/>
-                <w:color w:val="000000"/>
-                <w:sz w:val="22"/>
-                <w:szCs w:val="22"/>
-                <w:u w:val="none"/>
-                <w:shd w:fill="auto" w:val="clear"/>
-                <w:vertAlign w:val="baseline"/>
-                <w:rtl w:val="0"/>
-              </w:rPr>
-              <w:t xml:space="preserve">3.1.10  Caso de uso Orden médica y resultado.</w:t>
-              <w:tab/>
-              <w:t xml:space="preserve">24</w:t>
-            </w:r>
-          </w:hyperlink>
-          <w:r>
-            <w:rPr>
-              <w:rtl w:val="0"/>
-            </w:rPr>
-          </w:r>
-        </w:p>
-        <w:p>
-          <w:pPr>
-            <w:widowControl w:val="0"/>
-            <w:tabs>
-              <w:tab w:val="right" w:leader="none" w:pos="12000"/>
-            </w:tabs>
-            <w:spacing w:before="60" w:lineRule="auto"/>
-            <w:jc w:val="left"/>
-            <w:rPr>
-              <w:i w:val="0"/>
-              <w:smallCaps w:val="0"/>
-              <w:strike w:val="0"/>
-              <w:color w:val="000000"/>
-              <w:sz w:val="22"/>
-              <w:szCs w:val="22"/>
-              <w:u w:val="none"/>
-              <w:shd w:fill="auto" w:val="clear"/>
-              <w:vertAlign w:val="baseline"/>
-            </w:rPr>
-          </w:pPr>
-          <w:hyperlink w:anchor="_heading=h.p421gufr25xr">
-            <w:r>
-              <w:rPr>
-                <w:i w:val="0"/>
-                <w:smallCaps w:val="0"/>
-                <w:strike w:val="0"/>
-                <w:color w:val="000000"/>
-                <w:sz w:val="22"/>
-                <w:szCs w:val="22"/>
-                <w:u w:val="none"/>
-                <w:shd w:fill="auto" w:val="clear"/>
-                <w:vertAlign w:val="baseline"/>
-                <w:rtl w:val="0"/>
-              </w:rPr>
-              <w:t xml:space="preserve">3.1.11 Caso de uso Actualización.</w:t>
-              <w:tab/>
-              <w:t xml:space="preserve">26</w:t>
-            </w:r>
-          </w:hyperlink>
-          <w:r>
-            <w:rPr>
-              <w:rtl w:val="0"/>
-            </w:rPr>
-          </w:r>
-        </w:p>
-        <w:p>
-          <w:pPr>
-            <w:widowControl w:val="0"/>
-            <w:tabs>
-              <w:tab w:val="right" w:leader="none" w:pos="12000"/>
-            </w:tabs>
-            <w:spacing w:before="60" w:lineRule="auto"/>
-            <w:ind w:left="360" w:firstLine="0"/>
-            <w:jc w:val="left"/>
-            <w:rPr>
-              <w:i w:val="0"/>
-              <w:smallCaps w:val="0"/>
-              <w:strike w:val="0"/>
-              <w:color w:val="000000"/>
-              <w:sz w:val="22"/>
-              <w:szCs w:val="22"/>
-              <w:u w:val="none"/>
-              <w:shd w:fill="auto" w:val="clear"/>
-              <w:vertAlign w:val="baseline"/>
-            </w:rPr>
-          </w:pPr>
-          <w:hyperlink w:anchor="_heading=h.2jxsxqh">
-            <w:r>
-              <w:rPr>
-                <w:i w:val="0"/>
-                <w:smallCaps w:val="0"/>
-                <w:strike w:val="0"/>
-                <w:color w:val="000000"/>
-                <w:sz w:val="24"/>
-                <w:szCs w:val="24"/>
-                <w:u w:val="none"/>
-                <w:shd w:fill="auto" w:val="clear"/>
-                <w:vertAlign w:val="baseline"/>
-                <w:rtl w:val="0"/>
-              </w:rPr>
-              <w:t xml:space="preserve">3.2. Vista de Procesos</w:t>
-              <w:tab/>
-              <w:t xml:space="preserve">27</w:t>
-            </w:r>
-          </w:hyperlink>
-          <w:r>
-            <w:rPr>
-              <w:rtl w:val="0"/>
-            </w:rPr>
-          </w:r>
-        </w:p>
-        <w:p>
-          <w:pPr>
-            <w:widowControl w:val="0"/>
-            <w:tabs>
-              <w:tab w:val="right" w:leader="none" w:pos="12000"/>
-            </w:tabs>
-            <w:spacing w:before="60" w:lineRule="auto"/>
-            <w:jc w:val="left"/>
-            <w:rPr>
-              <w:i w:val="0"/>
-              <w:smallCaps w:val="0"/>
-              <w:strike w:val="0"/>
-              <w:color w:val="000000"/>
-              <w:sz w:val="22"/>
-              <w:szCs w:val="22"/>
-              <w:u w:val="none"/>
-              <w:shd w:fill="auto" w:val="clear"/>
-              <w:vertAlign w:val="baseline"/>
-            </w:rPr>
-          </w:pPr>
-          <w:hyperlink w:anchor="_heading=h.sj9owzvzy8o0">
-            <w:r>
-              <w:rPr>
-                <w:i w:val="0"/>
-                <w:smallCaps w:val="0"/>
-                <w:strike w:val="0"/>
-                <w:color w:val="000000"/>
-                <w:sz w:val="22"/>
-                <w:szCs w:val="22"/>
-                <w:u w:val="none"/>
-                <w:shd w:fill="auto" w:val="clear"/>
-                <w:vertAlign w:val="baseline"/>
-                <w:rtl w:val="0"/>
-              </w:rPr>
-              <w:t xml:space="preserve">3.2.1.1 Gestión de cita</w:t>
-              <w:tab/>
-              <w:t xml:space="preserve">28</w:t>
-            </w:r>
-          </w:hyperlink>
-          <w:r>
-            <w:rPr>
-              <w:rtl w:val="0"/>
-            </w:rPr>
-          </w:r>
-        </w:p>
-        <w:p>
-          <w:pPr>
-            <w:widowControl w:val="0"/>
-            <w:tabs>
-              <w:tab w:val="right" w:leader="none" w:pos="12000"/>
-            </w:tabs>
-            <w:spacing w:before="60" w:lineRule="auto"/>
-            <w:jc w:val="left"/>
-            <w:rPr>
-              <w:i w:val="0"/>
-              <w:smallCaps w:val="0"/>
-              <w:strike w:val="0"/>
-              <w:color w:val="000000"/>
-              <w:sz w:val="22"/>
-              <w:szCs w:val="22"/>
-              <w:u w:val="none"/>
-              <w:shd w:fill="auto" w:val="clear"/>
-              <w:vertAlign w:val="baseline"/>
-            </w:rPr>
-          </w:pPr>
-          <w:hyperlink w:anchor="_heading=h.9q9a3siz3q2r">
-            <w:r>
-              <w:rPr>
-                <w:i w:val="0"/>
-                <w:smallCaps w:val="0"/>
-                <w:strike w:val="0"/>
-                <w:color w:val="000000"/>
-                <w:sz w:val="22"/>
-                <w:szCs w:val="22"/>
-                <w:u w:val="none"/>
-                <w:shd w:fill="auto" w:val="clear"/>
-                <w:vertAlign w:val="baseline"/>
-                <w:rtl w:val="0"/>
-              </w:rPr>
-              <w:t xml:space="preserve">3.2.1.3 Gestión medicamento</w:t>
-              <w:tab/>
-              <w:t xml:space="preserve">31</w:t>
-            </w:r>
-          </w:hyperlink>
-          <w:r>
-            <w:rPr>
-              <w:rtl w:val="0"/>
-            </w:rPr>
-          </w:r>
-        </w:p>
-        <w:p>
-          <w:pPr>
-            <w:widowControl w:val="0"/>
-            <w:tabs>
-              <w:tab w:val="right" w:leader="none" w:pos="12000"/>
-            </w:tabs>
-            <w:spacing w:before="60" w:lineRule="auto"/>
-            <w:jc w:val="left"/>
-            <w:rPr>
-              <w:i w:val="0"/>
-              <w:smallCaps w:val="0"/>
-              <w:strike w:val="0"/>
-              <w:color w:val="000000"/>
-              <w:sz w:val="22"/>
-              <w:szCs w:val="22"/>
-              <w:u w:val="none"/>
-              <w:shd w:fill="auto" w:val="clear"/>
-              <w:vertAlign w:val="baseline"/>
-            </w:rPr>
-          </w:pPr>
-          <w:hyperlink w:anchor="_heading=h.3d8hhs8zsjhz">
-            <w:r>
-              <w:rPr>
-                <w:i w:val="0"/>
-                <w:smallCaps w:val="0"/>
-                <w:strike w:val="0"/>
-                <w:color w:val="000000"/>
-                <w:sz w:val="22"/>
-                <w:szCs w:val="22"/>
-                <w:u w:val="none"/>
-                <w:shd w:fill="auto" w:val="clear"/>
-                <w:vertAlign w:val="baseline"/>
-                <w:rtl w:val="0"/>
-              </w:rPr>
-              <w:t xml:space="preserve">3.2.1.4 Control de salud paciente</w:t>
-              <w:tab/>
-              <w:t xml:space="preserve">32</w:t>
-            </w:r>
-          </w:hyperlink>
-          <w:r>
-            <w:rPr>
-              <w:rtl w:val="0"/>
-            </w:rPr>
-          </w:r>
-        </w:p>
-        <w:p>
-          <w:pPr>
-            <w:widowControl w:val="0"/>
-            <w:tabs>
-              <w:tab w:val="right" w:leader="none" w:pos="12000"/>
-            </w:tabs>
-            <w:spacing w:before="60" w:lineRule="auto"/>
-            <w:jc w:val="left"/>
-            <w:rPr>
-              <w:i w:val="0"/>
-              <w:smallCaps w:val="0"/>
-              <w:strike w:val="0"/>
-              <w:color w:val="000000"/>
-              <w:sz w:val="22"/>
-              <w:szCs w:val="22"/>
-              <w:u w:val="none"/>
-              <w:shd w:fill="auto" w:val="clear"/>
-              <w:vertAlign w:val="baseline"/>
-            </w:rPr>
-          </w:pPr>
-          <w:hyperlink w:anchor="_heading=h.bxyajrxzviuq">
-            <w:r>
-              <w:rPr>
-                <w:i w:val="0"/>
-                <w:smallCaps w:val="0"/>
-                <w:strike w:val="0"/>
-                <w:color w:val="000000"/>
-                <w:sz w:val="22"/>
-                <w:szCs w:val="22"/>
-                <w:u w:val="none"/>
-                <w:shd w:fill="auto" w:val="clear"/>
-                <w:vertAlign w:val="baseline"/>
-                <w:rtl w:val="0"/>
-              </w:rPr>
-              <w:t xml:space="preserve">3.2.1.6 Información y notificación</w:t>
-              <w:tab/>
-              <w:t xml:space="preserve">35</w:t>
-            </w:r>
-          </w:hyperlink>
-          <w:r>
-            <w:rPr>
-              <w:rtl w:val="0"/>
-            </w:rPr>
-          </w:r>
-        </w:p>
-        <w:p>
-          <w:pPr>
-            <w:widowControl w:val="0"/>
-            <w:tabs>
-              <w:tab w:val="right" w:leader="none" w:pos="12000"/>
-            </w:tabs>
-            <w:spacing w:before="60" w:lineRule="auto"/>
-            <w:jc w:val="left"/>
-            <w:rPr>
-              <w:i w:val="0"/>
-              <w:smallCaps w:val="0"/>
-              <w:strike w:val="0"/>
-              <w:color w:val="000000"/>
-              <w:sz w:val="22"/>
-              <w:szCs w:val="22"/>
-              <w:u w:val="none"/>
-              <w:shd w:fill="auto" w:val="clear"/>
-              <w:vertAlign w:val="baseline"/>
-            </w:rPr>
-          </w:pPr>
-          <w:hyperlink w:anchor="_heading=h.9gquh28q1bpl">
-            <w:r>
-              <w:rPr>
-                <w:i w:val="0"/>
-                <w:smallCaps w:val="0"/>
-                <w:strike w:val="0"/>
-                <w:color w:val="000000"/>
-                <w:sz w:val="22"/>
-                <w:szCs w:val="22"/>
-                <w:u w:val="none"/>
-                <w:shd w:fill="auto" w:val="clear"/>
-                <w:vertAlign w:val="baseline"/>
-                <w:rtl w:val="0"/>
-              </w:rPr>
-              <w:t xml:space="preserve">3.2.1.7 Tratamiento</w:t>
-              <w:tab/>
-              <w:t xml:space="preserve">37</w:t>
-            </w:r>
-          </w:hyperlink>
-          <w:r>
-            <w:rPr>
-              <w:rtl w:val="0"/>
-            </w:rPr>
-          </w:r>
-        </w:p>
-        <w:p>
-          <w:pPr>
-            <w:widowControl w:val="0"/>
-            <w:tabs>
-              <w:tab w:val="right" w:leader="none" w:pos="12000"/>
-            </w:tabs>
-            <w:spacing w:before="60" w:lineRule="auto"/>
-            <w:jc w:val="left"/>
-            <w:rPr>
-              <w:i w:val="0"/>
-              <w:smallCaps w:val="0"/>
-              <w:strike w:val="0"/>
-              <w:color w:val="000000"/>
-              <w:sz w:val="22"/>
-              <w:szCs w:val="22"/>
-              <w:u w:val="none"/>
-              <w:shd w:fill="auto" w:val="clear"/>
-              <w:vertAlign w:val="baseline"/>
-            </w:rPr>
-          </w:pPr>
-          <w:hyperlink w:anchor="_heading=h.c4cpz2els34v">
-            <w:r>
-              <w:rPr>
-                <w:i w:val="0"/>
-                <w:smallCaps w:val="0"/>
-                <w:strike w:val="0"/>
-                <w:color w:val="000000"/>
-                <w:sz w:val="22"/>
-                <w:szCs w:val="22"/>
-                <w:u w:val="none"/>
-                <w:shd w:fill="auto" w:val="clear"/>
-                <w:vertAlign w:val="baseline"/>
-                <w:rtl w:val="0"/>
-              </w:rPr>
-              <w:t xml:space="preserve">3.2.1.8 Gestión de órdenes médicas</w:t>
-              <w:tab/>
-              <w:t xml:space="preserve">38</w:t>
-            </w:r>
-          </w:hyperlink>
-          <w:r>
-            <w:rPr>
-              <w:rtl w:val="0"/>
-            </w:rPr>
-          </w:r>
-        </w:p>
-        <w:p>
-          <w:pPr>
-            <w:widowControl w:val="0"/>
-            <w:tabs>
-              <w:tab w:val="right" w:leader="none" w:pos="12000"/>
-            </w:tabs>
-            <w:spacing w:before="60" w:lineRule="auto"/>
-            <w:jc w:val="left"/>
-            <w:rPr>
-              <w:i w:val="0"/>
-              <w:smallCaps w:val="0"/>
-              <w:strike w:val="0"/>
-              <w:color w:val="000000"/>
-              <w:sz w:val="22"/>
-              <w:szCs w:val="22"/>
-              <w:u w:val="none"/>
-              <w:shd w:fill="auto" w:val="clear"/>
-              <w:vertAlign w:val="baseline"/>
-            </w:rPr>
-          </w:pPr>
-          <w:hyperlink w:anchor="_heading=h.9k5oyvl9ouyj">
-            <w:r>
-              <w:rPr>
-                <w:i w:val="0"/>
-                <w:smallCaps w:val="0"/>
-                <w:strike w:val="0"/>
-                <w:color w:val="000000"/>
-                <w:sz w:val="22"/>
-                <w:szCs w:val="22"/>
-                <w:u w:val="none"/>
-                <w:shd w:fill="auto" w:val="clear"/>
-                <w:vertAlign w:val="baseline"/>
-                <w:rtl w:val="0"/>
-              </w:rPr>
-              <w:t xml:space="preserve">3.2.1.9 Seguimiento</w:t>
-              <w:tab/>
-              <w:t xml:space="preserve">40</w:t>
-            </w:r>
-          </w:hyperlink>
-          <w:r>
-            <w:rPr>
-              <w:rtl w:val="0"/>
-            </w:rPr>
-          </w:r>
-        </w:p>
-        <w:p>
-          <w:pPr>
-            <w:widowControl w:val="0"/>
-            <w:tabs>
-              <w:tab w:val="right" w:leader="none" w:pos="12000"/>
-            </w:tabs>
-            <w:spacing w:before="60" w:lineRule="auto"/>
-            <w:jc w:val="left"/>
-            <w:rPr>
-              <w:rFonts w:ascii="Arial" w:cs="Arial" w:eastAsia="Arial" w:hAnsi="Arial"/>
-              <w:b w:val="1"/>
-              <w:i w:val="0"/>
-              <w:smallCaps w:val="0"/>
-              <w:strike w:val="0"/>
-              <w:color w:val="000000"/>
-              <w:sz w:val="22"/>
-              <w:szCs w:val="22"/>
-              <w:u w:val="none"/>
-              <w:shd w:fill="auto" w:val="clear"/>
-              <w:vertAlign w:val="baseline"/>
-            </w:rPr>
-          </w:pPr>
-          <w:hyperlink w:anchor="_heading=h.qkcwqkhl86jt">
-            <w:r>
-              <w:rPr>
-                <w:i w:val="0"/>
-                <w:smallCaps w:val="0"/>
-                <w:strike w:val="0"/>
-                <w:color w:val="000000"/>
-                <w:sz w:val="22"/>
-                <w:szCs w:val="22"/>
-                <w:u w:val="none"/>
-                <w:shd w:fill="auto" w:val="clear"/>
-                <w:vertAlign w:val="baseline"/>
-                <w:rtl w:val="0"/>
-              </w:rPr>
-              <w:t xml:space="preserve">3.2.1.10 Gestión de recomendaciones</w:t>
-            </w:r>
-          </w:hyperlink>
-          <w:hyperlink w:anchor="_heading=h.qkcwqkhl86jt">
-            <w:r>
-              <w:rPr>
-                <w:rFonts w:ascii="Arial" w:cs="Arial" w:eastAsia="Arial" w:hAnsi="Arial"/>
-                <w:b w:val="1"/>
-                <w:i w:val="0"/>
-                <w:smallCaps w:val="0"/>
-                <w:strike w:val="0"/>
-                <w:color w:val="000000"/>
-                <w:sz w:val="22"/>
-                <w:szCs w:val="22"/>
-                <w:u w:val="none"/>
-                <w:shd w:fill="auto" w:val="clear"/>
-                <w:vertAlign w:val="baseline"/>
-                <w:rtl w:val="0"/>
-              </w:rPr>
-              <w:tab/>
-              <w:t xml:space="preserve">41</w:t>
-            </w:r>
-          </w:hyperlink>
-          <w:r>
-            <w:rPr>
-              <w:rtl w:val="0"/>
-            </w:rPr>
-          </w:r>
-        </w:p>
-        <w:p>
-          <w:pPr>
-            <w:widowControl w:val="0"/>
-            <w:tabs>
-              <w:tab w:val="right" w:leader="none" w:pos="12000"/>
-            </w:tabs>
-            <w:spacing w:before="60" w:lineRule="auto"/>
-            <w:jc w:val="left"/>
-            <w:rPr>
-              <w:i w:val="0"/>
-              <w:smallCaps w:val="0"/>
-              <w:strike w:val="0"/>
-              <w:color w:val="000000"/>
-              <w:sz w:val="22"/>
-              <w:szCs w:val="22"/>
-              <w:u w:val="none"/>
-              <w:shd w:fill="auto" w:val="clear"/>
-              <w:vertAlign w:val="baseline"/>
-            </w:rPr>
-          </w:pPr>
-          <w:hyperlink w:anchor="_heading=h.kzckz9q87j9e">
-            <w:r>
-              <w:rPr>
-                <w:i w:val="0"/>
-                <w:smallCaps w:val="0"/>
-                <w:strike w:val="0"/>
-                <w:color w:val="000000"/>
-                <w:sz w:val="22"/>
-                <w:szCs w:val="22"/>
-                <w:u w:val="none"/>
-                <w:shd w:fill="auto" w:val="clear"/>
-                <w:vertAlign w:val="baseline"/>
-                <w:rtl w:val="0"/>
-              </w:rPr>
-              <w:t xml:space="preserve">3.2.1.11 Gestión de órdenes y resultados</w:t>
-              <w:tab/>
-              <w:t xml:space="preserve">42</w:t>
-            </w:r>
-          </w:hyperlink>
-          <w:r>
-            <w:rPr>
-              <w:rtl w:val="0"/>
-            </w:rPr>
-          </w:r>
-        </w:p>
-        <w:p>
-          <w:pPr>
-            <w:widowControl w:val="0"/>
-            <w:tabs>
-              <w:tab w:val="right" w:leader="none" w:pos="12000"/>
-            </w:tabs>
-            <w:spacing w:before="60" w:lineRule="auto"/>
-            <w:jc w:val="left"/>
-            <w:rPr>
-              <w:rFonts w:ascii="Arial" w:cs="Arial" w:eastAsia="Arial" w:hAnsi="Arial"/>
-              <w:b w:val="1"/>
-              <w:i w:val="0"/>
-              <w:smallCaps w:val="0"/>
-              <w:strike w:val="0"/>
-              <w:color w:val="000000"/>
-              <w:sz w:val="22"/>
-              <w:szCs w:val="22"/>
-              <w:u w:val="none"/>
-              <w:shd w:fill="auto" w:val="clear"/>
-              <w:vertAlign w:val="baseline"/>
-            </w:rPr>
-          </w:pPr>
-          <w:hyperlink w:anchor="_heading=h.2dssi0cktwbd">
-            <w:r>
-              <w:rPr>
-                <w:i w:val="0"/>
-                <w:smallCaps w:val="0"/>
-                <w:strike w:val="0"/>
-                <w:color w:val="000000"/>
-                <w:sz w:val="22"/>
-                <w:szCs w:val="22"/>
-                <w:u w:val="none"/>
-                <w:shd w:fill="auto" w:val="clear"/>
-                <w:vertAlign w:val="baseline"/>
-                <w:rtl w:val="0"/>
-              </w:rPr>
-              <w:t xml:space="preserve">3.2.1.12 Medicamentos y permisos</w:t>
-            </w:r>
-          </w:hyperlink>
-          <w:hyperlink w:anchor="_heading=h.2dssi0cktwbd">
-            <w:r>
-              <w:rPr>
-                <w:rFonts w:ascii="Arial" w:cs="Arial" w:eastAsia="Arial" w:hAnsi="Arial"/>
-                <w:b w:val="1"/>
-                <w:i w:val="0"/>
-                <w:smallCaps w:val="0"/>
-                <w:strike w:val="0"/>
-                <w:color w:val="000000"/>
-                <w:sz w:val="22"/>
-                <w:szCs w:val="22"/>
-                <w:u w:val="none"/>
-                <w:shd w:fill="auto" w:val="clear"/>
-                <w:vertAlign w:val="baseline"/>
-                <w:rtl w:val="0"/>
-              </w:rPr>
-              <w:tab/>
-              <w:t xml:space="preserve">45</w:t>
-            </w:r>
-          </w:hyperlink>
-          <w:r>
-            <w:rPr>
-              <w:rtl w:val="0"/>
-            </w:rPr>
-          </w:r>
-        </w:p>
-        <w:p>
-          <w:pPr>
-            <w:widowControl w:val="0"/>
-            <w:tabs>
-              <w:tab w:val="right" w:leader="none" w:pos="12000"/>
-            </w:tabs>
-            <w:spacing w:before="60" w:lineRule="auto"/>
-            <w:ind w:left="360" w:firstLine="0"/>
-            <w:jc w:val="left"/>
-            <w:rPr>
-              <w:rFonts w:ascii="Arial" w:cs="Arial" w:eastAsia="Arial" w:hAnsi="Arial"/>
-              <w:b w:val="0"/>
-              <w:i w:val="0"/>
-              <w:smallCaps w:val="0"/>
-              <w:strike w:val="0"/>
-              <w:color w:val="000000"/>
-              <w:sz w:val="22"/>
-              <w:szCs w:val="22"/>
-              <w:u w:val="none"/>
-              <w:shd w:fill="auto" w:val="clear"/>
-              <w:vertAlign w:val="baseline"/>
-            </w:rPr>
-          </w:pPr>
-          <w:hyperlink w:anchor="_heading=h.z337ya">
-            <w:r>
-              <w:rPr>
-                <w:rFonts w:ascii="Arial" w:cs="Arial" w:eastAsia="Arial" w:hAnsi="Arial"/>
-                <w:b w:val="0"/>
-                <w:i w:val="0"/>
-                <w:smallCaps w:val="0"/>
-                <w:strike w:val="0"/>
-                <w:color w:val="000000"/>
-                <w:sz w:val="24"/>
-                <w:szCs w:val="24"/>
-                <w:u w:val="none"/>
-                <w:shd w:fill="auto" w:val="clear"/>
-                <w:vertAlign w:val="baseline"/>
-                <w:rtl w:val="0"/>
-              </w:rPr>
-              <w:t xml:space="preserve">3.3. Vista Lógica</w:t>
-              <w:tab/>
-              <w:t xml:space="preserve">47</w:t>
-            </w:r>
-          </w:hyperlink>
-          <w:r>
-            <w:rPr>
-              <w:rtl w:val="0"/>
-            </w:rPr>
-          </w:r>
-        </w:p>
-        <w:p>
-          <w:pPr>
-            <w:widowControl w:val="0"/>
-            <w:tabs>
-              <w:tab w:val="right" w:leader="none" w:pos="12000"/>
-            </w:tabs>
-            <w:spacing w:before="60" w:lineRule="auto"/>
-            <w:ind w:left="360" w:firstLine="0"/>
-            <w:jc w:val="left"/>
-            <w:rPr>
-              <w:rFonts w:ascii="Arial" w:cs="Arial" w:eastAsia="Arial" w:hAnsi="Arial"/>
-              <w:b w:val="0"/>
-              <w:i w:val="0"/>
-              <w:smallCaps w:val="0"/>
-              <w:strike w:val="0"/>
-              <w:color w:val="000000"/>
-              <w:sz w:val="22"/>
-              <w:szCs w:val="22"/>
-              <w:u w:val="none"/>
-              <w:shd w:fill="auto" w:val="clear"/>
-              <w:vertAlign w:val="baseline"/>
-            </w:rPr>
-          </w:pPr>
-          <w:hyperlink w:anchor="_heading=h.1y810tw">
-            <w:r>
-              <w:rPr>
-                <w:rFonts w:ascii="Arial" w:cs="Arial" w:eastAsia="Arial" w:hAnsi="Arial"/>
-                <w:b w:val="0"/>
-                <w:i w:val="0"/>
-                <w:smallCaps w:val="0"/>
-                <w:strike w:val="0"/>
-                <w:color w:val="000000"/>
-                <w:sz w:val="24"/>
-                <w:szCs w:val="24"/>
-                <w:u w:val="none"/>
-                <w:shd w:fill="auto" w:val="clear"/>
-                <w:vertAlign w:val="baseline"/>
-                <w:rtl w:val="0"/>
-              </w:rPr>
-              <w:t xml:space="preserve">3.4. Vista de Implementación</w:t>
-              <w:tab/>
-              <w:t xml:space="preserve">47</w:t>
-            </w:r>
-          </w:hyperlink>
-          <w:r>
-            <w:rPr>
-              <w:rtl w:val="0"/>
-            </w:rPr>
-          </w:r>
-        </w:p>
-        <w:p>
-          <w:pPr>
-            <w:widowControl w:val="0"/>
-            <w:tabs>
-              <w:tab w:val="right" w:leader="none" w:pos="12000"/>
-            </w:tabs>
-            <w:spacing w:before="60" w:lineRule="auto"/>
-            <w:ind w:left="360" w:firstLine="0"/>
-            <w:jc w:val="left"/>
-            <w:rPr>
-              <w:rFonts w:ascii="Arial" w:cs="Arial" w:eastAsia="Arial" w:hAnsi="Arial"/>
-              <w:b w:val="0"/>
-              <w:i w:val="0"/>
-              <w:smallCaps w:val="0"/>
-              <w:strike w:val="0"/>
-              <w:color w:val="000000"/>
-              <w:sz w:val="22"/>
-              <w:szCs w:val="22"/>
-              <w:u w:val="none"/>
-              <w:shd w:fill="auto" w:val="clear"/>
-              <w:vertAlign w:val="baseline"/>
-            </w:rPr>
-          </w:pPr>
-          <w:hyperlink w:anchor="_heading=h.4i7ojhp">
-            <w:r>
-              <w:rPr>
-                <w:rFonts w:ascii="Arial" w:cs="Arial" w:eastAsia="Arial" w:hAnsi="Arial"/>
-                <w:b w:val="0"/>
-                <w:i w:val="0"/>
-                <w:smallCaps w:val="0"/>
-                <w:strike w:val="0"/>
-                <w:color w:val="000000"/>
-                <w:sz w:val="24"/>
-                <w:szCs w:val="24"/>
-                <w:u w:val="none"/>
-                <w:shd w:fill="auto" w:val="clear"/>
-                <w:vertAlign w:val="baseline"/>
-                <w:rtl w:val="0"/>
-              </w:rPr>
-              <w:t xml:space="preserve">3.5. Vista de Despliegue</w:t>
-              <w:tab/>
-              <w:t xml:space="preserve">47</w:t>
-            </w:r>
-          </w:hyperlink>
-          <w:r>
-            <w:rPr>
-              <w:rtl w:val="0"/>
-            </w:rPr>
-          </w:r>
-        </w:p>
-        <w:p>
-          <w:pPr>
-            <w:widowControl w:val="0"/>
-            <w:tabs>
-              <w:tab w:val="right" w:leader="none" w:pos="12000"/>
-            </w:tabs>
-            <w:spacing w:before="60" w:lineRule="auto"/>
-            <w:jc w:val="left"/>
-            <w:rPr>
-              <w:rFonts w:ascii="Arial" w:cs="Arial" w:eastAsia="Arial" w:hAnsi="Arial"/>
-              <w:b w:val="1"/>
-              <w:i w:val="0"/>
-              <w:smallCaps w:val="0"/>
-              <w:strike w:val="0"/>
-              <w:color w:val="000000"/>
-              <w:sz w:val="22"/>
-              <w:szCs w:val="22"/>
-              <w:u w:val="none"/>
-              <w:shd w:fill="auto" w:val="clear"/>
-              <w:vertAlign w:val="baseline"/>
-            </w:rPr>
-          </w:pPr>
-          <w:hyperlink w:anchor="_heading=h.2xcytpi">
-            <w:r>
-              <w:rPr>
-                <w:b w:val="1"/>
-                <w:i w:val="0"/>
-                <w:smallCaps w:val="0"/>
-                <w:strike w:val="0"/>
-                <w:color w:val="000000"/>
-                <w:sz w:val="24"/>
-                <w:szCs w:val="24"/>
-                <w:u w:val="none"/>
-                <w:shd w:fill="auto" w:val="clear"/>
-                <w:vertAlign w:val="baseline"/>
-                <w:rtl w:val="0"/>
-              </w:rPr>
-              <w:t xml:space="preserve">4. Arquitectura en capas</w:t>
-              <w:tab/>
-              <w:t xml:space="preserve">47</w:t>
-            </w:r>
-          </w:hyperlink>
-          <w:r>
-            <w:rPr>
-              <w:rtl w:val="0"/>
-            </w:rPr>
-          </w:r>
-        </w:p>
-        <w:p>
-          <w:pPr>
-            <w:widowControl w:val="0"/>
-            <w:tabs>
-              <w:tab w:val="right" w:leader="none" w:pos="12000"/>
-            </w:tabs>
-            <w:spacing w:before="60" w:lineRule="auto"/>
-            <w:jc w:val="left"/>
-            <w:rPr>
-              <w:rFonts w:ascii="Arial" w:cs="Arial" w:eastAsia="Arial" w:hAnsi="Arial"/>
-              <w:b w:val="1"/>
-              <w:i w:val="0"/>
-              <w:smallCaps w:val="0"/>
-              <w:strike w:val="0"/>
-              <w:color w:val="000000"/>
-              <w:sz w:val="22"/>
-              <w:szCs w:val="22"/>
-              <w:u w:val="none"/>
-              <w:shd w:fill="auto" w:val="clear"/>
-              <w:vertAlign w:val="baseline"/>
-            </w:rPr>
-          </w:pPr>
-          <w:hyperlink w:anchor="_heading=h.1ci93xb">
-            <w:r>
-              <w:rPr>
-                <w:b w:val="1"/>
-                <w:i w:val="0"/>
-                <w:smallCaps w:val="0"/>
-                <w:strike w:val="0"/>
-                <w:color w:val="000000"/>
-                <w:sz w:val="24"/>
-                <w:szCs w:val="24"/>
-                <w:u w:val="none"/>
-                <w:shd w:fill="auto" w:val="clear"/>
-                <w:vertAlign w:val="baseline"/>
-                <w:rtl w:val="0"/>
-              </w:rPr>
-              <w:t xml:space="preserve">5. Vista de Datos</w:t>
-            </w:r>
-          </w:hyperlink>
-          <w:hyperlink w:anchor="_heading=h.1ci93xb">
-            <w:r>
-              <w:rPr>
-                <w:rFonts w:ascii="Arial" w:cs="Arial" w:eastAsia="Arial" w:hAnsi="Arial"/>
-                <w:b w:val="0"/>
-                <w:i w:val="0"/>
-                <w:smallCaps w:val="0"/>
-                <w:strike w:val="0"/>
-                <w:color w:val="000000"/>
-                <w:sz w:val="24"/>
-                <w:szCs w:val="24"/>
-                <w:u w:val="none"/>
-                <w:shd w:fill="auto" w:val="clear"/>
-                <w:vertAlign w:val="baseline"/>
-                <w:rtl w:val="0"/>
-              </w:rPr>
-              <w:tab/>
-              <w:t xml:space="preserve">47</w:t>
-            </w:r>
-          </w:hyperlink>
-          <w:r>
-            <w:rPr>
-              <w:rtl w:val="0"/>
-            </w:rPr>
-          </w:r>
-        </w:p>
-        <w:p>
-          <w:pPr>
-            <w:widowControl w:val="0"/>
-            <w:tabs>
-              <w:tab w:val="right" w:leader="none" w:pos="12000"/>
-            </w:tabs>
-            <w:spacing w:before="60" w:lineRule="auto"/>
-            <w:ind w:left="360" w:firstLine="0"/>
-            <w:jc w:val="left"/>
-            <w:rPr>
-              <w:rFonts w:ascii="Arial" w:cs="Arial" w:eastAsia="Arial" w:hAnsi="Arial"/>
-              <w:b w:val="0"/>
-              <w:i w:val="0"/>
-              <w:smallCaps w:val="0"/>
-              <w:strike w:val="0"/>
-              <w:color w:val="000000"/>
-              <w:sz w:val="22"/>
-              <w:szCs w:val="22"/>
-              <w:u w:val="none"/>
-              <w:shd w:fill="auto" w:val="clear"/>
-              <w:vertAlign w:val="baseline"/>
-            </w:rPr>
-          </w:pPr>
-          <w:hyperlink w:anchor="_heading=h.3whwml4">
-            <w:r>
-              <w:rPr>
-                <w:rFonts w:ascii="Arial" w:cs="Arial" w:eastAsia="Arial" w:hAnsi="Arial"/>
-                <w:b w:val="0"/>
-                <w:i w:val="0"/>
-                <w:smallCaps w:val="0"/>
-                <w:strike w:val="0"/>
-                <w:color w:val="000000"/>
-                <w:sz w:val="24"/>
-                <w:szCs w:val="24"/>
-                <w:u w:val="none"/>
-                <w:shd w:fill="auto" w:val="clear"/>
-                <w:vertAlign w:val="baseline"/>
-                <w:rtl w:val="0"/>
-              </w:rPr>
-              <w:t xml:space="preserve">5.1. Modelo Relacional (Corresponde al modelo que se está elaborando en BD)</w:t>
-              <w:tab/>
-              <w:t xml:space="preserve">47</w:t>
-            </w:r>
-          </w:hyperlink>
-          <w:r>
-            <w:rPr>
-              <w:rtl w:val="0"/>
-            </w:rPr>
-          </w:r>
-        </w:p>
-        <w:p>
-          <w:pPr>
-            <w:widowControl w:val="0"/>
-            <w:tabs>
-              <w:tab w:val="right" w:leader="none" w:pos="12000"/>
-            </w:tabs>
-            <w:spacing w:before="60" w:lineRule="auto"/>
-            <w:jc w:val="left"/>
-            <w:rPr>
-              <w:rFonts w:ascii="Arial" w:cs="Arial" w:eastAsia="Arial" w:hAnsi="Arial"/>
-              <w:b w:val="1"/>
-              <w:i w:val="0"/>
-              <w:smallCaps w:val="0"/>
-              <w:strike w:val="0"/>
-              <w:color w:val="000000"/>
-              <w:sz w:val="22"/>
-              <w:szCs w:val="22"/>
-              <w:u w:val="none"/>
-              <w:shd w:fill="auto" w:val="clear"/>
-              <w:vertAlign w:val="baseline"/>
-            </w:rPr>
-          </w:pPr>
-          <w:hyperlink w:anchor="_heading=h.2bn6wsx">
-            <w:r>
-              <w:rPr>
-                <w:b w:val="1"/>
-                <w:i w:val="0"/>
-                <w:smallCaps w:val="0"/>
-                <w:strike w:val="0"/>
-                <w:color w:val="000000"/>
-                <w:sz w:val="24"/>
-                <w:szCs w:val="24"/>
-                <w:u w:val="none"/>
-                <w:shd w:fill="auto" w:val="clear"/>
-                <w:vertAlign w:val="baseline"/>
-                <w:rtl w:val="0"/>
-              </w:rPr>
-              <w:t xml:space="preserve">6. Definición de Interfaces de Usuario</w:t>
-              <w:tab/>
-              <w:t xml:space="preserve">47</w:t>
-            </w:r>
-          </w:hyperlink>
-          <w:r>
-            <w:rPr>
-              <w:rtl w:val="0"/>
-            </w:rPr>
-          </w:r>
-        </w:p>
-        <w:p>
-          <w:pPr>
-            <w:widowControl w:val="0"/>
-            <w:tabs>
-              <w:tab w:val="right" w:leader="none" w:pos="12000"/>
-            </w:tabs>
-            <w:spacing w:before="60" w:lineRule="auto"/>
-            <w:jc w:val="left"/>
-            <w:rPr>
-              <w:rFonts w:ascii="Arial" w:cs="Arial" w:eastAsia="Arial" w:hAnsi="Arial"/>
-              <w:b w:val="1"/>
-              <w:i w:val="0"/>
-              <w:smallCaps w:val="0"/>
-              <w:strike w:val="0"/>
-              <w:color w:val="000000"/>
-              <w:sz w:val="22"/>
-              <w:szCs w:val="22"/>
-              <w:u w:val="none"/>
-              <w:shd w:fill="auto" w:val="clear"/>
-              <w:vertAlign w:val="baseline"/>
-            </w:rPr>
-          </w:pPr>
-          <w:hyperlink w:anchor="_heading=h.qsh70q">
-            <w:r>
-              <w:rPr>
-                <w:b w:val="1"/>
-                <w:i w:val="0"/>
-                <w:smallCaps w:val="0"/>
-                <w:strike w:val="0"/>
-                <w:color w:val="000000"/>
-                <w:sz w:val="24"/>
-                <w:szCs w:val="24"/>
-                <w:u w:val="none"/>
-                <w:shd w:fill="auto" w:val="clear"/>
-                <w:vertAlign w:val="baseline"/>
-                <w:rtl w:val="0"/>
-              </w:rPr>
-              <w:t xml:space="preserve">7. Características Generales de Calidad</w:t>
-              <w:tab/>
-              <w:t xml:space="preserve">48</w:t>
-            </w:r>
-          </w:hyperlink>
-          <w:r>
-            <w:rPr>
-              <w:rtl w:val="0"/>
-            </w:rPr>
-          </w:r>
-        </w:p>
-        <w:p>
-          <w:pPr>
-            <w:widowControl w:val="0"/>
-            <w:tabs>
-              <w:tab w:val="right" w:leader="none" w:pos="12000"/>
-            </w:tabs>
-            <w:spacing w:before="60" w:lineRule="auto"/>
-            <w:ind w:left="360" w:firstLine="0"/>
-            <w:jc w:val="left"/>
-            <w:rPr>
-              <w:rFonts w:ascii="Arial" w:cs="Arial" w:eastAsia="Arial" w:hAnsi="Arial"/>
-              <w:b w:val="0"/>
-              <w:i w:val="0"/>
-              <w:smallCaps w:val="0"/>
-              <w:strike w:val="0"/>
-              <w:color w:val="000000"/>
-              <w:sz w:val="22"/>
-              <w:szCs w:val="22"/>
-              <w:u w:val="none"/>
-              <w:shd w:fill="auto" w:val="clear"/>
-              <w:vertAlign w:val="baseline"/>
-            </w:rPr>
-          </w:pPr>
-          <w:hyperlink w:anchor="_heading=h.3as4poj">
-            <w:r>
-              <w:rPr>
-                <w:rFonts w:ascii="Arial" w:cs="Arial" w:eastAsia="Arial" w:hAnsi="Arial"/>
-                <w:b w:val="0"/>
-                <w:i w:val="0"/>
-                <w:smallCaps w:val="0"/>
-                <w:strike w:val="0"/>
-                <w:color w:val="000000"/>
-                <w:sz w:val="24"/>
-                <w:szCs w:val="24"/>
-                <w:u w:val="none"/>
-                <w:shd w:fill="auto" w:val="clear"/>
-                <w:vertAlign w:val="baseline"/>
-                <w:rtl w:val="0"/>
-              </w:rPr>
-              <w:t xml:space="preserve">7.1. Tamaño y performance</w:t>
-              <w:tab/>
-              <w:t xml:space="preserve">48</w:t>
-            </w:r>
-          </w:hyperlink>
-          <w:r>
-            <w:rPr>
-              <w:rtl w:val="0"/>
-            </w:rPr>
-          </w:r>
-        </w:p>
-        <w:p>
-          <w:pPr>
-            <w:widowControl w:val="0"/>
-            <w:tabs>
-              <w:tab w:val="right" w:leader="none" w:pos="12000"/>
-            </w:tabs>
-            <w:spacing w:before="60" w:lineRule="auto"/>
-            <w:ind w:left="360" w:firstLine="0"/>
-            <w:jc w:val="left"/>
-            <w:rPr>
-              <w:rFonts w:ascii="Arial" w:cs="Arial" w:eastAsia="Arial" w:hAnsi="Arial"/>
-              <w:b w:val="0"/>
-              <w:i w:val="0"/>
-              <w:smallCaps w:val="0"/>
-              <w:strike w:val="0"/>
-              <w:color w:val="000000"/>
-              <w:sz w:val="22"/>
-              <w:szCs w:val="22"/>
-              <w:u w:val="none"/>
-              <w:shd w:fill="auto" w:val="clear"/>
-              <w:vertAlign w:val="baseline"/>
-            </w:rPr>
-          </w:pPr>
-          <w:hyperlink w:anchor="_heading=h.2p2csry">
-            <w:r>
-              <w:rPr>
-                <w:rFonts w:ascii="Arial" w:cs="Arial" w:eastAsia="Arial" w:hAnsi="Arial"/>
-                <w:b w:val="0"/>
-                <w:i w:val="0"/>
-                <w:smallCaps w:val="0"/>
-                <w:strike w:val="0"/>
-                <w:color w:val="000000"/>
-                <w:sz w:val="24"/>
-                <w:szCs w:val="24"/>
-                <w:u w:val="none"/>
-                <w:shd w:fill="auto" w:val="clear"/>
-                <w:vertAlign w:val="baseline"/>
-                <w:rtl w:val="0"/>
-              </w:rPr>
-              <w:t xml:space="preserve">7.2. Calidad</w:t>
-              <w:tab/>
-              <w:t xml:space="preserve">48</w:t>
-            </w:r>
-          </w:hyperlink>
-          <w:r>
-            <w:rPr>
-              <w:rtl w:val="0"/>
-            </w:rPr>
-          </w:r>
-        </w:p>
-        <w:p>
-          <w:pPr>
-            <w:widowControl w:val="0"/>
-            <w:tabs>
-              <w:tab w:val="right" w:leader="none" w:pos="12000"/>
-            </w:tabs>
-            <w:spacing w:before="60" w:lineRule="auto"/>
-            <w:ind w:left="360" w:firstLine="0"/>
-            <w:jc w:val="left"/>
-            <w:rPr>
-              <w:rFonts w:ascii="Arial" w:cs="Arial" w:eastAsia="Arial" w:hAnsi="Arial"/>
-              <w:b w:val="0"/>
-              <w:i w:val="0"/>
-              <w:smallCaps w:val="0"/>
-              <w:strike w:val="0"/>
-              <w:color w:val="000000"/>
-              <w:sz w:val="22"/>
-              <w:szCs w:val="22"/>
-              <w:u w:val="none"/>
-              <w:shd w:fill="auto" w:val="clear"/>
-              <w:vertAlign w:val="baseline"/>
-            </w:rPr>
-          </w:pPr>
-          <w:hyperlink w:anchor="_heading=h.147n2zr">
-            <w:r>
-              <w:rPr>
-                <w:rFonts w:ascii="Arial" w:cs="Arial" w:eastAsia="Arial" w:hAnsi="Arial"/>
-                <w:b w:val="0"/>
-                <w:i w:val="0"/>
-                <w:smallCaps w:val="0"/>
-                <w:strike w:val="0"/>
-                <w:color w:val="000000"/>
-                <w:sz w:val="24"/>
-                <w:szCs w:val="24"/>
-                <w:u w:val="none"/>
-                <w:shd w:fill="auto" w:val="clear"/>
-                <w:vertAlign w:val="baseline"/>
-                <w:rtl w:val="0"/>
-              </w:rPr>
-              <w:t xml:space="preserve">7.3. Usabilidad</w:t>
-              <w:tab/>
-              <w:t xml:space="preserve">48</w:t>
-            </w:r>
-          </w:hyperlink>
-          <w:r>
-            <w:rPr>
-              <w:rtl w:val="0"/>
-            </w:rPr>
-          </w:r>
-        </w:p>
-        <w:p>
-          <w:pPr>
-            <w:widowControl w:val="0"/>
-            <w:tabs>
-              <w:tab w:val="right" w:leader="none" w:pos="12000"/>
-            </w:tabs>
-            <w:spacing w:before="60" w:lineRule="auto"/>
-            <w:ind w:left="360" w:firstLine="0"/>
-            <w:jc w:val="left"/>
-            <w:rPr>
-              <w:rFonts w:ascii="Arial" w:cs="Arial" w:eastAsia="Arial" w:hAnsi="Arial"/>
-              <w:b w:val="0"/>
-              <w:i w:val="0"/>
-              <w:smallCaps w:val="0"/>
-              <w:strike w:val="0"/>
-              <w:color w:val="000000"/>
-              <w:sz w:val="22"/>
-              <w:szCs w:val="22"/>
-              <w:u w:val="none"/>
-              <w:shd w:fill="auto" w:val="clear"/>
-              <w:vertAlign w:val="baseline"/>
-            </w:rPr>
-          </w:pPr>
-          <w:hyperlink w:anchor="_heading=h.3o7alnk">
-            <w:r>
-              <w:rPr>
-                <w:rFonts w:ascii="Arial" w:cs="Arial" w:eastAsia="Arial" w:hAnsi="Arial"/>
-                <w:b w:val="0"/>
-                <w:i w:val="0"/>
-                <w:smallCaps w:val="0"/>
-                <w:strike w:val="0"/>
-                <w:color w:val="000000"/>
-                <w:sz w:val="24"/>
-                <w:szCs w:val="24"/>
-                <w:u w:val="none"/>
-                <w:shd w:fill="auto" w:val="clear"/>
-                <w:vertAlign w:val="baseline"/>
-                <w:rtl w:val="0"/>
-              </w:rPr>
-              <w:t xml:space="preserve">7.4. Eficiencia</w:t>
-              <w:tab/>
-              <w:t xml:space="preserve">48</w:t>
-            </w:r>
-          </w:hyperlink>
-          <w:r>
-            <w:rPr>
-              <w:rtl w:val="0"/>
-            </w:rPr>
-          </w:r>
-        </w:p>
-        <w:p>
-          <w:pPr>
-            <w:widowControl w:val="0"/>
-            <w:tabs>
-              <w:tab w:val="right" w:leader="none" w:pos="12000"/>
-            </w:tabs>
-            <w:spacing w:before="60" w:lineRule="auto"/>
-            <w:ind w:left="360" w:firstLine="0"/>
-            <w:jc w:val="left"/>
-            <w:rPr>
-              <w:rFonts w:ascii="Arial" w:cs="Arial" w:eastAsia="Arial" w:hAnsi="Arial"/>
-              <w:b w:val="0"/>
-              <w:i w:val="0"/>
-              <w:smallCaps w:val="0"/>
-              <w:strike w:val="0"/>
-              <w:color w:val="000000"/>
-              <w:sz w:val="22"/>
-              <w:szCs w:val="22"/>
-              <w:u w:val="none"/>
-              <w:shd w:fill="auto" w:val="clear"/>
-              <w:vertAlign w:val="baseline"/>
-            </w:rPr>
-          </w:pPr>
-          <w:hyperlink w:anchor="_heading=h.23ckvvd">
-            <w:r>
-              <w:rPr>
-                <w:rFonts w:ascii="Arial" w:cs="Arial" w:eastAsia="Arial" w:hAnsi="Arial"/>
-                <w:b w:val="0"/>
-                <w:i w:val="0"/>
-                <w:smallCaps w:val="0"/>
-                <w:strike w:val="0"/>
-                <w:color w:val="000000"/>
-                <w:sz w:val="24"/>
-                <w:szCs w:val="24"/>
-                <w:u w:val="none"/>
-                <w:shd w:fill="auto" w:val="clear"/>
-                <w:vertAlign w:val="baseline"/>
-                <w:rtl w:val="0"/>
-              </w:rPr>
-              <w:t xml:space="preserve">7.5. Seguridad</w:t>
-              <w:tab/>
-              <w:t xml:space="preserve">48</w:t>
-            </w:r>
-          </w:hyperlink>
-          <w:r>
-            <w:rPr>
-              <w:rtl w:val="0"/>
-            </w:rPr>
-          </w:r>
-        </w:p>
-        <w:p>
-          <w:pPr>
-            <w:widowControl w:val="0"/>
-            <w:tabs>
-              <w:tab w:val="right" w:leader="none" w:pos="12000"/>
-            </w:tabs>
-            <w:spacing w:before="60" w:lineRule="auto"/>
-            <w:ind w:left="360" w:firstLine="0"/>
-            <w:jc w:val="left"/>
-            <w:rPr>
-              <w:rFonts w:ascii="Arial" w:cs="Arial" w:eastAsia="Arial" w:hAnsi="Arial"/>
-              <w:b w:val="0"/>
-              <w:i w:val="0"/>
-              <w:smallCaps w:val="0"/>
-              <w:strike w:val="0"/>
-              <w:color w:val="000000"/>
-              <w:sz w:val="22"/>
-              <w:szCs w:val="22"/>
-              <w:u w:val="none"/>
-              <w:shd w:fill="auto" w:val="clear"/>
-              <w:vertAlign w:val="baseline"/>
-            </w:rPr>
-          </w:pPr>
-          <w:hyperlink w:anchor="_heading=h.ihv636">
-            <w:r>
-              <w:rPr>
-                <w:rFonts w:ascii="Arial" w:cs="Arial" w:eastAsia="Arial" w:hAnsi="Arial"/>
-                <w:b w:val="0"/>
-                <w:i w:val="0"/>
-                <w:smallCaps w:val="0"/>
-                <w:strike w:val="0"/>
-                <w:color w:val="000000"/>
-                <w:sz w:val="24"/>
-                <w:szCs w:val="24"/>
-                <w:u w:val="none"/>
-                <w:shd w:fill="auto" w:val="clear"/>
-                <w:vertAlign w:val="baseline"/>
-                <w:rtl w:val="0"/>
-              </w:rPr>
-              <w:t xml:space="preserve">7.6. Confiabilidad</w:t>
-              <w:tab/>
-              <w:t xml:space="preserve">48</w:t>
-            </w:r>
-          </w:hyperlink>
-          <w:r>
-            <w:rPr>
-              <w:rtl w:val="0"/>
-            </w:rPr>
-          </w:r>
-        </w:p>
-        <w:p>
-          <w:pPr>
-            <w:widowControl w:val="0"/>
-            <w:tabs>
-              <w:tab w:val="right" w:leader="none" w:pos="12000"/>
-            </w:tabs>
-            <w:spacing w:before="60" w:lineRule="auto"/>
-            <w:ind w:left="360" w:firstLine="0"/>
-            <w:jc w:val="left"/>
-            <w:rPr>
-              <w:rFonts w:ascii="Arial" w:cs="Arial" w:eastAsia="Arial" w:hAnsi="Arial"/>
-              <w:b w:val="0"/>
-              <w:i w:val="0"/>
-              <w:smallCaps w:val="0"/>
-              <w:strike w:val="0"/>
-              <w:color w:val="000000"/>
-              <w:sz w:val="22"/>
-              <w:szCs w:val="22"/>
-              <w:u w:val="none"/>
-              <w:shd w:fill="auto" w:val="clear"/>
-              <w:vertAlign w:val="baseline"/>
-            </w:rPr>
-          </w:pPr>
-          <w:hyperlink w:anchor="_heading=h.32hioqz">
-            <w:r>
-              <w:rPr>
-                <w:rFonts w:ascii="Arial" w:cs="Arial" w:eastAsia="Arial" w:hAnsi="Arial"/>
-                <w:b w:val="0"/>
-                <w:i w:val="0"/>
-                <w:smallCaps w:val="0"/>
-                <w:strike w:val="0"/>
-                <w:color w:val="000000"/>
-                <w:sz w:val="24"/>
-                <w:szCs w:val="24"/>
-                <w:u w:val="none"/>
-                <w:shd w:fill="auto" w:val="clear"/>
-                <w:vertAlign w:val="baseline"/>
-                <w:rtl w:val="0"/>
-              </w:rPr>
-              <w:t xml:space="preserve">7.7. Mantenimiento</w:t>
-              <w:tab/>
-              <w:t xml:space="preserve">48</w:t>
-            </w:r>
-          </w:hyperlink>
-          <w:r>
-            <w:rPr>
-              <w:rtl w:val="0"/>
-            </w:rPr>
-          </w:r>
-        </w:p>
-        <w:p>
-          <w:pPr>
-            <w:widowControl w:val="0"/>
-            <w:tabs>
-              <w:tab w:val="right" w:leader="none" w:pos="12000"/>
-            </w:tabs>
-            <w:spacing w:before="60" w:lineRule="auto"/>
-            <w:ind w:left="360" w:firstLine="0"/>
-            <w:jc w:val="left"/>
-            <w:rPr>
-              <w:rFonts w:ascii="Arial" w:cs="Arial" w:eastAsia="Arial" w:hAnsi="Arial"/>
-              <w:b w:val="0"/>
-              <w:i w:val="0"/>
-              <w:smallCaps w:val="0"/>
-              <w:strike w:val="0"/>
-              <w:color w:val="000000"/>
-              <w:sz w:val="22"/>
-              <w:szCs w:val="22"/>
-              <w:u w:val="none"/>
-              <w:shd w:fill="auto" w:val="clear"/>
-              <w:vertAlign w:val="baseline"/>
-            </w:rPr>
-          </w:pPr>
-          <w:hyperlink w:anchor="_heading=h.1hmsyys">
-            <w:r>
-              <w:rPr>
-                <w:rFonts w:ascii="Arial" w:cs="Arial" w:eastAsia="Arial" w:hAnsi="Arial"/>
-                <w:b w:val="0"/>
-                <w:i w:val="0"/>
-                <w:smallCaps w:val="0"/>
-                <w:strike w:val="0"/>
-                <w:color w:val="000000"/>
-                <w:sz w:val="24"/>
-                <w:szCs w:val="24"/>
-                <w:u w:val="none"/>
-                <w:shd w:fill="auto" w:val="clear"/>
-                <w:vertAlign w:val="baseline"/>
-                <w:rtl w:val="0"/>
-              </w:rPr>
-              <w:t xml:space="preserve">7.8. Estándares (Normas de calidad): Mencionar dos o tres normas, y argumentar </w:t>
-            </w:r>
-          </w:hyperlink>
-          <w:hyperlink w:anchor="_heading=h.1hmsyys">
-            <w:r>
-              <w:rPr>
-                <w:rtl w:val="0"/>
-              </w:rPr>
-              <w:t xml:space="preserve">cómo</w:t>
-            </w:r>
-          </w:hyperlink>
-          <w:hyperlink w:anchor="_heading=h.1hmsyys">
-            <w:r>
-              <w:rPr>
-                <w:rFonts w:ascii="Arial" w:cs="Arial" w:eastAsia="Arial" w:hAnsi="Arial"/>
-                <w:b w:val="0"/>
-                <w:i w:val="0"/>
-                <w:smallCaps w:val="0"/>
-                <w:strike w:val="0"/>
-                <w:color w:val="000000"/>
-                <w:sz w:val="24"/>
-                <w:szCs w:val="24"/>
-                <w:u w:val="none"/>
-                <w:shd w:fill="auto" w:val="clear"/>
-                <w:vertAlign w:val="baseline"/>
-                <w:rtl w:val="0"/>
-              </w:rPr>
-              <w:t xml:space="preserve"> esas normas aplican para el sistema de información</w:t>
-              <w:tab/>
-              <w:t xml:space="preserve">48</w:t>
-            </w:r>
-          </w:hyperlink>
-          <w:r>
-            <w:rPr>
-              <w:rtl w:val="0"/>
-            </w:rPr>
-          </w:r>
-          <w:r>
-            <w:fldChar w:fldCharType="end"/>
-          </w:r>
-        </w:p>
-      </w:sdtContent>
-    </w:sdt>
+        <w:t xml:space="preserve">1.5 Definiciones, acrónimos y abreviaciones</w:t>
+      </w:r>
+    </w:p>
+    <w:p>
+      <w:pPr>
+        <w:widowControl w:val="1"/>
+        <w:spacing w:after="40" w:before="0" w:line="240" w:lineRule="auto"/>
+        <w:ind w:left="0" w:right="0" w:firstLine="0"/>
+        <w:jc w:val="left"/>
+        <w:rPr>
+          <w:rFonts w:ascii="Arial" w:cs="Arial" w:hAnsi="Arial" w:eastAsia="Arial"/>
+          <w:b w:val="1"/>
+          <w:color w:val="000000"/>
+          <w:sz w:val="22"/>
+          <w:szCs w:val="22"/>
+        </w:rPr>
+      </w:pPr>
+      <w:r>
+        <w:rPr>
+          <w:rFonts w:ascii="Arial" w:cs="Arial" w:hAnsi="Arial" w:eastAsia="Arial"/>
+          <w:b w:val="1"/>
+          <w:color w:val="000000"/>
+          <w:sz w:val="22"/>
+          <w:szCs w:val="22"/>
+        </w:rPr>
+        <w:t xml:space="preserve">2. Generalidades del Proyecto</w:t>
+      </w:r>
+    </w:p>
+    <w:p>
+      <w:pPr>
+        <w:widowControl w:val="1"/>
+        <w:spacing w:after="40" w:before="0" w:line="240" w:lineRule="auto"/>
+        <w:ind w:left="397" w:right="0" w:firstLine="0"/>
+        <w:jc w:val="left"/>
+        <w:rPr>
+          <w:rFonts w:ascii="Arial" w:cs="Arial" w:hAnsi="Arial" w:eastAsia="Arial"/>
+          <w:b w:val="0"/>
+          <w:color w:val="000000"/>
+          <w:sz w:val="22"/>
+          <w:szCs w:val="22"/>
+        </w:rPr>
+      </w:pPr>
+      <w:r>
+        <w:rPr>
+          <w:rFonts w:ascii="Arial" w:cs="Arial" w:hAnsi="Arial" w:eastAsia="Arial"/>
+          <w:b w:val="0"/>
+          <w:color w:val="000000"/>
+          <w:sz w:val="22"/>
+          <w:szCs w:val="22"/>
+        </w:rPr>
+        <w:t xml:space="preserve">2.1 Justificación</w:t>
+      </w:r>
+    </w:p>
+    <w:p>
+      <w:pPr>
+        <w:widowControl w:val="1"/>
+        <w:spacing w:after="40" w:before="0" w:line="240" w:lineRule="auto"/>
+        <w:ind w:left="397" w:right="0" w:firstLine="0"/>
+        <w:jc w:val="left"/>
+        <w:rPr>
+          <w:rFonts w:ascii="Arial" w:cs="Arial" w:hAnsi="Arial" w:eastAsia="Arial"/>
+          <w:b w:val="0"/>
+          <w:color w:val="000000"/>
+          <w:sz w:val="22"/>
+          <w:szCs w:val="22"/>
+        </w:rPr>
+      </w:pPr>
+      <w:r>
+        <w:rPr>
+          <w:rFonts w:ascii="Arial" w:cs="Arial" w:hAnsi="Arial" w:eastAsia="Arial"/>
+          <w:b w:val="0"/>
+          <w:color w:val="000000"/>
+          <w:sz w:val="22"/>
+          <w:szCs w:val="22"/>
+        </w:rPr>
+        <w:t xml:space="preserve">2.2 Problema a resolver</w:t>
+      </w:r>
+    </w:p>
+    <w:p>
+      <w:pPr>
+        <w:widowControl w:val="1"/>
+        <w:spacing w:after="40" w:before="0" w:line="240" w:lineRule="auto"/>
+        <w:ind w:left="397" w:right="0" w:firstLine="0"/>
+        <w:jc w:val="left"/>
+        <w:rPr>
+          <w:rFonts w:ascii="Arial" w:cs="Arial" w:hAnsi="Arial" w:eastAsia="Arial"/>
+          <w:b w:val="0"/>
+          <w:color w:val="000000"/>
+          <w:sz w:val="22"/>
+          <w:szCs w:val="22"/>
+        </w:rPr>
+      </w:pPr>
+      <w:r>
+        <w:rPr>
+          <w:rFonts w:ascii="Arial" w:cs="Arial" w:hAnsi="Arial" w:eastAsia="Arial"/>
+          <w:b w:val="0"/>
+          <w:color w:val="000000"/>
+          <w:sz w:val="22"/>
+          <w:szCs w:val="22"/>
+        </w:rPr>
+        <w:t xml:space="preserve">2.3 Objetivos</w:t>
+      </w:r>
+    </w:p>
+    <w:p>
+      <w:pPr>
+        <w:widowControl w:val="1"/>
+        <w:spacing w:after="40" w:before="0" w:line="240" w:lineRule="auto"/>
+        <w:ind w:left="397" w:right="0" w:firstLine="0"/>
+        <w:jc w:val="left"/>
+        <w:rPr>
+          <w:rFonts w:ascii="Arial" w:cs="Arial" w:hAnsi="Arial" w:eastAsia="Arial"/>
+          <w:b w:val="0"/>
+          <w:color w:val="000000"/>
+          <w:sz w:val="22"/>
+          <w:szCs w:val="22"/>
+        </w:rPr>
+      </w:pPr>
+      <w:r>
+        <w:rPr>
+          <w:rFonts w:ascii="Arial" w:cs="Arial" w:hAnsi="Arial" w:eastAsia="Arial"/>
+          <w:b w:val="0"/>
+          <w:color w:val="000000"/>
+          <w:sz w:val="22"/>
+          <w:szCs w:val="22"/>
+        </w:rPr>
+        <w:t xml:space="preserve">2.4 Descripción general del sistema</w:t>
+      </w:r>
+    </w:p>
+    <w:p>
+      <w:pPr>
+        <w:widowControl w:val="1"/>
+        <w:spacing w:after="40" w:before="0" w:line="240" w:lineRule="auto"/>
+        <w:ind w:left="397" w:right="0" w:firstLine="0"/>
+        <w:jc w:val="left"/>
+        <w:rPr>
+          <w:rFonts w:ascii="Arial" w:cs="Arial" w:hAnsi="Arial" w:eastAsia="Arial"/>
+          <w:b w:val="0"/>
+          <w:color w:val="000000"/>
+          <w:sz w:val="22"/>
+          <w:szCs w:val="22"/>
+        </w:rPr>
+      </w:pPr>
+      <w:r>
+        <w:rPr>
+          <w:rFonts w:ascii="Arial" w:cs="Arial" w:hAnsi="Arial" w:eastAsia="Arial"/>
+          <w:b w:val="0"/>
+          <w:color w:val="000000"/>
+          <w:sz w:val="22"/>
+          <w:szCs w:val="22"/>
+        </w:rPr>
+        <w:t xml:space="preserve">2.5 Identificación de los Stakeholders y sus responsabilidades</w:t>
+      </w:r>
+    </w:p>
+    <w:p>
+      <w:pPr>
+        <w:widowControl w:val="1"/>
+        <w:spacing w:after="40" w:before="0" w:line="240" w:lineRule="auto"/>
+        <w:ind w:left="0" w:right="0" w:firstLine="0"/>
+        <w:jc w:val="left"/>
+        <w:rPr>
+          <w:rFonts w:ascii="Arial" w:cs="Arial" w:hAnsi="Arial" w:eastAsia="Arial"/>
+          <w:b w:val="1"/>
+          <w:color w:val="000000"/>
+          <w:sz w:val="22"/>
+          <w:szCs w:val="22"/>
+        </w:rPr>
+      </w:pPr>
+      <w:r>
+        <w:rPr>
+          <w:rFonts w:ascii="Arial" w:cs="Arial" w:hAnsi="Arial" w:eastAsia="Arial"/>
+          <w:b w:val="1"/>
+          <w:color w:val="000000"/>
+          <w:sz w:val="22"/>
+          <w:szCs w:val="22"/>
+        </w:rPr>
+        <w:t xml:space="preserve">3. Vistas de la Arquitectura</w:t>
+      </w:r>
+    </w:p>
+    <w:p>
+      <w:pPr>
+        <w:widowControl w:val="1"/>
+        <w:spacing w:after="40" w:before="0" w:line="240" w:lineRule="auto"/>
+        <w:ind w:left="397" w:right="0" w:firstLine="0"/>
+        <w:jc w:val="left"/>
+        <w:rPr>
+          <w:rFonts w:ascii="Arial" w:cs="Arial" w:hAnsi="Arial" w:eastAsia="Arial"/>
+          <w:b w:val="0"/>
+          <w:color w:val="000000"/>
+          <w:sz w:val="22"/>
+          <w:szCs w:val="22"/>
+        </w:rPr>
+      </w:pPr>
+      <w:r>
+        <w:rPr>
+          <w:rFonts w:ascii="Arial" w:cs="Arial" w:hAnsi="Arial" w:eastAsia="Arial"/>
+          <w:b w:val="0"/>
+          <w:color w:val="000000"/>
+          <w:sz w:val="22"/>
+          <w:szCs w:val="22"/>
+        </w:rPr>
+        <w:t xml:space="preserve">3.1 Vista de casos de uso</w:t>
+      </w:r>
+    </w:p>
+    <w:p>
+      <w:pPr>
+        <w:widowControl w:val="1"/>
+        <w:spacing w:after="40" w:before="0" w:line="240" w:lineRule="auto"/>
+        <w:ind w:left="397" w:right="0" w:firstLine="0"/>
+        <w:jc w:val="left"/>
+        <w:rPr>
+          <w:rFonts w:ascii="Arial" w:cs="Arial" w:hAnsi="Arial" w:eastAsia="Arial"/>
+          <w:b w:val="0"/>
+          <w:color w:val="000000"/>
+          <w:sz w:val="22"/>
+          <w:szCs w:val="22"/>
+        </w:rPr>
+      </w:pPr>
+      <w:r>
+        <w:rPr>
+          <w:rFonts w:ascii="Arial" w:cs="Arial" w:hAnsi="Arial" w:eastAsia="Arial"/>
+          <w:b w:val="0"/>
+          <w:color w:val="000000"/>
+          <w:sz w:val="22"/>
+          <w:szCs w:val="22"/>
+        </w:rPr>
+        <w:t xml:space="preserve">3.2 Vista de procesos</w:t>
+      </w:r>
+    </w:p>
+    <w:p>
+      <w:pPr>
+        <w:widowControl w:val="1"/>
+        <w:spacing w:after="40" w:before="0" w:line="240" w:lineRule="auto"/>
+        <w:ind w:left="397" w:right="0" w:firstLine="0"/>
+        <w:jc w:val="left"/>
+        <w:rPr>
+          <w:rFonts w:ascii="Arial" w:cs="Arial" w:hAnsi="Arial" w:eastAsia="Arial"/>
+          <w:b w:val="0"/>
+          <w:color w:val="000000"/>
+          <w:sz w:val="22"/>
+          <w:szCs w:val="22"/>
+        </w:rPr>
+      </w:pPr>
+      <w:r>
+        <w:rPr>
+          <w:rFonts w:ascii="Arial" w:cs="Arial" w:hAnsi="Arial" w:eastAsia="Arial"/>
+          <w:b w:val="0"/>
+          <w:color w:val="000000"/>
+          <w:sz w:val="22"/>
+          <w:szCs w:val="22"/>
+        </w:rPr>
+        <w:t xml:space="preserve">3.3 Vista lógica</w:t>
+      </w:r>
+    </w:p>
+    <w:p>
+      <w:pPr>
+        <w:widowControl w:val="1"/>
+        <w:spacing w:after="40" w:before="0" w:line="240" w:lineRule="auto"/>
+        <w:ind w:left="397" w:right="0" w:firstLine="0"/>
+        <w:jc w:val="left"/>
+        <w:rPr>
+          <w:rFonts w:ascii="Arial" w:cs="Arial" w:hAnsi="Arial" w:eastAsia="Arial"/>
+          <w:b w:val="0"/>
+          <w:color w:val="000000"/>
+          <w:sz w:val="22"/>
+          <w:szCs w:val="22"/>
+        </w:rPr>
+      </w:pPr>
+      <w:r>
+        <w:rPr>
+          <w:rFonts w:ascii="Arial" w:cs="Arial" w:hAnsi="Arial" w:eastAsia="Arial"/>
+          <w:b w:val="0"/>
+          <w:color w:val="000000"/>
+          <w:sz w:val="22"/>
+          <w:szCs w:val="22"/>
+        </w:rPr>
+        <w:t xml:space="preserve">3.4 Vista de implementación</w:t>
+      </w:r>
+    </w:p>
+    <w:p>
+      <w:pPr>
+        <w:widowControl w:val="1"/>
+        <w:spacing w:after="40" w:before="0" w:line="240" w:lineRule="auto"/>
+        <w:ind w:left="397" w:right="0" w:firstLine="0"/>
+        <w:jc w:val="left"/>
+        <w:rPr>
+          <w:rFonts w:ascii="Arial" w:cs="Arial" w:hAnsi="Arial" w:eastAsia="Arial"/>
+          <w:b w:val="0"/>
+          <w:color w:val="000000"/>
+          <w:sz w:val="22"/>
+          <w:szCs w:val="22"/>
+        </w:rPr>
+      </w:pPr>
+      <w:r>
+        <w:rPr>
+          <w:rFonts w:ascii="Arial" w:cs="Arial" w:hAnsi="Arial" w:eastAsia="Arial"/>
+          <w:b w:val="0"/>
+          <w:color w:val="000000"/>
+          <w:sz w:val="22"/>
+          <w:szCs w:val="22"/>
+        </w:rPr>
+        <w:t xml:space="preserve">3.5 Vista de despliegue</w:t>
+      </w:r>
+    </w:p>
+    <w:p>
+      <w:pPr>
+        <w:widowControl w:val="1"/>
+        <w:spacing w:after="40" w:before="0" w:line="240" w:lineRule="auto"/>
+        <w:ind w:left="397" w:right="0" w:firstLine="0"/>
+        <w:jc w:val="left"/>
+        <w:rPr>
+          <w:rFonts w:ascii="Arial" w:cs="Arial" w:hAnsi="Arial" w:eastAsia="Arial"/>
+          <w:b w:val="0"/>
+          <w:color w:val="000000"/>
+          <w:sz w:val="22"/>
+          <w:szCs w:val="22"/>
+        </w:rPr>
+      </w:pPr>
+      <w:r>
+        <w:rPr>
+          <w:rFonts w:ascii="Arial" w:cs="Arial" w:hAnsi="Arial" w:eastAsia="Arial"/>
+          <w:b w:val="0"/>
+          <w:color w:val="000000"/>
+          <w:sz w:val="22"/>
+          <w:szCs w:val="22"/>
+        </w:rPr>
+        <w:t xml:space="preserve">3.6 Arquitectura en capas</w:t>
+      </w:r>
+    </w:p>
+    <w:p>
+      <w:pPr>
+        <w:widowControl w:val="1"/>
+        <w:spacing w:after="40" w:before="0" w:line="240" w:lineRule="auto"/>
+        <w:ind w:left="397" w:right="0" w:firstLine="0"/>
+        <w:jc w:val="left"/>
+        <w:rPr>
+          <w:rFonts w:ascii="Arial" w:cs="Arial" w:hAnsi="Arial" w:eastAsia="Arial"/>
+          <w:b w:val="0"/>
+          <w:color w:val="000000"/>
+          <w:sz w:val="22"/>
+          <w:szCs w:val="22"/>
+        </w:rPr>
+      </w:pPr>
+      <w:r>
+        <w:rPr>
+          <w:rFonts w:ascii="Arial" w:cs="Arial" w:hAnsi="Arial" w:eastAsia="Arial"/>
+          <w:b w:val="0"/>
+          <w:color w:val="000000"/>
+          <w:sz w:val="22"/>
+          <w:szCs w:val="22"/>
+        </w:rPr>
+        <w:t xml:space="preserve">3.7 Vista de datos</w:t>
+      </w:r>
+    </w:p>
+    <w:p>
+      <w:pPr>
+        <w:widowControl w:val="1"/>
+        <w:spacing w:after="40" w:before="0" w:line="240" w:lineRule="auto"/>
+        <w:ind w:left="0" w:right="0" w:firstLine="0"/>
+        <w:jc w:val="left"/>
+        <w:rPr>
+          <w:rFonts w:ascii="Arial" w:cs="Arial" w:hAnsi="Arial" w:eastAsia="Arial"/>
+          <w:b w:val="1"/>
+          <w:color w:val="000000"/>
+          <w:sz w:val="22"/>
+          <w:szCs w:val="22"/>
+        </w:rPr>
+      </w:pPr>
+      <w:r>
+        <w:rPr>
+          <w:rFonts w:ascii="Arial" w:cs="Arial" w:hAnsi="Arial" w:eastAsia="Arial"/>
+          <w:b w:val="1"/>
+          <w:color w:val="000000"/>
+          <w:sz w:val="22"/>
+          <w:szCs w:val="22"/>
+        </w:rPr>
+        <w:t xml:space="preserve">4. Definición de Interfaces de Usuario</w:t>
+      </w:r>
+    </w:p>
+    <w:p>
+      <w:pPr>
+        <w:widowControl w:val="1"/>
+        <w:spacing w:after="40" w:before="0" w:line="240" w:lineRule="auto"/>
+        <w:ind w:left="0" w:right="0" w:firstLine="0"/>
+        <w:jc w:val="left"/>
+        <w:rPr>
+          <w:rFonts w:ascii="Arial" w:cs="Arial" w:hAnsi="Arial" w:eastAsia="Arial"/>
+          <w:b w:val="1"/>
+          <w:color w:val="000000"/>
+          <w:sz w:val="22"/>
+          <w:szCs w:val="22"/>
+        </w:rPr>
+      </w:pPr>
+      <w:r>
+        <w:rPr>
+          <w:rFonts w:ascii="Arial" w:cs="Arial" w:hAnsi="Arial" w:eastAsia="Arial"/>
+          <w:b w:val="1"/>
+          <w:color w:val="000000"/>
+          <w:sz w:val="22"/>
+          <w:szCs w:val="22"/>
+        </w:rPr>
+        <w:t xml:space="preserve">5. Características Generales de Calidad</w:t>
+      </w:r>
+    </w:p>
+    <w:p>
+      <w:pPr>
+        <w:widowControl w:val="1"/>
+        <w:spacing w:after="40" w:before="0" w:line="240" w:lineRule="auto"/>
+        <w:ind w:left="397" w:right="0" w:firstLine="0"/>
+        <w:jc w:val="left"/>
+        <w:rPr>
+          <w:rFonts w:ascii="Arial" w:cs="Arial" w:hAnsi="Arial" w:eastAsia="Arial"/>
+          <w:b w:val="0"/>
+          <w:color w:val="000000"/>
+          <w:sz w:val="22"/>
+          <w:szCs w:val="22"/>
+        </w:rPr>
+      </w:pPr>
+      <w:r>
+        <w:rPr>
+          <w:rFonts w:ascii="Arial" w:cs="Arial" w:hAnsi="Arial" w:eastAsia="Arial"/>
+          <w:b w:val="0"/>
+          <w:color w:val="000000"/>
+          <w:sz w:val="22"/>
+          <w:szCs w:val="22"/>
+        </w:rPr>
+        <w:t xml:space="preserve">5.1 Tamaño y performance</w:t>
+      </w:r>
+    </w:p>
+    <w:p>
+      <w:pPr>
+        <w:widowControl w:val="1"/>
+        <w:spacing w:after="40" w:before="0" w:line="240" w:lineRule="auto"/>
+        <w:ind w:left="397" w:right="0" w:firstLine="0"/>
+        <w:jc w:val="left"/>
+        <w:rPr>
+          <w:rFonts w:ascii="Arial" w:cs="Arial" w:hAnsi="Arial" w:eastAsia="Arial"/>
+          <w:b w:val="0"/>
+          <w:color w:val="000000"/>
+          <w:sz w:val="22"/>
+          <w:szCs w:val="22"/>
+        </w:rPr>
+      </w:pPr>
+      <w:r>
+        <w:rPr>
+          <w:rFonts w:ascii="Arial" w:cs="Arial" w:hAnsi="Arial" w:eastAsia="Arial"/>
+          <w:b w:val="0"/>
+          <w:color w:val="000000"/>
+          <w:sz w:val="22"/>
+          <w:szCs w:val="22"/>
+        </w:rPr>
+        <w:t xml:space="preserve">5.2 Calidad</w:t>
+      </w:r>
+    </w:p>
+    <w:p>
+      <w:pPr>
+        <w:widowControl w:val="1"/>
+        <w:spacing w:after="40" w:before="0" w:line="240" w:lineRule="auto"/>
+        <w:ind w:left="397" w:right="0" w:firstLine="0"/>
+        <w:jc w:val="left"/>
+        <w:rPr>
+          <w:rFonts w:ascii="Arial" w:cs="Arial" w:hAnsi="Arial" w:eastAsia="Arial"/>
+          <w:b w:val="0"/>
+          <w:color w:val="000000"/>
+          <w:sz w:val="22"/>
+          <w:szCs w:val="22"/>
+        </w:rPr>
+      </w:pPr>
+      <w:r>
+        <w:rPr>
+          <w:rFonts w:ascii="Arial" w:cs="Arial" w:hAnsi="Arial" w:eastAsia="Arial"/>
+          <w:b w:val="0"/>
+          <w:color w:val="000000"/>
+          <w:sz w:val="22"/>
+          <w:szCs w:val="22"/>
+        </w:rPr>
+        <w:t xml:space="preserve">5.3 Usabilidad</w:t>
+      </w:r>
+    </w:p>
+    <w:p>
+      <w:pPr>
+        <w:widowControl w:val="1"/>
+        <w:spacing w:after="40" w:before="0" w:line="240" w:lineRule="auto"/>
+        <w:ind w:left="397" w:right="0" w:firstLine="0"/>
+        <w:jc w:val="left"/>
+        <w:rPr>
+          <w:rFonts w:ascii="Arial" w:cs="Arial" w:hAnsi="Arial" w:eastAsia="Arial"/>
+          <w:b w:val="0"/>
+          <w:color w:val="000000"/>
+          <w:sz w:val="22"/>
+          <w:szCs w:val="22"/>
+        </w:rPr>
+      </w:pPr>
+      <w:r>
+        <w:rPr>
+          <w:rFonts w:ascii="Arial" w:cs="Arial" w:hAnsi="Arial" w:eastAsia="Arial"/>
+          <w:b w:val="0"/>
+          <w:color w:val="000000"/>
+          <w:sz w:val="22"/>
+          <w:szCs w:val="22"/>
+        </w:rPr>
+        <w:t xml:space="preserve">5.4 Eficiencia</w:t>
+      </w:r>
+    </w:p>
+    <w:p>
+      <w:pPr>
+        <w:widowControl w:val="1"/>
+        <w:spacing w:after="40" w:before="0" w:line="240" w:lineRule="auto"/>
+        <w:ind w:left="397" w:right="0" w:firstLine="0"/>
+        <w:jc w:val="left"/>
+        <w:rPr>
+          <w:rFonts w:ascii="Arial" w:cs="Arial" w:hAnsi="Arial" w:eastAsia="Arial"/>
+          <w:b w:val="0"/>
+          <w:color w:val="000000"/>
+          <w:sz w:val="22"/>
+          <w:szCs w:val="22"/>
+        </w:rPr>
+      </w:pPr>
+      <w:r>
+        <w:rPr>
+          <w:rFonts w:ascii="Arial" w:cs="Arial" w:hAnsi="Arial" w:eastAsia="Arial"/>
+          <w:b w:val="0"/>
+          <w:color w:val="000000"/>
+          <w:sz w:val="22"/>
+          <w:szCs w:val="22"/>
+        </w:rPr>
+        <w:t xml:space="preserve">5.5 Seguridad</w:t>
+      </w:r>
+    </w:p>
+    <w:p>
+      <w:pPr>
+        <w:widowControl w:val="1"/>
+        <w:spacing w:after="40" w:before="0" w:line="240" w:lineRule="auto"/>
+        <w:ind w:left="397" w:right="0" w:firstLine="0"/>
+        <w:jc w:val="left"/>
+        <w:rPr>
+          <w:rFonts w:ascii="Arial" w:cs="Arial" w:hAnsi="Arial" w:eastAsia="Arial"/>
+          <w:b w:val="0"/>
+          <w:color w:val="000000"/>
+          <w:sz w:val="22"/>
+          <w:szCs w:val="22"/>
+        </w:rPr>
+      </w:pPr>
+      <w:r>
+        <w:rPr>
+          <w:rFonts w:ascii="Arial" w:cs="Arial" w:hAnsi="Arial" w:eastAsia="Arial"/>
+          <w:b w:val="0"/>
+          <w:color w:val="000000"/>
+          <w:sz w:val="22"/>
+          <w:szCs w:val="22"/>
+        </w:rPr>
+        <w:t xml:space="preserve">5.6 Confiabilidad</w:t>
+      </w:r>
+    </w:p>
+    <w:p>
+      <w:pPr>
+        <w:widowControl w:val="1"/>
+        <w:spacing w:after="40" w:before="0" w:line="240" w:lineRule="auto"/>
+        <w:ind w:left="397" w:right="0" w:firstLine="0"/>
+        <w:jc w:val="left"/>
+        <w:rPr>
+          <w:rFonts w:ascii="Arial" w:cs="Arial" w:hAnsi="Arial" w:eastAsia="Arial"/>
+          <w:b w:val="0"/>
+          <w:color w:val="000000"/>
+          <w:sz w:val="22"/>
+          <w:szCs w:val="22"/>
+        </w:rPr>
+      </w:pPr>
+      <w:r>
+        <w:rPr>
+          <w:rFonts w:ascii="Arial" w:cs="Arial" w:hAnsi="Arial" w:eastAsia="Arial"/>
+          <w:b w:val="0"/>
+          <w:color w:val="000000"/>
+          <w:sz w:val="22"/>
+          <w:szCs w:val="22"/>
+        </w:rPr>
+        <w:t xml:space="preserve">5.7 Mantenibilidad</w:t>
+      </w:r>
+    </w:p>
+    <w:p>
+      <w:pPr>
+        <w:widowControl w:val="1"/>
+        <w:spacing w:after="40" w:before="0" w:line="240" w:lineRule="auto"/>
+        <w:ind w:left="397" w:right="0" w:firstLine="0"/>
+        <w:jc w:val="left"/>
+        <w:rPr>
+          <w:rFonts w:ascii="Arial" w:cs="Arial" w:hAnsi="Arial" w:eastAsia="Arial"/>
+          <w:b w:val="0"/>
+          <w:color w:val="000000"/>
+          <w:sz w:val="22"/>
+          <w:szCs w:val="22"/>
+        </w:rPr>
+      </w:pPr>
+      <w:r>
+        <w:rPr>
+          <w:rFonts w:ascii="Arial" w:cs="Arial" w:hAnsi="Arial" w:eastAsia="Arial"/>
+          <w:b w:val="0"/>
+          <w:color w:val="000000"/>
+          <w:sz w:val="22"/>
+          <w:szCs w:val="22"/>
+        </w:rPr>
+        <w:t xml:space="preserve">Evidencia técnica: normas y estándares aplicables</w:t>
+      </w:r>
+    </w:p>
     <w:p>
       <w:r>
         <w:rPr>

</xml_diff>

<commit_message>
chore: update DEA Formato_Documento_de_Arquitectura.docx file
</commit_message>
<xml_diff>
--- a/DEA Formato_Documento_de_Arquitectura.docx
+++ b/DEA Formato_Documento_de_Arquitectura.docx
@@ -6803,9 +6803,9 @@
         </w:rPr>
         <w:drawing>
           <wp:inline distT="0" distB="0" distL="0" distR="0">
-            <wp:extent cx="1529715" cy="6813550"/>
+            <wp:extent cx="5029200" cy="2876550"/>
             <wp:effectExtent l="0" t="0" r="0" b="0"/>
-            <wp:docPr id="1" name="Picture 1" descr=""/>
+            <wp:docPr id="900" name="Picture 900" descr=""/>
             <wp:cNvGraphicFramePr>
               <a:graphicFrameLocks xmlns:a="http://schemas.openxmlformats.org/drawingml/2006/main" noChangeAspect="1"/>
             </wp:cNvGraphicFramePr>
@@ -6813,13 +6813,13 @@
               <a:graphicData uri="http://schemas.openxmlformats.org/drawingml/2006/picture">
                 <pic:pic xmlns:pic="http://schemas.openxmlformats.org/drawingml/2006/picture">
                   <pic:nvPicPr>
-                    <pic:cNvPr id="1" name="Picture 1" descr=""/>
+                    <pic:cNvPr id="900" name="Picture 900" descr=""/>
                     <pic:cNvPicPr>
                       <a:picLocks noChangeAspect="1" noChangeArrowheads="1"/>
                     </pic:cNvPicPr>
                   </pic:nvPicPr>
                   <pic:blipFill>
-                    <a:blip r:embed="rId2"/>
+                    <a:blip r:embed="rId47"/>
                     <a:stretch>
                       <a:fillRect/>
                     </a:stretch>
@@ -6827,7 +6827,7 @@
                   <pic:spPr bwMode="auto">
                     <a:xfrm>
                       <a:off x="0" y="0"/>
-                      <a:ext cx="1529715" cy="6813550"/>
+                      <a:ext cx="5029200" cy="2876550"/>
                     </a:xfrm>
                     <a:prstGeom prst="rect">
                       <a:avLst/>
@@ -6857,7 +6857,810 @@
           <w:sz w:val="24"/>
           <w:szCs w:val="20"/>
         </w:rPr>
-        <w:t>Diagrama de casos de uso general, agrupado por los 8 módulos funcionales del sistema.</w:t>
+        <w:t xml:space="preserve">Módulo Sitio público — Visitante público.</w:t>
+      </w:r>
+    </w:p>
+    <w:p>
+      <w:pPr>
+        <w:pStyle w:val="normal1"/>
+        <w:jc w:val="center"/>
+        <w:rPr>
+          <w:sz w:val="24"/>
+          <w:szCs w:val="20"/>
+        </w:rPr>
+      </w:pPr>
+      <w:r>
+        <w:rPr>
+          <w:sz w:val="24"/>
+          <w:szCs w:val="20"/>
+        </w:rPr>
+        <w:drawing>
+          <wp:inline distT="0" distB="0" distL="0" distR="0">
+            <wp:extent cx="5029200" cy="1581150"/>
+            <wp:effectExtent l="0" t="0" r="0" b="0"/>
+            <wp:docPr id="901" name="Picture 901" descr=""/>
+            <wp:cNvGraphicFramePr>
+              <a:graphicFrameLocks xmlns:a="http://schemas.openxmlformats.org/drawingml/2006/main" noChangeAspect="1"/>
+            </wp:cNvGraphicFramePr>
+            <a:graphic xmlns:a="http://schemas.openxmlformats.org/drawingml/2006/main">
+              <a:graphicData uri="http://schemas.openxmlformats.org/drawingml/2006/picture">
+                <pic:pic xmlns:pic="http://schemas.openxmlformats.org/drawingml/2006/picture">
+                  <pic:nvPicPr>
+                    <pic:cNvPr id="901" name="Picture 901" descr=""/>
+                    <pic:cNvPicPr>
+                      <a:picLocks noChangeAspect="1" noChangeArrowheads="1"/>
+                    </pic:cNvPicPr>
+                  </pic:nvPicPr>
+                  <pic:blipFill>
+                    <a:blip r:embed="rId48"/>
+                    <a:stretch>
+                      <a:fillRect/>
+                    </a:stretch>
+                  </pic:blipFill>
+                  <pic:spPr bwMode="auto">
+                    <a:xfrm>
+                      <a:off x="0" y="0"/>
+                      <a:ext cx="5029200" cy="1581150"/>
+                    </a:xfrm>
+                    <a:prstGeom prst="rect">
+                      <a:avLst/>
+                    </a:prstGeom>
+                  </pic:spPr>
+                </pic:pic>
+              </a:graphicData>
+            </a:graphic>
+          </wp:inline>
+        </w:drawing>
+      </w:r>
+    </w:p>
+    <w:p>
+      <w:pPr>
+        <w:pStyle w:val="normal1"/>
+        <w:jc w:val="center"/>
+        <w:rPr>
+          <w:sz w:val="24"/>
+          <w:szCs w:val="20"/>
+        </w:rPr>
+      </w:pPr>
+      <w:r>
+        <w:rPr>
+          <w:rFonts w:cs="Arial"/>
+          <w:b w:val="false"/>
+          <w:i/>
+          <w:sz w:val="24"/>
+          <w:szCs w:val="20"/>
+        </w:rPr>
+        <w:t xml:space="preserve">Módulo Sitio público — Buscador (Google/Bing).</w:t>
+      </w:r>
+    </w:p>
+    <w:p>
+      <w:pPr>
+        <w:pStyle w:val="normal1"/>
+        <w:jc w:val="center"/>
+        <w:rPr>
+          <w:sz w:val="24"/>
+          <w:szCs w:val="20"/>
+        </w:rPr>
+      </w:pPr>
+      <w:r>
+        <w:rPr>
+          <w:sz w:val="24"/>
+          <w:szCs w:val="20"/>
+        </w:rPr>
+        <w:drawing>
+          <wp:inline distT="0" distB="0" distL="0" distR="0">
+            <wp:extent cx="5029200" cy="3124200"/>
+            <wp:effectExtent l="0" t="0" r="0" b="0"/>
+            <wp:docPr id="902" name="Picture 902" descr=""/>
+            <wp:cNvGraphicFramePr>
+              <a:graphicFrameLocks xmlns:a="http://schemas.openxmlformats.org/drawingml/2006/main" noChangeAspect="1"/>
+            </wp:cNvGraphicFramePr>
+            <a:graphic xmlns:a="http://schemas.openxmlformats.org/drawingml/2006/main">
+              <a:graphicData uri="http://schemas.openxmlformats.org/drawingml/2006/picture">
+                <pic:pic xmlns:pic="http://schemas.openxmlformats.org/drawingml/2006/picture">
+                  <pic:nvPicPr>
+                    <pic:cNvPr id="902" name="Picture 902" descr=""/>
+                    <pic:cNvPicPr>
+                      <a:picLocks noChangeAspect="1" noChangeArrowheads="1"/>
+                    </pic:cNvPicPr>
+                  </pic:nvPicPr>
+                  <pic:blipFill>
+                    <a:blip r:embed="rId49"/>
+                    <a:stretch>
+                      <a:fillRect/>
+                    </a:stretch>
+                  </pic:blipFill>
+                  <pic:spPr bwMode="auto">
+                    <a:xfrm>
+                      <a:off x="0" y="0"/>
+                      <a:ext cx="5029200" cy="3124200"/>
+                    </a:xfrm>
+                    <a:prstGeom prst="rect">
+                      <a:avLst/>
+                    </a:prstGeom>
+                  </pic:spPr>
+                </pic:pic>
+              </a:graphicData>
+            </a:graphic>
+          </wp:inline>
+        </w:drawing>
+      </w:r>
+    </w:p>
+    <w:p>
+      <w:pPr>
+        <w:pStyle w:val="normal1"/>
+        <w:jc w:val="center"/>
+        <w:rPr>
+          <w:sz w:val="24"/>
+          <w:szCs w:val="20"/>
+        </w:rPr>
+      </w:pPr>
+      <w:r>
+        <w:rPr>
+          <w:rFonts w:cs="Arial"/>
+          <w:b w:val="false"/>
+          <w:i/>
+          <w:sz w:val="24"/>
+          <w:szCs w:val="20"/>
+        </w:rPr>
+        <w:t xml:space="preserve">Módulo Autenticación y sesiones — Administrador.</w:t>
+      </w:r>
+    </w:p>
+    <w:p>
+      <w:pPr>
+        <w:pStyle w:val="normal1"/>
+        <w:jc w:val="center"/>
+        <w:rPr>
+          <w:sz w:val="24"/>
+          <w:szCs w:val="20"/>
+        </w:rPr>
+      </w:pPr>
+      <w:r>
+        <w:rPr>
+          <w:sz w:val="24"/>
+          <w:szCs w:val="20"/>
+        </w:rPr>
+        <w:drawing>
+          <wp:inline distT="0" distB="0" distL="0" distR="0">
+            <wp:extent cx="5760000" cy="1401543"/>
+            <wp:effectExtent l="0" t="0" r="0" b="0"/>
+            <wp:docPr id="903" name="Picture 903" descr=""/>
+            <wp:cNvGraphicFramePr>
+              <a:graphicFrameLocks xmlns:a="http://schemas.openxmlformats.org/drawingml/2006/main" noChangeAspect="1"/>
+            </wp:cNvGraphicFramePr>
+            <a:graphic xmlns:a="http://schemas.openxmlformats.org/drawingml/2006/main">
+              <a:graphicData uri="http://schemas.openxmlformats.org/drawingml/2006/picture">
+                <pic:pic xmlns:pic="http://schemas.openxmlformats.org/drawingml/2006/picture">
+                  <pic:nvPicPr>
+                    <pic:cNvPr id="903" name="Picture 903" descr=""/>
+                    <pic:cNvPicPr>
+                      <a:picLocks noChangeAspect="1" noChangeArrowheads="1"/>
+                    </pic:cNvPicPr>
+                  </pic:nvPicPr>
+                  <pic:blipFill>
+                    <a:blip r:embed="rId50"/>
+                    <a:stretch>
+                      <a:fillRect/>
+                    </a:stretch>
+                  </pic:blipFill>
+                  <pic:spPr bwMode="auto">
+                    <a:xfrm>
+                      <a:off x="0" y="0"/>
+                      <a:ext cx="5760000" cy="1401543"/>
+                    </a:xfrm>
+                    <a:prstGeom prst="rect">
+                      <a:avLst/>
+                    </a:prstGeom>
+                  </pic:spPr>
+                </pic:pic>
+              </a:graphicData>
+            </a:graphic>
+          </wp:inline>
+        </w:drawing>
+      </w:r>
+    </w:p>
+    <w:p>
+      <w:pPr>
+        <w:pStyle w:val="normal1"/>
+        <w:jc w:val="center"/>
+        <w:rPr>
+          <w:sz w:val="24"/>
+          <w:szCs w:val="20"/>
+        </w:rPr>
+      </w:pPr>
+      <w:r>
+        <w:rPr>
+          <w:rFonts w:cs="Arial"/>
+          <w:b w:val="false"/>
+          <w:i/>
+          <w:sz w:val="24"/>
+          <w:szCs w:val="20"/>
+        </w:rPr>
+        <w:t xml:space="preserve">Módulo CRM (proyectos, clientes, seguimiento) — Administrador.</w:t>
+      </w:r>
+    </w:p>
+    <w:p>
+      <w:pPr>
+        <w:pStyle w:val="normal1"/>
+        <w:jc w:val="center"/>
+        <w:rPr>
+          <w:sz w:val="24"/>
+          <w:szCs w:val="20"/>
+        </w:rPr>
+      </w:pPr>
+      <w:r>
+        <w:rPr>
+          <w:sz w:val="24"/>
+          <w:szCs w:val="20"/>
+        </w:rPr>
+        <w:drawing>
+          <wp:inline distT="0" distB="0" distL="0" distR="0">
+            <wp:extent cx="5760000" cy="1019360"/>
+            <wp:effectExtent l="0" t="0" r="0" b="0"/>
+            <wp:docPr id="904" name="Picture 904" descr=""/>
+            <wp:cNvGraphicFramePr>
+              <a:graphicFrameLocks xmlns:a="http://schemas.openxmlformats.org/drawingml/2006/main" noChangeAspect="1"/>
+            </wp:cNvGraphicFramePr>
+            <a:graphic xmlns:a="http://schemas.openxmlformats.org/drawingml/2006/main">
+              <a:graphicData uri="http://schemas.openxmlformats.org/drawingml/2006/picture">
+                <pic:pic xmlns:pic="http://schemas.openxmlformats.org/drawingml/2006/picture">
+                  <pic:nvPicPr>
+                    <pic:cNvPr id="904" name="Picture 904" descr=""/>
+                    <pic:cNvPicPr>
+                      <a:picLocks noChangeAspect="1" noChangeArrowheads="1"/>
+                    </pic:cNvPicPr>
+                  </pic:nvPicPr>
+                  <pic:blipFill>
+                    <a:blip r:embed="rId51"/>
+                    <a:stretch>
+                      <a:fillRect/>
+                    </a:stretch>
+                  </pic:blipFill>
+                  <pic:spPr bwMode="auto">
+                    <a:xfrm>
+                      <a:off x="0" y="0"/>
+                      <a:ext cx="5760000" cy="1019360"/>
+                    </a:xfrm>
+                    <a:prstGeom prst="rect">
+                      <a:avLst/>
+                    </a:prstGeom>
+                  </pic:spPr>
+                </pic:pic>
+              </a:graphicData>
+            </a:graphic>
+          </wp:inline>
+        </w:drawing>
+      </w:r>
+    </w:p>
+    <w:p>
+      <w:pPr>
+        <w:pStyle w:val="normal1"/>
+        <w:jc w:val="center"/>
+        <w:rPr>
+          <w:sz w:val="24"/>
+          <w:szCs w:val="20"/>
+        </w:rPr>
+      </w:pPr>
+      <w:r>
+        <w:rPr>
+          <w:rFonts w:cs="Arial"/>
+          <w:b w:val="false"/>
+          <w:i/>
+          <w:sz w:val="24"/>
+          <w:szCs w:val="20"/>
+        </w:rPr>
+        <w:t xml:space="preserve">Módulo CRM (proyectos, clientes, seguimiento) — Cliente.</w:t>
+      </w:r>
+    </w:p>
+    <w:p>
+      <w:pPr>
+        <w:pStyle w:val="normal1"/>
+        <w:jc w:val="center"/>
+        <w:rPr>
+          <w:sz w:val="24"/>
+          <w:szCs w:val="20"/>
+        </w:rPr>
+      </w:pPr>
+      <w:r>
+        <w:rPr>
+          <w:sz w:val="24"/>
+          <w:szCs w:val="20"/>
+        </w:rPr>
+        <w:drawing>
+          <wp:inline distT="0" distB="0" distL="0" distR="0">
+            <wp:extent cx="5760000" cy="1547463"/>
+            <wp:effectExtent l="0" t="0" r="0" b="0"/>
+            <wp:docPr id="905" name="Picture 905" descr=""/>
+            <wp:cNvGraphicFramePr>
+              <a:graphicFrameLocks xmlns:a="http://schemas.openxmlformats.org/drawingml/2006/main" noChangeAspect="1"/>
+            </wp:cNvGraphicFramePr>
+            <a:graphic xmlns:a="http://schemas.openxmlformats.org/drawingml/2006/main">
+              <a:graphicData uri="http://schemas.openxmlformats.org/drawingml/2006/picture">
+                <pic:pic xmlns:pic="http://schemas.openxmlformats.org/drawingml/2006/picture">
+                  <pic:nvPicPr>
+                    <pic:cNvPr id="905" name="Picture 905" descr=""/>
+                    <pic:cNvPicPr>
+                      <a:picLocks noChangeAspect="1" noChangeArrowheads="1"/>
+                    </pic:cNvPicPr>
+                  </pic:nvPicPr>
+                  <pic:blipFill>
+                    <a:blip r:embed="rId52"/>
+                    <a:stretch>
+                      <a:fillRect/>
+                    </a:stretch>
+                  </pic:blipFill>
+                  <pic:spPr bwMode="auto">
+                    <a:xfrm>
+                      <a:off x="0" y="0"/>
+                      <a:ext cx="5760000" cy="1547463"/>
+                    </a:xfrm>
+                    <a:prstGeom prst="rect">
+                      <a:avLst/>
+                    </a:prstGeom>
+                  </pic:spPr>
+                </pic:pic>
+              </a:graphicData>
+            </a:graphic>
+          </wp:inline>
+        </w:drawing>
+      </w:r>
+    </w:p>
+    <w:p>
+      <w:pPr>
+        <w:pStyle w:val="normal1"/>
+        <w:jc w:val="center"/>
+        <w:rPr>
+          <w:sz w:val="24"/>
+          <w:szCs w:val="20"/>
+        </w:rPr>
+      </w:pPr>
+      <w:r>
+        <w:rPr>
+          <w:rFonts w:cs="Arial"/>
+          <w:b w:val="false"/>
+          <w:i/>
+          <w:sz w:val="24"/>
+          <w:szCs w:val="20"/>
+        </w:rPr>
+        <w:t xml:space="preserve">Módulo Finanzas — Administrador.</w:t>
+      </w:r>
+    </w:p>
+    <w:p>
+      <w:pPr>
+        <w:pStyle w:val="normal1"/>
+        <w:jc w:val="center"/>
+        <w:rPr>
+          <w:sz w:val="24"/>
+          <w:szCs w:val="20"/>
+        </w:rPr>
+      </w:pPr>
+      <w:r>
+        <w:rPr>
+          <w:sz w:val="24"/>
+          <w:szCs w:val="20"/>
+        </w:rPr>
+        <w:drawing>
+          <wp:inline distT="0" distB="0" distL="0" distR="0">
+            <wp:extent cx="5760000" cy="1076795"/>
+            <wp:effectExtent l="0" t="0" r="0" b="0"/>
+            <wp:docPr id="906" name="Picture 906" descr=""/>
+            <wp:cNvGraphicFramePr>
+              <a:graphicFrameLocks xmlns:a="http://schemas.openxmlformats.org/drawingml/2006/main" noChangeAspect="1"/>
+            </wp:cNvGraphicFramePr>
+            <a:graphic xmlns:a="http://schemas.openxmlformats.org/drawingml/2006/main">
+              <a:graphicData uri="http://schemas.openxmlformats.org/drawingml/2006/picture">
+                <pic:pic xmlns:pic="http://schemas.openxmlformats.org/drawingml/2006/picture">
+                  <pic:nvPicPr>
+                    <pic:cNvPr id="906" name="Picture 906" descr=""/>
+                    <pic:cNvPicPr>
+                      <a:picLocks noChangeAspect="1" noChangeArrowheads="1"/>
+                    </pic:cNvPicPr>
+                  </pic:nvPicPr>
+                  <pic:blipFill>
+                    <a:blip r:embed="rId53"/>
+                    <a:stretch>
+                      <a:fillRect/>
+                    </a:stretch>
+                  </pic:blipFill>
+                  <pic:spPr bwMode="auto">
+                    <a:xfrm>
+                      <a:off x="0" y="0"/>
+                      <a:ext cx="5760000" cy="1076795"/>
+                    </a:xfrm>
+                    <a:prstGeom prst="rect">
+                      <a:avLst/>
+                    </a:prstGeom>
+                  </pic:spPr>
+                </pic:pic>
+              </a:graphicData>
+            </a:graphic>
+          </wp:inline>
+        </w:drawing>
+      </w:r>
+    </w:p>
+    <w:p>
+      <w:pPr>
+        <w:pStyle w:val="normal1"/>
+        <w:jc w:val="center"/>
+        <w:rPr>
+          <w:sz w:val="24"/>
+          <w:szCs w:val="20"/>
+        </w:rPr>
+      </w:pPr>
+      <w:r>
+        <w:rPr>
+          <w:rFonts w:cs="Arial"/>
+          <w:b w:val="false"/>
+          <w:i/>
+          <w:sz w:val="24"/>
+          <w:szCs w:val="20"/>
+        </w:rPr>
+        <w:t xml:space="preserve">Módulo Observabilidad — Cron externo.</w:t>
+      </w:r>
+    </w:p>
+    <w:p>
+      <w:pPr>
+        <w:pStyle w:val="normal1"/>
+        <w:jc w:val="center"/>
+        <w:rPr>
+          <w:sz w:val="24"/>
+          <w:szCs w:val="20"/>
+        </w:rPr>
+      </w:pPr>
+      <w:r>
+        <w:rPr>
+          <w:sz w:val="24"/>
+          <w:szCs w:val="20"/>
+        </w:rPr>
+        <w:drawing>
+          <wp:inline distT="0" distB="0" distL="0" distR="0">
+            <wp:extent cx="5029200" cy="1581150"/>
+            <wp:effectExtent l="0" t="0" r="0" b="0"/>
+            <wp:docPr id="907" name="Picture 907" descr=""/>
+            <wp:cNvGraphicFramePr>
+              <a:graphicFrameLocks xmlns:a="http://schemas.openxmlformats.org/drawingml/2006/main" noChangeAspect="1"/>
+            </wp:cNvGraphicFramePr>
+            <a:graphic xmlns:a="http://schemas.openxmlformats.org/drawingml/2006/main">
+              <a:graphicData uri="http://schemas.openxmlformats.org/drawingml/2006/picture">
+                <pic:pic xmlns:pic="http://schemas.openxmlformats.org/drawingml/2006/picture">
+                  <pic:nvPicPr>
+                    <pic:cNvPr id="907" name="Picture 907" descr=""/>
+                    <pic:cNvPicPr>
+                      <a:picLocks noChangeAspect="1" noChangeArrowheads="1"/>
+                    </pic:cNvPicPr>
+                  </pic:nvPicPr>
+                  <pic:blipFill>
+                    <a:blip r:embed="rId54"/>
+                    <a:stretch>
+                      <a:fillRect/>
+                    </a:stretch>
+                  </pic:blipFill>
+                  <pic:spPr bwMode="auto">
+                    <a:xfrm>
+                      <a:off x="0" y="0"/>
+                      <a:ext cx="5029200" cy="1581150"/>
+                    </a:xfrm>
+                    <a:prstGeom prst="rect">
+                      <a:avLst/>
+                    </a:prstGeom>
+                  </pic:spPr>
+                </pic:pic>
+              </a:graphicData>
+            </a:graphic>
+          </wp:inline>
+        </w:drawing>
+      </w:r>
+    </w:p>
+    <w:p>
+      <w:pPr>
+        <w:pStyle w:val="normal1"/>
+        <w:jc w:val="center"/>
+        <w:rPr>
+          <w:sz w:val="24"/>
+          <w:szCs w:val="20"/>
+        </w:rPr>
+      </w:pPr>
+      <w:r>
+        <w:rPr>
+          <w:rFonts w:cs="Arial"/>
+          <w:b w:val="false"/>
+          <w:i/>
+          <w:sz w:val="24"/>
+          <w:szCs w:val="20"/>
+        </w:rPr>
+        <w:t xml:space="preserve">Módulo Observabilidad — Administrador.</w:t>
+      </w:r>
+    </w:p>
+    <w:p>
+      <w:pPr>
+        <w:pStyle w:val="normal1"/>
+        <w:jc w:val="center"/>
+        <w:rPr>
+          <w:sz w:val="24"/>
+          <w:szCs w:val="20"/>
+        </w:rPr>
+      </w:pPr>
+      <w:r>
+        <w:rPr>
+          <w:sz w:val="24"/>
+          <w:szCs w:val="20"/>
+        </w:rPr>
+        <w:drawing>
+          <wp:inline distT="0" distB="0" distL="0" distR="0">
+            <wp:extent cx="5760000" cy="1672258"/>
+            <wp:effectExtent l="0" t="0" r="0" b="0"/>
+            <wp:docPr id="908" name="Picture 908" descr=""/>
+            <wp:cNvGraphicFramePr>
+              <a:graphicFrameLocks xmlns:a="http://schemas.openxmlformats.org/drawingml/2006/main" noChangeAspect="1"/>
+            </wp:cNvGraphicFramePr>
+            <a:graphic xmlns:a="http://schemas.openxmlformats.org/drawingml/2006/main">
+              <a:graphicData uri="http://schemas.openxmlformats.org/drawingml/2006/picture">
+                <pic:pic xmlns:pic="http://schemas.openxmlformats.org/drawingml/2006/picture">
+                  <pic:nvPicPr>
+                    <pic:cNvPr id="908" name="Picture 908" descr=""/>
+                    <pic:cNvPicPr>
+                      <a:picLocks noChangeAspect="1" noChangeArrowheads="1"/>
+                    </pic:cNvPicPr>
+                  </pic:nvPicPr>
+                  <pic:blipFill>
+                    <a:blip r:embed="rId55"/>
+                    <a:stretch>
+                      <a:fillRect/>
+                    </a:stretch>
+                  </pic:blipFill>
+                  <pic:spPr bwMode="auto">
+                    <a:xfrm>
+                      <a:off x="0" y="0"/>
+                      <a:ext cx="5760000" cy="1672258"/>
+                    </a:xfrm>
+                    <a:prstGeom prst="rect">
+                      <a:avLst/>
+                    </a:prstGeom>
+                  </pic:spPr>
+                </pic:pic>
+              </a:graphicData>
+            </a:graphic>
+          </wp:inline>
+        </w:drawing>
+      </w:r>
+    </w:p>
+    <w:p>
+      <w:pPr>
+        <w:pStyle w:val="normal1"/>
+        <w:jc w:val="center"/>
+        <w:rPr>
+          <w:sz w:val="24"/>
+          <w:szCs w:val="20"/>
+        </w:rPr>
+      </w:pPr>
+      <w:r>
+        <w:rPr>
+          <w:rFonts w:cs="Arial"/>
+          <w:b w:val="false"/>
+          <w:i/>
+          <w:sz w:val="24"/>
+          <w:szCs w:val="20"/>
+        </w:rPr>
+        <w:t xml:space="preserve">Módulo LAB — Pasarela de pagos (Wompi).</w:t>
+      </w:r>
+    </w:p>
+    <w:p>
+      <w:pPr>
+        <w:pStyle w:val="normal1"/>
+        <w:jc w:val="center"/>
+        <w:rPr>
+          <w:sz w:val="24"/>
+          <w:szCs w:val="20"/>
+        </w:rPr>
+      </w:pPr>
+      <w:r>
+        <w:rPr>
+          <w:sz w:val="24"/>
+          <w:szCs w:val="20"/>
+        </w:rPr>
+        <w:drawing>
+          <wp:inline distT="0" distB="0" distL="0" distR="0">
+            <wp:extent cx="5760000" cy="1547463"/>
+            <wp:effectExtent l="0" t="0" r="0" b="0"/>
+            <wp:docPr id="909" name="Picture 909" descr=""/>
+            <wp:cNvGraphicFramePr>
+              <a:graphicFrameLocks xmlns:a="http://schemas.openxmlformats.org/drawingml/2006/main" noChangeAspect="1"/>
+            </wp:cNvGraphicFramePr>
+            <a:graphic xmlns:a="http://schemas.openxmlformats.org/drawingml/2006/main">
+              <a:graphicData uri="http://schemas.openxmlformats.org/drawingml/2006/picture">
+                <pic:pic xmlns:pic="http://schemas.openxmlformats.org/drawingml/2006/picture">
+                  <pic:nvPicPr>
+                    <pic:cNvPr id="909" name="Picture 909" descr=""/>
+                    <pic:cNvPicPr>
+                      <a:picLocks noChangeAspect="1" noChangeArrowheads="1"/>
+                    </pic:cNvPicPr>
+                  </pic:nvPicPr>
+                  <pic:blipFill>
+                    <a:blip r:embed="rId56"/>
+                    <a:stretch>
+                      <a:fillRect/>
+                    </a:stretch>
+                  </pic:blipFill>
+                  <pic:spPr bwMode="auto">
+                    <a:xfrm>
+                      <a:off x="0" y="0"/>
+                      <a:ext cx="5760000" cy="1547463"/>
+                    </a:xfrm>
+                    <a:prstGeom prst="rect">
+                      <a:avLst/>
+                    </a:prstGeom>
+                  </pic:spPr>
+                </pic:pic>
+              </a:graphicData>
+            </a:graphic>
+          </wp:inline>
+        </w:drawing>
+      </w:r>
+    </w:p>
+    <w:p>
+      <w:pPr>
+        <w:pStyle w:val="normal1"/>
+        <w:jc w:val="center"/>
+        <w:rPr>
+          <w:sz w:val="24"/>
+          <w:szCs w:val="20"/>
+        </w:rPr>
+      </w:pPr>
+      <w:r>
+        <w:rPr>
+          <w:rFonts w:cs="Arial"/>
+          <w:b w:val="false"/>
+          <w:i/>
+          <w:sz w:val="24"/>
+          <w:szCs w:val="20"/>
+        </w:rPr>
+        <w:t xml:space="preserve">Módulo LAB — Administrador.</w:t>
+      </w:r>
+    </w:p>
+    <w:p>
+      <w:pPr>
+        <w:pStyle w:val="normal1"/>
+        <w:jc w:val="center"/>
+        <w:rPr>
+          <w:sz w:val="24"/>
+          <w:szCs w:val="20"/>
+        </w:rPr>
+      </w:pPr>
+      <w:r>
+        <w:rPr>
+          <w:sz w:val="24"/>
+          <w:szCs w:val="20"/>
+        </w:rPr>
+        <w:drawing>
+          <wp:inline distT="0" distB="0" distL="0" distR="0">
+            <wp:extent cx="5760000" cy="2014158"/>
+            <wp:effectExtent l="0" t="0" r="0" b="0"/>
+            <wp:docPr id="910" name="Picture 910" descr=""/>
+            <wp:cNvGraphicFramePr>
+              <a:graphicFrameLocks xmlns:a="http://schemas.openxmlformats.org/drawingml/2006/main" noChangeAspect="1"/>
+            </wp:cNvGraphicFramePr>
+            <a:graphic xmlns:a="http://schemas.openxmlformats.org/drawingml/2006/main">
+              <a:graphicData uri="http://schemas.openxmlformats.org/drawingml/2006/picture">
+                <pic:pic xmlns:pic="http://schemas.openxmlformats.org/drawingml/2006/picture">
+                  <pic:nvPicPr>
+                    <pic:cNvPr id="910" name="Picture 910" descr=""/>
+                    <pic:cNvPicPr>
+                      <a:picLocks noChangeAspect="1" noChangeArrowheads="1"/>
+                    </pic:cNvPicPr>
+                  </pic:nvPicPr>
+                  <pic:blipFill>
+                    <a:blip r:embed="rId57"/>
+                    <a:stretch>
+                      <a:fillRect/>
+                    </a:stretch>
+                  </pic:blipFill>
+                  <pic:spPr bwMode="auto">
+                    <a:xfrm>
+                      <a:off x="0" y="0"/>
+                      <a:ext cx="5760000" cy="2014158"/>
+                    </a:xfrm>
+                    <a:prstGeom prst="rect">
+                      <a:avLst/>
+                    </a:prstGeom>
+                  </pic:spPr>
+                </pic:pic>
+              </a:graphicData>
+            </a:graphic>
+          </wp:inline>
+        </w:drawing>
+      </w:r>
+    </w:p>
+    <w:p>
+      <w:pPr>
+        <w:pStyle w:val="normal1"/>
+        <w:jc w:val="center"/>
+        <w:rPr>
+          <w:sz w:val="24"/>
+          <w:szCs w:val="20"/>
+        </w:rPr>
+      </w:pPr>
+      <w:r>
+        <w:rPr>
+          <w:rFonts w:cs="Arial"/>
+          <w:b w:val="false"/>
+          <w:i/>
+          <w:sz w:val="24"/>
+          <w:szCs w:val="20"/>
+        </w:rPr>
+        <w:t xml:space="preserve">Módulo Seguridad (micro-SIEM) — Administrador.</w:t>
+      </w:r>
+    </w:p>
+    <w:p>
+      <w:pPr>
+        <w:pStyle w:val="normal1"/>
+        <w:jc w:val="center"/>
+        <w:rPr>
+          <w:sz w:val="24"/>
+          <w:szCs w:val="20"/>
+        </w:rPr>
+      </w:pPr>
+      <w:r>
+        <w:rPr>
+          <w:sz w:val="24"/>
+          <w:szCs w:val="20"/>
+        </w:rPr>
+        <w:drawing>
+          <wp:inline distT="0" distB="0" distL="0" distR="0">
+            <wp:extent cx="5760000" cy="2640512"/>
+            <wp:effectExtent l="0" t="0" r="0" b="0"/>
+            <wp:docPr id="911" name="Picture 911" descr=""/>
+            <wp:cNvGraphicFramePr>
+              <a:graphicFrameLocks xmlns:a="http://schemas.openxmlformats.org/drawingml/2006/main" noChangeAspect="1"/>
+            </wp:cNvGraphicFramePr>
+            <a:graphic xmlns:a="http://schemas.openxmlformats.org/drawingml/2006/main">
+              <a:graphicData uri="http://schemas.openxmlformats.org/drawingml/2006/picture">
+                <pic:pic xmlns:pic="http://schemas.openxmlformats.org/drawingml/2006/picture">
+                  <pic:nvPicPr>
+                    <pic:cNvPr id="911" name="Picture 911" descr=""/>
+                    <pic:cNvPicPr>
+                      <a:picLocks noChangeAspect="1" noChangeArrowheads="1"/>
+                    </pic:cNvPicPr>
+                  </pic:nvPicPr>
+                  <pic:blipFill>
+                    <a:blip r:embed="rId58"/>
+                    <a:stretch>
+                      <a:fillRect/>
+                    </a:stretch>
+                  </pic:blipFill>
+                  <pic:spPr bwMode="auto">
+                    <a:xfrm>
+                      <a:off x="0" y="0"/>
+                      <a:ext cx="5760000" cy="2640512"/>
+                    </a:xfrm>
+                    <a:prstGeom prst="rect">
+                      <a:avLst/>
+                    </a:prstGeom>
+                  </pic:spPr>
+                </pic:pic>
+              </a:graphicData>
+            </a:graphic>
+          </wp:inline>
+        </w:drawing>
+      </w:r>
+    </w:p>
+    <w:p>
+      <w:pPr>
+        <w:pStyle w:val="normal1"/>
+        <w:jc w:val="center"/>
+        <w:rPr>
+          <w:sz w:val="24"/>
+          <w:szCs w:val="20"/>
+        </w:rPr>
+      </w:pPr>
+      <w:r>
+        <w:rPr>
+          <w:rFonts w:cs="Arial"/>
+          <w:b w:val="false"/>
+          <w:i/>
+          <w:sz w:val="24"/>
+          <w:szCs w:val="20"/>
+        </w:rPr>
+        <w:t xml:space="preserve">Módulo Sistema — Administrador.</w:t>
       </w:r>
     </w:p>
     <w:p>

</xml_diff>

<commit_message>
feat: add BPMN export script and printable diagram page
- Implemented a new script to export BPMN diagrams as SVG and PNG files with a white background for architecture documentation.
- Created a new Astro page for printing BPMN diagrams, featuring a clean layout suitable for paper, including a cover page and notation section.
- Ensured diagrams are rendered accurately with appropriate scaling and styles for print.
</commit_message>
<xml_diff>
--- a/DEA Formato_Documento_de_Arquitectura.docx
+++ b/DEA Formato_Documento_de_Arquitectura.docx
@@ -102,7 +102,10 @@
         </w:rPr>
       </w:pPr>
       <w:r>
-        <w:rPr/>
+        <w:rPr>
+          <w:sz w:val="28"/>
+          <w:szCs w:val="28"/>
+        </w:rPr>
       </w:r>
     </w:p>
     <w:p>
@@ -314,25 +317,6 @@
           <w:vertAlign w:val="baseline"/>
         </w:rPr>
         <w:tab/>
-      </w:r>
-      <w:r>
-        <w:rPr>
-          <w:rFonts w:eastAsia="Arial" w:cs="Arial"/>
-          <w:b/>
-          <w:i w:val="false"/>
-          <w:caps w:val="false"/>
-          <w:smallCaps w:val="false"/>
-          <w:strike w:val="false"/>
-          <w:dstrike w:val="false"/>
-          <w:color w:val="000000"/>
-          <w:position w:val="0"/>
-          <w:sz w:val="24"/>
-          <w:sz w:val="24"/>
-          <w:szCs w:val="24"/>
-          <w:u w:val="none"/>
-          <w:shd w:fill="auto" w:val="clear"/>
-          <w:vertAlign w:val="baseline"/>
-        </w:rPr>
         <w:t>Ficha: 3114731</w:t>
       </w:r>
     </w:p>
@@ -386,7 +370,6 @@
         <w:keepLines w:val="false"/>
         <w:pageBreakBefore w:val="false"/>
         <w:widowControl/>
-        <w:pBdr/>
         <w:shd w:val="clear" w:fill="auto"/>
         <w:spacing w:lineRule="auto" w:line="240" w:before="200" w:after="0"/>
         <w:ind w:hanging="0" w:left="0" w:right="-81"/>
@@ -437,7 +420,6 @@
         <w:keepLines w:val="false"/>
         <w:pageBreakBefore w:val="false"/>
         <w:widowControl/>
-        <w:pBdr/>
         <w:shd w:val="clear" w:fill="auto"/>
         <w:tabs>
           <w:tab w:val="clear" w:pos="720"/>
@@ -493,7 +475,6 @@
         <w:keepLines w:val="false"/>
         <w:pageBreakBefore w:val="false"/>
         <w:widowControl/>
-        <w:pBdr/>
         <w:shd w:val="clear" w:fill="auto"/>
         <w:tabs>
           <w:tab w:val="clear" w:pos="720"/>
@@ -549,7 +530,6 @@
         <w:keepLines w:val="false"/>
         <w:pageBreakBefore w:val="false"/>
         <w:widowControl/>
-        <w:pBdr/>
         <w:shd w:val="clear" w:fill="auto"/>
         <w:tabs>
           <w:tab w:val="clear" w:pos="720"/>
@@ -605,7 +585,6 @@
         <w:keepLines w:val="false"/>
         <w:pageBreakBefore w:val="false"/>
         <w:widowControl/>
-        <w:pBdr/>
         <w:shd w:val="clear" w:fill="auto"/>
         <w:tabs>
           <w:tab w:val="clear" w:pos="720"/>
@@ -661,7 +640,6 @@
         <w:keepLines w:val="false"/>
         <w:pageBreakBefore w:val="false"/>
         <w:widowControl/>
-        <w:pBdr/>
         <w:shd w:val="clear" w:fill="auto"/>
         <w:tabs>
           <w:tab w:val="clear" w:pos="720"/>
@@ -717,7 +695,6 @@
         <w:keepLines w:val="false"/>
         <w:pageBreakBefore w:val="false"/>
         <w:widowControl/>
-        <w:pBdr/>
         <w:shd w:val="clear" w:fill="auto"/>
         <w:tabs>
           <w:tab w:val="clear" w:pos="720"/>
@@ -773,7 +750,6 @@
         <w:keepLines w:val="false"/>
         <w:pageBreakBefore w:val="false"/>
         <w:widowControl/>
-        <w:pBdr/>
         <w:shd w:val="clear" w:fill="auto"/>
         <w:tabs>
           <w:tab w:val="clear" w:pos="720"/>
@@ -829,7 +805,6 @@
         <w:keepLines w:val="false"/>
         <w:pageBreakBefore w:val="false"/>
         <w:widowControl/>
-        <w:pBdr/>
         <w:shd w:val="clear" w:fill="auto"/>
         <w:tabs>
           <w:tab w:val="clear" w:pos="720"/>
@@ -885,7 +860,6 @@
         <w:keepLines w:val="false"/>
         <w:pageBreakBefore w:val="false"/>
         <w:widowControl/>
-        <w:pBdr/>
         <w:shd w:val="clear" w:fill="auto"/>
         <w:tabs>
           <w:tab w:val="clear" w:pos="720"/>
@@ -941,7 +915,6 @@
         <w:keepLines w:val="false"/>
         <w:pageBreakBefore w:val="false"/>
         <w:widowControl/>
-        <w:pBdr/>
         <w:shd w:val="clear" w:fill="auto"/>
         <w:tabs>
           <w:tab w:val="clear" w:pos="720"/>
@@ -997,7 +970,6 @@
         <w:keepLines w:val="false"/>
         <w:pageBreakBefore w:val="false"/>
         <w:widowControl/>
-        <w:pBdr/>
         <w:shd w:val="clear" w:fill="auto"/>
         <w:tabs>
           <w:tab w:val="clear" w:pos="720"/>
@@ -1053,7 +1025,6 @@
         <w:keepLines w:val="false"/>
         <w:pageBreakBefore w:val="false"/>
         <w:widowControl/>
-        <w:pBdr/>
         <w:shd w:val="clear" w:fill="auto"/>
         <w:tabs>
           <w:tab w:val="clear" w:pos="720"/>
@@ -1106,7 +1077,6 @@
       <w:pPr>
         <w:pStyle w:val="normal1"/>
         <w:widowControl/>
-        <w:pBdr/>
         <w:shd w:val="clear" w:fill="auto"/>
         <w:tabs>
           <w:tab w:val="clear" w:pos="720"/>
@@ -1159,7 +1129,6 @@
       <w:pPr>
         <w:pStyle w:val="normal1"/>
         <w:widowControl/>
-        <w:pBdr/>
         <w:shd w:val="clear" w:fill="auto"/>
         <w:tabs>
           <w:tab w:val="clear" w:pos="720"/>
@@ -1215,7 +1184,6 @@
         <w:keepLines w:val="false"/>
         <w:pageBreakBefore w:val="false"/>
         <w:widowControl/>
-        <w:pBdr/>
         <w:shd w:val="clear" w:fill="auto"/>
         <w:tabs>
           <w:tab w:val="clear" w:pos="720"/>
@@ -1271,7 +1239,6 @@
         <w:keepLines w:val="false"/>
         <w:pageBreakBefore w:val="false"/>
         <w:widowControl/>
-        <w:pBdr/>
         <w:shd w:val="clear" w:fill="auto"/>
         <w:tabs>
           <w:tab w:val="clear" w:pos="720"/>
@@ -1327,7 +1294,6 @@
         <w:keepLines w:val="false"/>
         <w:pageBreakBefore w:val="false"/>
         <w:widowControl/>
-        <w:pBdr/>
         <w:shd w:val="clear" w:fill="auto"/>
         <w:tabs>
           <w:tab w:val="clear" w:pos="720"/>
@@ -1383,7 +1349,6 @@
         <w:keepLines w:val="false"/>
         <w:pageBreakBefore w:val="false"/>
         <w:widowControl/>
-        <w:pBdr/>
         <w:shd w:val="clear" w:fill="auto"/>
         <w:tabs>
           <w:tab w:val="clear" w:pos="720"/>
@@ -1439,7 +1404,6 @@
         <w:keepLines w:val="false"/>
         <w:pageBreakBefore w:val="false"/>
         <w:widowControl/>
-        <w:pBdr/>
         <w:shd w:val="clear" w:fill="auto"/>
         <w:tabs>
           <w:tab w:val="clear" w:pos="720"/>
@@ -1495,7 +1459,6 @@
         <w:keepLines w:val="false"/>
         <w:pageBreakBefore w:val="false"/>
         <w:widowControl/>
-        <w:pBdr/>
         <w:shd w:val="clear" w:fill="auto"/>
         <w:tabs>
           <w:tab w:val="clear" w:pos="720"/>
@@ -1551,7 +1514,6 @@
         <w:keepLines w:val="false"/>
         <w:pageBreakBefore w:val="false"/>
         <w:widowControl/>
-        <w:pBdr/>
         <w:shd w:val="clear" w:fill="auto"/>
         <w:tabs>
           <w:tab w:val="clear" w:pos="720"/>
@@ -1608,7 +1570,6 @@
         <w:keepLines w:val="false"/>
         <w:pageBreakBefore w:val="false"/>
         <w:widowControl/>
-        <w:pBdr/>
         <w:shd w:val="clear" w:fill="auto"/>
         <w:tabs>
           <w:tab w:val="clear" w:pos="720"/>
@@ -1664,7 +1625,6 @@
         <w:keepLines w:val="false"/>
         <w:pageBreakBefore w:val="false"/>
         <w:widowControl/>
-        <w:pBdr/>
         <w:shd w:val="clear" w:fill="auto"/>
         <w:tabs>
           <w:tab w:val="clear" w:pos="720"/>
@@ -2044,7 +2004,6 @@
         <w:keepLines/>
         <w:pageBreakBefore w:val="false"/>
         <w:widowControl/>
-        <w:pBdr/>
         <w:shd w:val="clear" w:fill="auto"/>
         <w:spacing w:lineRule="auto" w:line="276" w:before="480" w:after="0"/>
         <w:ind w:hanging="0" w:left="0" w:right="0"/>
@@ -2095,7 +2054,6 @@
         <w:keepLines/>
         <w:pageBreakBefore w:val="false"/>
         <w:widowControl/>
-        <w:pBdr/>
         <w:shd w:val="clear" w:fill="auto"/>
         <w:spacing w:lineRule="auto" w:line="276" w:before="480" w:after="0"/>
         <w:ind w:hanging="0" w:left="0" w:right="0"/>
@@ -2148,7 +2106,6 @@
         <w:keepNext w:val="true"/>
         <w:keepLines/>
         <w:widowControl/>
-        <w:pBdr/>
         <w:shd w:val="clear" w:fill="auto"/>
         <w:spacing w:lineRule="auto" w:line="276" w:before="0" w:after="0"/>
         <w:ind w:hanging="0" w:left="0" w:right="0"/>
@@ -2197,7 +2154,6 @@
       <w:pPr>
         <w:pStyle w:val="normal1"/>
         <w:widowControl/>
-        <w:pBdr/>
         <w:shd w:val="clear" w:fill="auto"/>
         <w:spacing w:lineRule="auto" w:line="276" w:before="0" w:after="0"/>
         <w:ind w:hanging="0" w:left="0" w:right="0"/>
@@ -2367,8 +2323,9 @@
       </w:pPr>
       <w:r>
         <w:rPr>
-          <w:sz w:val="24"/>
-          <w:szCs w:val="20"/>
+          <w:rFonts w:eastAsia="Arial" w:cs="Arial"/>
+          <w:b w:val="false"/>
+          <w:color w:val="000000"/>
         </w:rPr>
       </w:r>
     </w:p>
@@ -2525,8 +2482,9 @@
       </w:pPr>
       <w:r>
         <w:rPr>
-          <w:sz w:val="24"/>
-          <w:szCs w:val="20"/>
+          <w:rFonts w:eastAsia="Arial" w:cs="Arial"/>
+          <w:b w:val="false"/>
+          <w:color w:val="000000"/>
         </w:rPr>
       </w:r>
     </w:p>
@@ -2729,8 +2687,9 @@
       </w:pPr>
       <w:r>
         <w:rPr>
-          <w:sz w:val="24"/>
-          <w:szCs w:val="20"/>
+          <w:rFonts w:eastAsia="Arial" w:cs="Arial"/>
+          <w:b w:val="false"/>
+          <w:color w:val="000000"/>
         </w:rPr>
       </w:r>
     </w:p>
@@ -2772,8 +2731,9 @@
       </w:pPr>
       <w:r>
         <w:rPr>
-          <w:sz w:val="24"/>
-          <w:szCs w:val="20"/>
+          <w:rFonts w:eastAsia="Arial" w:cs="Arial"/>
+          <w:b/>
+          <w:color w:val="000000"/>
         </w:rPr>
       </w:r>
     </w:p>
@@ -2999,8 +2959,9 @@
       </w:pPr>
       <w:r>
         <w:rPr>
-          <w:sz w:val="24"/>
-          <w:szCs w:val="20"/>
+          <w:rFonts w:eastAsia="Arial" w:cs="Arial"/>
+          <w:b w:val="false"/>
+          <w:color w:val="000000"/>
         </w:rPr>
       </w:r>
     </w:p>
@@ -3032,8 +2993,8 @@
       </w:pPr>
       <w:r>
         <w:rPr>
-          <w:sz w:val="24"/>
-          <w:szCs w:val="20"/>
+          <w:rFonts w:cs="Arial"/>
+          <w:b/>
         </w:rPr>
       </w:r>
     </w:p>
@@ -3070,25 +3031,7 @@
           <w:sz w:val="24"/>
           <w:szCs w:val="20"/>
         </w:rPr>
-        <w:t xml:space="preserve">Este documento describe la arquitectura del portafolio profesional y panel de control privado </w:t>
-      </w:r>
-      <w:r>
-        <w:rPr>
-          <w:rFonts w:cs="Arial"/>
-          <w:b w:val="false"/>
-          <w:sz w:val="24"/>
-          <w:szCs w:val="20"/>
-        </w:rPr>
-        <w:t>de Codebymike,</w:t>
-      </w:r>
-      <w:r>
-        <w:rPr>
-          <w:rFonts w:cs="Arial"/>
-          <w:b w:val="false"/>
-          <w:sz w:val="24"/>
-          <w:szCs w:val="20"/>
-        </w:rPr>
-        <w:t xml:space="preserve"> publicado en codebymike.tech. El proyecto combina un sitio público (proyectos, notas técnicas, estado del sistema, herramientas), un panel administrativo privado que funciona como CRM + control de costos/rentabilidad + bóveda de credenciales + observabilidad, un portal de clientes independiente, una pasarela de pagos con idempotencia real, un micro-SIEM propio de seguridad perimetral, y un laboratorio de ingeniería ("LAB") donde se practican y documentan disciplinas de CI/CD, chaos engineering, SRE y testing avanzado como evidencia técnica para la formación SENA del autor.</w:t>
+        <w:t>Este documento describe la arquitectura del portafolio profesional y panel de control privado de Codebymike, publicado en codebymike.tech. El proyecto combina un sitio público (proyectos, notas técnicas, estado del sistema, herramientas), un panel administrativo privado que funciona como CRM + control de costos/rentabilidad + bóveda de credenciales + observabilidad, un portal de clientes independiente, una pasarela de pagos con idempotencia real, un micro-SIEM propio de seguridad perimetral, y un laboratorio de ingeniería ("LAB") donde se practican y documentan disciplinas de CI/CD, chaos engineering, SRE y testing avanzado como evidencia técnica para la formación SENA del autor.</w:t>
       </w:r>
     </w:p>
     <w:p>
@@ -3101,8 +3044,8 @@
       </w:pPr>
       <w:r>
         <w:rPr>
-          <w:sz w:val="24"/>
-          <w:szCs w:val="20"/>
+          <w:rFonts w:cs="Arial"/>
+          <w:b w:val="false"/>
         </w:rPr>
       </w:r>
     </w:p>
@@ -3134,8 +3077,8 @@
       </w:pPr>
       <w:r>
         <w:rPr>
-          <w:sz w:val="24"/>
-          <w:szCs w:val="20"/>
+          <w:rFonts w:cs="Arial"/>
+          <w:b w:val="false"/>
         </w:rPr>
       </w:r>
     </w:p>
@@ -3185,8 +3128,8 @@
       </w:pPr>
       <w:r>
         <w:rPr>
-          <w:sz w:val="24"/>
-          <w:szCs w:val="20"/>
+          <w:rFonts w:cs="Arial"/>
+          <w:b w:val="false"/>
         </w:rPr>
       </w:r>
     </w:p>
@@ -3254,8 +3197,8 @@
       </w:pPr>
       <w:r>
         <w:rPr>
-          <w:sz w:val="24"/>
-          <w:szCs w:val="20"/>
+          <w:rFonts w:cs="Arial"/>
+          <w:b w:val="false"/>
         </w:rPr>
       </w:r>
     </w:p>
@@ -3305,8 +3248,8 @@
       </w:pPr>
       <w:r>
         <w:rPr>
-          <w:sz w:val="24"/>
-          <w:szCs w:val="20"/>
+          <w:rFonts w:cs="Arial"/>
+          <w:b w:val="false"/>
         </w:rPr>
       </w:r>
     </w:p>
@@ -3338,8 +3281,8 @@
       </w:pPr>
       <w:r>
         <w:rPr>
-          <w:sz w:val="24"/>
-          <w:szCs w:val="20"/>
+          <w:rFonts w:cs="Arial"/>
+          <w:b/>
         </w:rPr>
       </w:r>
     </w:p>
@@ -3441,8 +3384,8 @@
       </w:pPr>
       <w:r>
         <w:rPr>
-          <w:sz w:val="24"/>
-          <w:szCs w:val="20"/>
+          <w:rFonts w:cs="Arial"/>
+          <w:b w:val="false"/>
         </w:rPr>
       </w:r>
     </w:p>
@@ -3474,8 +3417,8 @@
       </w:pPr>
       <w:r>
         <w:rPr>
-          <w:sz w:val="24"/>
-          <w:szCs w:val="20"/>
+          <w:rFonts w:cs="Arial"/>
+          <w:b/>
         </w:rPr>
       </w:r>
     </w:p>
@@ -3498,25 +3441,7 @@
           <w:sz w:val="24"/>
           <w:szCs w:val="20"/>
         </w:rPr>
-        <w:t xml:space="preserve">El administrador único del sistema </w:t>
-      </w:r>
-      <w:r>
-        <w:rPr>
-          <w:rFonts w:cs="Arial"/>
-          <w:b w:val="false"/>
-          <w:sz w:val="24"/>
-          <w:szCs w:val="20"/>
-        </w:rPr>
-        <w:t>es Michael Rodriguez,</w:t>
-      </w:r>
-      <w:r>
-        <w:rPr>
-          <w:rFonts w:cs="Arial"/>
-          <w:b w:val="false"/>
-          <w:sz w:val="24"/>
-          <w:szCs w:val="20"/>
-        </w:rPr>
-        <w:t xml:space="preserve"> vía el panel /admin.</w:t>
+        <w:t>El administrador único del sistema es Michael Rodriguez, vía el panel /admin.</w:t>
       </w:r>
     </w:p>
     <w:p>
@@ -3595,8 +3520,8 @@
       </w:pPr>
       <w:r>
         <w:rPr>
-          <w:sz w:val="24"/>
-          <w:szCs w:val="20"/>
+          <w:rFonts w:cs="Arial"/>
+          <w:b w:val="false"/>
         </w:rPr>
       </w:r>
     </w:p>
@@ -3610,8 +3535,8 @@
       </w:pPr>
       <w:r>
         <w:rPr>
-          <w:sz w:val="24"/>
-          <w:szCs w:val="20"/>
+          <w:rFonts w:cs="Arial"/>
+          <w:b w:val="false"/>
         </w:rPr>
       </w:r>
     </w:p>
@@ -3625,8 +3550,8 @@
       </w:pPr>
       <w:r>
         <w:rPr>
-          <w:sz w:val="24"/>
-          <w:szCs w:val="20"/>
+          <w:rFonts w:cs="Arial"/>
+          <w:b w:val="false"/>
         </w:rPr>
       </w:r>
     </w:p>
@@ -3640,8 +3565,8 @@
       </w:pPr>
       <w:r>
         <w:rPr>
-          <w:sz w:val="24"/>
-          <w:szCs w:val="20"/>
+          <w:rFonts w:cs="Arial"/>
+          <w:b w:val="false"/>
         </w:rPr>
       </w:r>
     </w:p>
@@ -3655,8 +3580,8 @@
       </w:pPr>
       <w:r>
         <w:rPr>
-          <w:sz w:val="24"/>
-          <w:szCs w:val="20"/>
+          <w:rFonts w:cs="Arial"/>
+          <w:b w:val="false"/>
         </w:rPr>
       </w:r>
     </w:p>
@@ -3670,8 +3595,8 @@
       </w:pPr>
       <w:r>
         <w:rPr>
-          <w:sz w:val="24"/>
-          <w:szCs w:val="20"/>
+          <w:rFonts w:cs="Arial"/>
+          <w:b w:val="false"/>
         </w:rPr>
       </w:r>
     </w:p>
@@ -3685,8 +3610,8 @@
       </w:pPr>
       <w:r>
         <w:rPr>
-          <w:sz w:val="24"/>
-          <w:szCs w:val="20"/>
+          <w:rFonts w:cs="Arial"/>
+          <w:b w:val="false"/>
         </w:rPr>
       </w:r>
     </w:p>
@@ -3700,8 +3625,8 @@
       </w:pPr>
       <w:r>
         <w:rPr>
-          <w:sz w:val="24"/>
-          <w:szCs w:val="20"/>
+          <w:rFonts w:cs="Arial"/>
+          <w:b w:val="false"/>
         </w:rPr>
       </w:r>
     </w:p>
@@ -3715,8 +3640,8 @@
       </w:pPr>
       <w:r>
         <w:rPr>
-          <w:sz w:val="24"/>
-          <w:szCs w:val="20"/>
+          <w:rFonts w:cs="Arial"/>
+          <w:b w:val="false"/>
         </w:rPr>
       </w:r>
     </w:p>
@@ -3730,8 +3655,8 @@
       </w:pPr>
       <w:r>
         <w:rPr>
-          <w:sz w:val="24"/>
-          <w:szCs w:val="20"/>
+          <w:rFonts w:cs="Arial"/>
+          <w:b w:val="false"/>
         </w:rPr>
       </w:r>
     </w:p>
@@ -3745,8 +3670,8 @@
       </w:pPr>
       <w:r>
         <w:rPr>
-          <w:sz w:val="24"/>
-          <w:szCs w:val="20"/>
+          <w:rFonts w:cs="Arial"/>
+          <w:b w:val="false"/>
         </w:rPr>
       </w:r>
     </w:p>
@@ -3760,8 +3685,8 @@
       </w:pPr>
       <w:r>
         <w:rPr>
-          <w:sz w:val="24"/>
-          <w:szCs w:val="20"/>
+          <w:rFonts w:cs="Arial"/>
+          <w:b w:val="false"/>
         </w:rPr>
       </w:r>
     </w:p>
@@ -3775,8 +3700,8 @@
       </w:pPr>
       <w:r>
         <w:rPr>
-          <w:sz w:val="24"/>
-          <w:szCs w:val="20"/>
+          <w:rFonts w:cs="Arial"/>
+          <w:b w:val="false"/>
         </w:rPr>
       </w:r>
     </w:p>
@@ -3790,8 +3715,8 @@
       </w:pPr>
       <w:r>
         <w:rPr>
-          <w:sz w:val="24"/>
-          <w:szCs w:val="20"/>
+          <w:rFonts w:cs="Arial"/>
+          <w:b w:val="false"/>
         </w:rPr>
       </w:r>
     </w:p>
@@ -3805,8 +3730,8 @@
       </w:pPr>
       <w:r>
         <w:rPr>
-          <w:sz w:val="24"/>
-          <w:szCs w:val="20"/>
+          <w:rFonts w:cs="Arial"/>
+          <w:b w:val="false"/>
         </w:rPr>
       </w:r>
     </w:p>
@@ -3820,8 +3745,8 @@
       </w:pPr>
       <w:r>
         <w:rPr>
-          <w:sz w:val="24"/>
-          <w:szCs w:val="20"/>
+          <w:rFonts w:cs="Arial"/>
+          <w:b w:val="false"/>
         </w:rPr>
       </w:r>
     </w:p>
@@ -3835,8 +3760,8 @@
       </w:pPr>
       <w:r>
         <w:rPr>
-          <w:sz w:val="24"/>
-          <w:szCs w:val="20"/>
+          <w:rFonts w:cs="Arial"/>
+          <w:b w:val="false"/>
         </w:rPr>
       </w:r>
     </w:p>
@@ -3850,8 +3775,8 @@
       </w:pPr>
       <w:r>
         <w:rPr>
-          <w:sz w:val="24"/>
-          <w:szCs w:val="20"/>
+          <w:rFonts w:cs="Arial"/>
+          <w:b w:val="false"/>
         </w:rPr>
       </w:r>
     </w:p>
@@ -3865,8 +3790,8 @@
       </w:pPr>
       <w:r>
         <w:rPr>
-          <w:sz w:val="24"/>
-          <w:szCs w:val="20"/>
+          <w:rFonts w:cs="Arial"/>
+          <w:b w:val="false"/>
         </w:rPr>
       </w:r>
     </w:p>
@@ -3880,8 +3805,8 @@
       </w:pPr>
       <w:r>
         <w:rPr>
-          <w:sz w:val="24"/>
-          <w:szCs w:val="20"/>
+          <w:rFonts w:cs="Arial"/>
+          <w:b w:val="false"/>
         </w:rPr>
       </w:r>
     </w:p>
@@ -3913,8 +3838,8 @@
       </w:pPr>
       <w:r>
         <w:rPr>
-          <w:sz w:val="24"/>
-          <w:szCs w:val="20"/>
+          <w:rFonts w:cs="Arial"/>
+          <w:b/>
         </w:rPr>
       </w:r>
     </w:p>
@@ -3946,8 +3871,8 @@
       </w:pPr>
       <w:r>
         <w:rPr>
-          <w:sz w:val="24"/>
-          <w:szCs w:val="20"/>
+          <w:rFonts w:cs="Arial"/>
+          <w:b w:val="false"/>
         </w:rPr>
       </w:r>
     </w:p>
@@ -4347,8 +4272,8 @@
       </w:pPr>
       <w:r>
         <w:rPr>
-          <w:sz w:val="24"/>
-          <w:szCs w:val="20"/>
+          <w:rFonts w:cs="Arial"/>
+          <w:b/>
         </w:rPr>
       </w:r>
     </w:p>
@@ -4380,8 +4305,8 @@
       </w:pPr>
       <w:r>
         <w:rPr>
-          <w:sz w:val="24"/>
-          <w:szCs w:val="20"/>
+          <w:rFonts w:cs="Arial"/>
+          <w:b/>
         </w:rPr>
       </w:r>
     </w:p>
@@ -4779,8 +4704,8 @@
       </w:pPr>
       <w:r>
         <w:rPr>
-          <w:sz w:val="24"/>
-          <w:szCs w:val="20"/>
+          <w:rFonts w:cs="Arial"/>
+          <w:b/>
         </w:rPr>
       </w:r>
     </w:p>
@@ -4830,8 +4755,8 @@
       </w:pPr>
       <w:r>
         <w:rPr>
-          <w:sz w:val="24"/>
-          <w:szCs w:val="20"/>
+          <w:rFonts w:cs="Arial"/>
+          <w:b w:val="false"/>
         </w:rPr>
       </w:r>
     </w:p>
@@ -4863,8 +4788,8 @@
       </w:pPr>
       <w:r>
         <w:rPr>
-          <w:sz w:val="24"/>
-          <w:szCs w:val="20"/>
+          <w:rFonts w:cs="Arial"/>
+          <w:b w:val="false"/>
         </w:rPr>
       </w:r>
     </w:p>
@@ -4914,8 +4839,8 @@
       </w:pPr>
       <w:r>
         <w:rPr>
-          <w:sz w:val="24"/>
-          <w:szCs w:val="20"/>
+          <w:rFonts w:cs="Arial"/>
+          <w:b w:val="false"/>
         </w:rPr>
       </w:r>
     </w:p>
@@ -4947,8 +4872,8 @@
       </w:pPr>
       <w:r>
         <w:rPr>
-          <w:sz w:val="24"/>
-          <w:szCs w:val="20"/>
+          <w:rFonts w:cs="Arial"/>
+          <w:b w:val="false"/>
         </w:rPr>
       </w:r>
     </w:p>
@@ -4980,8 +4905,8 @@
       </w:pPr>
       <w:r>
         <w:rPr>
-          <w:sz w:val="24"/>
-          <w:szCs w:val="20"/>
+          <w:rFonts w:cs="Arial"/>
+          <w:b/>
         </w:rPr>
       </w:r>
     </w:p>
@@ -5031,8 +4956,8 @@
       </w:pPr>
       <w:r>
         <w:rPr>
-          <w:sz w:val="24"/>
-          <w:szCs w:val="20"/>
+          <w:rFonts w:cs="Arial"/>
+          <w:b w:val="false"/>
         </w:rPr>
       </w:r>
     </w:p>
@@ -5046,8 +4971,8 @@
       </w:pPr>
       <w:r>
         <w:rPr>
-          <w:sz w:val="24"/>
-          <w:szCs w:val="20"/>
+          <w:rFonts w:cs="Arial"/>
+          <w:b w:val="false"/>
         </w:rPr>
       </w:r>
     </w:p>
@@ -5061,8 +4986,8 @@
       </w:pPr>
       <w:r>
         <w:rPr>
-          <w:sz w:val="24"/>
-          <w:szCs w:val="20"/>
+          <w:rFonts w:cs="Arial"/>
+          <w:b w:val="false"/>
         </w:rPr>
       </w:r>
     </w:p>
@@ -5094,8 +5019,8 @@
       </w:pPr>
       <w:r>
         <w:rPr>
-          <w:sz w:val="24"/>
-          <w:szCs w:val="20"/>
+          <w:rFonts w:cs="Arial"/>
+          <w:b/>
         </w:rPr>
       </w:r>
     </w:p>
@@ -5235,8 +5160,8 @@
       </w:pPr>
       <w:r>
         <w:rPr>
-          <w:sz w:val="24"/>
-          <w:szCs w:val="20"/>
+          <w:rFonts w:cs="Arial"/>
+          <w:b w:val="false"/>
         </w:rPr>
       </w:r>
     </w:p>
@@ -5268,8 +5193,8 @@
       </w:pPr>
       <w:r>
         <w:rPr>
-          <w:sz w:val="24"/>
-          <w:szCs w:val="20"/>
+          <w:rFonts w:cs="Arial"/>
+          <w:b/>
         </w:rPr>
       </w:r>
     </w:p>
@@ -5301,8 +5226,8 @@
       </w:pPr>
       <w:r>
         <w:rPr>
-          <w:sz w:val="24"/>
-          <w:szCs w:val="20"/>
+          <w:rFonts w:cs="Arial"/>
+          <w:b w:val="false"/>
         </w:rPr>
       </w:r>
     </w:p>
@@ -5334,8 +5259,8 @@
       </w:pPr>
       <w:r>
         <w:rPr>
-          <w:sz w:val="24"/>
-          <w:szCs w:val="20"/>
+          <w:rFonts w:cs="Arial"/>
+          <w:b w:val="false"/>
         </w:rPr>
       </w:r>
     </w:p>
@@ -5367,8 +5292,8 @@
       </w:pPr>
       <w:r>
         <w:rPr>
-          <w:sz w:val="24"/>
-          <w:szCs w:val="20"/>
+          <w:rFonts w:cs="Arial"/>
+          <w:b w:val="false"/>
         </w:rPr>
       </w:r>
     </w:p>
@@ -5382,8 +5307,8 @@
       </w:pPr>
       <w:r>
         <w:rPr>
-          <w:sz w:val="24"/>
-          <w:szCs w:val="20"/>
+          <w:rFonts w:cs="Arial"/>
+          <w:b w:val="false"/>
         </w:rPr>
       </w:r>
     </w:p>
@@ -5397,8 +5322,8 @@
       </w:pPr>
       <w:r>
         <w:rPr>
-          <w:sz w:val="24"/>
-          <w:szCs w:val="20"/>
+          <w:rFonts w:cs="Arial"/>
+          <w:b w:val="false"/>
         </w:rPr>
       </w:r>
     </w:p>
@@ -5412,8 +5337,8 @@
       </w:pPr>
       <w:r>
         <w:rPr>
-          <w:sz w:val="24"/>
-          <w:szCs w:val="20"/>
+          <w:rFonts w:cs="Arial"/>
+          <w:b w:val="false"/>
         </w:rPr>
       </w:r>
     </w:p>
@@ -5427,8 +5352,8 @@
       </w:pPr>
       <w:r>
         <w:rPr>
-          <w:sz w:val="24"/>
-          <w:szCs w:val="20"/>
+          <w:rFonts w:cs="Arial"/>
+          <w:b w:val="false"/>
         </w:rPr>
       </w:r>
     </w:p>
@@ -5442,8 +5367,8 @@
       </w:pPr>
       <w:r>
         <w:rPr>
-          <w:sz w:val="24"/>
-          <w:szCs w:val="20"/>
+          <w:rFonts w:cs="Arial"/>
+          <w:b w:val="false"/>
         </w:rPr>
       </w:r>
     </w:p>
@@ -5457,8 +5382,8 @@
       </w:pPr>
       <w:r>
         <w:rPr>
-          <w:sz w:val="24"/>
-          <w:szCs w:val="20"/>
+          <w:rFonts w:cs="Arial"/>
+          <w:b w:val="false"/>
         </w:rPr>
       </w:r>
     </w:p>
@@ -5490,8 +5415,8 @@
       </w:pPr>
       <w:r>
         <w:rPr>
-          <w:sz w:val="24"/>
-          <w:szCs w:val="20"/>
+          <w:rFonts w:cs="Arial"/>
+          <w:b/>
         </w:rPr>
       </w:r>
     </w:p>
@@ -6284,8 +6209,8 @@
       </w:pPr>
       <w:r>
         <w:rPr>
-          <w:sz w:val="24"/>
-          <w:szCs w:val="20"/>
+          <w:rFonts w:cs="Arial"/>
+          <w:b/>
         </w:rPr>
       </w:r>
     </w:p>
@@ -6335,8 +6260,8 @@
       </w:pPr>
       <w:r>
         <w:rPr>
-          <w:sz w:val="24"/>
-          <w:szCs w:val="20"/>
+          <w:rFonts w:cs="Arial"/>
+          <w:b w:val="false"/>
         </w:rPr>
       </w:r>
     </w:p>
@@ -6797,15 +6722,12 @@
         </w:rPr>
       </w:pPr>
       <w:r>
-        <w:rPr>
-          <w:sz w:val="24"/>
-          <w:szCs w:val="20"/>
-        </w:rPr>
+        <w:rPr/>
         <w:drawing>
           <wp:inline distT="0" distB="0" distL="0" distR="0">
             <wp:extent cx="5029200" cy="2876550"/>
             <wp:effectExtent l="0" t="0" r="0" b="0"/>
-            <wp:docPr id="900" name="Picture 900" descr=""/>
+            <wp:docPr id="1" name="Picture 900" descr=""/>
             <wp:cNvGraphicFramePr>
               <a:graphicFrameLocks xmlns:a="http://schemas.openxmlformats.org/drawingml/2006/main" noChangeAspect="1"/>
             </wp:cNvGraphicFramePr>
@@ -6813,13 +6735,13 @@
               <a:graphicData uri="http://schemas.openxmlformats.org/drawingml/2006/picture">
                 <pic:pic xmlns:pic="http://schemas.openxmlformats.org/drawingml/2006/picture">
                   <pic:nvPicPr>
-                    <pic:cNvPr id="900" name="Picture 900" descr=""/>
+                    <pic:cNvPr id="1" name="Picture 900" descr=""/>
                     <pic:cNvPicPr>
                       <a:picLocks noChangeAspect="1" noChangeArrowheads="1"/>
                     </pic:cNvPicPr>
                   </pic:nvPicPr>
                   <pic:blipFill>
-                    <a:blip r:embed="rId47"/>
+                    <a:blip r:embed="rId2"/>
                     <a:stretch>
                       <a:fillRect/>
                     </a:stretch>
@@ -6857,7 +6779,7 @@
           <w:sz w:val="24"/>
           <w:szCs w:val="20"/>
         </w:rPr>
-        <w:t xml:space="preserve">Módulo Sitio público — Visitante público.</w:t>
+        <w:t>Módulo Sitio público — Visitante público.</w:t>
       </w:r>
     </w:p>
     <w:p>
@@ -6870,15 +6792,12 @@
         </w:rPr>
       </w:pPr>
       <w:r>
-        <w:rPr>
-          <w:sz w:val="24"/>
-          <w:szCs w:val="20"/>
-        </w:rPr>
+        <w:rPr/>
         <w:drawing>
           <wp:inline distT="0" distB="0" distL="0" distR="0">
             <wp:extent cx="5029200" cy="1581150"/>
             <wp:effectExtent l="0" t="0" r="0" b="0"/>
-            <wp:docPr id="901" name="Picture 901" descr=""/>
+            <wp:docPr id="2" name="Picture 901" descr=""/>
             <wp:cNvGraphicFramePr>
               <a:graphicFrameLocks xmlns:a="http://schemas.openxmlformats.org/drawingml/2006/main" noChangeAspect="1"/>
             </wp:cNvGraphicFramePr>
@@ -6886,13 +6805,13 @@
               <a:graphicData uri="http://schemas.openxmlformats.org/drawingml/2006/picture">
                 <pic:pic xmlns:pic="http://schemas.openxmlformats.org/drawingml/2006/picture">
                   <pic:nvPicPr>
-                    <pic:cNvPr id="901" name="Picture 901" descr=""/>
+                    <pic:cNvPr id="2" name="Picture 901" descr=""/>
                     <pic:cNvPicPr>
                       <a:picLocks noChangeAspect="1" noChangeArrowheads="1"/>
                     </pic:cNvPicPr>
                   </pic:nvPicPr>
                   <pic:blipFill>
-                    <a:blip r:embed="rId48"/>
+                    <a:blip r:embed="rId3"/>
                     <a:stretch>
                       <a:fillRect/>
                     </a:stretch>
@@ -6930,7 +6849,7 @@
           <w:sz w:val="24"/>
           <w:szCs w:val="20"/>
         </w:rPr>
-        <w:t xml:space="preserve">Módulo Sitio público — Buscador (Google/Bing).</w:t>
+        <w:t>Módulo Sitio público — Buscador (Google/Bing).</w:t>
       </w:r>
     </w:p>
     <w:p>
@@ -6943,15 +6862,12 @@
         </w:rPr>
       </w:pPr>
       <w:r>
-        <w:rPr>
-          <w:sz w:val="24"/>
-          <w:szCs w:val="20"/>
-        </w:rPr>
+        <w:rPr/>
         <w:drawing>
           <wp:inline distT="0" distB="0" distL="0" distR="0">
             <wp:extent cx="5029200" cy="3124200"/>
             <wp:effectExtent l="0" t="0" r="0" b="0"/>
-            <wp:docPr id="902" name="Picture 902" descr=""/>
+            <wp:docPr id="3" name="Picture 902" descr=""/>
             <wp:cNvGraphicFramePr>
               <a:graphicFrameLocks xmlns:a="http://schemas.openxmlformats.org/drawingml/2006/main" noChangeAspect="1"/>
             </wp:cNvGraphicFramePr>
@@ -6959,13 +6875,13 @@
               <a:graphicData uri="http://schemas.openxmlformats.org/drawingml/2006/picture">
                 <pic:pic xmlns:pic="http://schemas.openxmlformats.org/drawingml/2006/picture">
                   <pic:nvPicPr>
-                    <pic:cNvPr id="902" name="Picture 902" descr=""/>
+                    <pic:cNvPr id="3" name="Picture 902" descr=""/>
                     <pic:cNvPicPr>
                       <a:picLocks noChangeAspect="1" noChangeArrowheads="1"/>
                     </pic:cNvPicPr>
                   </pic:nvPicPr>
                   <pic:blipFill>
-                    <a:blip r:embed="rId49"/>
+                    <a:blip r:embed="rId4"/>
                     <a:stretch>
                       <a:fillRect/>
                     </a:stretch>
@@ -7003,7 +6919,7 @@
           <w:sz w:val="24"/>
           <w:szCs w:val="20"/>
         </w:rPr>
-        <w:t xml:space="preserve">Módulo Autenticación y sesiones — Administrador.</w:t>
+        <w:t>Módulo Autenticación y sesiones — Administrador.</w:t>
       </w:r>
     </w:p>
     <w:p>
@@ -7016,15 +6932,12 @@
         </w:rPr>
       </w:pPr>
       <w:r>
-        <w:rPr>
-          <w:sz w:val="24"/>
-          <w:szCs w:val="20"/>
-        </w:rPr>
+        <w:rPr/>
         <w:drawing>
           <wp:inline distT="0" distB="0" distL="0" distR="0">
-            <wp:extent cx="5760000" cy="1401543"/>
+            <wp:extent cx="5760085" cy="1401445"/>
             <wp:effectExtent l="0" t="0" r="0" b="0"/>
-            <wp:docPr id="903" name="Picture 903" descr=""/>
+            <wp:docPr id="4" name="Picture 903" descr=""/>
             <wp:cNvGraphicFramePr>
               <a:graphicFrameLocks xmlns:a="http://schemas.openxmlformats.org/drawingml/2006/main" noChangeAspect="1"/>
             </wp:cNvGraphicFramePr>
@@ -7032,13 +6945,13 @@
               <a:graphicData uri="http://schemas.openxmlformats.org/drawingml/2006/picture">
                 <pic:pic xmlns:pic="http://schemas.openxmlformats.org/drawingml/2006/picture">
                   <pic:nvPicPr>
-                    <pic:cNvPr id="903" name="Picture 903" descr=""/>
+                    <pic:cNvPr id="4" name="Picture 903" descr=""/>
                     <pic:cNvPicPr>
                       <a:picLocks noChangeAspect="1" noChangeArrowheads="1"/>
                     </pic:cNvPicPr>
                   </pic:nvPicPr>
                   <pic:blipFill>
-                    <a:blip r:embed="rId50"/>
+                    <a:blip r:embed="rId5"/>
                     <a:stretch>
                       <a:fillRect/>
                     </a:stretch>
@@ -7046,7 +6959,7 @@
                   <pic:spPr bwMode="auto">
                     <a:xfrm>
                       <a:off x="0" y="0"/>
-                      <a:ext cx="5760000" cy="1401543"/>
+                      <a:ext cx="5760085" cy="1401445"/>
                     </a:xfrm>
                     <a:prstGeom prst="rect">
                       <a:avLst/>
@@ -7076,7 +6989,7 @@
           <w:sz w:val="24"/>
           <w:szCs w:val="20"/>
         </w:rPr>
-        <w:t xml:space="preserve">Módulo CRM (proyectos, clientes, seguimiento) — Administrador.</w:t>
+        <w:t>Módulo CRM (proyectos, clientes, seguimiento) — Administrador.</w:t>
       </w:r>
     </w:p>
     <w:p>
@@ -7089,15 +7002,12 @@
         </w:rPr>
       </w:pPr>
       <w:r>
-        <w:rPr>
-          <w:sz w:val="24"/>
-          <w:szCs w:val="20"/>
-        </w:rPr>
+        <w:rPr/>
         <w:drawing>
           <wp:inline distT="0" distB="0" distL="0" distR="0">
-            <wp:extent cx="5760000" cy="1019360"/>
+            <wp:extent cx="5760085" cy="1019810"/>
             <wp:effectExtent l="0" t="0" r="0" b="0"/>
-            <wp:docPr id="904" name="Picture 904" descr=""/>
+            <wp:docPr id="5" name="Picture 904" descr=""/>
             <wp:cNvGraphicFramePr>
               <a:graphicFrameLocks xmlns:a="http://schemas.openxmlformats.org/drawingml/2006/main" noChangeAspect="1"/>
             </wp:cNvGraphicFramePr>
@@ -7105,13 +7015,13 @@
               <a:graphicData uri="http://schemas.openxmlformats.org/drawingml/2006/picture">
                 <pic:pic xmlns:pic="http://schemas.openxmlformats.org/drawingml/2006/picture">
                   <pic:nvPicPr>
-                    <pic:cNvPr id="904" name="Picture 904" descr=""/>
+                    <pic:cNvPr id="5" name="Picture 904" descr=""/>
                     <pic:cNvPicPr>
                       <a:picLocks noChangeAspect="1" noChangeArrowheads="1"/>
                     </pic:cNvPicPr>
                   </pic:nvPicPr>
                   <pic:blipFill>
-                    <a:blip r:embed="rId51"/>
+                    <a:blip r:embed="rId6"/>
                     <a:stretch>
                       <a:fillRect/>
                     </a:stretch>
@@ -7119,7 +7029,7 @@
                   <pic:spPr bwMode="auto">
                     <a:xfrm>
                       <a:off x="0" y="0"/>
-                      <a:ext cx="5760000" cy="1019360"/>
+                      <a:ext cx="5760085" cy="1019810"/>
                     </a:xfrm>
                     <a:prstGeom prst="rect">
                       <a:avLst/>
@@ -7149,7 +7059,7 @@
           <w:sz w:val="24"/>
           <w:szCs w:val="20"/>
         </w:rPr>
-        <w:t xml:space="preserve">Módulo CRM (proyectos, clientes, seguimiento) — Cliente.</w:t>
+        <w:t>Módulo CRM (proyectos, clientes, seguimiento) — Cliente.</w:t>
       </w:r>
     </w:p>
     <w:p>
@@ -7162,15 +7072,12 @@
         </w:rPr>
       </w:pPr>
       <w:r>
-        <w:rPr>
-          <w:sz w:val="24"/>
-          <w:szCs w:val="20"/>
-        </w:rPr>
+        <w:rPr/>
         <w:drawing>
           <wp:inline distT="0" distB="0" distL="0" distR="0">
-            <wp:extent cx="5760000" cy="1547463"/>
+            <wp:extent cx="5760085" cy="1547495"/>
             <wp:effectExtent l="0" t="0" r="0" b="0"/>
-            <wp:docPr id="905" name="Picture 905" descr=""/>
+            <wp:docPr id="6" name="Picture 905" descr=""/>
             <wp:cNvGraphicFramePr>
               <a:graphicFrameLocks xmlns:a="http://schemas.openxmlformats.org/drawingml/2006/main" noChangeAspect="1"/>
             </wp:cNvGraphicFramePr>
@@ -7178,13 +7085,13 @@
               <a:graphicData uri="http://schemas.openxmlformats.org/drawingml/2006/picture">
                 <pic:pic xmlns:pic="http://schemas.openxmlformats.org/drawingml/2006/picture">
                   <pic:nvPicPr>
-                    <pic:cNvPr id="905" name="Picture 905" descr=""/>
+                    <pic:cNvPr id="6" name="Picture 905" descr=""/>
                     <pic:cNvPicPr>
                       <a:picLocks noChangeAspect="1" noChangeArrowheads="1"/>
                     </pic:cNvPicPr>
                   </pic:nvPicPr>
                   <pic:blipFill>
-                    <a:blip r:embed="rId52"/>
+                    <a:blip r:embed="rId7"/>
                     <a:stretch>
                       <a:fillRect/>
                     </a:stretch>
@@ -7192,7 +7099,7 @@
                   <pic:spPr bwMode="auto">
                     <a:xfrm>
                       <a:off x="0" y="0"/>
-                      <a:ext cx="5760000" cy="1547463"/>
+                      <a:ext cx="5760085" cy="1547495"/>
                     </a:xfrm>
                     <a:prstGeom prst="rect">
                       <a:avLst/>
@@ -7222,7 +7129,7 @@
           <w:sz w:val="24"/>
           <w:szCs w:val="20"/>
         </w:rPr>
-        <w:t xml:space="preserve">Módulo Finanzas — Administrador.</w:t>
+        <w:t>Módulo Finanzas — Administrador.</w:t>
       </w:r>
     </w:p>
     <w:p>
@@ -7235,15 +7142,12 @@
         </w:rPr>
       </w:pPr>
       <w:r>
-        <w:rPr>
-          <w:sz w:val="24"/>
-          <w:szCs w:val="20"/>
-        </w:rPr>
+        <w:rPr/>
         <w:drawing>
           <wp:inline distT="0" distB="0" distL="0" distR="0">
-            <wp:extent cx="5760000" cy="1076795"/>
+            <wp:extent cx="5760085" cy="1076960"/>
             <wp:effectExtent l="0" t="0" r="0" b="0"/>
-            <wp:docPr id="906" name="Picture 906" descr=""/>
+            <wp:docPr id="7" name="Picture 906" descr=""/>
             <wp:cNvGraphicFramePr>
               <a:graphicFrameLocks xmlns:a="http://schemas.openxmlformats.org/drawingml/2006/main" noChangeAspect="1"/>
             </wp:cNvGraphicFramePr>
@@ -7251,13 +7155,13 @@
               <a:graphicData uri="http://schemas.openxmlformats.org/drawingml/2006/picture">
                 <pic:pic xmlns:pic="http://schemas.openxmlformats.org/drawingml/2006/picture">
                   <pic:nvPicPr>
-                    <pic:cNvPr id="906" name="Picture 906" descr=""/>
+                    <pic:cNvPr id="7" name="Picture 906" descr=""/>
                     <pic:cNvPicPr>
                       <a:picLocks noChangeAspect="1" noChangeArrowheads="1"/>
                     </pic:cNvPicPr>
                   </pic:nvPicPr>
                   <pic:blipFill>
-                    <a:blip r:embed="rId53"/>
+                    <a:blip r:embed="rId8"/>
                     <a:stretch>
                       <a:fillRect/>
                     </a:stretch>
@@ -7265,7 +7169,7 @@
                   <pic:spPr bwMode="auto">
                     <a:xfrm>
                       <a:off x="0" y="0"/>
-                      <a:ext cx="5760000" cy="1076795"/>
+                      <a:ext cx="5760085" cy="1076960"/>
                     </a:xfrm>
                     <a:prstGeom prst="rect">
                       <a:avLst/>
@@ -7295,7 +7199,7 @@
           <w:sz w:val="24"/>
           <w:szCs w:val="20"/>
         </w:rPr>
-        <w:t xml:space="preserve">Módulo Observabilidad — Cron externo.</w:t>
+        <w:t>Módulo Observabilidad — Cron externo.</w:t>
       </w:r>
     </w:p>
     <w:p>
@@ -7308,15 +7212,12 @@
         </w:rPr>
       </w:pPr>
       <w:r>
-        <w:rPr>
-          <w:sz w:val="24"/>
-          <w:szCs w:val="20"/>
-        </w:rPr>
+        <w:rPr/>
         <w:drawing>
           <wp:inline distT="0" distB="0" distL="0" distR="0">
             <wp:extent cx="5029200" cy="1581150"/>
             <wp:effectExtent l="0" t="0" r="0" b="0"/>
-            <wp:docPr id="907" name="Picture 907" descr=""/>
+            <wp:docPr id="8" name="Picture 907" descr=""/>
             <wp:cNvGraphicFramePr>
               <a:graphicFrameLocks xmlns:a="http://schemas.openxmlformats.org/drawingml/2006/main" noChangeAspect="1"/>
             </wp:cNvGraphicFramePr>
@@ -7324,13 +7225,13 @@
               <a:graphicData uri="http://schemas.openxmlformats.org/drawingml/2006/picture">
                 <pic:pic xmlns:pic="http://schemas.openxmlformats.org/drawingml/2006/picture">
                   <pic:nvPicPr>
-                    <pic:cNvPr id="907" name="Picture 907" descr=""/>
+                    <pic:cNvPr id="8" name="Picture 907" descr=""/>
                     <pic:cNvPicPr>
                       <a:picLocks noChangeAspect="1" noChangeArrowheads="1"/>
                     </pic:cNvPicPr>
                   </pic:nvPicPr>
                   <pic:blipFill>
-                    <a:blip r:embed="rId54"/>
+                    <a:blip r:embed="rId9"/>
                     <a:stretch>
                       <a:fillRect/>
                     </a:stretch>
@@ -7368,7 +7269,7 @@
           <w:sz w:val="24"/>
           <w:szCs w:val="20"/>
         </w:rPr>
-        <w:t xml:space="preserve">Módulo Observabilidad — Administrador.</w:t>
+        <w:t>Módulo Observabilidad — Administrador.</w:t>
       </w:r>
     </w:p>
     <w:p>
@@ -7381,15 +7282,12 @@
         </w:rPr>
       </w:pPr>
       <w:r>
-        <w:rPr>
-          <w:sz w:val="24"/>
-          <w:szCs w:val="20"/>
-        </w:rPr>
+        <w:rPr/>
         <w:drawing>
           <wp:inline distT="0" distB="0" distL="0" distR="0">
-            <wp:extent cx="5760000" cy="1672258"/>
+            <wp:extent cx="5760085" cy="1671955"/>
             <wp:effectExtent l="0" t="0" r="0" b="0"/>
-            <wp:docPr id="908" name="Picture 908" descr=""/>
+            <wp:docPr id="9" name="Picture 908" descr=""/>
             <wp:cNvGraphicFramePr>
               <a:graphicFrameLocks xmlns:a="http://schemas.openxmlformats.org/drawingml/2006/main" noChangeAspect="1"/>
             </wp:cNvGraphicFramePr>
@@ -7397,13 +7295,13 @@
               <a:graphicData uri="http://schemas.openxmlformats.org/drawingml/2006/picture">
                 <pic:pic xmlns:pic="http://schemas.openxmlformats.org/drawingml/2006/picture">
                   <pic:nvPicPr>
-                    <pic:cNvPr id="908" name="Picture 908" descr=""/>
+                    <pic:cNvPr id="9" name="Picture 908" descr=""/>
                     <pic:cNvPicPr>
                       <a:picLocks noChangeAspect="1" noChangeArrowheads="1"/>
                     </pic:cNvPicPr>
                   </pic:nvPicPr>
                   <pic:blipFill>
-                    <a:blip r:embed="rId55"/>
+                    <a:blip r:embed="rId10"/>
                     <a:stretch>
                       <a:fillRect/>
                     </a:stretch>
@@ -7411,7 +7309,7 @@
                   <pic:spPr bwMode="auto">
                     <a:xfrm>
                       <a:off x="0" y="0"/>
-                      <a:ext cx="5760000" cy="1672258"/>
+                      <a:ext cx="5760085" cy="1671955"/>
                     </a:xfrm>
                     <a:prstGeom prst="rect">
                       <a:avLst/>
@@ -7441,7 +7339,7 @@
           <w:sz w:val="24"/>
           <w:szCs w:val="20"/>
         </w:rPr>
-        <w:t xml:space="preserve">Módulo LAB — Pasarela de pagos (Wompi).</w:t>
+        <w:t>Módulo LAB — Pasarela de pagos (Wompi).</w:t>
       </w:r>
     </w:p>
     <w:p>
@@ -7454,15 +7352,12 @@
         </w:rPr>
       </w:pPr>
       <w:r>
-        <w:rPr>
-          <w:sz w:val="24"/>
-          <w:szCs w:val="20"/>
-        </w:rPr>
+        <w:rPr/>
         <w:drawing>
           <wp:inline distT="0" distB="0" distL="0" distR="0">
-            <wp:extent cx="5760000" cy="1547463"/>
+            <wp:extent cx="5760085" cy="1547495"/>
             <wp:effectExtent l="0" t="0" r="0" b="0"/>
-            <wp:docPr id="909" name="Picture 909" descr=""/>
+            <wp:docPr id="10" name="Picture 909" descr=""/>
             <wp:cNvGraphicFramePr>
               <a:graphicFrameLocks xmlns:a="http://schemas.openxmlformats.org/drawingml/2006/main" noChangeAspect="1"/>
             </wp:cNvGraphicFramePr>
@@ -7470,13 +7365,13 @@
               <a:graphicData uri="http://schemas.openxmlformats.org/drawingml/2006/picture">
                 <pic:pic xmlns:pic="http://schemas.openxmlformats.org/drawingml/2006/picture">
                   <pic:nvPicPr>
-                    <pic:cNvPr id="909" name="Picture 909" descr=""/>
+                    <pic:cNvPr id="10" name="Picture 909" descr=""/>
                     <pic:cNvPicPr>
                       <a:picLocks noChangeAspect="1" noChangeArrowheads="1"/>
                     </pic:cNvPicPr>
                   </pic:nvPicPr>
                   <pic:blipFill>
-                    <a:blip r:embed="rId56"/>
+                    <a:blip r:embed="rId11"/>
                     <a:stretch>
                       <a:fillRect/>
                     </a:stretch>
@@ -7484,7 +7379,7 @@
                   <pic:spPr bwMode="auto">
                     <a:xfrm>
                       <a:off x="0" y="0"/>
-                      <a:ext cx="5760000" cy="1547463"/>
+                      <a:ext cx="5760085" cy="1547495"/>
                     </a:xfrm>
                     <a:prstGeom prst="rect">
                       <a:avLst/>
@@ -7514,7 +7409,7 @@
           <w:sz w:val="24"/>
           <w:szCs w:val="20"/>
         </w:rPr>
-        <w:t xml:space="preserve">Módulo LAB — Administrador.</w:t>
+        <w:t>Módulo LAB — Administrador.</w:t>
       </w:r>
     </w:p>
     <w:p>
@@ -7527,15 +7422,12 @@
         </w:rPr>
       </w:pPr>
       <w:r>
-        <w:rPr>
-          <w:sz w:val="24"/>
-          <w:szCs w:val="20"/>
-        </w:rPr>
+        <w:rPr/>
         <w:drawing>
           <wp:inline distT="0" distB="0" distL="0" distR="0">
-            <wp:extent cx="5760000" cy="2014158"/>
+            <wp:extent cx="5760085" cy="2014220"/>
             <wp:effectExtent l="0" t="0" r="0" b="0"/>
-            <wp:docPr id="910" name="Picture 910" descr=""/>
+            <wp:docPr id="11" name="Picture 910" descr=""/>
             <wp:cNvGraphicFramePr>
               <a:graphicFrameLocks xmlns:a="http://schemas.openxmlformats.org/drawingml/2006/main" noChangeAspect="1"/>
             </wp:cNvGraphicFramePr>
@@ -7543,13 +7435,13 @@
               <a:graphicData uri="http://schemas.openxmlformats.org/drawingml/2006/picture">
                 <pic:pic xmlns:pic="http://schemas.openxmlformats.org/drawingml/2006/picture">
                   <pic:nvPicPr>
-                    <pic:cNvPr id="910" name="Picture 910" descr=""/>
+                    <pic:cNvPr id="11" name="Picture 910" descr=""/>
                     <pic:cNvPicPr>
                       <a:picLocks noChangeAspect="1" noChangeArrowheads="1"/>
                     </pic:cNvPicPr>
                   </pic:nvPicPr>
                   <pic:blipFill>
-                    <a:blip r:embed="rId57"/>
+                    <a:blip r:embed="rId12"/>
                     <a:stretch>
                       <a:fillRect/>
                     </a:stretch>
@@ -7557,7 +7449,7 @@
                   <pic:spPr bwMode="auto">
                     <a:xfrm>
                       <a:off x="0" y="0"/>
-                      <a:ext cx="5760000" cy="2014158"/>
+                      <a:ext cx="5760085" cy="2014220"/>
                     </a:xfrm>
                     <a:prstGeom prst="rect">
                       <a:avLst/>
@@ -7587,7 +7479,7 @@
           <w:sz w:val="24"/>
           <w:szCs w:val="20"/>
         </w:rPr>
-        <w:t xml:space="preserve">Módulo Seguridad (micro-SIEM) — Administrador.</w:t>
+        <w:t>Módulo Seguridad (micro-SIEM) — Administrador.</w:t>
       </w:r>
     </w:p>
     <w:p>
@@ -7600,15 +7492,12 @@
         </w:rPr>
       </w:pPr>
       <w:r>
-        <w:rPr>
-          <w:sz w:val="24"/>
-          <w:szCs w:val="20"/>
-        </w:rPr>
+        <w:rPr/>
         <w:drawing>
           <wp:inline distT="0" distB="0" distL="0" distR="0">
-            <wp:extent cx="5760000" cy="2640512"/>
+            <wp:extent cx="5760085" cy="2640330"/>
             <wp:effectExtent l="0" t="0" r="0" b="0"/>
-            <wp:docPr id="911" name="Picture 911" descr=""/>
+            <wp:docPr id="12" name="Picture 911" descr=""/>
             <wp:cNvGraphicFramePr>
               <a:graphicFrameLocks xmlns:a="http://schemas.openxmlformats.org/drawingml/2006/main" noChangeAspect="1"/>
             </wp:cNvGraphicFramePr>
@@ -7616,13 +7505,13 @@
               <a:graphicData uri="http://schemas.openxmlformats.org/drawingml/2006/picture">
                 <pic:pic xmlns:pic="http://schemas.openxmlformats.org/drawingml/2006/picture">
                   <pic:nvPicPr>
-                    <pic:cNvPr id="911" name="Picture 911" descr=""/>
+                    <pic:cNvPr id="12" name="Picture 911" descr=""/>
                     <pic:cNvPicPr>
                       <a:picLocks noChangeAspect="1" noChangeArrowheads="1"/>
                     </pic:cNvPicPr>
                   </pic:nvPicPr>
                   <pic:blipFill>
-                    <a:blip r:embed="rId58"/>
+                    <a:blip r:embed="rId13"/>
                     <a:stretch>
                       <a:fillRect/>
                     </a:stretch>
@@ -7630,7 +7519,7 @@
                   <pic:spPr bwMode="auto">
                     <a:xfrm>
                       <a:off x="0" y="0"/>
-                      <a:ext cx="5760000" cy="2640512"/>
+                      <a:ext cx="5760085" cy="2640330"/>
                     </a:xfrm>
                     <a:prstGeom prst="rect">
                       <a:avLst/>
@@ -7660,7 +7549,7 @@
           <w:sz w:val="24"/>
           <w:szCs w:val="20"/>
         </w:rPr>
-        <w:t xml:space="preserve">Módulo Sistema — Administrador.</w:t>
+        <w:t>Módulo Sistema — Administrador.</w:t>
       </w:r>
     </w:p>
     <w:p>
@@ -7676,8 +7565,9 @@
       </w:pPr>
       <w:r>
         <w:rPr>
-          <w:sz w:val="24"/>
-          <w:szCs w:val="20"/>
+          <w:rFonts w:cs="Arial"/>
+          <w:b w:val="false"/>
+          <w:i/>
         </w:rPr>
       </w:r>
     </w:p>
@@ -7694,8 +7584,9 @@
       </w:pPr>
       <w:r>
         <w:rPr>
-          <w:sz w:val="24"/>
-          <w:szCs w:val="20"/>
+          <w:rFonts w:cs="Arial"/>
+          <w:b w:val="false"/>
+          <w:i/>
         </w:rPr>
       </w:r>
     </w:p>
@@ -7712,8 +7603,9 @@
       </w:pPr>
       <w:r>
         <w:rPr>
-          <w:sz w:val="24"/>
-          <w:szCs w:val="20"/>
+          <w:rFonts w:cs="Arial"/>
+          <w:b w:val="false"/>
+          <w:i/>
         </w:rPr>
       </w:r>
     </w:p>
@@ -7730,8 +7622,9 @@
       </w:pPr>
       <w:r>
         <w:rPr>
-          <w:sz w:val="24"/>
-          <w:szCs w:val="20"/>
+          <w:rFonts w:cs="Arial"/>
+          <w:b w:val="false"/>
+          <w:i/>
         </w:rPr>
       </w:r>
     </w:p>
@@ -7835,8 +7728,8 @@
       </w:pPr>
       <w:r>
         <w:rPr>
-          <w:sz w:val="24"/>
-          <w:szCs w:val="20"/>
+          <w:rFonts w:cs="Arial"/>
+          <w:b w:val="false"/>
         </w:rPr>
       </w:r>
     </w:p>
@@ -7922,8 +7815,8 @@
       </w:pPr>
       <w:r>
         <w:rPr>
-          <w:sz w:val="24"/>
-          <w:szCs w:val="20"/>
+          <w:rFonts w:cs="Arial"/>
+          <w:b w:val="false"/>
         </w:rPr>
       </w:r>
     </w:p>
@@ -8027,8 +7920,8 @@
       </w:pPr>
       <w:r>
         <w:rPr>
-          <w:sz w:val="24"/>
-          <w:szCs w:val="20"/>
+          <w:rFonts w:cs="Arial"/>
+          <w:b w:val="false"/>
         </w:rPr>
       </w:r>
     </w:p>
@@ -8096,8 +7989,8 @@
       </w:pPr>
       <w:r>
         <w:rPr>
-          <w:sz w:val="24"/>
-          <w:szCs w:val="20"/>
+          <w:rFonts w:cs="Arial"/>
+          <w:b w:val="false"/>
         </w:rPr>
       </w:r>
     </w:p>
@@ -8183,8 +8076,8 @@
       </w:pPr>
       <w:r>
         <w:rPr>
-          <w:sz w:val="24"/>
-          <w:szCs w:val="20"/>
+          <w:rFonts w:cs="Arial"/>
+          <w:b w:val="false"/>
         </w:rPr>
       </w:r>
     </w:p>
@@ -8270,8 +8163,8 @@
       </w:pPr>
       <w:r>
         <w:rPr>
-          <w:sz w:val="24"/>
-          <w:szCs w:val="20"/>
+          <w:rFonts w:cs="Arial"/>
+          <w:b w:val="false"/>
         </w:rPr>
       </w:r>
     </w:p>
@@ -8357,8 +8250,8 @@
       </w:pPr>
       <w:r>
         <w:rPr>
-          <w:sz w:val="24"/>
-          <w:szCs w:val="20"/>
+          <w:rFonts w:cs="Arial"/>
+          <w:b w:val="false"/>
         </w:rPr>
       </w:r>
     </w:p>
@@ -8485,8 +8378,8 @@
       </w:pPr>
       <w:r>
         <w:rPr>
-          <w:sz w:val="24"/>
-          <w:szCs w:val="20"/>
+          <w:rFonts w:cs="Arial"/>
+          <w:b/>
         </w:rPr>
       </w:r>
     </w:p>
@@ -8518,8 +8411,8 @@
       </w:pPr>
       <w:r>
         <w:rPr>
-          <w:sz w:val="24"/>
-          <w:szCs w:val="20"/>
+          <w:rFonts w:cs="Arial"/>
+          <w:b/>
         </w:rPr>
       </w:r>
     </w:p>
@@ -8568,15 +8461,12 @@
         </w:rPr>
       </w:pPr>
       <w:r>
-        <w:rPr>
-          <w:sz w:val="24"/>
-          <w:szCs w:val="20"/>
-        </w:rPr>
+        <w:rPr/>
         <w:drawing>
           <wp:inline distT="0" distB="0" distL="0" distR="0">
             <wp:extent cx="2695575" cy="5360035"/>
             <wp:effectExtent l="0" t="0" r="0" b="0"/>
-            <wp:docPr id="2" name="Picture 2" descr=""/>
+            <wp:docPr id="13" name="Picture 2" descr=""/>
             <wp:cNvGraphicFramePr>
               <a:graphicFrameLocks xmlns:a="http://schemas.openxmlformats.org/drawingml/2006/main" noChangeAspect="1"/>
             </wp:cNvGraphicFramePr>
@@ -8584,13 +8474,13 @@
               <a:graphicData uri="http://schemas.openxmlformats.org/drawingml/2006/picture">
                 <pic:pic xmlns:pic="http://schemas.openxmlformats.org/drawingml/2006/picture">
                   <pic:nvPicPr>
-                    <pic:cNvPr id="2" name="Picture 2" descr=""/>
+                    <pic:cNvPr id="13" name="Picture 2" descr=""/>
                     <pic:cNvPicPr>
                       <a:picLocks noChangeAspect="1" noChangeArrowheads="1"/>
                     </pic:cNvPicPr>
                   </pic:nvPicPr>
                   <pic:blipFill>
-                    <a:blip r:embed="rId3"/>
+                    <a:blip r:embed="rId14"/>
                     <a:stretch>
                       <a:fillRect/>
                     </a:stretch>
@@ -8673,29 +8563,26 @@
       </w:pPr>
       <w:r>
         <w:rPr>
-          <w:sz w:val="24"/>
-          <w:szCs w:val="20"/>
-        </w:rPr>
-      </w:r>
-    </w:p>
-    <w:p>
-      <w:pPr>
-        <w:pStyle w:val="normal1"/>
-        <w:rPr>
-          <w:sz w:val="24"/>
-          <w:szCs w:val="20"/>
-        </w:rPr>
-      </w:pPr>
-      <w:r>
-        <w:rPr>
-          <w:sz w:val="24"/>
-          <w:szCs w:val="20"/>
-        </w:rPr>
+          <w:rFonts w:cs="Arial"/>
+          <w:b w:val="false"/>
+        </w:rPr>
+      </w:r>
+    </w:p>
+    <w:p>
+      <w:pPr>
+        <w:pStyle w:val="normal1"/>
+        <w:rPr>
+          <w:sz w:val="24"/>
+          <w:szCs w:val="20"/>
+        </w:rPr>
+      </w:pPr>
+      <w:r>
+        <w:rPr/>
         <w:drawing>
           <wp:inline distT="0" distB="0" distL="0" distR="0">
             <wp:extent cx="3994150" cy="6688455"/>
             <wp:effectExtent l="0" t="0" r="0" b="0"/>
-            <wp:docPr id="3" name="Picture 3" descr=""/>
+            <wp:docPr id="14" name="Picture 3" descr=""/>
             <wp:cNvGraphicFramePr>
               <a:graphicFrameLocks xmlns:a="http://schemas.openxmlformats.org/drawingml/2006/main" noChangeAspect="1"/>
             </wp:cNvGraphicFramePr>
@@ -8703,13 +8590,13 @@
               <a:graphicData uri="http://schemas.openxmlformats.org/drawingml/2006/picture">
                 <pic:pic xmlns:pic="http://schemas.openxmlformats.org/drawingml/2006/picture">
                   <pic:nvPicPr>
-                    <pic:cNvPr id="3" name="Picture 3" descr=""/>
+                    <pic:cNvPr id="14" name="Picture 3" descr=""/>
                     <pic:cNvPicPr>
                       <a:picLocks noChangeAspect="1" noChangeArrowheads="1"/>
                     </pic:cNvPicPr>
                   </pic:nvPicPr>
                   <pic:blipFill>
-                    <a:blip r:embed="rId4"/>
+                    <a:blip r:embed="rId15"/>
                     <a:stretch>
                       <a:fillRect/>
                     </a:stretch>
@@ -8791,15 +8678,12 @@
         </w:rPr>
       </w:pPr>
       <w:r>
-        <w:rPr>
-          <w:sz w:val="24"/>
-          <w:szCs w:val="20"/>
-        </w:rPr>
+        <w:rPr/>
         <w:drawing>
           <wp:inline distT="0" distB="0" distL="0" distR="0">
             <wp:extent cx="3640455" cy="6609080"/>
             <wp:effectExtent l="0" t="0" r="0" b="0"/>
-            <wp:docPr id="4" name="Picture 4" descr=""/>
+            <wp:docPr id="15" name="Picture 4" descr=""/>
             <wp:cNvGraphicFramePr>
               <a:graphicFrameLocks xmlns:a="http://schemas.openxmlformats.org/drawingml/2006/main" noChangeAspect="1"/>
             </wp:cNvGraphicFramePr>
@@ -8807,13 +8691,13 @@
               <a:graphicData uri="http://schemas.openxmlformats.org/drawingml/2006/picture">
                 <pic:pic xmlns:pic="http://schemas.openxmlformats.org/drawingml/2006/picture">
                   <pic:nvPicPr>
-                    <pic:cNvPr id="4" name="Picture 4" descr=""/>
+                    <pic:cNvPr id="15" name="Picture 4" descr=""/>
                     <pic:cNvPicPr>
                       <a:picLocks noChangeAspect="1" noChangeArrowheads="1"/>
                     </pic:cNvPicPr>
                   </pic:nvPicPr>
                   <pic:blipFill>
-                    <a:blip r:embed="rId5"/>
+                    <a:blip r:embed="rId16"/>
                     <a:stretch>
                       <a:fillRect/>
                     </a:stretch>
@@ -8896,15 +8780,12 @@
         </w:rPr>
       </w:pPr>
       <w:r>
-        <w:rPr>
-          <w:sz w:val="24"/>
-          <w:szCs w:val="20"/>
-        </w:rPr>
+        <w:rPr/>
         <w:drawing>
           <wp:inline distT="0" distB="0" distL="0" distR="0">
             <wp:extent cx="2641600" cy="6657975"/>
             <wp:effectExtent l="0" t="0" r="0" b="0"/>
-            <wp:docPr id="5" name="Picture 5" descr=""/>
+            <wp:docPr id="16" name="Picture 5" descr=""/>
             <wp:cNvGraphicFramePr>
               <a:graphicFrameLocks xmlns:a="http://schemas.openxmlformats.org/drawingml/2006/main" noChangeAspect="1"/>
             </wp:cNvGraphicFramePr>
@@ -8912,13 +8793,13 @@
               <a:graphicData uri="http://schemas.openxmlformats.org/drawingml/2006/picture">
                 <pic:pic xmlns:pic="http://schemas.openxmlformats.org/drawingml/2006/picture">
                   <pic:nvPicPr>
-                    <pic:cNvPr id="5" name="Picture 5" descr=""/>
+                    <pic:cNvPr id="16" name="Picture 5" descr=""/>
                     <pic:cNvPicPr>
                       <a:picLocks noChangeAspect="1" noChangeArrowheads="1"/>
                     </pic:cNvPicPr>
                   </pic:nvPicPr>
                   <pic:blipFill>
-                    <a:blip r:embed="rId6"/>
+                    <a:blip r:embed="rId17"/>
                     <a:stretch>
                       <a:fillRect/>
                     </a:stretch>
@@ -9071,8 +8952,8 @@
       </w:pPr>
       <w:r>
         <w:rPr>
-          <w:sz w:val="24"/>
-          <w:szCs w:val="20"/>
+          <w:rFonts w:cs="Arial"/>
+          <w:b w:val="false"/>
         </w:rPr>
       </w:r>
     </w:p>
@@ -9158,8 +9039,8 @@
       </w:pPr>
       <w:r>
         <w:rPr>
-          <w:sz w:val="24"/>
-          <w:szCs w:val="20"/>
+          <w:rFonts w:cs="Arial"/>
+          <w:b w:val="false"/>
         </w:rPr>
       </w:r>
     </w:p>
@@ -9227,8 +9108,8 @@
       </w:pPr>
       <w:r>
         <w:rPr>
-          <w:sz w:val="24"/>
-          <w:szCs w:val="20"/>
+          <w:rFonts w:cs="Arial"/>
+          <w:b w:val="false"/>
         </w:rPr>
       </w:r>
     </w:p>
@@ -9242,8 +9123,8 @@
       </w:pPr>
       <w:r>
         <w:rPr>
-          <w:sz w:val="24"/>
-          <w:szCs w:val="20"/>
+          <w:rFonts w:cs="Arial"/>
+          <w:b w:val="false"/>
         </w:rPr>
       </w:r>
     </w:p>
@@ -9257,8 +9138,8 @@
       </w:pPr>
       <w:r>
         <w:rPr>
-          <w:sz w:val="24"/>
-          <w:szCs w:val="20"/>
+          <w:rFonts w:cs="Arial"/>
+          <w:b w:val="false"/>
         </w:rPr>
       </w:r>
     </w:p>
@@ -9272,8 +9153,8 @@
       </w:pPr>
       <w:r>
         <w:rPr>
-          <w:sz w:val="24"/>
-          <w:szCs w:val="20"/>
+          <w:rFonts w:cs="Arial"/>
+          <w:b w:val="false"/>
         </w:rPr>
       </w:r>
     </w:p>
@@ -9287,8 +9168,8 @@
       </w:pPr>
       <w:r>
         <w:rPr>
-          <w:sz w:val="24"/>
-          <w:szCs w:val="20"/>
+          <w:rFonts w:cs="Arial"/>
+          <w:b w:val="false"/>
         </w:rPr>
       </w:r>
     </w:p>
@@ -9302,8 +9183,8 @@
       </w:pPr>
       <w:r>
         <w:rPr>
-          <w:sz w:val="24"/>
-          <w:szCs w:val="20"/>
+          <w:rFonts w:cs="Arial"/>
+          <w:b w:val="false"/>
         </w:rPr>
       </w:r>
     </w:p>
@@ -9317,8 +9198,8 @@
       </w:pPr>
       <w:r>
         <w:rPr>
-          <w:sz w:val="24"/>
-          <w:szCs w:val="20"/>
+          <w:rFonts w:cs="Arial"/>
+          <w:b w:val="false"/>
         </w:rPr>
       </w:r>
     </w:p>
@@ -9332,8 +9213,8 @@
       </w:pPr>
       <w:r>
         <w:rPr>
-          <w:sz w:val="24"/>
-          <w:szCs w:val="20"/>
+          <w:rFonts w:cs="Arial"/>
+          <w:b w:val="false"/>
         </w:rPr>
       </w:r>
     </w:p>
@@ -9347,8 +9228,8 @@
       </w:pPr>
       <w:r>
         <w:rPr>
-          <w:sz w:val="24"/>
-          <w:szCs w:val="20"/>
+          <w:rFonts w:cs="Arial"/>
+          <w:b w:val="false"/>
         </w:rPr>
       </w:r>
     </w:p>
@@ -9362,8 +9243,8 @@
       </w:pPr>
       <w:r>
         <w:rPr>
-          <w:sz w:val="24"/>
-          <w:szCs w:val="20"/>
+          <w:rFonts w:cs="Arial"/>
+          <w:b w:val="false"/>
         </w:rPr>
       </w:r>
     </w:p>
@@ -9377,8 +9258,8 @@
       </w:pPr>
       <w:r>
         <w:rPr>
-          <w:sz w:val="24"/>
-          <w:szCs w:val="20"/>
+          <w:rFonts w:cs="Arial"/>
+          <w:b w:val="false"/>
         </w:rPr>
       </w:r>
     </w:p>
@@ -9392,8 +9273,8 @@
       </w:pPr>
       <w:r>
         <w:rPr>
-          <w:sz w:val="24"/>
-          <w:szCs w:val="20"/>
+          <w:rFonts w:cs="Arial"/>
+          <w:b w:val="false"/>
         </w:rPr>
       </w:r>
     </w:p>
@@ -9407,8 +9288,8 @@
       </w:pPr>
       <w:r>
         <w:rPr>
-          <w:sz w:val="24"/>
-          <w:szCs w:val="20"/>
+          <w:rFonts w:cs="Arial"/>
+          <w:b w:val="false"/>
         </w:rPr>
       </w:r>
     </w:p>
@@ -9422,8 +9303,8 @@
       </w:pPr>
       <w:r>
         <w:rPr>
-          <w:sz w:val="24"/>
-          <w:szCs w:val="20"/>
+          <w:rFonts w:cs="Arial"/>
+          <w:b w:val="false"/>
         </w:rPr>
       </w:r>
     </w:p>
@@ -9437,8 +9318,8 @@
       </w:pPr>
       <w:r>
         <w:rPr>
-          <w:sz w:val="24"/>
-          <w:szCs w:val="20"/>
+          <w:rFonts w:cs="Arial"/>
+          <w:b w:val="false"/>
         </w:rPr>
       </w:r>
     </w:p>
@@ -9452,8 +9333,8 @@
       </w:pPr>
       <w:r>
         <w:rPr>
-          <w:sz w:val="24"/>
-          <w:szCs w:val="20"/>
+          <w:rFonts w:cs="Arial"/>
+          <w:b w:val="false"/>
         </w:rPr>
       </w:r>
     </w:p>
@@ -9467,8 +9348,8 @@
       </w:pPr>
       <w:r>
         <w:rPr>
-          <w:sz w:val="24"/>
-          <w:szCs w:val="20"/>
+          <w:rFonts w:cs="Arial"/>
+          <w:b w:val="false"/>
         </w:rPr>
       </w:r>
     </w:p>
@@ -9482,8 +9363,8 @@
       </w:pPr>
       <w:r>
         <w:rPr>
-          <w:sz w:val="24"/>
-          <w:szCs w:val="20"/>
+          <w:rFonts w:cs="Arial"/>
+          <w:b w:val="false"/>
         </w:rPr>
       </w:r>
     </w:p>
@@ -9497,8 +9378,8 @@
       </w:pPr>
       <w:r>
         <w:rPr>
-          <w:sz w:val="24"/>
-          <w:szCs w:val="20"/>
+          <w:rFonts w:cs="Arial"/>
+          <w:b w:val="false"/>
         </w:rPr>
       </w:r>
     </w:p>
@@ -9512,8 +9393,8 @@
       </w:pPr>
       <w:r>
         <w:rPr>
-          <w:sz w:val="24"/>
-          <w:szCs w:val="20"/>
+          <w:rFonts w:cs="Arial"/>
+          <w:b w:val="false"/>
         </w:rPr>
       </w:r>
     </w:p>
@@ -9545,8 +9426,8 @@
       </w:pPr>
       <w:r>
         <w:rPr>
-          <w:sz w:val="24"/>
-          <w:szCs w:val="20"/>
+          <w:rFonts w:cs="Arial"/>
+          <w:b/>
         </w:rPr>
       </w:r>
     </w:p>
@@ -9596,29 +9477,26 @@
       </w:pPr>
       <w:r>
         <w:rPr>
-          <w:sz w:val="24"/>
-          <w:szCs w:val="20"/>
-        </w:rPr>
-      </w:r>
-    </w:p>
-    <w:p>
-      <w:pPr>
-        <w:pStyle w:val="normal1"/>
-        <w:rPr>
-          <w:sz w:val="24"/>
-          <w:szCs w:val="20"/>
-        </w:rPr>
-      </w:pPr>
-      <w:r>
-        <w:rPr>
-          <w:sz w:val="24"/>
-          <w:szCs w:val="20"/>
-        </w:rPr>
+          <w:rFonts w:cs="Arial"/>
+          <w:b w:val="false"/>
+        </w:rPr>
+      </w:r>
+    </w:p>
+    <w:p>
+      <w:pPr>
+        <w:pStyle w:val="normal1"/>
+        <w:rPr>
+          <w:sz w:val="24"/>
+          <w:szCs w:val="20"/>
+        </w:rPr>
+      </w:pPr>
+      <w:r>
+        <w:rPr/>
         <w:drawing>
           <wp:inline distT="0" distB="0" distL="0" distR="0">
             <wp:extent cx="5182235" cy="5005705"/>
             <wp:effectExtent l="0" t="0" r="0" b="0"/>
-            <wp:docPr id="6" name="Picture 6" descr=""/>
+            <wp:docPr id="17" name="Picture 6" descr=""/>
             <wp:cNvGraphicFramePr>
               <a:graphicFrameLocks xmlns:a="http://schemas.openxmlformats.org/drawingml/2006/main" noChangeAspect="1"/>
             </wp:cNvGraphicFramePr>
@@ -9626,13 +9504,13 @@
               <a:graphicData uri="http://schemas.openxmlformats.org/drawingml/2006/picture">
                 <pic:pic xmlns:pic="http://schemas.openxmlformats.org/drawingml/2006/picture">
                   <pic:nvPicPr>
-                    <pic:cNvPr id="6" name="Picture 6" descr=""/>
+                    <pic:cNvPr id="17" name="Picture 6" descr=""/>
                     <pic:cNvPicPr>
                       <a:picLocks noChangeAspect="1" noChangeArrowheads="1"/>
                     </pic:cNvPicPr>
                   </pic:nvPicPr>
                   <pic:blipFill>
-                    <a:blip r:embed="rId7"/>
+                    <a:blip r:embed="rId18"/>
                     <a:stretch>
                       <a:fillRect/>
                     </a:stretch>
@@ -9809,8 +9687,8 @@
       </w:pPr>
       <w:r>
         <w:rPr>
-          <w:sz w:val="24"/>
-          <w:szCs w:val="20"/>
+          <w:rFonts w:cs="Arial"/>
+          <w:b/>
         </w:rPr>
       </w:r>
     </w:p>
@@ -9824,15 +9702,12 @@
         </w:rPr>
       </w:pPr>
       <w:r>
-        <w:rPr>
-          <w:sz w:val="24"/>
-          <w:szCs w:val="20"/>
-        </w:rPr>
+        <w:rPr/>
         <w:drawing>
           <wp:inline distT="0" distB="0" distL="0" distR="0">
             <wp:extent cx="3654425" cy="2996565"/>
             <wp:effectExtent l="0" t="0" r="0" b="0"/>
-            <wp:docPr id="7" name="Picture 7" descr=""/>
+            <wp:docPr id="18" name="Picture 7" descr=""/>
             <wp:cNvGraphicFramePr>
               <a:graphicFrameLocks xmlns:a="http://schemas.openxmlformats.org/drawingml/2006/main" noChangeAspect="1"/>
             </wp:cNvGraphicFramePr>
@@ -9840,13 +9715,13 @@
               <a:graphicData uri="http://schemas.openxmlformats.org/drawingml/2006/picture">
                 <pic:pic xmlns:pic="http://schemas.openxmlformats.org/drawingml/2006/picture">
                   <pic:nvPicPr>
-                    <pic:cNvPr id="7" name="Picture 7" descr=""/>
+                    <pic:cNvPr id="18" name="Picture 7" descr=""/>
                     <pic:cNvPicPr>
                       <a:picLocks noChangeAspect="1" noChangeArrowheads="1"/>
                     </pic:cNvPicPr>
                   </pic:nvPicPr>
                   <pic:blipFill>
-                    <a:blip r:embed="rId8"/>
+                    <a:blip r:embed="rId19"/>
                     <a:stretch>
                       <a:fillRect/>
                     </a:stretch>
@@ -9929,8 +9804,8 @@
       </w:pPr>
       <w:r>
         <w:rPr>
-          <w:sz w:val="24"/>
-          <w:szCs w:val="20"/>
+          <w:rFonts w:cs="Arial"/>
+          <w:b w:val="false"/>
         </w:rPr>
       </w:r>
     </w:p>
@@ -9944,15 +9819,12 @@
         </w:rPr>
       </w:pPr>
       <w:r>
-        <w:rPr>
-          <w:sz w:val="24"/>
-          <w:szCs w:val="20"/>
-        </w:rPr>
+        <w:rPr/>
         <w:drawing>
           <wp:inline distT="0" distB="0" distL="0" distR="0">
             <wp:extent cx="3303270" cy="3251835"/>
             <wp:effectExtent l="0" t="0" r="0" b="0"/>
-            <wp:docPr id="8" name="Picture 8" descr=""/>
+            <wp:docPr id="19" name="Picture 8" descr=""/>
             <wp:cNvGraphicFramePr>
               <a:graphicFrameLocks xmlns:a="http://schemas.openxmlformats.org/drawingml/2006/main" noChangeAspect="1"/>
             </wp:cNvGraphicFramePr>
@@ -9960,13 +9832,13 @@
               <a:graphicData uri="http://schemas.openxmlformats.org/drawingml/2006/picture">
                 <pic:pic xmlns:pic="http://schemas.openxmlformats.org/drawingml/2006/picture">
                   <pic:nvPicPr>
-                    <pic:cNvPr id="8" name="Picture 8" descr=""/>
+                    <pic:cNvPr id="19" name="Picture 8" descr=""/>
                     <pic:cNvPicPr>
                       <a:picLocks noChangeAspect="1" noChangeArrowheads="1"/>
                     </pic:cNvPicPr>
                   </pic:nvPicPr>
                   <pic:blipFill>
-                    <a:blip r:embed="rId9"/>
+                    <a:blip r:embed="rId20"/>
                     <a:stretch>
                       <a:fillRect/>
                     </a:stretch>
@@ -10017,8 +9889,8 @@
       </w:pPr>
       <w:r>
         <w:rPr>
-          <w:sz w:val="24"/>
-          <w:szCs w:val="20"/>
+          <w:rFonts w:cs="Arial"/>
+          <w:b/>
         </w:rPr>
       </w:r>
     </w:p>
@@ -10068,8 +9940,8 @@
       </w:pPr>
       <w:r>
         <w:rPr>
-          <w:sz w:val="24"/>
-          <w:szCs w:val="20"/>
+          <w:rFonts w:cs="Arial"/>
+          <w:b w:val="false"/>
         </w:rPr>
       </w:r>
     </w:p>
@@ -10083,15 +9955,12 @@
         </w:rPr>
       </w:pPr>
       <w:r>
-        <w:rPr>
-          <w:sz w:val="24"/>
-          <w:szCs w:val="20"/>
-        </w:rPr>
+        <w:rPr/>
         <w:drawing>
           <wp:inline distT="0" distB="0" distL="0" distR="0">
             <wp:extent cx="5760720" cy="3404870"/>
             <wp:effectExtent l="0" t="0" r="0" b="0"/>
-            <wp:docPr id="9" name="Picture 9" descr=""/>
+            <wp:docPr id="20" name="Picture 9" descr=""/>
             <wp:cNvGraphicFramePr>
               <a:graphicFrameLocks xmlns:a="http://schemas.openxmlformats.org/drawingml/2006/main" noChangeAspect="1"/>
             </wp:cNvGraphicFramePr>
@@ -10099,13 +9968,13 @@
               <a:graphicData uri="http://schemas.openxmlformats.org/drawingml/2006/picture">
                 <pic:pic xmlns:pic="http://schemas.openxmlformats.org/drawingml/2006/picture">
                   <pic:nvPicPr>
-                    <pic:cNvPr id="9" name="Picture 9" descr=""/>
+                    <pic:cNvPr id="20" name="Picture 9" descr=""/>
                     <pic:cNvPicPr>
                       <a:picLocks noChangeAspect="1" noChangeArrowheads="1"/>
                     </pic:cNvPicPr>
                   </pic:nvPicPr>
                   <pic:blipFill>
-                    <a:blip r:embed="rId10"/>
+                    <a:blip r:embed="rId21"/>
                     <a:stretch>
                       <a:fillRect/>
                     </a:stretch>
@@ -10170,8 +10039,8 @@
       </w:pPr>
       <w:r>
         <w:rPr>
-          <w:sz w:val="24"/>
-          <w:szCs w:val="20"/>
+          <w:rFonts w:cs="Arial"/>
+          <w:b/>
         </w:rPr>
       </w:r>
     </w:p>
@@ -10221,8 +10090,8 @@
       </w:pPr>
       <w:r>
         <w:rPr>
-          <w:sz w:val="24"/>
-          <w:szCs w:val="20"/>
+          <w:rFonts w:cs="Arial"/>
+          <w:b w:val="false"/>
         </w:rPr>
       </w:r>
     </w:p>
@@ -10236,15 +10105,12 @@
         </w:rPr>
       </w:pPr>
       <w:r>
-        <w:rPr>
-          <w:sz w:val="24"/>
-          <w:szCs w:val="20"/>
-        </w:rPr>
+        <w:rPr/>
         <w:drawing>
           <wp:inline distT="0" distB="0" distL="0" distR="0">
             <wp:extent cx="5760720" cy="786765"/>
             <wp:effectExtent l="0" t="0" r="0" b="0"/>
-            <wp:docPr id="10" name="Picture 10" descr=""/>
+            <wp:docPr id="21" name="Picture 10" descr=""/>
             <wp:cNvGraphicFramePr>
               <a:graphicFrameLocks xmlns:a="http://schemas.openxmlformats.org/drawingml/2006/main" noChangeAspect="1"/>
             </wp:cNvGraphicFramePr>
@@ -10252,13 +10118,13 @@
               <a:graphicData uri="http://schemas.openxmlformats.org/drawingml/2006/picture">
                 <pic:pic xmlns:pic="http://schemas.openxmlformats.org/drawingml/2006/picture">
                   <pic:nvPicPr>
-                    <pic:cNvPr id="10" name="Picture 10" descr=""/>
+                    <pic:cNvPr id="21" name="Picture 10" descr=""/>
                     <pic:cNvPicPr>
                       <a:picLocks noChangeAspect="1" noChangeArrowheads="1"/>
                     </pic:cNvPicPr>
                   </pic:nvPicPr>
                   <pic:blipFill>
-                    <a:blip r:embed="rId11"/>
+                    <a:blip r:embed="rId22"/>
                     <a:stretch>
                       <a:fillRect/>
                     </a:stretch>
@@ -10435,8 +10301,8 @@
       </w:pPr>
       <w:r>
         <w:rPr>
-          <w:sz w:val="24"/>
-          <w:szCs w:val="20"/>
+          <w:rFonts w:cs="Arial"/>
+          <w:b/>
         </w:rPr>
       </w:r>
     </w:p>
@@ -10468,8 +10334,8 @@
       </w:pPr>
       <w:r>
         <w:rPr>
-          <w:sz w:val="24"/>
-          <w:szCs w:val="20"/>
+          <w:rFonts w:cs="Arial"/>
+          <w:b/>
         </w:rPr>
       </w:r>
     </w:p>
@@ -10483,15 +10349,12 @@
         </w:rPr>
       </w:pPr>
       <w:r>
-        <w:rPr>
-          <w:sz w:val="24"/>
-          <w:szCs w:val="20"/>
-        </w:rPr>
+        <w:rPr/>
         <w:drawing>
           <wp:inline distT="0" distB="0" distL="0" distR="0">
             <wp:extent cx="5669280" cy="4823460"/>
             <wp:effectExtent l="0" t="0" r="0" b="0"/>
-            <wp:docPr id="11" name="Picture 11" descr=""/>
+            <wp:docPr id="22" name="Picture 11" descr=""/>
             <wp:cNvGraphicFramePr>
               <a:graphicFrameLocks xmlns:a="http://schemas.openxmlformats.org/drawingml/2006/main" noChangeAspect="1"/>
             </wp:cNvGraphicFramePr>
@@ -10499,13 +10362,13 @@
               <a:graphicData uri="http://schemas.openxmlformats.org/drawingml/2006/picture">
                 <pic:pic xmlns:pic="http://schemas.openxmlformats.org/drawingml/2006/picture">
                   <pic:nvPicPr>
-                    <pic:cNvPr id="11" name="Picture 11" descr=""/>
+                    <pic:cNvPr id="22" name="Picture 11" descr=""/>
                     <pic:cNvPicPr>
                       <a:picLocks noChangeAspect="1" noChangeArrowheads="1"/>
                     </pic:cNvPicPr>
                   </pic:nvPicPr>
                   <pic:blipFill>
-                    <a:blip r:embed="rId12"/>
+                    <a:blip r:embed="rId23"/>
                     <a:stretch>
                       <a:fillRect/>
                     </a:stretch>
@@ -10657,6 +10520,102 @@
     <w:p>
       <w:pPr>
         <w:pStyle w:val="normal1"/>
+        <w:jc w:val="center"/>
+        <w:rPr>
+          <w:sz w:val="24"/>
+          <w:szCs w:val="20"/>
+        </w:rPr>
+      </w:pPr>
+      <w:r>
+        <w:rPr>
+          <w:sz w:val="24"/>
+          <w:szCs w:val="20"/>
+        </w:rPr>
+      </w:r>
+    </w:p>
+    <w:p>
+      <w:pPr>
+        <w:pStyle w:val="normal1"/>
+        <w:jc w:val="center"/>
+        <w:rPr>
+          <w:sz w:val="24"/>
+          <w:szCs w:val="20"/>
+        </w:rPr>
+      </w:pPr>
+      <w:r>
+        <w:rPr>
+          <w:sz w:val="24"/>
+          <w:szCs w:val="20"/>
+        </w:rPr>
+      </w:r>
+    </w:p>
+    <w:p>
+      <w:pPr>
+        <w:pStyle w:val="normal1"/>
+        <w:jc w:val="center"/>
+        <w:rPr>
+          <w:sz w:val="24"/>
+          <w:szCs w:val="20"/>
+        </w:rPr>
+      </w:pPr>
+      <w:r>
+        <w:rPr>
+          <w:sz w:val="24"/>
+          <w:szCs w:val="20"/>
+        </w:rPr>
+      </w:r>
+    </w:p>
+    <w:p>
+      <w:pPr>
+        <w:pStyle w:val="normal1"/>
+        <w:jc w:val="center"/>
+        <w:rPr>
+          <w:sz w:val="24"/>
+          <w:szCs w:val="20"/>
+        </w:rPr>
+      </w:pPr>
+      <w:r>
+        <w:rPr>
+          <w:sz w:val="24"/>
+          <w:szCs w:val="20"/>
+        </w:rPr>
+      </w:r>
+    </w:p>
+    <w:p>
+      <w:pPr>
+        <w:pStyle w:val="normal1"/>
+        <w:jc w:val="center"/>
+        <w:rPr>
+          <w:sz w:val="24"/>
+          <w:szCs w:val="20"/>
+        </w:rPr>
+      </w:pPr>
+      <w:r>
+        <w:rPr>
+          <w:sz w:val="24"/>
+          <w:szCs w:val="20"/>
+        </w:rPr>
+      </w:r>
+    </w:p>
+    <w:p>
+      <w:pPr>
+        <w:pStyle w:val="normal1"/>
+        <w:jc w:val="center"/>
+        <w:rPr>
+          <w:sz w:val="24"/>
+          <w:szCs w:val="20"/>
+        </w:rPr>
+      </w:pPr>
+      <w:r>
+        <w:rPr>
+          <w:sz w:val="24"/>
+          <w:szCs w:val="20"/>
+        </w:rPr>
+      </w:r>
+    </w:p>
+    <w:p>
+      <w:pPr>
+        <w:pStyle w:val="normal1"/>
         <w:rPr>
           <w:sz w:val="24"/>
           <w:szCs w:val="20"/>
@@ -10682,8 +10641,8 @@
       </w:pPr>
       <w:r>
         <w:rPr>
-          <w:sz w:val="24"/>
-          <w:szCs w:val="20"/>
+          <w:rFonts w:cs="Arial"/>
+          <w:b/>
         </w:rPr>
       </w:r>
     </w:p>
@@ -10697,15 +10656,12 @@
         </w:rPr>
       </w:pPr>
       <w:r>
-        <w:rPr>
-          <w:sz w:val="24"/>
-          <w:szCs w:val="20"/>
-        </w:rPr>
+        <w:rPr/>
         <w:drawing>
           <wp:inline distT="0" distB="0" distL="0" distR="0">
             <wp:extent cx="4603750" cy="3274695"/>
             <wp:effectExtent l="0" t="0" r="0" b="0"/>
-            <wp:docPr id="12" name="Picture 12" descr=""/>
+            <wp:docPr id="23" name="Picture 12" descr=""/>
             <wp:cNvGraphicFramePr>
               <a:graphicFrameLocks xmlns:a="http://schemas.openxmlformats.org/drawingml/2006/main" noChangeAspect="1"/>
             </wp:cNvGraphicFramePr>
@@ -10713,13 +10669,13 @@
               <a:graphicData uri="http://schemas.openxmlformats.org/drawingml/2006/picture">
                 <pic:pic xmlns:pic="http://schemas.openxmlformats.org/drawingml/2006/picture">
                   <pic:nvPicPr>
-                    <pic:cNvPr id="12" name="Picture 12" descr=""/>
+                    <pic:cNvPr id="23" name="Picture 12" descr=""/>
                     <pic:cNvPicPr>
                       <a:picLocks noChangeAspect="1" noChangeArrowheads="1"/>
                     </pic:cNvPicPr>
                   </pic:nvPicPr>
                   <pic:blipFill>
-                    <a:blip r:embed="rId13"/>
+                    <a:blip r:embed="rId24"/>
                     <a:stretch>
                       <a:fillRect/>
                     </a:stretch>
@@ -10802,8 +10758,8 @@
       </w:pPr>
       <w:r>
         <w:rPr>
-          <w:sz w:val="24"/>
-          <w:szCs w:val="20"/>
+          <w:rFonts w:cs="Arial"/>
+          <w:b w:val="false"/>
         </w:rPr>
       </w:r>
     </w:p>
@@ -10817,15 +10773,12 @@
         </w:rPr>
       </w:pPr>
       <w:r>
-        <w:rPr>
-          <w:sz w:val="24"/>
-          <w:szCs w:val="20"/>
-        </w:rPr>
+        <w:rPr/>
         <w:drawing>
           <wp:inline distT="0" distB="0" distL="0" distR="0">
             <wp:extent cx="5487035" cy="2795270"/>
             <wp:effectExtent l="0" t="0" r="0" b="0"/>
-            <wp:docPr id="13" name="Picture 13" descr=""/>
+            <wp:docPr id="24" name="Picture 13" descr=""/>
             <wp:cNvGraphicFramePr>
               <a:graphicFrameLocks xmlns:a="http://schemas.openxmlformats.org/drawingml/2006/main" noChangeAspect="1"/>
             </wp:cNvGraphicFramePr>
@@ -10833,13 +10786,13 @@
               <a:graphicData uri="http://schemas.openxmlformats.org/drawingml/2006/picture">
                 <pic:pic xmlns:pic="http://schemas.openxmlformats.org/drawingml/2006/picture">
                   <pic:nvPicPr>
-                    <pic:cNvPr id="13" name="Picture 13" descr=""/>
+                    <pic:cNvPr id="24" name="Picture 13" descr=""/>
                     <pic:cNvPicPr>
                       <a:picLocks noChangeAspect="1" noChangeArrowheads="1"/>
                     </pic:cNvPicPr>
                   </pic:nvPicPr>
                   <pic:blipFill>
-                    <a:blip r:embed="rId14"/>
+                    <a:blip r:embed="rId25"/>
                     <a:stretch>
                       <a:fillRect/>
                     </a:stretch>
@@ -10863,6 +10816,19 @@
     <w:p>
       <w:pPr>
         <w:pStyle w:val="normal1"/>
+        <w:jc w:val="center"/>
+        <w:rPr>
+          <w:sz w:val="24"/>
+          <w:szCs w:val="20"/>
+        </w:rPr>
+      </w:pPr>
+      <w:r>
+        <w:rPr/>
+      </w:r>
+    </w:p>
+    <w:p>
+      <w:pPr>
+        <w:pStyle w:val="normal1"/>
         <w:rPr>
           <w:sz w:val="24"/>
           <w:szCs w:val="20"/>
@@ -10888,8 +10854,8 @@
       </w:pPr>
       <w:r>
         <w:rPr>
-          <w:sz w:val="24"/>
-          <w:szCs w:val="20"/>
+          <w:rFonts w:cs="Arial"/>
+          <w:b/>
         </w:rPr>
       </w:r>
     </w:p>
@@ -10903,15 +10869,12 @@
         </w:rPr>
       </w:pPr>
       <w:r>
-        <w:rPr>
-          <w:sz w:val="24"/>
-          <w:szCs w:val="20"/>
-        </w:rPr>
+        <w:rPr/>
         <w:drawing>
           <wp:inline distT="0" distB="0" distL="0" distR="0">
             <wp:extent cx="5669280" cy="3592195"/>
             <wp:effectExtent l="0" t="0" r="0" b="0"/>
-            <wp:docPr id="14" name="Picture 14" descr=""/>
+            <wp:docPr id="25" name="Picture 14" descr=""/>
             <wp:cNvGraphicFramePr>
               <a:graphicFrameLocks xmlns:a="http://schemas.openxmlformats.org/drawingml/2006/main" noChangeAspect="1"/>
             </wp:cNvGraphicFramePr>
@@ -10919,13 +10882,13 @@
               <a:graphicData uri="http://schemas.openxmlformats.org/drawingml/2006/picture">
                 <pic:pic xmlns:pic="http://schemas.openxmlformats.org/drawingml/2006/picture">
                   <pic:nvPicPr>
-                    <pic:cNvPr id="14" name="Picture 14" descr=""/>
+                    <pic:cNvPr id="25" name="Picture 14" descr=""/>
                     <pic:cNvPicPr>
                       <a:picLocks noChangeAspect="1" noChangeArrowheads="1"/>
                     </pic:cNvPicPr>
                   </pic:nvPicPr>
                   <pic:blipFill>
-                    <a:blip r:embed="rId15"/>
+                    <a:blip r:embed="rId26"/>
                     <a:stretch>
                       <a:fillRect/>
                     </a:stretch>
@@ -10990,15 +10953,12 @@
         </w:rPr>
       </w:pPr>
       <w:r>
-        <w:rPr>
-          <w:sz w:val="24"/>
-          <w:szCs w:val="20"/>
-        </w:rPr>
+        <w:rPr/>
         <w:drawing>
           <wp:inline distT="0" distB="0" distL="0" distR="0">
             <wp:extent cx="5669280" cy="3112770"/>
             <wp:effectExtent l="0" t="0" r="0" b="0"/>
-            <wp:docPr id="15" name="Picture 15" descr=""/>
+            <wp:docPr id="26" name="Picture 15" descr=""/>
             <wp:cNvGraphicFramePr>
               <a:graphicFrameLocks xmlns:a="http://schemas.openxmlformats.org/drawingml/2006/main" noChangeAspect="1"/>
             </wp:cNvGraphicFramePr>
@@ -11006,13 +10966,13 @@
               <a:graphicData uri="http://schemas.openxmlformats.org/drawingml/2006/picture">
                 <pic:pic xmlns:pic="http://schemas.openxmlformats.org/drawingml/2006/picture">
                   <pic:nvPicPr>
-                    <pic:cNvPr id="15" name="Picture 15" descr=""/>
+                    <pic:cNvPr id="26" name="Picture 15" descr=""/>
                     <pic:cNvPicPr>
                       <a:picLocks noChangeAspect="1" noChangeArrowheads="1"/>
                     </pic:cNvPicPr>
                   </pic:nvPicPr>
                   <pic:blipFill>
-                    <a:blip r:embed="rId16"/>
+                    <a:blip r:embed="rId27"/>
                     <a:stretch>
                       <a:fillRect/>
                     </a:stretch>
@@ -11066,8 +11026,8 @@
       </w:pPr>
       <w:r>
         <w:rPr>
-          <w:sz w:val="24"/>
-          <w:szCs w:val="20"/>
+          <w:rFonts w:cs="Arial"/>
+          <w:b/>
         </w:rPr>
       </w:r>
     </w:p>
@@ -11117,8 +11077,8 @@
       </w:pPr>
       <w:r>
         <w:rPr>
-          <w:sz w:val="24"/>
-          <w:szCs w:val="20"/>
+          <w:rFonts w:cs="Arial"/>
+          <w:b w:val="false"/>
         </w:rPr>
       </w:r>
     </w:p>
@@ -11132,15 +11092,12 @@
         </w:rPr>
       </w:pPr>
       <w:r>
-        <w:rPr>
-          <w:sz w:val="24"/>
-          <w:szCs w:val="20"/>
-        </w:rPr>
+        <w:rPr/>
         <w:drawing>
           <wp:inline distT="0" distB="0" distL="0" distR="0">
             <wp:extent cx="5760720" cy="1744345"/>
             <wp:effectExtent l="0" t="0" r="0" b="0"/>
-            <wp:docPr id="16" name="Picture 16" descr=""/>
+            <wp:docPr id="27" name="Picture 16" descr=""/>
             <wp:cNvGraphicFramePr>
               <a:graphicFrameLocks xmlns:a="http://schemas.openxmlformats.org/drawingml/2006/main" noChangeAspect="1"/>
             </wp:cNvGraphicFramePr>
@@ -11148,13 +11105,13 @@
               <a:graphicData uri="http://schemas.openxmlformats.org/drawingml/2006/picture">
                 <pic:pic xmlns:pic="http://schemas.openxmlformats.org/drawingml/2006/picture">
                   <pic:nvPicPr>
-                    <pic:cNvPr id="16" name="Picture 16" descr=""/>
+                    <pic:cNvPr id="27" name="Picture 16" descr=""/>
                     <pic:cNvPicPr>
                       <a:picLocks noChangeAspect="1" noChangeArrowheads="1"/>
                     </pic:cNvPicPr>
                   </pic:nvPicPr>
                   <pic:blipFill>
-                    <a:blip r:embed="rId17"/>
+                    <a:blip r:embed="rId28"/>
                     <a:stretch>
                       <a:fillRect/>
                     </a:stretch>
@@ -11219,8 +11176,8 @@
       </w:pPr>
       <w:r>
         <w:rPr>
-          <w:sz w:val="24"/>
-          <w:szCs w:val="20"/>
+          <w:rFonts w:cs="Arial"/>
+          <w:b/>
         </w:rPr>
       </w:r>
     </w:p>
@@ -11252,8 +11209,8 @@
       </w:pPr>
       <w:r>
         <w:rPr>
-          <w:sz w:val="24"/>
-          <w:szCs w:val="20"/>
+          <w:rFonts w:cs="Arial"/>
+          <w:b w:val="false"/>
         </w:rPr>
       </w:r>
     </w:p>
@@ -11267,15 +11224,12 @@
         </w:rPr>
       </w:pPr>
       <w:r>
-        <w:rPr>
-          <w:sz w:val="24"/>
-          <w:szCs w:val="20"/>
-        </w:rPr>
+        <w:rPr/>
         <w:drawing>
           <wp:inline distT="0" distB="0" distL="0" distR="0">
             <wp:extent cx="5760720" cy="2609850"/>
             <wp:effectExtent l="0" t="0" r="0" b="0"/>
-            <wp:docPr id="17" name="Picture 17" descr=""/>
+            <wp:docPr id="28" name="Picture 17" descr=""/>
             <wp:cNvGraphicFramePr>
               <a:graphicFrameLocks xmlns:a="http://schemas.openxmlformats.org/drawingml/2006/main" noChangeAspect="1"/>
             </wp:cNvGraphicFramePr>
@@ -11283,13 +11237,13 @@
               <a:graphicData uri="http://schemas.openxmlformats.org/drawingml/2006/picture">
                 <pic:pic xmlns:pic="http://schemas.openxmlformats.org/drawingml/2006/picture">
                   <pic:nvPicPr>
-                    <pic:cNvPr id="17" name="Picture 17" descr=""/>
+                    <pic:cNvPr id="28" name="Picture 17" descr=""/>
                     <pic:cNvPicPr>
                       <a:picLocks noChangeAspect="1" noChangeArrowheads="1"/>
                     </pic:cNvPicPr>
                   </pic:nvPicPr>
                   <pic:blipFill>
-                    <a:blip r:embed="rId18"/>
+                    <a:blip r:embed="rId29"/>
                     <a:stretch>
                       <a:fillRect/>
                     </a:stretch>
@@ -11377,6 +11331,105 @@
     <w:p>
       <w:pPr>
         <w:pStyle w:val="normal1"/>
+        <w:rPr>
+          <w:sz w:val="24"/>
+          <w:szCs w:val="20"/>
+        </w:rPr>
+      </w:pPr>
+      <w:r>
+        <w:rPr>
+          <w:rFonts w:cs="Arial"/>
+          <w:b/>
+          <w:sz w:val="24"/>
+          <w:szCs w:val="20"/>
+        </w:rPr>
+        <w:t>3.5 Vista de despliegue</w:t>
+      </w:r>
+    </w:p>
+    <w:p>
+      <w:pPr>
+        <w:pStyle w:val="normal1"/>
+        <w:rPr>
+          <w:rFonts w:ascii="Arial" w:hAnsi="Arial" w:cs="Arial"/>
+          <w:b/>
+        </w:rPr>
+      </w:pPr>
+      <w:r>
+        <w:rPr>
+          <w:rFonts w:cs="Arial"/>
+          <w:b/>
+        </w:rPr>
+      </w:r>
+    </w:p>
+    <w:p>
+      <w:pPr>
+        <w:pStyle w:val="normal1"/>
+        <w:rPr>
+          <w:sz w:val="24"/>
+          <w:szCs w:val="20"/>
+        </w:rPr>
+      </w:pPr>
+      <w:r>
+        <w:rPr>
+          <w:rFonts w:cs="Arial"/>
+          <w:b/>
+          <w:sz w:val="24"/>
+          <w:szCs w:val="20"/>
+        </w:rPr>
+        <w:t>Diagrama de despliegue</w:t>
+      </w:r>
+    </w:p>
+    <w:p>
+      <w:pPr>
+        <w:pStyle w:val="normal1"/>
+        <w:rPr>
+          <w:rFonts w:ascii="Arial" w:hAnsi="Arial" w:cs="Arial"/>
+          <w:b/>
+        </w:rPr>
+      </w:pPr>
+      <w:r>
+        <w:rPr>
+          <w:rFonts w:cs="Arial"/>
+          <w:b/>
+        </w:rPr>
+      </w:r>
+    </w:p>
+    <w:p>
+      <w:pPr>
+        <w:pStyle w:val="normal1"/>
+        <w:rPr>
+          <w:sz w:val="24"/>
+          <w:szCs w:val="20"/>
+        </w:rPr>
+      </w:pPr>
+      <w:r>
+        <w:rPr>
+          <w:rFonts w:cs="Arial"/>
+          <w:b w:val="false"/>
+          <w:sz w:val="24"/>
+          <w:szCs w:val="20"/>
+        </w:rPr>
+        <w:t>El sistema se despliega en Vercel (proyecto dev-portfolio) bajo el dominio codebymike.tech. El pipeline de GitHub Actions corre pruebas de calidad, end-to-end, seguridad, accesibilidad y mutation testing; en push a main, un job adicional verifica el health check post-deploy y ejecuta rollback automático si el despliegue resulta insano.</w:t>
+      </w:r>
+    </w:p>
+    <w:p>
+      <w:pPr>
+        <w:pStyle w:val="normal1"/>
+        <w:rPr>
+          <w:rFonts w:ascii="Arial" w:hAnsi="Arial" w:cs="Arial"/>
+          <w:b w:val="false"/>
+        </w:rPr>
+      </w:pPr>
+      <w:r>
+        <w:rPr>
+          <w:rFonts w:cs="Arial"/>
+          <w:b w:val="false"/>
+        </w:rPr>
+      </w:r>
+    </w:p>
+    <w:p>
+      <w:pPr>
+        <w:pStyle w:val="normal1"/>
         <w:jc w:val="center"/>
         <w:rPr>
           <w:sz w:val="24"/>
@@ -11384,194 +11437,12 @@
         </w:rPr>
       </w:pPr>
       <w:r>
-        <w:rPr>
-          <w:sz w:val="24"/>
-          <w:szCs w:val="20"/>
-        </w:rPr>
-      </w:r>
-    </w:p>
-    <w:p>
-      <w:pPr>
-        <w:pStyle w:val="normal1"/>
-        <w:jc w:val="center"/>
-        <w:rPr>
-          <w:sz w:val="24"/>
-          <w:szCs w:val="20"/>
-        </w:rPr>
-      </w:pPr>
-      <w:r>
-        <w:rPr>
-          <w:sz w:val="24"/>
-          <w:szCs w:val="20"/>
-        </w:rPr>
-      </w:r>
-    </w:p>
-    <w:p>
-      <w:pPr>
-        <w:pStyle w:val="normal1"/>
-        <w:jc w:val="center"/>
-        <w:rPr>
-          <w:sz w:val="24"/>
-          <w:szCs w:val="20"/>
-        </w:rPr>
-      </w:pPr>
-      <w:r>
-        <w:rPr>
-          <w:sz w:val="24"/>
-          <w:szCs w:val="20"/>
-        </w:rPr>
-      </w:r>
-    </w:p>
-    <w:p>
-      <w:pPr>
-        <w:pStyle w:val="normal1"/>
-        <w:jc w:val="center"/>
-        <w:rPr>
-          <w:sz w:val="24"/>
-          <w:szCs w:val="20"/>
-        </w:rPr>
-      </w:pPr>
-      <w:r>
-        <w:rPr>
-          <w:sz w:val="24"/>
-          <w:szCs w:val="20"/>
-        </w:rPr>
-      </w:r>
-    </w:p>
-    <w:p>
-      <w:pPr>
-        <w:pStyle w:val="normal1"/>
-        <w:jc w:val="center"/>
-        <w:rPr>
-          <w:sz w:val="24"/>
-          <w:szCs w:val="20"/>
-        </w:rPr>
-      </w:pPr>
-      <w:r>
-        <w:rPr>
-          <w:sz w:val="24"/>
-          <w:szCs w:val="20"/>
-        </w:rPr>
-      </w:r>
-    </w:p>
-    <w:p>
-      <w:pPr>
-        <w:pStyle w:val="normal1"/>
-        <w:rPr>
-          <w:sz w:val="24"/>
-          <w:szCs w:val="20"/>
-        </w:rPr>
-      </w:pPr>
-      <w:r>
-        <w:rPr>
-          <w:rFonts w:cs="Arial"/>
-          <w:b/>
-          <w:sz w:val="24"/>
-          <w:szCs w:val="20"/>
-        </w:rPr>
-        <w:t>3.5 Vista de despliegue</w:t>
-      </w:r>
-    </w:p>
-    <w:p>
-      <w:pPr>
-        <w:pStyle w:val="normal1"/>
-        <w:rPr>
-          <w:rFonts w:ascii="Arial" w:hAnsi="Arial" w:cs="Arial"/>
-          <w:b/>
-        </w:rPr>
-      </w:pPr>
-      <w:r>
-        <w:rPr>
-          <w:sz w:val="24"/>
-          <w:szCs w:val="20"/>
-        </w:rPr>
-      </w:r>
-    </w:p>
-    <w:p>
-      <w:pPr>
-        <w:pStyle w:val="normal1"/>
-        <w:rPr>
-          <w:sz w:val="24"/>
-          <w:szCs w:val="20"/>
-        </w:rPr>
-      </w:pPr>
-      <w:r>
-        <w:rPr>
-          <w:rFonts w:cs="Arial"/>
-          <w:b/>
-          <w:sz w:val="24"/>
-          <w:szCs w:val="20"/>
-        </w:rPr>
-        <w:t>Diagrama de despliegue</w:t>
-      </w:r>
-    </w:p>
-    <w:p>
-      <w:pPr>
-        <w:pStyle w:val="normal1"/>
-        <w:rPr>
-          <w:rFonts w:ascii="Arial" w:hAnsi="Arial" w:cs="Arial"/>
-          <w:b/>
-        </w:rPr>
-      </w:pPr>
-      <w:r>
-        <w:rPr>
-          <w:sz w:val="24"/>
-          <w:szCs w:val="20"/>
-        </w:rPr>
-      </w:r>
-    </w:p>
-    <w:p>
-      <w:pPr>
-        <w:pStyle w:val="normal1"/>
-        <w:rPr>
-          <w:sz w:val="24"/>
-          <w:szCs w:val="20"/>
-        </w:rPr>
-      </w:pPr>
-      <w:r>
-        <w:rPr>
-          <w:rFonts w:cs="Arial"/>
-          <w:b w:val="false"/>
-          <w:sz w:val="24"/>
-          <w:szCs w:val="20"/>
-        </w:rPr>
-        <w:t>El sistema se despliega en Vercel (proyecto dev-portfolio) bajo el dominio codebymike.tech. El pipeline de GitHub Actions corre pruebas de calidad, end-to-end, seguridad, accesibilidad y mutation testing; en push a main, un job adicional verifica el health check post-deploy y ejecuta rollback automático si el despliegue resulta insano.</w:t>
-      </w:r>
-    </w:p>
-    <w:p>
-      <w:pPr>
-        <w:pStyle w:val="normal1"/>
-        <w:rPr>
-          <w:rFonts w:ascii="Arial" w:hAnsi="Arial" w:cs="Arial"/>
-          <w:b w:val="false"/>
-        </w:rPr>
-      </w:pPr>
-      <w:r>
-        <w:rPr>
-          <w:sz w:val="24"/>
-          <w:szCs w:val="20"/>
-        </w:rPr>
-      </w:r>
-    </w:p>
-    <w:p>
-      <w:pPr>
-        <w:pStyle w:val="normal1"/>
-        <w:jc w:val="center"/>
-        <w:rPr>
-          <w:sz w:val="24"/>
-          <w:szCs w:val="20"/>
-        </w:rPr>
-      </w:pPr>
-      <w:r>
-        <w:rPr>
-          <w:sz w:val="24"/>
-          <w:szCs w:val="20"/>
-        </w:rPr>
+        <w:rPr/>
         <w:drawing>
           <wp:inline distT="0" distB="0" distL="0" distR="0">
             <wp:extent cx="5760720" cy="1410970"/>
             <wp:effectExtent l="0" t="0" r="0" b="0"/>
-            <wp:docPr id="18" name="Picture 18" descr=""/>
+            <wp:docPr id="29" name="Picture 18" descr=""/>
             <wp:cNvGraphicFramePr>
               <a:graphicFrameLocks xmlns:a="http://schemas.openxmlformats.org/drawingml/2006/main" noChangeAspect="1"/>
             </wp:cNvGraphicFramePr>
@@ -11579,13 +11450,13 @@
               <a:graphicData uri="http://schemas.openxmlformats.org/drawingml/2006/picture">
                 <pic:pic xmlns:pic="http://schemas.openxmlformats.org/drawingml/2006/picture">
                   <pic:nvPicPr>
-                    <pic:cNvPr id="18" name="Picture 18" descr=""/>
+                    <pic:cNvPr id="29" name="Picture 18" descr=""/>
                     <pic:cNvPicPr>
                       <a:picLocks noChangeAspect="1" noChangeArrowheads="1"/>
                     </pic:cNvPicPr>
                   </pic:nvPicPr>
                   <pic:blipFill>
-                    <a:blip r:embed="rId19"/>
+                    <a:blip r:embed="rId30"/>
                     <a:stretch>
                       <a:fillRect/>
                     </a:stretch>
@@ -11650,8 +11521,8 @@
       </w:pPr>
       <w:r>
         <w:rPr>
-          <w:sz w:val="24"/>
-          <w:szCs w:val="20"/>
+          <w:rFonts w:cs="Arial"/>
+          <w:b/>
         </w:rPr>
       </w:r>
     </w:p>
@@ -11683,8 +11554,8 @@
       </w:pPr>
       <w:r>
         <w:rPr>
-          <w:sz w:val="24"/>
-          <w:szCs w:val="20"/>
+          <w:rFonts w:cs="Arial"/>
+          <w:b w:val="false"/>
         </w:rPr>
       </w:r>
     </w:p>
@@ -11698,15 +11569,12 @@
         </w:rPr>
       </w:pPr>
       <w:r>
-        <w:rPr>
-          <w:sz w:val="24"/>
-          <w:szCs w:val="20"/>
-        </w:rPr>
+        <w:rPr/>
         <w:drawing>
           <wp:inline distT="0" distB="0" distL="0" distR="0">
             <wp:extent cx="5760720" cy="791210"/>
             <wp:effectExtent l="0" t="0" r="0" b="0"/>
-            <wp:docPr id="19" name="Picture 19" descr=""/>
+            <wp:docPr id="30" name="Picture 19" descr=""/>
             <wp:cNvGraphicFramePr>
               <a:graphicFrameLocks xmlns:a="http://schemas.openxmlformats.org/drawingml/2006/main" noChangeAspect="1"/>
             </wp:cNvGraphicFramePr>
@@ -11714,13 +11582,13 @@
               <a:graphicData uri="http://schemas.openxmlformats.org/drawingml/2006/picture">
                 <pic:pic xmlns:pic="http://schemas.openxmlformats.org/drawingml/2006/picture">
                   <pic:nvPicPr>
-                    <pic:cNvPr id="19" name="Picture 19" descr=""/>
+                    <pic:cNvPr id="30" name="Picture 19" descr=""/>
                     <pic:cNvPicPr>
                       <a:picLocks noChangeAspect="1" noChangeArrowheads="1"/>
                     </pic:cNvPicPr>
                   </pic:nvPicPr>
                   <pic:blipFill>
-                    <a:blip r:embed="rId20"/>
+                    <a:blip r:embed="rId31"/>
                     <a:stretch>
                       <a:fillRect/>
                     </a:stretch>
@@ -11872,6 +11740,54 @@
     <w:p>
       <w:pPr>
         <w:pStyle w:val="normal1"/>
+        <w:jc w:val="center"/>
+        <w:rPr>
+          <w:sz w:val="24"/>
+          <w:szCs w:val="20"/>
+        </w:rPr>
+      </w:pPr>
+      <w:r>
+        <w:rPr>
+          <w:sz w:val="24"/>
+          <w:szCs w:val="20"/>
+        </w:rPr>
+      </w:r>
+    </w:p>
+    <w:p>
+      <w:pPr>
+        <w:pStyle w:val="normal1"/>
+        <w:jc w:val="center"/>
+        <w:rPr>
+          <w:sz w:val="24"/>
+          <w:szCs w:val="20"/>
+        </w:rPr>
+      </w:pPr>
+      <w:r>
+        <w:rPr>
+          <w:sz w:val="24"/>
+          <w:szCs w:val="20"/>
+        </w:rPr>
+      </w:r>
+    </w:p>
+    <w:p>
+      <w:pPr>
+        <w:pStyle w:val="normal1"/>
+        <w:jc w:val="center"/>
+        <w:rPr>
+          <w:sz w:val="24"/>
+          <w:szCs w:val="20"/>
+        </w:rPr>
+      </w:pPr>
+      <w:r>
+        <w:rPr>
+          <w:sz w:val="24"/>
+          <w:szCs w:val="20"/>
+        </w:rPr>
+      </w:r>
+    </w:p>
+    <w:p>
+      <w:pPr>
+        <w:pStyle w:val="normal1"/>
         <w:rPr>
           <w:sz w:val="24"/>
           <w:szCs w:val="20"/>
@@ -11897,8 +11813,8 @@
       </w:pPr>
       <w:r>
         <w:rPr>
-          <w:sz w:val="24"/>
-          <w:szCs w:val="20"/>
+          <w:rFonts w:cs="Arial"/>
+          <w:b/>
         </w:rPr>
       </w:r>
     </w:p>
@@ -11912,15 +11828,12 @@
         </w:rPr>
       </w:pPr>
       <w:r>
-        <w:rPr>
-          <w:sz w:val="24"/>
-          <w:szCs w:val="20"/>
-        </w:rPr>
+        <w:rPr/>
         <w:drawing>
           <wp:inline distT="0" distB="0" distL="0" distR="0">
             <wp:extent cx="1990090" cy="6813550"/>
             <wp:effectExtent l="0" t="0" r="0" b="0"/>
-            <wp:docPr id="20" name="Picture 20" descr=""/>
+            <wp:docPr id="31" name="Picture 20" descr=""/>
             <wp:cNvGraphicFramePr>
               <a:graphicFrameLocks xmlns:a="http://schemas.openxmlformats.org/drawingml/2006/main" noChangeAspect="1"/>
             </wp:cNvGraphicFramePr>
@@ -11928,13 +11841,13 @@
               <a:graphicData uri="http://schemas.openxmlformats.org/drawingml/2006/picture">
                 <pic:pic xmlns:pic="http://schemas.openxmlformats.org/drawingml/2006/picture">
                   <pic:nvPicPr>
-                    <pic:cNvPr id="20" name="Picture 20" descr=""/>
+                    <pic:cNvPr id="31" name="Picture 20" descr=""/>
                     <pic:cNvPicPr>
                       <a:picLocks noChangeAspect="1" noChangeArrowheads="1"/>
                     </pic:cNvPicPr>
                   </pic:nvPicPr>
                   <pic:blipFill>
-                    <a:blip r:embed="rId21"/>
+                    <a:blip r:embed="rId32"/>
                     <a:stretch>
                       <a:fillRect/>
                     </a:stretch>
@@ -12031,8 +11944,8 @@
       </w:pPr>
       <w:r>
         <w:rPr>
-          <w:sz w:val="24"/>
-          <w:szCs w:val="20"/>
+          <w:rFonts w:cs="Arial"/>
+          <w:b/>
         </w:rPr>
       </w:r>
     </w:p>
@@ -12493,8 +12406,8 @@
       </w:pPr>
       <w:r>
         <w:rPr>
-          <w:sz w:val="24"/>
-          <w:szCs w:val="20"/>
+          <w:rFonts w:cs="Arial"/>
+          <w:b/>
         </w:rPr>
       </w:r>
     </w:p>
@@ -12526,8 +12439,8 @@
       </w:pPr>
       <w:r>
         <w:rPr>
-          <w:sz w:val="24"/>
-          <w:szCs w:val="20"/>
+          <w:rFonts w:cs="Arial"/>
+          <w:b/>
         </w:rPr>
       </w:r>
     </w:p>
@@ -12989,8 +12902,8 @@
       </w:pPr>
       <w:r>
         <w:rPr>
-          <w:sz w:val="24"/>
-          <w:szCs w:val="20"/>
+          <w:rFonts w:cs="Arial"/>
+          <w:b/>
         </w:rPr>
       </w:r>
     </w:p>
@@ -13005,8 +12918,8 @@
       </w:pPr>
       <w:r>
         <w:rPr>
-          <w:sz w:val="24"/>
-          <w:szCs w:val="20"/>
+          <w:rFonts w:cs="Arial"/>
+          <w:b/>
         </w:rPr>
       </w:r>
     </w:p>
@@ -13040,8 +12953,8 @@
       </w:pPr>
       <w:r>
         <w:rPr>
-          <w:sz w:val="24"/>
-          <w:szCs w:val="20"/>
+          <w:rFonts w:cs="Arial"/>
+          <w:b/>
         </w:rPr>
       </w:r>
     </w:p>
@@ -13091,8 +13004,23 @@
       </w:pPr>
       <w:r>
         <w:rPr>
-          <w:sz w:val="24"/>
-          <w:szCs w:val="20"/>
+          <w:rFonts w:cs="Arial"/>
+          <w:b w:val="false"/>
+        </w:rPr>
+      </w:r>
+    </w:p>
+    <w:p>
+      <w:pPr>
+        <w:pStyle w:val="normal1"/>
+        <w:rPr>
+          <w:rFonts w:ascii="Arial" w:hAnsi="Arial" w:cs="Arial"/>
+          <w:b w:val="false"/>
+        </w:rPr>
+      </w:pPr>
+      <w:r>
+        <w:rPr>
+          <w:rFonts w:cs="Arial"/>
+          <w:b w:val="false"/>
         </w:rPr>
       </w:r>
     </w:p>
@@ -13196,8 +13124,8 @@
       </w:pPr>
       <w:r>
         <w:rPr>
-          <w:sz w:val="24"/>
-          <w:szCs w:val="20"/>
+          <w:rFonts w:cs="Arial"/>
+          <w:b w:val="false"/>
         </w:rPr>
       </w:r>
     </w:p>
@@ -13265,8 +13193,8 @@
       </w:pPr>
       <w:r>
         <w:rPr>
-          <w:sz w:val="24"/>
-          <w:szCs w:val="20"/>
+          <w:rFonts w:cs="Arial"/>
+          <w:b w:val="false"/>
         </w:rPr>
       </w:r>
     </w:p>
@@ -13316,8 +13244,8 @@
       </w:pPr>
       <w:r>
         <w:rPr>
-          <w:sz w:val="24"/>
-          <w:szCs w:val="20"/>
+          <w:rFonts w:cs="Arial"/>
+          <w:b w:val="false"/>
         </w:rPr>
       </w:r>
     </w:p>
@@ -13367,8 +13295,8 @@
       </w:pPr>
       <w:r>
         <w:rPr>
-          <w:sz w:val="24"/>
-          <w:szCs w:val="20"/>
+          <w:rFonts w:cs="Arial"/>
+          <w:b w:val="false"/>
         </w:rPr>
       </w:r>
     </w:p>
@@ -13418,8 +13346,8 @@
       </w:pPr>
       <w:r>
         <w:rPr>
-          <w:sz w:val="24"/>
-          <w:szCs w:val="20"/>
+          <w:rFonts w:cs="Arial"/>
+          <w:b w:val="false"/>
         </w:rPr>
       </w:r>
     </w:p>
@@ -13469,8 +13397,8 @@
       </w:pPr>
       <w:r>
         <w:rPr>
-          <w:sz w:val="24"/>
-          <w:szCs w:val="20"/>
+          <w:rFonts w:cs="Arial"/>
+          <w:b w:val="false"/>
         </w:rPr>
       </w:r>
     </w:p>
@@ -13520,8 +13448,8 @@
       </w:pPr>
       <w:r>
         <w:rPr>
-          <w:sz w:val="24"/>
-          <w:szCs w:val="20"/>
+          <w:rFonts w:cs="Arial"/>
+          <w:b w:val="false"/>
         </w:rPr>
       </w:r>
     </w:p>
@@ -13535,15 +13463,12 @@
         </w:rPr>
       </w:pPr>
       <w:r>
-        <w:rPr>
-          <w:sz w:val="24"/>
-          <w:szCs w:val="20"/>
-        </w:rPr>
+        <w:rPr/>
         <w:drawing>
           <wp:inline distT="0" distB="0" distL="0" distR="0">
             <wp:extent cx="5760720" cy="1419225"/>
             <wp:effectExtent l="0" t="0" r="0" b="0"/>
-            <wp:docPr id="21" name="Picture 21" descr=""/>
+            <wp:docPr id="32" name="Picture 21" descr=""/>
             <wp:cNvGraphicFramePr>
               <a:graphicFrameLocks xmlns:a="http://schemas.openxmlformats.org/drawingml/2006/main" noChangeAspect="1"/>
             </wp:cNvGraphicFramePr>
@@ -13551,13 +13476,13 @@
               <a:graphicData uri="http://schemas.openxmlformats.org/drawingml/2006/picture">
                 <pic:pic xmlns:pic="http://schemas.openxmlformats.org/drawingml/2006/picture">
                   <pic:nvPicPr>
-                    <pic:cNvPr id="21" name="Picture 21" descr=""/>
+                    <pic:cNvPr id="32" name="Picture 21" descr=""/>
                     <pic:cNvPicPr>
                       <a:picLocks noChangeAspect="1" noChangeArrowheads="1"/>
                     </pic:cNvPicPr>
                   </pic:nvPicPr>
                   <pic:blipFill>
-                    <a:blip r:embed="rId22"/>
+                    <a:blip r:embed="rId33"/>
                     <a:stretch>
                       <a:fillRect/>
                     </a:stretch>
@@ -13611,8 +13536,9 @@
       </w:pPr>
       <w:r>
         <w:rPr>
-          <w:sz w:val="24"/>
-          <w:szCs w:val="20"/>
+          <w:rFonts w:cs="Arial"/>
+          <w:b w:val="false"/>
+          <w:i/>
         </w:rPr>
       </w:r>
     </w:p>
@@ -13626,15 +13552,12 @@
         </w:rPr>
       </w:pPr>
       <w:r>
-        <w:rPr>
-          <w:sz w:val="24"/>
-          <w:szCs w:val="20"/>
-        </w:rPr>
+        <w:rPr/>
         <w:drawing>
           <wp:inline distT="0" distB="0" distL="0" distR="0">
             <wp:extent cx="5760720" cy="1069340"/>
             <wp:effectExtent l="0" t="0" r="0" b="0"/>
-            <wp:docPr id="22" name="Picture 22" descr=""/>
+            <wp:docPr id="33" name="Picture 22" descr=""/>
             <wp:cNvGraphicFramePr>
               <a:graphicFrameLocks xmlns:a="http://schemas.openxmlformats.org/drawingml/2006/main" noChangeAspect="1"/>
             </wp:cNvGraphicFramePr>
@@ -13642,13 +13565,13 @@
               <a:graphicData uri="http://schemas.openxmlformats.org/drawingml/2006/picture">
                 <pic:pic xmlns:pic="http://schemas.openxmlformats.org/drawingml/2006/picture">
                   <pic:nvPicPr>
-                    <pic:cNvPr id="22" name="Picture 22" descr=""/>
+                    <pic:cNvPr id="33" name="Picture 22" descr=""/>
                     <pic:cNvPicPr>
                       <a:picLocks noChangeAspect="1" noChangeArrowheads="1"/>
                     </pic:cNvPicPr>
                   </pic:nvPicPr>
                   <pic:blipFill>
-                    <a:blip r:embed="rId23"/>
+                    <a:blip r:embed="rId34"/>
                     <a:stretch>
                       <a:fillRect/>
                     </a:stretch>
@@ -13702,8 +13625,9 @@
       </w:pPr>
       <w:r>
         <w:rPr>
-          <w:sz w:val="24"/>
-          <w:szCs w:val="20"/>
+          <w:rFonts w:cs="Arial"/>
+          <w:b w:val="false"/>
+          <w:i/>
         </w:rPr>
       </w:r>
     </w:p>
@@ -13735,8 +13659,8 @@
       </w:pPr>
       <w:r>
         <w:rPr>
-          <w:sz w:val="24"/>
-          <w:szCs w:val="20"/>
+          <w:rFonts w:cs="Arial"/>
+          <w:b/>
         </w:rPr>
       </w:r>
     </w:p>
@@ -13898,8 +13822,8 @@
       </w:pPr>
       <w:r>
         <w:rPr>
-          <w:sz w:val="24"/>
-          <w:szCs w:val="20"/>
+          <w:rFonts w:cs="Arial"/>
+          <w:b/>
         </w:rPr>
       </w:r>
     </w:p>
@@ -13931,8 +13855,8 @@
       </w:pPr>
       <w:r>
         <w:rPr>
-          <w:sz w:val="24"/>
-          <w:szCs w:val="20"/>
+          <w:rFonts w:cs="Arial"/>
+          <w:b w:val="false"/>
         </w:rPr>
       </w:r>
     </w:p>
@@ -13964,8 +13888,8 @@
       </w:pPr>
       <w:r>
         <w:rPr>
-          <w:sz w:val="24"/>
-          <w:szCs w:val="20"/>
+          <w:rFonts w:cs="Arial"/>
+          <w:b/>
         </w:rPr>
       </w:r>
     </w:p>
@@ -13979,15 +13903,12 @@
         </w:rPr>
       </w:pPr>
       <w:r>
-        <w:rPr>
-          <w:sz w:val="24"/>
-          <w:szCs w:val="20"/>
-        </w:rPr>
+        <w:rPr/>
         <w:drawing>
           <wp:inline distT="0" distB="0" distL="0" distR="0">
             <wp:extent cx="5760720" cy="1098550"/>
             <wp:effectExtent l="0" t="0" r="0" b="0"/>
-            <wp:docPr id="23" name="Picture 23" descr=""/>
+            <wp:docPr id="34" name="Picture 23" descr=""/>
             <wp:cNvGraphicFramePr>
               <a:graphicFrameLocks xmlns:a="http://schemas.openxmlformats.org/drawingml/2006/main" noChangeAspect="1"/>
             </wp:cNvGraphicFramePr>
@@ -13995,13 +13916,13 @@
               <a:graphicData uri="http://schemas.openxmlformats.org/drawingml/2006/picture">
                 <pic:pic xmlns:pic="http://schemas.openxmlformats.org/drawingml/2006/picture">
                   <pic:nvPicPr>
-                    <pic:cNvPr id="23" name="Picture 23" descr=""/>
+                    <pic:cNvPr id="34" name="Picture 23" descr=""/>
                     <pic:cNvPicPr>
                       <a:picLocks noChangeAspect="1" noChangeArrowheads="1"/>
                     </pic:cNvPicPr>
                   </pic:nvPicPr>
                   <pic:blipFill>
-                    <a:blip r:embed="rId24"/>
+                    <a:blip r:embed="rId35"/>
                     <a:stretch>
                       <a:fillRect/>
                     </a:stretch>
@@ -14106,8 +14027,8 @@
       </w:pPr>
       <w:r>
         <w:rPr>
-          <w:sz w:val="24"/>
-          <w:szCs w:val="20"/>
+          <w:rFonts w:cs="Arial"/>
+          <w:b/>
         </w:rPr>
       </w:r>
     </w:p>
@@ -14139,8 +14060,8 @@
       </w:pPr>
       <w:r>
         <w:rPr>
-          <w:sz w:val="24"/>
-          <w:szCs w:val="20"/>
+          <w:rFonts w:cs="Arial"/>
+          <w:b w:val="false"/>
         </w:rPr>
       </w:r>
     </w:p>
@@ -14172,8 +14093,8 @@
       </w:pPr>
       <w:r>
         <w:rPr>
-          <w:sz w:val="24"/>
-          <w:szCs w:val="20"/>
+          <w:rFonts w:cs="Arial"/>
+          <w:b/>
         </w:rPr>
       </w:r>
     </w:p>
@@ -14187,15 +14108,12 @@
         </w:rPr>
       </w:pPr>
       <w:r>
-        <w:rPr>
-          <w:sz w:val="24"/>
-          <w:szCs w:val="20"/>
-        </w:rPr>
+        <w:rPr/>
         <w:drawing>
           <wp:inline distT="0" distB="0" distL="0" distR="0">
             <wp:extent cx="5760720" cy="2900680"/>
             <wp:effectExtent l="0" t="0" r="0" b="0"/>
-            <wp:docPr id="24" name="Picture 24" descr=""/>
+            <wp:docPr id="35" name="Picture 24" descr=""/>
             <wp:cNvGraphicFramePr>
               <a:graphicFrameLocks xmlns:a="http://schemas.openxmlformats.org/drawingml/2006/main" noChangeAspect="1"/>
             </wp:cNvGraphicFramePr>
@@ -14203,13 +14121,13 @@
               <a:graphicData uri="http://schemas.openxmlformats.org/drawingml/2006/picture">
                 <pic:pic xmlns:pic="http://schemas.openxmlformats.org/drawingml/2006/picture">
                   <pic:nvPicPr>
-                    <pic:cNvPr id="24" name="Picture 24" descr=""/>
+                    <pic:cNvPr id="35" name="Picture 24" descr=""/>
                     <pic:cNvPicPr>
                       <a:picLocks noChangeAspect="1" noChangeArrowheads="1"/>
                     </pic:cNvPicPr>
                   </pic:nvPicPr>
                   <pic:blipFill>
-                    <a:blip r:embed="rId25"/>
+                    <a:blip r:embed="rId36"/>
                     <a:stretch>
                       <a:fillRect/>
                     </a:stretch>
@@ -14274,8 +14192,8 @@
       </w:pPr>
       <w:r>
         <w:rPr>
-          <w:sz w:val="24"/>
-          <w:szCs w:val="20"/>
+          <w:rFonts w:cs="Arial"/>
+          <w:b/>
         </w:rPr>
       </w:r>
     </w:p>
@@ -14289,15 +14207,12 @@
         </w:rPr>
       </w:pPr>
       <w:r>
-        <w:rPr>
-          <w:sz w:val="24"/>
-          <w:szCs w:val="20"/>
-        </w:rPr>
+        <w:rPr/>
         <w:drawing>
           <wp:inline distT="0" distB="0" distL="0" distR="0">
             <wp:extent cx="5760720" cy="2900680"/>
             <wp:effectExtent l="0" t="0" r="0" b="0"/>
-            <wp:docPr id="25" name="Picture 25" descr=""/>
+            <wp:docPr id="36" name="Picture 25" descr=""/>
             <wp:cNvGraphicFramePr>
               <a:graphicFrameLocks xmlns:a="http://schemas.openxmlformats.org/drawingml/2006/main" noChangeAspect="1"/>
             </wp:cNvGraphicFramePr>
@@ -14305,13 +14220,13 @@
               <a:graphicData uri="http://schemas.openxmlformats.org/drawingml/2006/picture">
                 <pic:pic xmlns:pic="http://schemas.openxmlformats.org/drawingml/2006/picture">
                   <pic:nvPicPr>
-                    <pic:cNvPr id="25" name="Picture 25" descr=""/>
+                    <pic:cNvPr id="36" name="Picture 25" descr=""/>
                     <pic:cNvPicPr>
                       <a:picLocks noChangeAspect="1" noChangeArrowheads="1"/>
                     </pic:cNvPicPr>
                   </pic:nvPicPr>
                   <pic:blipFill>
-                    <a:blip r:embed="rId26"/>
+                    <a:blip r:embed="rId37"/>
                     <a:stretch>
                       <a:fillRect/>
                     </a:stretch>
@@ -14408,8 +14323,8 @@
       </w:pPr>
       <w:r>
         <w:rPr>
-          <w:sz w:val="24"/>
-          <w:szCs w:val="20"/>
+          <w:rFonts w:cs="Arial"/>
+          <w:b/>
         </w:rPr>
       </w:r>
     </w:p>
@@ -14423,15 +14338,12 @@
         </w:rPr>
       </w:pPr>
       <w:r>
-        <w:rPr>
-          <w:sz w:val="24"/>
-          <w:szCs w:val="20"/>
-        </w:rPr>
+        <w:rPr/>
         <w:drawing>
           <wp:inline distT="0" distB="0" distL="0" distR="0">
             <wp:extent cx="5760720" cy="2900680"/>
             <wp:effectExtent l="0" t="0" r="0" b="0"/>
-            <wp:docPr id="26" name="Picture 26" descr=""/>
+            <wp:docPr id="37" name="Picture 26" descr=""/>
             <wp:cNvGraphicFramePr>
               <a:graphicFrameLocks xmlns:a="http://schemas.openxmlformats.org/drawingml/2006/main" noChangeAspect="1"/>
             </wp:cNvGraphicFramePr>
@@ -14439,13 +14351,13 @@
               <a:graphicData uri="http://schemas.openxmlformats.org/drawingml/2006/picture">
                 <pic:pic xmlns:pic="http://schemas.openxmlformats.org/drawingml/2006/picture">
                   <pic:nvPicPr>
-                    <pic:cNvPr id="26" name="Picture 26" descr=""/>
+                    <pic:cNvPr id="37" name="Picture 26" descr=""/>
                     <pic:cNvPicPr>
                       <a:picLocks noChangeAspect="1" noChangeArrowheads="1"/>
                     </pic:cNvPicPr>
                   </pic:nvPicPr>
                   <pic:blipFill>
-                    <a:blip r:embed="rId27"/>
+                    <a:blip r:embed="rId38"/>
                     <a:stretch>
                       <a:fillRect/>
                     </a:stretch>
@@ -14510,8 +14422,8 @@
       </w:pPr>
       <w:r>
         <w:rPr>
-          <w:sz w:val="24"/>
-          <w:szCs w:val="20"/>
+          <w:rFonts w:cs="Arial"/>
+          <w:b/>
         </w:rPr>
       </w:r>
     </w:p>
@@ -14525,15 +14437,12 @@
         </w:rPr>
       </w:pPr>
       <w:r>
-        <w:rPr>
-          <w:sz w:val="24"/>
-          <w:szCs w:val="20"/>
-        </w:rPr>
+        <w:rPr/>
         <w:drawing>
           <wp:inline distT="0" distB="0" distL="0" distR="0">
             <wp:extent cx="5760720" cy="2900680"/>
             <wp:effectExtent l="0" t="0" r="0" b="0"/>
-            <wp:docPr id="27" name="Picture 27" descr=""/>
+            <wp:docPr id="38" name="Picture 27" descr=""/>
             <wp:cNvGraphicFramePr>
               <a:graphicFrameLocks xmlns:a="http://schemas.openxmlformats.org/drawingml/2006/main" noChangeAspect="1"/>
             </wp:cNvGraphicFramePr>
@@ -14541,13 +14450,13 @@
               <a:graphicData uri="http://schemas.openxmlformats.org/drawingml/2006/picture">
                 <pic:pic xmlns:pic="http://schemas.openxmlformats.org/drawingml/2006/picture">
                   <pic:nvPicPr>
-                    <pic:cNvPr id="27" name="Picture 27" descr=""/>
+                    <pic:cNvPr id="38" name="Picture 27" descr=""/>
                     <pic:cNvPicPr>
                       <a:picLocks noChangeAspect="1" noChangeArrowheads="1"/>
                     </pic:cNvPicPr>
                   </pic:nvPicPr>
                   <pic:blipFill>
-                    <a:blip r:embed="rId28"/>
+                    <a:blip r:embed="rId39"/>
                     <a:stretch>
                       <a:fillRect/>
                     </a:stretch>
@@ -14602,16 +14511,7 @@
           <w:sz w:val="24"/>
           <w:szCs w:val="20"/>
         </w:rPr>
-        <w:t>/admin — Dashboard (vía pase de demo</w:t>
-      </w:r>
-      <w:r>
-        <w:rPr>
-          <w:rFonts w:cs="Arial"/>
-          <w:b/>
-          <w:sz w:val="24"/>
-          <w:szCs w:val="20"/>
-        </w:rPr>
-        <w:t>)</w:t>
+        <w:t>/admin — Dashboard (vía pase de demo)</w:t>
       </w:r>
     </w:p>
     <w:p>
@@ -14625,8 +14525,8 @@
       </w:pPr>
       <w:r>
         <w:rPr>
-          <w:sz w:val="24"/>
-          <w:szCs w:val="20"/>
+          <w:rFonts w:cs="Arial"/>
+          <w:b/>
         </w:rPr>
       </w:r>
     </w:p>
@@ -14640,15 +14540,12 @@
         </w:rPr>
       </w:pPr>
       <w:r>
-        <w:rPr>
-          <w:sz w:val="24"/>
-          <w:szCs w:val="20"/>
-        </w:rPr>
+        <w:rPr/>
         <w:drawing>
           <wp:inline distT="0" distB="0" distL="0" distR="0">
             <wp:extent cx="5760720" cy="2900680"/>
             <wp:effectExtent l="0" t="0" r="0" b="0"/>
-            <wp:docPr id="28" name="Picture 28" descr=""/>
+            <wp:docPr id="39" name="Picture 28" descr=""/>
             <wp:cNvGraphicFramePr>
               <a:graphicFrameLocks xmlns:a="http://schemas.openxmlformats.org/drawingml/2006/main" noChangeAspect="1"/>
             </wp:cNvGraphicFramePr>
@@ -14656,13 +14553,13 @@
               <a:graphicData uri="http://schemas.openxmlformats.org/drawingml/2006/picture">
                 <pic:pic xmlns:pic="http://schemas.openxmlformats.org/drawingml/2006/picture">
                   <pic:nvPicPr>
-                    <pic:cNvPr id="28" name="Picture 28" descr=""/>
+                    <pic:cNvPr id="39" name="Picture 28" descr=""/>
                     <pic:cNvPicPr>
                       <a:picLocks noChangeAspect="1" noChangeArrowheads="1"/>
                     </pic:cNvPicPr>
                   </pic:nvPicPr>
                   <pic:blipFill>
-                    <a:blip r:embed="rId29"/>
+                    <a:blip r:embed="rId40"/>
                     <a:stretch>
                       <a:fillRect/>
                     </a:stretch>
@@ -14727,8 +14624,8 @@
       </w:pPr>
       <w:r>
         <w:rPr>
-          <w:sz w:val="24"/>
-          <w:szCs w:val="20"/>
+          <w:rFonts w:cs="Arial"/>
+          <w:b/>
         </w:rPr>
       </w:r>
     </w:p>
@@ -14742,15 +14639,12 @@
         </w:rPr>
       </w:pPr>
       <w:r>
-        <w:rPr>
-          <w:sz w:val="24"/>
-          <w:szCs w:val="20"/>
-        </w:rPr>
+        <w:rPr/>
         <w:drawing>
           <wp:inline distT="0" distB="0" distL="0" distR="0">
             <wp:extent cx="5760720" cy="2900680"/>
             <wp:effectExtent l="0" t="0" r="0" b="0"/>
-            <wp:docPr id="29" name="Picture 29" descr=""/>
+            <wp:docPr id="40" name="Picture 29" descr=""/>
             <wp:cNvGraphicFramePr>
               <a:graphicFrameLocks xmlns:a="http://schemas.openxmlformats.org/drawingml/2006/main" noChangeAspect="1"/>
             </wp:cNvGraphicFramePr>
@@ -14758,13 +14652,13 @@
               <a:graphicData uri="http://schemas.openxmlformats.org/drawingml/2006/picture">
                 <pic:pic xmlns:pic="http://schemas.openxmlformats.org/drawingml/2006/picture">
                   <pic:nvPicPr>
-                    <pic:cNvPr id="29" name="Picture 29" descr=""/>
+                    <pic:cNvPr id="40" name="Picture 29" descr=""/>
                     <pic:cNvPicPr>
                       <a:picLocks noChangeAspect="1" noChangeArrowheads="1"/>
                     </pic:cNvPicPr>
                   </pic:nvPicPr>
                   <pic:blipFill>
-                    <a:blip r:embed="rId30"/>
+                    <a:blip r:embed="rId41"/>
                     <a:stretch>
                       <a:fillRect/>
                     </a:stretch>
@@ -14925,8 +14819,8 @@
       </w:pPr>
       <w:r>
         <w:rPr>
-          <w:sz w:val="24"/>
-          <w:szCs w:val="20"/>
+          <w:rFonts w:cs="Arial"/>
+          <w:b/>
         </w:rPr>
       </w:r>
     </w:p>
@@ -14940,15 +14834,12 @@
         </w:rPr>
       </w:pPr>
       <w:r>
-        <w:rPr>
-          <w:sz w:val="24"/>
-          <w:szCs w:val="20"/>
-        </w:rPr>
+        <w:rPr/>
         <w:drawing>
           <wp:inline distT="0" distB="0" distL="0" distR="0">
             <wp:extent cx="5760720" cy="2900680"/>
             <wp:effectExtent l="0" t="0" r="0" b="0"/>
-            <wp:docPr id="30" name="Picture 30" descr=""/>
+            <wp:docPr id="41" name="Picture 30" descr=""/>
             <wp:cNvGraphicFramePr>
               <a:graphicFrameLocks xmlns:a="http://schemas.openxmlformats.org/drawingml/2006/main" noChangeAspect="1"/>
             </wp:cNvGraphicFramePr>
@@ -14956,13 +14847,13 @@
               <a:graphicData uri="http://schemas.openxmlformats.org/drawingml/2006/picture">
                 <pic:pic xmlns:pic="http://schemas.openxmlformats.org/drawingml/2006/picture">
                   <pic:nvPicPr>
-                    <pic:cNvPr id="30" name="Picture 30" descr=""/>
+                    <pic:cNvPr id="41" name="Picture 30" descr=""/>
                     <pic:cNvPicPr>
                       <a:picLocks noChangeAspect="1" noChangeArrowheads="1"/>
                     </pic:cNvPicPr>
                   </pic:nvPicPr>
                   <pic:blipFill>
-                    <a:blip r:embed="rId31"/>
+                    <a:blip r:embed="rId42"/>
                     <a:stretch>
                       <a:fillRect/>
                     </a:stretch>
@@ -14994,8 +14885,8 @@
       </w:pPr>
       <w:r>
         <w:rPr>
-          <w:sz w:val="24"/>
-          <w:szCs w:val="20"/>
+          <w:rFonts w:cs="Arial"/>
+          <w:b/>
         </w:rPr>
       </w:r>
     </w:p>
@@ -15029,8 +14920,8 @@
       </w:pPr>
       <w:r>
         <w:rPr>
-          <w:sz w:val="24"/>
-          <w:szCs w:val="20"/>
+          <w:rFonts w:cs="Arial"/>
+          <w:b/>
         </w:rPr>
       </w:r>
     </w:p>
@@ -15044,15 +14935,12 @@
         </w:rPr>
       </w:pPr>
       <w:r>
-        <w:rPr>
-          <w:sz w:val="24"/>
-          <w:szCs w:val="20"/>
-        </w:rPr>
+        <w:rPr/>
         <w:drawing>
           <wp:inline distT="0" distB="0" distL="0" distR="0">
             <wp:extent cx="5760720" cy="2900680"/>
             <wp:effectExtent l="0" t="0" r="0" b="0"/>
-            <wp:docPr id="31" name="Picture 31" descr=""/>
+            <wp:docPr id="42" name="Picture 31" descr=""/>
             <wp:cNvGraphicFramePr>
               <a:graphicFrameLocks xmlns:a="http://schemas.openxmlformats.org/drawingml/2006/main" noChangeAspect="1"/>
             </wp:cNvGraphicFramePr>
@@ -15060,13 +14948,13 @@
               <a:graphicData uri="http://schemas.openxmlformats.org/drawingml/2006/picture">
                 <pic:pic xmlns:pic="http://schemas.openxmlformats.org/drawingml/2006/picture">
                   <pic:nvPicPr>
-                    <pic:cNvPr id="31" name="Picture 31" descr=""/>
+                    <pic:cNvPr id="42" name="Picture 31" descr=""/>
                     <pic:cNvPicPr>
                       <a:picLocks noChangeAspect="1" noChangeArrowheads="1"/>
                     </pic:cNvPicPr>
                   </pic:nvPicPr>
                   <pic:blipFill>
-                    <a:blip r:embed="rId32"/>
+                    <a:blip r:embed="rId43"/>
                     <a:stretch>
                       <a:fillRect/>
                     </a:stretch>
@@ -15227,8 +15115,8 @@
       </w:pPr>
       <w:r>
         <w:rPr>
-          <w:sz w:val="24"/>
-          <w:szCs w:val="20"/>
+          <w:rFonts w:cs="Arial"/>
+          <w:b/>
         </w:rPr>
       </w:r>
     </w:p>
@@ -15242,15 +15130,12 @@
         </w:rPr>
       </w:pPr>
       <w:r>
-        <w:rPr>
-          <w:sz w:val="24"/>
-          <w:szCs w:val="20"/>
-        </w:rPr>
+        <w:rPr/>
         <w:drawing>
           <wp:inline distT="0" distB="0" distL="0" distR="0">
             <wp:extent cx="5760720" cy="2900680"/>
             <wp:effectExtent l="0" t="0" r="0" b="0"/>
-            <wp:docPr id="32" name="Picture 32" descr=""/>
+            <wp:docPr id="43" name="Picture 32" descr=""/>
             <wp:cNvGraphicFramePr>
               <a:graphicFrameLocks xmlns:a="http://schemas.openxmlformats.org/drawingml/2006/main" noChangeAspect="1"/>
             </wp:cNvGraphicFramePr>
@@ -15258,13 +15143,13 @@
               <a:graphicData uri="http://schemas.openxmlformats.org/drawingml/2006/picture">
                 <pic:pic xmlns:pic="http://schemas.openxmlformats.org/drawingml/2006/picture">
                   <pic:nvPicPr>
-                    <pic:cNvPr id="32" name="Picture 32" descr=""/>
+                    <pic:cNvPr id="43" name="Picture 32" descr=""/>
                     <pic:cNvPicPr>
                       <a:picLocks noChangeAspect="1" noChangeArrowheads="1"/>
                     </pic:cNvPicPr>
                   </pic:nvPicPr>
                   <pic:blipFill>
-                    <a:blip r:embed="rId33"/>
+                    <a:blip r:embed="rId44"/>
                     <a:stretch>
                       <a:fillRect/>
                     </a:stretch>
@@ -15296,8 +15181,8 @@
       </w:pPr>
       <w:r>
         <w:rPr>
-          <w:sz w:val="24"/>
-          <w:szCs w:val="20"/>
+          <w:rFonts w:cs="Arial"/>
+          <w:b/>
         </w:rPr>
       </w:r>
     </w:p>
@@ -15331,8 +15216,8 @@
       </w:pPr>
       <w:r>
         <w:rPr>
-          <w:sz w:val="24"/>
-          <w:szCs w:val="20"/>
+          <w:rFonts w:cs="Arial"/>
+          <w:b/>
         </w:rPr>
       </w:r>
     </w:p>
@@ -15346,15 +15231,12 @@
         </w:rPr>
       </w:pPr>
       <w:r>
-        <w:rPr>
-          <w:sz w:val="24"/>
-          <w:szCs w:val="20"/>
-        </w:rPr>
+        <w:rPr/>
         <w:drawing>
           <wp:inline distT="0" distB="0" distL="0" distR="0">
             <wp:extent cx="5760720" cy="2900680"/>
             <wp:effectExtent l="0" t="0" r="0" b="0"/>
-            <wp:docPr id="33" name="Picture 33" descr=""/>
+            <wp:docPr id="44" name="Picture 33" descr=""/>
             <wp:cNvGraphicFramePr>
               <a:graphicFrameLocks xmlns:a="http://schemas.openxmlformats.org/drawingml/2006/main" noChangeAspect="1"/>
             </wp:cNvGraphicFramePr>
@@ -15362,13 +15244,13 @@
               <a:graphicData uri="http://schemas.openxmlformats.org/drawingml/2006/picture">
                 <pic:pic xmlns:pic="http://schemas.openxmlformats.org/drawingml/2006/picture">
                   <pic:nvPicPr>
-                    <pic:cNvPr id="33" name="Picture 33" descr=""/>
+                    <pic:cNvPr id="44" name="Picture 33" descr=""/>
                     <pic:cNvPicPr>
                       <a:picLocks noChangeAspect="1" noChangeArrowheads="1"/>
                     </pic:cNvPicPr>
                   </pic:nvPicPr>
                   <pic:blipFill>
-                    <a:blip r:embed="rId34"/>
+                    <a:blip r:embed="rId45"/>
                     <a:stretch>
                       <a:fillRect/>
                     </a:stretch>
@@ -15529,8 +15411,8 @@
       </w:pPr>
       <w:r>
         <w:rPr>
-          <w:sz w:val="24"/>
-          <w:szCs w:val="20"/>
+          <w:rFonts w:cs="Arial"/>
+          <w:b/>
         </w:rPr>
       </w:r>
     </w:p>
@@ -15544,15 +15426,12 @@
         </w:rPr>
       </w:pPr>
       <w:r>
-        <w:rPr>
-          <w:sz w:val="24"/>
-          <w:szCs w:val="20"/>
-        </w:rPr>
+        <w:rPr/>
         <w:drawing>
           <wp:inline distT="0" distB="0" distL="0" distR="0">
             <wp:extent cx="5760720" cy="2900680"/>
             <wp:effectExtent l="0" t="0" r="0" b="0"/>
-            <wp:docPr id="34" name="Picture 34" descr=""/>
+            <wp:docPr id="45" name="Picture 34" descr=""/>
             <wp:cNvGraphicFramePr>
               <a:graphicFrameLocks xmlns:a="http://schemas.openxmlformats.org/drawingml/2006/main" noChangeAspect="1"/>
             </wp:cNvGraphicFramePr>
@@ -15560,13 +15439,13 @@
               <a:graphicData uri="http://schemas.openxmlformats.org/drawingml/2006/picture">
                 <pic:pic xmlns:pic="http://schemas.openxmlformats.org/drawingml/2006/picture">
                   <pic:nvPicPr>
-                    <pic:cNvPr id="34" name="Picture 34" descr=""/>
+                    <pic:cNvPr id="45" name="Picture 34" descr=""/>
                     <pic:cNvPicPr>
                       <a:picLocks noChangeAspect="1" noChangeArrowheads="1"/>
                     </pic:cNvPicPr>
                   </pic:nvPicPr>
                   <pic:blipFill>
-                    <a:blip r:embed="rId35"/>
+                    <a:blip r:embed="rId46"/>
                     <a:stretch>
                       <a:fillRect/>
                     </a:stretch>
@@ -15598,8 +15477,8 @@
       </w:pPr>
       <w:r>
         <w:rPr>
-          <w:sz w:val="24"/>
-          <w:szCs w:val="20"/>
+          <w:rFonts w:cs="Arial"/>
+          <w:b/>
         </w:rPr>
       </w:r>
     </w:p>
@@ -15633,8 +15512,8 @@
       </w:pPr>
       <w:r>
         <w:rPr>
-          <w:sz w:val="24"/>
-          <w:szCs w:val="20"/>
+          <w:rFonts w:cs="Arial"/>
+          <w:b/>
         </w:rPr>
       </w:r>
     </w:p>
@@ -15702,8 +15581,8 @@
       </w:pPr>
       <w:r>
         <w:rPr>
-          <w:sz w:val="24"/>
-          <w:szCs w:val="20"/>
+          <w:rFonts w:cs="Arial"/>
+          <w:b w:val="false"/>
         </w:rPr>
       </w:r>
     </w:p>
@@ -15753,8 +15632,8 @@
       </w:pPr>
       <w:r>
         <w:rPr>
-          <w:sz w:val="24"/>
-          <w:szCs w:val="20"/>
+          <w:rFonts w:cs="Arial"/>
+          <w:b w:val="false"/>
         </w:rPr>
       </w:r>
     </w:p>
@@ -15804,8 +15683,8 @@
       </w:pPr>
       <w:r>
         <w:rPr>
-          <w:sz w:val="24"/>
-          <w:szCs w:val="20"/>
+          <w:rFonts w:cs="Arial"/>
+          <w:b w:val="false"/>
         </w:rPr>
       </w:r>
     </w:p>
@@ -15855,8 +15734,8 @@
       </w:pPr>
       <w:r>
         <w:rPr>
-          <w:sz w:val="24"/>
-          <w:szCs w:val="20"/>
+          <w:rFonts w:cs="Arial"/>
+          <w:b w:val="false"/>
         </w:rPr>
       </w:r>
     </w:p>
@@ -15870,8 +15749,8 @@
       </w:pPr>
       <w:r>
         <w:rPr>
-          <w:sz w:val="24"/>
-          <w:szCs w:val="20"/>
+          <w:rFonts w:cs="Arial"/>
+          <w:b w:val="false"/>
         </w:rPr>
       </w:r>
     </w:p>
@@ -15921,8 +15800,8 @@
       </w:pPr>
       <w:r>
         <w:rPr>
-          <w:sz w:val="24"/>
-          <w:szCs w:val="20"/>
+          <w:rFonts w:cs="Arial"/>
+          <w:b w:val="false"/>
         </w:rPr>
       </w:r>
     </w:p>
@@ -15972,8 +15851,8 @@
       </w:pPr>
       <w:r>
         <w:rPr>
-          <w:sz w:val="24"/>
-          <w:szCs w:val="20"/>
+          <w:rFonts w:cs="Arial"/>
+          <w:b w:val="false"/>
         </w:rPr>
       </w:r>
     </w:p>
@@ -16023,8 +15902,8 @@
       </w:pPr>
       <w:r>
         <w:rPr>
-          <w:sz w:val="24"/>
-          <w:szCs w:val="20"/>
+          <w:rFonts w:cs="Arial"/>
+          <w:b w:val="false"/>
         </w:rPr>
       </w:r>
     </w:p>
@@ -16074,8 +15953,8 @@
       </w:pPr>
       <w:r>
         <w:rPr>
-          <w:sz w:val="24"/>
-          <w:szCs w:val="20"/>
+          <w:rFonts w:cs="Arial"/>
+          <w:b w:val="false"/>
         </w:rPr>
       </w:r>
     </w:p>
@@ -16210,8 +16089,8 @@
       </w:pPr>
       <w:r>
         <w:rPr>
-          <w:sz w:val="24"/>
-          <w:szCs w:val="20"/>
+          <w:rFonts w:cs="Arial"/>
+          <w:b w:val="false"/>
         </w:rPr>
       </w:r>
     </w:p>
@@ -16328,8 +16207,8 @@
       </w:pPr>
       <w:r>
         <w:rPr>
-          <w:sz w:val="24"/>
-          <w:szCs w:val="20"/>
+          <w:rFonts w:cs="Arial"/>
+          <w:b w:val="false"/>
         </w:rPr>
       </w:r>
     </w:p>
@@ -16464,8 +16343,8 @@
       </w:pPr>
       <w:r>
         <w:rPr>
-          <w:sz w:val="24"/>
-          <w:szCs w:val="20"/>
+          <w:rFonts w:cs="Arial"/>
+          <w:b w:val="false"/>
         </w:rPr>
       </w:r>
     </w:p>
@@ -16569,12 +16448,12 @@
       </w:r>
     </w:p>
     <w:sectPr>
-      <w:headerReference w:type="even" r:id="rId36"/>
-      <w:headerReference w:type="default" r:id="rId37"/>
-      <w:headerReference w:type="first" r:id="rId38"/>
-      <w:footerReference w:type="even" r:id="rId39"/>
-      <w:footerReference w:type="default" r:id="rId40"/>
-      <w:footerReference w:type="first" r:id="rId41"/>
+      <w:headerReference w:type="even" r:id="rId47"/>
+      <w:headerReference w:type="default" r:id="rId48"/>
+      <w:headerReference w:type="first" r:id="rId49"/>
+      <w:footerReference w:type="even" r:id="rId50"/>
+      <w:footerReference w:type="default" r:id="rId51"/>
+      <w:footerReference w:type="first" r:id="rId52"/>
       <w:type w:val="nextPage"/>
       <w:pgSz w:w="11906" w:h="16838"/>
       <w:pgMar w:left="1418" w:right="1418" w:gutter="0" w:header="680" w:top="1418" w:footer="327" w:bottom="1135"/>
@@ -16691,7 +16570,6 @@
       <w:keepNext w:val="false"/>
       <w:keepLines w:val="false"/>
       <w:widowControl/>
-      <w:pBdr/>
       <w:shd w:val="clear" w:fill="auto"/>
       <w:spacing w:lineRule="auto" w:line="240" w:before="0" w:after="60"/>
       <w:ind w:hanging="0" w:left="0" w:right="0"/>
@@ -16749,7 +16627,7 @@
     </w:r>
     <w:r>
       <w:rPr/>
-      <w:t>40</w:t>
+      <w:t>43</w:t>
     </w:r>
     <w:r>
       <w:rPr/>
@@ -16789,7 +16667,7 @@
     </w:r>
     <w:r>
       <w:rPr/>
-      <w:t>40</w:t>
+      <w:t>43</w:t>
     </w:r>
     <w:r>
       <w:rPr/>
@@ -16802,7 +16680,6 @@
       <w:keepNext w:val="false"/>
       <w:keepLines w:val="false"/>
       <w:widowControl/>
-      <w:pBdr/>
       <w:shd w:val="clear" w:fill="auto"/>
       <w:tabs>
         <w:tab w:val="clear" w:pos="720"/>
@@ -16886,7 +16763,6 @@
       <w:keepNext w:val="false"/>
       <w:keepLines w:val="false"/>
       <w:widowControl/>
-      <w:pBdr/>
       <w:shd w:val="clear" w:fill="auto"/>
       <w:spacing w:lineRule="auto" w:line="240" w:before="0" w:after="60"/>
       <w:ind w:hanging="0" w:left="0" w:right="0"/>
@@ -16984,7 +16860,7 @@
     </w:r>
     <w:r>
       <w:rPr/>
-      <w:t>40</w:t>
+      <w:t>43</w:t>
     </w:r>
     <w:r>
       <w:rPr/>
@@ -16997,7 +16873,6 @@
       <w:keepNext w:val="false"/>
       <w:keepLines w:val="false"/>
       <w:widowControl/>
-      <w:pBdr/>
       <w:shd w:val="clear" w:fill="auto"/>
       <w:tabs>
         <w:tab w:val="clear" w:pos="720"/>
@@ -17071,7 +16946,6 @@
       <w:keepNext w:val="false"/>
       <w:keepLines w:val="false"/>
       <w:widowControl w:val="false"/>
-      <w:pBdr/>
       <w:shd w:val="clear" w:fill="auto"/>
       <w:spacing w:lineRule="auto" w:line="276" w:before="0" w:after="0"/>
       <w:ind w:hanging="0" w:left="0" w:right="0"/>
@@ -17098,9 +16972,9 @@
       <w:tblLook w:val="0400"/>
     </w:tblPr>
     <w:tblGrid>
-      <w:gridCol w:w="1346"/>
+      <w:gridCol w:w="1345"/>
       <w:gridCol w:w="5248"/>
-      <w:gridCol w:w="2331"/>
+      <w:gridCol w:w="2332"/>
     </w:tblGrid>
     <w:tr>
       <w:trPr>
@@ -17108,7 +16982,7 @@
       </w:trPr>
       <w:tc>
         <w:tcPr>
-          <w:tcW w:w="1346" w:type="dxa"/>
+          <w:tcW w:w="1345" w:type="dxa"/>
           <w:vMerge w:val="restart"/>
           <w:tcBorders>
             <w:top w:val="single" w:sz="4" w:space="0" w:color="000000"/>
@@ -17159,7 +17033,7 @@
               <wp:inline distT="0" distB="0" distL="0" distR="0">
                 <wp:extent cx="685800" cy="695325"/>
                 <wp:effectExtent l="0" t="0" r="0" b="0"/>
-                <wp:docPr id="35" name="image23.jpg" descr="Descripción: logo_membrete"/>
+                <wp:docPr id="46" name="image23.jpg" descr="Descripción: logo_membrete"/>
                 <wp:cNvGraphicFramePr>
                   <a:graphicFrameLocks xmlns:a="http://schemas.openxmlformats.org/drawingml/2006/main" noChangeAspect="1"/>
                 </wp:cNvGraphicFramePr>
@@ -17167,7 +17041,7 @@
                   <a:graphicData uri="http://schemas.openxmlformats.org/drawingml/2006/picture">
                     <pic:pic xmlns:pic="http://schemas.openxmlformats.org/drawingml/2006/picture">
                       <pic:nvPicPr>
-                        <pic:cNvPr id="35" name="image23.jpg" descr="Descripción: logo_membrete"/>
+                        <pic:cNvPr id="46" name="image23.jpg" descr="Descripción: logo_membrete"/>
                         <pic:cNvPicPr>
                           <a:picLocks noChangeAspect="1" noChangeArrowheads="1"/>
                         </pic:cNvPicPr>
@@ -17269,7 +17143,7 @@
               <w:sz w:val="16"/>
               <w:szCs w:val="16"/>
             </w:rPr>
-            <w:t xml:space="preserve">SERVICIO NACIONAL DE APRENDIZAJE SENA </w:t>
+            <w:t>SERVICIO NACIONAL DE APRENDIZAJE SENA</w:t>
           </w:r>
         </w:p>
         <w:p>
@@ -17362,7 +17236,7 @@
       </w:tc>
       <w:tc>
         <w:tcPr>
-          <w:tcW w:w="2331" w:type="dxa"/>
+          <w:tcW w:w="2332" w:type="dxa"/>
           <w:tcBorders>
             <w:top w:val="single" w:sz="4" w:space="0" w:color="000000"/>
             <w:left w:val="single" w:sz="4" w:space="0" w:color="000000"/>
@@ -17409,7 +17283,7 @@
               <w:sz w:val="16"/>
               <w:szCs w:val="16"/>
             </w:rPr>
-            <w:t xml:space="preserve">Versión: 1  </w:t>
+            <w:t>Versión: 1</w:t>
           </w:r>
         </w:p>
         <w:p>
@@ -17460,7 +17334,7 @@
       </w:trPr>
       <w:tc>
         <w:tcPr>
-          <w:tcW w:w="1346" w:type="dxa"/>
+          <w:tcW w:w="1345" w:type="dxa"/>
           <w:vMerge w:val="continue"/>
           <w:tcBorders>
             <w:top w:val="single" w:sz="4" w:space="0" w:color="000000"/>
@@ -17476,7 +17350,6 @@
             <w:keepNext w:val="false"/>
             <w:keepLines w:val="false"/>
             <w:widowControl w:val="false"/>
-            <w:pBdr/>
             <w:shd w:val="clear" w:fill="auto"/>
             <w:spacing w:lineRule="auto" w:line="276" w:before="0" w:after="0"/>
             <w:ind w:hanging="0" w:left="0" w:right="0"/>
@@ -17514,7 +17387,6 @@
             <w:keepNext w:val="false"/>
             <w:keepLines w:val="false"/>
             <w:widowControl w:val="false"/>
-            <w:pBdr/>
             <w:shd w:val="clear" w:fill="auto"/>
             <w:spacing w:lineRule="auto" w:line="276" w:before="0" w:after="0"/>
             <w:ind w:hanging="0" w:left="0" w:right="0"/>
@@ -17536,7 +17408,7 @@
       </w:tc>
       <w:tc>
         <w:tcPr>
-          <w:tcW w:w="2331" w:type="dxa"/>
+          <w:tcW w:w="2332" w:type="dxa"/>
           <w:tcBorders>
             <w:top w:val="single" w:sz="4" w:space="0" w:color="000000"/>
             <w:left w:val="single" w:sz="4" w:space="0" w:color="000000"/>
@@ -17628,8 +17500,8 @@
     </w:tblPr>
     <w:tblGrid>
       <w:gridCol w:w="3226"/>
-      <w:gridCol w:w="3119"/>
-      <w:gridCol w:w="2580"/>
+      <w:gridCol w:w="3118"/>
+      <w:gridCol w:w="2581"/>
     </w:tblGrid>
     <w:tr>
       <w:trPr/>
@@ -17731,7 +17603,7 @@
               <w:sz w:val="18"/>
               <w:szCs w:val="18"/>
             </w:rPr>
-            <w:t xml:space="preserve">Código: </w:t>
+            <w:t>Código:</w:t>
           </w:r>
         </w:p>
         <w:p>
@@ -17758,7 +17630,7 @@
       </w:tc>
       <w:tc>
         <w:tcPr>
-          <w:tcW w:w="3119" w:type="dxa"/>
+          <w:tcW w:w="3118" w:type="dxa"/>
           <w:tcBorders>
             <w:top w:val="single" w:sz="4" w:space="0" w:color="000000"/>
             <w:left w:val="single" w:sz="4" w:space="0" w:color="000000"/>
@@ -17814,7 +17686,7 @@
       </w:tc>
       <w:tc>
         <w:tcPr>
-          <w:tcW w:w="2580" w:type="dxa"/>
+          <w:tcW w:w="2581" w:type="dxa"/>
           <w:tcBorders>
             <w:top w:val="single" w:sz="4" w:space="0" w:color="000000"/>
             <w:left w:val="single" w:sz="4" w:space="0" w:color="000000"/>
@@ -17843,16 +17715,7 @@
               <w:sz w:val="18"/>
               <w:szCs w:val="18"/>
             </w:rPr>
-            <w:t xml:space="preserve">Fecha: </w:t>
-          </w:r>
-          <w:r>
-            <w:rPr>
-              <w:b/>
-              <w:color w:val="000000"/>
-              <w:sz w:val="18"/>
-              <w:szCs w:val="18"/>
-            </w:rPr>
-            <w:t>27/07/2026</w:t>
+            <w:t>Fecha: 27/07/2026</w:t>
           </w:r>
         </w:p>
         <w:p>
@@ -17899,7 +17762,6 @@
       <w:keepNext w:val="false"/>
       <w:keepLines w:val="false"/>
       <w:widowControl w:val="false"/>
-      <w:pBdr/>
       <w:shd w:val="clear" w:fill="auto"/>
       <w:spacing w:lineRule="auto" w:line="276" w:before="0" w:after="0"/>
       <w:ind w:hanging="0" w:left="0" w:right="0"/>
@@ -17926,9 +17788,9 @@
       <w:tblLook w:val="0400"/>
     </w:tblPr>
     <w:tblGrid>
-      <w:gridCol w:w="1346"/>
+      <w:gridCol w:w="1345"/>
       <w:gridCol w:w="5248"/>
-      <w:gridCol w:w="2331"/>
+      <w:gridCol w:w="2332"/>
     </w:tblGrid>
     <w:tr>
       <w:trPr>
@@ -17936,7 +17798,7 @@
       </w:trPr>
       <w:tc>
         <w:tcPr>
-          <w:tcW w:w="1346" w:type="dxa"/>
+          <w:tcW w:w="1345" w:type="dxa"/>
           <w:vMerge w:val="restart"/>
           <w:tcBorders>
             <w:top w:val="single" w:sz="4" w:space="0" w:color="000000"/>
@@ -17987,7 +17849,7 @@
               <wp:inline distT="0" distB="0" distL="0" distR="0">
                 <wp:extent cx="685800" cy="695325"/>
                 <wp:effectExtent l="0" t="0" r="0" b="0"/>
-                <wp:docPr id="36" name="Image2" descr="Descripción: logo_membrete"/>
+                <wp:docPr id="47" name="Image2" descr="Descripción: logo_membrete"/>
                 <wp:cNvGraphicFramePr>
                   <a:graphicFrameLocks xmlns:a="http://schemas.openxmlformats.org/drawingml/2006/main" noChangeAspect="1"/>
                 </wp:cNvGraphicFramePr>
@@ -17995,7 +17857,7 @@
                   <a:graphicData uri="http://schemas.openxmlformats.org/drawingml/2006/picture">
                     <pic:pic xmlns:pic="http://schemas.openxmlformats.org/drawingml/2006/picture">
                       <pic:nvPicPr>
-                        <pic:cNvPr id="36" name="Image2" descr="Descripción: logo_membrete"/>
+                        <pic:cNvPr id="47" name="Image2" descr="Descripción: logo_membrete"/>
                         <pic:cNvPicPr>
                           <a:picLocks noChangeAspect="1" noChangeArrowheads="1"/>
                         </pic:cNvPicPr>
@@ -18097,7 +17959,7 @@
               <w:sz w:val="16"/>
               <w:szCs w:val="16"/>
             </w:rPr>
-            <w:t xml:space="preserve">SERVICIO NACIONAL DE APRENDIZAJE SENA </w:t>
+            <w:t>SERVICIO NACIONAL DE APRENDIZAJE SENA</w:t>
           </w:r>
         </w:p>
         <w:p>
@@ -18207,7 +18069,7 @@
       </w:tc>
       <w:tc>
         <w:tcPr>
-          <w:tcW w:w="2331" w:type="dxa"/>
+          <w:tcW w:w="2332" w:type="dxa"/>
           <w:tcBorders>
             <w:top w:val="single" w:sz="4" w:space="0" w:color="000000"/>
             <w:left w:val="single" w:sz="4" w:space="0" w:color="000000"/>
@@ -18254,7 +18116,7 @@
               <w:sz w:val="16"/>
               <w:szCs w:val="16"/>
             </w:rPr>
-            <w:t xml:space="preserve">Versión: 1  </w:t>
+            <w:t>Versión: 1</w:t>
           </w:r>
         </w:p>
         <w:p>
@@ -18305,7 +18167,7 @@
       </w:trPr>
       <w:tc>
         <w:tcPr>
-          <w:tcW w:w="1346" w:type="dxa"/>
+          <w:tcW w:w="1345" w:type="dxa"/>
           <w:vMerge w:val="continue"/>
           <w:tcBorders>
             <w:top w:val="single" w:sz="4" w:space="0" w:color="000000"/>
@@ -18321,7 +18183,6 @@
             <w:keepNext w:val="false"/>
             <w:keepLines w:val="false"/>
             <w:widowControl w:val="false"/>
-            <w:pBdr/>
             <w:shd w:val="clear" w:fill="auto"/>
             <w:spacing w:lineRule="auto" w:line="276" w:before="0" w:after="0"/>
             <w:ind w:hanging="0" w:left="0" w:right="0"/>
@@ -18359,7 +18220,6 @@
             <w:keepNext w:val="false"/>
             <w:keepLines w:val="false"/>
             <w:widowControl w:val="false"/>
-            <w:pBdr/>
             <w:shd w:val="clear" w:fill="auto"/>
             <w:spacing w:lineRule="auto" w:line="276" w:before="0" w:after="0"/>
             <w:ind w:hanging="0" w:left="0" w:right="0"/>
@@ -18381,7 +18241,7 @@
       </w:tc>
       <w:tc>
         <w:tcPr>
-          <w:tcW w:w="2331" w:type="dxa"/>
+          <w:tcW w:w="2332" w:type="dxa"/>
           <w:tcBorders>
             <w:top w:val="single" w:sz="4" w:space="0" w:color="000000"/>
             <w:left w:val="single" w:sz="4" w:space="0" w:color="000000"/>
@@ -18473,8 +18333,8 @@
     </w:tblPr>
     <w:tblGrid>
       <w:gridCol w:w="3226"/>
-      <w:gridCol w:w="3119"/>
-      <w:gridCol w:w="2580"/>
+      <w:gridCol w:w="3118"/>
+      <w:gridCol w:w="2581"/>
     </w:tblGrid>
     <w:tr>
       <w:trPr/>
@@ -18532,7 +18392,11 @@
             </w:rPr>
           </w:pPr>
           <w:r>
-            <w:rPr/>
+            <w:rPr>
+              <w:b/>
+              <w:sz w:val="18"/>
+              <w:szCs w:val="18"/>
+            </w:rPr>
           </w:r>
         </w:p>
       </w:tc>
@@ -18570,7 +18434,7 @@
               <w:sz w:val="18"/>
               <w:szCs w:val="18"/>
             </w:rPr>
-            <w:t xml:space="preserve">Código: </w:t>
+            <w:t>Código:</w:t>
           </w:r>
         </w:p>
         <w:p>
@@ -18597,7 +18461,7 @@
       </w:tc>
       <w:tc>
         <w:tcPr>
-          <w:tcW w:w="3119" w:type="dxa"/>
+          <w:tcW w:w="3118" w:type="dxa"/>
           <w:tcBorders>
             <w:top w:val="single" w:sz="4" w:space="0" w:color="000000"/>
             <w:left w:val="single" w:sz="4" w:space="0" w:color="000000"/>
@@ -18653,7 +18517,7 @@
       </w:tc>
       <w:tc>
         <w:tcPr>
-          <w:tcW w:w="2580" w:type="dxa"/>
+          <w:tcW w:w="2581" w:type="dxa"/>
           <w:tcBorders>
             <w:top w:val="single" w:sz="4" w:space="0" w:color="000000"/>
             <w:left w:val="single" w:sz="4" w:space="0" w:color="000000"/>
@@ -18682,16 +18546,7 @@
               <w:sz w:val="18"/>
               <w:szCs w:val="18"/>
             </w:rPr>
-            <w:t xml:space="preserve">Fecha: </w:t>
-          </w:r>
-          <w:r>
-            <w:rPr>
-              <w:b/>
-              <w:color w:val="000000"/>
-              <w:sz w:val="18"/>
-              <w:szCs w:val="18"/>
-            </w:rPr>
-            <w:t>27/07/2026</w:t>
+            <w:t>Fecha: 27/07/2026</w:t>
           </w:r>
         </w:p>
       </w:tc>
@@ -18703,7 +18558,6 @@
       <w:keepNext w:val="false"/>
       <w:keepLines w:val="false"/>
       <w:widowControl/>
-      <w:pBdr/>
       <w:shd w:val="clear" w:fill="auto"/>
       <w:tabs>
         <w:tab w:val="clear" w:pos="720"/>
@@ -20305,6 +20159,7 @@
     <w:rsid w:val="00272b27"/>
     <w:pPr>
       <w:widowControl/>
+      <w:suppressAutoHyphens w:val="true"/>
       <w:bidi w:val="0"/>
       <w:spacing w:before="0" w:after="0"/>
       <w:jc w:val="both"/>
@@ -20703,6 +20558,7 @@
     <w:qFormat/>
     <w:pPr>
       <w:widowControl/>
+      <w:suppressAutoHyphens w:val="true"/>
       <w:bidi w:val="0"/>
       <w:spacing w:before="0" w:after="0"/>
       <w:jc w:val="both"/>
@@ -21119,6 +20975,7 @@
     <w:rsid w:val="00c3282c"/>
     <w:pPr>
       <w:widowControl/>
+      <w:suppressAutoHyphens w:val="true"/>
       <w:bidi w:val="0"/>
       <w:spacing w:before="0" w:after="0"/>
       <w:jc w:val="both"/>

</xml_diff>

<commit_message>
feat: update DEA document with new architecture format
</commit_message>
<xml_diff>
--- a/DEA Formato_Documento_de_Arquitectura.docx
+++ b/DEA Formato_Documento_de_Arquitectura.docx
@@ -7908,6 +7908,24 @@
           <w:szCs w:val="20"/>
         </w:rPr>
         <w:t>CU-16 Presentar un proyecto a un cliente: control remoto de avance de diapositivas en tiempo real.</w:t>
+      </w:r>
+    </w:p>
+    <w:p>
+      <w:pPr>
+        <w:pStyle w:val="ListBullet"/>
+        <w:rPr>
+          <w:sz w:val="24"/>
+          <w:szCs w:val="20"/>
+        </w:rPr>
+      </w:pPr>
+      <w:r>
+        <w:rPr>
+          <w:rFonts w:cs="Arial"/>
+          <w:b w:val="false"/>
+          <w:sz w:val="24"/>
+          <w:szCs w:val="20"/>
+        </w:rPr>
+        <w:t>CU-19 Consultar proyectos en el portal: el cliente inicia sesión en /portal y revisa el listado de sus proyectos y el detalle de cada uno (hitos, documentos, facturas, mensajería).</w:t>
       </w:r>
     </w:p>
     <w:p>

</xml_diff>

<commit_message>
feat: add localization functions for handling translations in database content
</commit_message>
<xml_diff>
--- a/DEA Formato_Documento_de_Arquitectura.docx
+++ b/DEA Formato_Documento_de_Arquitectura.docx
@@ -7005,7 +7005,7 @@
         <w:rPr/>
         <w:drawing>
           <wp:inline distT="0" distB="0" distL="0" distR="0">
-            <wp:extent cx="5760085" cy="1019810"/>
+            <wp:extent cx="5760085" cy="1535858"/>
             <wp:effectExtent l="0" t="0" r="0" b="0"/>
             <wp:docPr id="5" name="Picture 904" descr=""/>
             <wp:cNvGraphicFramePr>
@@ -7029,7 +7029,7 @@
                   <pic:spPr bwMode="auto">
                     <a:xfrm>
                       <a:off x="0" y="0"/>
-                      <a:ext cx="5760085" cy="1019810"/>
+                      <a:ext cx="5760085" cy="1535858"/>
                     </a:xfrm>
                     <a:prstGeom prst="rect">
                       <a:avLst/>

</xml_diff>

<commit_message>
feat: implement live message notification and update handling in thread view
</commit_message>
<xml_diff>
--- a/DEA Formato_Documento_de_Arquitectura.docx
+++ b/DEA Formato_Documento_de_Arquitectura.docx
@@ -8482,7 +8482,7 @@
         <w:rPr/>
         <w:drawing>
           <wp:inline distT="0" distB="0" distL="0" distR="0">
-            <wp:extent cx="2695575" cy="5360035"/>
+            <wp:extent cx="5759450" cy="3419975"/>
             <wp:effectExtent l="0" t="0" r="0" b="0"/>
             <wp:docPr id="13" name="Picture 2" descr=""/>
             <wp:cNvGraphicFramePr>
@@ -8506,7 +8506,7 @@
                   <pic:spPr bwMode="auto">
                     <a:xfrm>
                       <a:off x="0" y="0"/>
-                      <a:ext cx="2695575" cy="5360035"/>
+                      <a:ext cx="5759450" cy="3419975"/>
                     </a:xfrm>
                     <a:prstGeom prst="rect">
                       <a:avLst/>
@@ -8598,7 +8598,7 @@
         <w:rPr/>
         <w:drawing>
           <wp:inline distT="0" distB="0" distL="0" distR="0">
-            <wp:extent cx="3994150" cy="6688455"/>
+            <wp:extent cx="5759450" cy="4450262"/>
             <wp:effectExtent l="0" t="0" r="0" b="0"/>
             <wp:docPr id="14" name="Picture 3" descr=""/>
             <wp:cNvGraphicFramePr>
@@ -8622,7 +8622,7 @@
                   <pic:spPr bwMode="auto">
                     <a:xfrm>
                       <a:off x="0" y="0"/>
-                      <a:ext cx="3994150" cy="6688455"/>
+                      <a:ext cx="5759450" cy="4450262"/>
                     </a:xfrm>
                     <a:prstGeom prst="rect">
                       <a:avLst/>
@@ -8699,7 +8699,7 @@
         <w:rPr/>
         <w:drawing>
           <wp:inline distT="0" distB="0" distL="0" distR="0">
-            <wp:extent cx="3640455" cy="6609080"/>
+            <wp:extent cx="4329274" cy="7600000"/>
             <wp:effectExtent l="0" t="0" r="0" b="0"/>
             <wp:docPr id="15" name="Picture 4" descr=""/>
             <wp:cNvGraphicFramePr>
@@ -8723,7 +8723,7 @@
                   <pic:spPr bwMode="auto">
                     <a:xfrm>
                       <a:off x="0" y="0"/>
-                      <a:ext cx="3640455" cy="6609080"/>
+                      <a:ext cx="4329274" cy="7600000"/>
                     </a:xfrm>
                     <a:prstGeom prst="rect">
                       <a:avLst/>
@@ -8801,7 +8801,7 @@
         <w:rPr/>
         <w:drawing>
           <wp:inline distT="0" distB="0" distL="0" distR="0">
-            <wp:extent cx="2641600" cy="6657975"/>
+            <wp:extent cx="5759450" cy="4685029"/>
             <wp:effectExtent l="0" t="0" r="0" b="0"/>
             <wp:docPr id="16" name="Picture 5" descr=""/>
             <wp:cNvGraphicFramePr>
@@ -8825,7 +8825,7 @@
                   <pic:spPr bwMode="auto">
                     <a:xfrm>
                       <a:off x="0" y="0"/>
-                      <a:ext cx="2641600" cy="6657975"/>
+                      <a:ext cx="5759450" cy="4685029"/>
                     </a:xfrm>
                     <a:prstGeom prst="rect">
                       <a:avLst/>
@@ -8962,6 +8962,55 @@
     </w:p>
     <w:p>
       <w:pPr>
+        <w:pStyle w:val="normal1"/>
+        <w:rPr>
+          <w:sz w:val="24"/>
+          <w:szCs w:val="20"/>
+        </w:rPr>
+      </w:pPr>
+      <w:r>
+        <w:rPr/>
+        <w:drawing>
+          <wp:inline distT="0" distB="0" distL="0" distR="0">
+            <wp:extent cx="5759450" cy="6210844"/>
+            <wp:effectExtent l="0" t="0" r="0" b="0"/>
+            <wp:docPr id="147" name="Picture CRM" descr=""/>
+            <wp:cNvGraphicFramePr>
+              <a:graphicFrameLocks xmlns:a="http://schemas.openxmlformats.org/drawingml/2006/main" noChangeAspect="1"/>
+            </wp:cNvGraphicFramePr>
+            <a:graphic xmlns:a="http://schemas.openxmlformats.org/drawingml/2006/main">
+              <a:graphicData uri="http://schemas.openxmlformats.org/drawingml/2006/picture">
+                <pic:pic xmlns:pic="http://schemas.openxmlformats.org/drawingml/2006/picture">
+                  <pic:nvPicPr>
+                    <pic:cNvPr id="147" name="Picture CRM" descr=""/>
+                    <pic:cNvPicPr>
+                      <a:picLocks noChangeAspect="1" noChangeArrowheads="1"/>
+                    </pic:cNvPicPr>
+                  </pic:nvPicPr>
+                  <pic:blipFill>
+                    <a:blip r:embed="rId58"/>
+                    <a:stretch>
+                      <a:fillRect/>
+                    </a:stretch>
+                  </pic:blipFill>
+                  <pic:spPr bwMode="auto">
+                    <a:xfrm>
+                      <a:off x="0" y="0"/>
+                      <a:ext cx="5759450" cy="6210844"/>
+                    </a:xfrm>
+                    <a:prstGeom prst="rect">
+                      <a:avLst/>
+                    </a:prstGeom>
+                  </pic:spPr>
+                </pic:pic>
+              </a:graphicData>
+            </a:graphic>
+          </wp:inline>
+        </w:drawing>
+      </w:r>
+    </w:p>
+    <w:p>
+      <w:pPr>
         <w:pStyle w:val="ListBullet"/>
         <w:rPr>
           <w:rFonts w:ascii="Arial" w:hAnsi="Arial" w:cs="Arial"/>
@@ -9049,6 +9098,55 @@
     </w:p>
     <w:p>
       <w:pPr>
+        <w:pStyle w:val="normal1"/>
+        <w:rPr>
+          <w:sz w:val="24"/>
+          <w:szCs w:val="20"/>
+        </w:rPr>
+      </w:pPr>
+      <w:r>
+        <w:rPr/>
+        <w:drawing>
+          <wp:inline distT="0" distB="0" distL="0" distR="0">
+            <wp:extent cx="5759450" cy="5396500"/>
+            <wp:effectExtent l="0" t="0" r="0" b="0"/>
+            <wp:docPr id="148" name="Picture Finanzas" descr=""/>
+            <wp:cNvGraphicFramePr>
+              <a:graphicFrameLocks xmlns:a="http://schemas.openxmlformats.org/drawingml/2006/main" noChangeAspect="1"/>
+            </wp:cNvGraphicFramePr>
+            <a:graphic xmlns:a="http://schemas.openxmlformats.org/drawingml/2006/main">
+              <a:graphicData uri="http://schemas.openxmlformats.org/drawingml/2006/picture">
+                <pic:pic xmlns:pic="http://schemas.openxmlformats.org/drawingml/2006/picture">
+                  <pic:nvPicPr>
+                    <pic:cNvPr id="148" name="Picture Finanzas" descr=""/>
+                    <pic:cNvPicPr>
+                      <a:picLocks noChangeAspect="1" noChangeArrowheads="1"/>
+                    </pic:cNvPicPr>
+                  </pic:nvPicPr>
+                  <pic:blipFill>
+                    <a:blip r:embed="rId59"/>
+                    <a:stretch>
+                      <a:fillRect/>
+                    </a:stretch>
+                  </pic:blipFill>
+                  <pic:spPr bwMode="auto">
+                    <a:xfrm>
+                      <a:off x="0" y="0"/>
+                      <a:ext cx="5759450" cy="5396500"/>
+                    </a:xfrm>
+                    <a:prstGeom prst="rect">
+                      <a:avLst/>
+                    </a:prstGeom>
+                  </pic:spPr>
+                </pic:pic>
+              </a:graphicData>
+            </a:graphic>
+          </wp:inline>
+        </w:drawing>
+      </w:r>
+    </w:p>
+    <w:p>
+      <w:pPr>
         <w:pStyle w:val="ListBullet"/>
         <w:rPr>
           <w:rFonts w:ascii="Arial" w:hAnsi="Arial" w:cs="Arial"/>
@@ -9114,6 +9212,55 @@
           <w:szCs w:val="20"/>
         </w:rPr>
         <w:t>runBackup() arma un dump JSON de las tablas de negocio y lo sube a Vercel Blob con acceso privado.</w:t>
+      </w:r>
+    </w:p>
+    <w:p>
+      <w:pPr>
+        <w:pStyle w:val="normal1"/>
+        <w:rPr>
+          <w:sz w:val="24"/>
+          <w:szCs w:val="20"/>
+        </w:rPr>
+      </w:pPr>
+      <w:r>
+        <w:rPr/>
+        <w:drawing>
+          <wp:inline distT="0" distB="0" distL="0" distR="0">
+            <wp:extent cx="5759450" cy="6029087"/>
+            <wp:effectExtent l="0" t="0" r="0" b="0"/>
+            <wp:docPr id="149" name="Picture Backup" descr=""/>
+            <wp:cNvGraphicFramePr>
+              <a:graphicFrameLocks xmlns:a="http://schemas.openxmlformats.org/drawingml/2006/main" noChangeAspect="1"/>
+            </wp:cNvGraphicFramePr>
+            <a:graphic xmlns:a="http://schemas.openxmlformats.org/drawingml/2006/main">
+              <a:graphicData uri="http://schemas.openxmlformats.org/drawingml/2006/picture">
+                <pic:pic xmlns:pic="http://schemas.openxmlformats.org/drawingml/2006/picture">
+                  <pic:nvPicPr>
+                    <pic:cNvPr id="149" name="Picture Backup" descr=""/>
+                    <pic:cNvPicPr>
+                      <a:picLocks noChangeAspect="1" noChangeArrowheads="1"/>
+                    </pic:cNvPicPr>
+                  </pic:nvPicPr>
+                  <pic:blipFill>
+                    <a:blip r:embed="rId60"/>
+                    <a:stretch>
+                      <a:fillRect/>
+                    </a:stretch>
+                  </pic:blipFill>
+                  <pic:spPr bwMode="auto">
+                    <a:xfrm>
+                      <a:off x="0" y="0"/>
+                      <a:ext cx="5759450" cy="6029087"/>
+                    </a:xfrm>
+                    <a:prstGeom prst="rect">
+                      <a:avLst/>
+                    </a:prstGeom>
+                  </pic:spPr>
+                </pic:pic>
+              </a:graphicData>
+            </a:graphic>
+          </wp:inline>
+        </w:drawing>
       </w:r>
     </w:p>
     <w:p>

</xml_diff>

<commit_message>
feat: update DEA Formato_Documento_de_Arquitectura document
</commit_message>
<xml_diff>
--- a/DEA Formato_Documento_de_Arquitectura.docx
+++ b/DEA Formato_Documento_de_Arquitectura.docx
@@ -7005,7 +7005,7 @@
         <w:rPr/>
         <w:drawing>
           <wp:inline distT="0" distB="0" distL="0" distR="0">
-            <wp:extent cx="5760085" cy="1535858"/>
+            <wp:extent cx="5760085" cy="1547495"/>
             <wp:effectExtent l="0" t="0" r="0" b="0"/>
             <wp:docPr id="5" name="Picture 904" descr=""/>
             <wp:cNvGraphicFramePr>
@@ -7029,7 +7029,7 @@
                   <pic:spPr bwMode="auto">
                     <a:xfrm>
                       <a:off x="0" y="0"/>
-                      <a:ext cx="5760085" cy="1535858"/>
+                      <a:ext cx="5760085" cy="1547495"/>
                     </a:xfrm>
                     <a:prstGeom prst="rect">
                       <a:avLst/>

</xml_diff>

<commit_message>
feat: add documentation for building a micro-SIEM in portfolio
</commit_message>
<xml_diff>
--- a/DEA Formato_Documento_de_Arquitectura.docx
+++ b/DEA Formato_Documento_de_Arquitectura.docx
@@ -8482,7 +8482,7 @@
         <w:rPr/>
         <w:drawing>
           <wp:inline distT="0" distB="0" distL="0" distR="0">
-            <wp:extent cx="5759450" cy="3419975"/>
+            <wp:extent cx="5759450" cy="3420110"/>
             <wp:effectExtent l="0" t="0" r="0" b="0"/>
             <wp:docPr id="13" name="Picture 2" descr=""/>
             <wp:cNvGraphicFramePr>
@@ -8506,7 +8506,7 @@
                   <pic:spPr bwMode="auto">
                     <a:xfrm>
                       <a:off x="0" y="0"/>
-                      <a:ext cx="5759450" cy="3419975"/>
+                      <a:ext cx="5759450" cy="3420110"/>
                     </a:xfrm>
                     <a:prstGeom prst="rect">
                       <a:avLst/>
@@ -8598,7 +8598,7 @@
         <w:rPr/>
         <w:drawing>
           <wp:inline distT="0" distB="0" distL="0" distR="0">
-            <wp:extent cx="5759450" cy="4450262"/>
+            <wp:extent cx="5759450" cy="4450080"/>
             <wp:effectExtent l="0" t="0" r="0" b="0"/>
             <wp:docPr id="14" name="Picture 3" descr=""/>
             <wp:cNvGraphicFramePr>
@@ -8622,7 +8622,7 @@
                   <pic:spPr bwMode="auto">
                     <a:xfrm>
                       <a:off x="0" y="0"/>
-                      <a:ext cx="5759450" cy="4450262"/>
+                      <a:ext cx="5759450" cy="4450080"/>
                     </a:xfrm>
                     <a:prstGeom prst="rect">
                       <a:avLst/>
@@ -8699,7 +8699,7 @@
         <w:rPr/>
         <w:drawing>
           <wp:inline distT="0" distB="0" distL="0" distR="0">
-            <wp:extent cx="4329274" cy="7600000"/>
+            <wp:extent cx="4329430" cy="7599680"/>
             <wp:effectExtent l="0" t="0" r="0" b="0"/>
             <wp:docPr id="15" name="Picture 4" descr=""/>
             <wp:cNvGraphicFramePr>
@@ -8723,7 +8723,7 @@
                   <pic:spPr bwMode="auto">
                     <a:xfrm>
                       <a:off x="0" y="0"/>
-                      <a:ext cx="4329274" cy="7600000"/>
+                      <a:ext cx="4329430" cy="7599680"/>
                     </a:xfrm>
                     <a:prstGeom prst="rect">
                       <a:avLst/>
@@ -8801,7 +8801,7 @@
         <w:rPr/>
         <w:drawing>
           <wp:inline distT="0" distB="0" distL="0" distR="0">
-            <wp:extent cx="5759450" cy="4685029"/>
+            <wp:extent cx="5759450" cy="4685030"/>
             <wp:effectExtent l="0" t="0" r="0" b="0"/>
             <wp:docPr id="16" name="Picture 5" descr=""/>
             <wp:cNvGraphicFramePr>
@@ -8825,7 +8825,7 @@
                   <pic:spPr bwMode="auto">
                     <a:xfrm>
                       <a:off x="0" y="0"/>
-                      <a:ext cx="5759450" cy="4685029"/>
+                      <a:ext cx="5759450" cy="4685030"/>
                     </a:xfrm>
                     <a:prstGeom prst="rect">
                       <a:avLst/>
@@ -8972,9 +8972,9 @@
         <w:rPr/>
         <w:drawing>
           <wp:inline distT="0" distB="0" distL="0" distR="0">
-            <wp:extent cx="5759450" cy="6210844"/>
+            <wp:extent cx="4867275" cy="5248910"/>
             <wp:effectExtent l="0" t="0" r="0" b="0"/>
-            <wp:docPr id="147" name="Picture CRM" descr=""/>
+            <wp:docPr id="17" name="Picture CRM" descr=""/>
             <wp:cNvGraphicFramePr>
               <a:graphicFrameLocks xmlns:a="http://schemas.openxmlformats.org/drawingml/2006/main" noChangeAspect="1"/>
             </wp:cNvGraphicFramePr>
@@ -8982,13 +8982,13 @@
               <a:graphicData uri="http://schemas.openxmlformats.org/drawingml/2006/picture">
                 <pic:pic xmlns:pic="http://schemas.openxmlformats.org/drawingml/2006/picture">
                   <pic:nvPicPr>
-                    <pic:cNvPr id="147" name="Picture CRM" descr=""/>
+                    <pic:cNvPr id="17" name="Picture CRM" descr=""/>
                     <pic:cNvPicPr>
                       <a:picLocks noChangeAspect="1" noChangeArrowheads="1"/>
                     </pic:cNvPicPr>
                   </pic:nvPicPr>
                   <pic:blipFill>
-                    <a:blip r:embed="rId58"/>
+                    <a:blip r:embed="rId18"/>
                     <a:stretch>
                       <a:fillRect/>
                     </a:stretch>
@@ -8996,7 +8996,7 @@
                   <pic:spPr bwMode="auto">
                     <a:xfrm>
                       <a:off x="0" y="0"/>
-                      <a:ext cx="5759450" cy="6210844"/>
+                      <a:ext cx="4867275" cy="5248910"/>
                     </a:xfrm>
                     <a:prstGeom prst="rect">
                       <a:avLst/>
@@ -9108,9 +9108,9 @@
         <w:rPr/>
         <w:drawing>
           <wp:inline distT="0" distB="0" distL="0" distR="0">
-            <wp:extent cx="5759450" cy="5396500"/>
+            <wp:extent cx="4659630" cy="4365625"/>
             <wp:effectExtent l="0" t="0" r="0" b="0"/>
-            <wp:docPr id="148" name="Picture Finanzas" descr=""/>
+            <wp:docPr id="18" name="Picture Finanzas" descr=""/>
             <wp:cNvGraphicFramePr>
               <a:graphicFrameLocks xmlns:a="http://schemas.openxmlformats.org/drawingml/2006/main" noChangeAspect="1"/>
             </wp:cNvGraphicFramePr>
@@ -9118,13 +9118,13 @@
               <a:graphicData uri="http://schemas.openxmlformats.org/drawingml/2006/picture">
                 <pic:pic xmlns:pic="http://schemas.openxmlformats.org/drawingml/2006/picture">
                   <pic:nvPicPr>
-                    <pic:cNvPr id="148" name="Picture Finanzas" descr=""/>
+                    <pic:cNvPr id="18" name="Picture Finanzas" descr=""/>
                     <pic:cNvPicPr>
                       <a:picLocks noChangeAspect="1" noChangeArrowheads="1"/>
                     </pic:cNvPicPr>
                   </pic:nvPicPr>
                   <pic:blipFill>
-                    <a:blip r:embed="rId59"/>
+                    <a:blip r:embed="rId19"/>
                     <a:stretch>
                       <a:fillRect/>
                     </a:stretch>
@@ -9132,7 +9132,7 @@
                   <pic:spPr bwMode="auto">
                     <a:xfrm>
                       <a:off x="0" y="0"/>
-                      <a:ext cx="5759450" cy="5396500"/>
+                      <a:ext cx="4659630" cy="4365625"/>
                     </a:xfrm>
                     <a:prstGeom prst="rect">
                       <a:avLst/>
@@ -9226,9 +9226,9 @@
         <w:rPr/>
         <w:drawing>
           <wp:inline distT="0" distB="0" distL="0" distR="0">
-            <wp:extent cx="5759450" cy="6029087"/>
+            <wp:extent cx="4383405" cy="4587875"/>
             <wp:effectExtent l="0" t="0" r="0" b="0"/>
-            <wp:docPr id="149" name="Picture Backup" descr=""/>
+            <wp:docPr id="19" name="Picture Backup" descr=""/>
             <wp:cNvGraphicFramePr>
               <a:graphicFrameLocks xmlns:a="http://schemas.openxmlformats.org/drawingml/2006/main" noChangeAspect="1"/>
             </wp:cNvGraphicFramePr>
@@ -9236,13 +9236,13 @@
               <a:graphicData uri="http://schemas.openxmlformats.org/drawingml/2006/picture">
                 <pic:pic xmlns:pic="http://schemas.openxmlformats.org/drawingml/2006/picture">
                   <pic:nvPicPr>
-                    <pic:cNvPr id="149" name="Picture Backup" descr=""/>
+                    <pic:cNvPr id="19" name="Picture Backup" descr=""/>
                     <pic:cNvPicPr>
                       <a:picLocks noChangeAspect="1" noChangeArrowheads="1"/>
                     </pic:cNvPicPr>
                   </pic:nvPicPr>
                   <pic:blipFill>
-                    <a:blip r:embed="rId60"/>
+                    <a:blip r:embed="rId20"/>
                     <a:stretch>
                       <a:fillRect/>
                     </a:stretch>
@@ -9250,7 +9250,7 @@
                   <pic:spPr bwMode="auto">
                     <a:xfrm>
                       <a:off x="0" y="0"/>
-                      <a:ext cx="5759450" cy="6029087"/>
+                      <a:ext cx="4383405" cy="4587875"/>
                     </a:xfrm>
                     <a:prstGeom prst="rect">
                       <a:avLst/>
@@ -9661,7 +9661,7 @@
           <wp:inline distT="0" distB="0" distL="0" distR="0">
             <wp:extent cx="5182235" cy="5005705"/>
             <wp:effectExtent l="0" t="0" r="0" b="0"/>
-            <wp:docPr id="17" name="Picture 6" descr=""/>
+            <wp:docPr id="20" name="Picture 6" descr=""/>
             <wp:cNvGraphicFramePr>
               <a:graphicFrameLocks xmlns:a="http://schemas.openxmlformats.org/drawingml/2006/main" noChangeAspect="1"/>
             </wp:cNvGraphicFramePr>
@@ -9669,13 +9669,13 @@
               <a:graphicData uri="http://schemas.openxmlformats.org/drawingml/2006/picture">
                 <pic:pic xmlns:pic="http://schemas.openxmlformats.org/drawingml/2006/picture">
                   <pic:nvPicPr>
-                    <pic:cNvPr id="17" name="Picture 6" descr=""/>
+                    <pic:cNvPr id="20" name="Picture 6" descr=""/>
                     <pic:cNvPicPr>
                       <a:picLocks noChangeAspect="1" noChangeArrowheads="1"/>
                     </pic:cNvPicPr>
                   </pic:nvPicPr>
                   <pic:blipFill>
-                    <a:blip r:embed="rId18"/>
+                    <a:blip r:embed="rId21"/>
                     <a:stretch>
                       <a:fillRect/>
                     </a:stretch>
@@ -9872,7 +9872,7 @@
           <wp:inline distT="0" distB="0" distL="0" distR="0">
             <wp:extent cx="3654425" cy="2996565"/>
             <wp:effectExtent l="0" t="0" r="0" b="0"/>
-            <wp:docPr id="18" name="Picture 7" descr=""/>
+            <wp:docPr id="21" name="Picture 7" descr=""/>
             <wp:cNvGraphicFramePr>
               <a:graphicFrameLocks xmlns:a="http://schemas.openxmlformats.org/drawingml/2006/main" noChangeAspect="1"/>
             </wp:cNvGraphicFramePr>
@@ -9880,13 +9880,13 @@
               <a:graphicData uri="http://schemas.openxmlformats.org/drawingml/2006/picture">
                 <pic:pic xmlns:pic="http://schemas.openxmlformats.org/drawingml/2006/picture">
                   <pic:nvPicPr>
-                    <pic:cNvPr id="18" name="Picture 7" descr=""/>
+                    <pic:cNvPr id="21" name="Picture 7" descr=""/>
                     <pic:cNvPicPr>
                       <a:picLocks noChangeAspect="1" noChangeArrowheads="1"/>
                     </pic:cNvPicPr>
                   </pic:nvPicPr>
                   <pic:blipFill>
-                    <a:blip r:embed="rId19"/>
+                    <a:blip r:embed="rId22"/>
                     <a:stretch>
                       <a:fillRect/>
                     </a:stretch>
@@ -9989,7 +9989,7 @@
           <wp:inline distT="0" distB="0" distL="0" distR="0">
             <wp:extent cx="3303270" cy="3251835"/>
             <wp:effectExtent l="0" t="0" r="0" b="0"/>
-            <wp:docPr id="19" name="Picture 8" descr=""/>
+            <wp:docPr id="22" name="Picture 8" descr=""/>
             <wp:cNvGraphicFramePr>
               <a:graphicFrameLocks xmlns:a="http://schemas.openxmlformats.org/drawingml/2006/main" noChangeAspect="1"/>
             </wp:cNvGraphicFramePr>
@@ -9997,13 +9997,13 @@
               <a:graphicData uri="http://schemas.openxmlformats.org/drawingml/2006/picture">
                 <pic:pic xmlns:pic="http://schemas.openxmlformats.org/drawingml/2006/picture">
                   <pic:nvPicPr>
-                    <pic:cNvPr id="19" name="Picture 8" descr=""/>
+                    <pic:cNvPr id="22" name="Picture 8" descr=""/>
                     <pic:cNvPicPr>
                       <a:picLocks noChangeAspect="1" noChangeArrowheads="1"/>
                     </pic:cNvPicPr>
                   </pic:nvPicPr>
                   <pic:blipFill>
-                    <a:blip r:embed="rId20"/>
+                    <a:blip r:embed="rId23"/>
                     <a:stretch>
                       <a:fillRect/>
                     </a:stretch>
@@ -10125,7 +10125,7 @@
           <wp:inline distT="0" distB="0" distL="0" distR="0">
             <wp:extent cx="5760720" cy="3404870"/>
             <wp:effectExtent l="0" t="0" r="0" b="0"/>
-            <wp:docPr id="20" name="Picture 9" descr=""/>
+            <wp:docPr id="23" name="Picture 9" descr=""/>
             <wp:cNvGraphicFramePr>
               <a:graphicFrameLocks xmlns:a="http://schemas.openxmlformats.org/drawingml/2006/main" noChangeAspect="1"/>
             </wp:cNvGraphicFramePr>
@@ -10133,13 +10133,13 @@
               <a:graphicData uri="http://schemas.openxmlformats.org/drawingml/2006/picture">
                 <pic:pic xmlns:pic="http://schemas.openxmlformats.org/drawingml/2006/picture">
                   <pic:nvPicPr>
-                    <pic:cNvPr id="20" name="Picture 9" descr=""/>
+                    <pic:cNvPr id="23" name="Picture 9" descr=""/>
                     <pic:cNvPicPr>
                       <a:picLocks noChangeAspect="1" noChangeArrowheads="1"/>
                     </pic:cNvPicPr>
                   </pic:nvPicPr>
                   <pic:blipFill>
-                    <a:blip r:embed="rId21"/>
+                    <a:blip r:embed="rId24"/>
                     <a:stretch>
                       <a:fillRect/>
                     </a:stretch>
@@ -10275,7 +10275,7 @@
           <wp:inline distT="0" distB="0" distL="0" distR="0">
             <wp:extent cx="5760720" cy="786765"/>
             <wp:effectExtent l="0" t="0" r="0" b="0"/>
-            <wp:docPr id="21" name="Picture 10" descr=""/>
+            <wp:docPr id="24" name="Picture 10" descr=""/>
             <wp:cNvGraphicFramePr>
               <a:graphicFrameLocks xmlns:a="http://schemas.openxmlformats.org/drawingml/2006/main" noChangeAspect="1"/>
             </wp:cNvGraphicFramePr>
@@ -10283,13 +10283,13 @@
               <a:graphicData uri="http://schemas.openxmlformats.org/drawingml/2006/picture">
                 <pic:pic xmlns:pic="http://schemas.openxmlformats.org/drawingml/2006/picture">
                   <pic:nvPicPr>
-                    <pic:cNvPr id="21" name="Picture 10" descr=""/>
+                    <pic:cNvPr id="24" name="Picture 10" descr=""/>
                     <pic:cNvPicPr>
                       <a:picLocks noChangeAspect="1" noChangeArrowheads="1"/>
                     </pic:cNvPicPr>
                   </pic:nvPicPr>
                   <pic:blipFill>
-                    <a:blip r:embed="rId22"/>
+                    <a:blip r:embed="rId25"/>
                     <a:stretch>
                       <a:fillRect/>
                     </a:stretch>
@@ -10519,7 +10519,7 @@
           <wp:inline distT="0" distB="0" distL="0" distR="0">
             <wp:extent cx="5669280" cy="4823460"/>
             <wp:effectExtent l="0" t="0" r="0" b="0"/>
-            <wp:docPr id="22" name="Picture 11" descr=""/>
+            <wp:docPr id="25" name="Picture 11" descr=""/>
             <wp:cNvGraphicFramePr>
               <a:graphicFrameLocks xmlns:a="http://schemas.openxmlformats.org/drawingml/2006/main" noChangeAspect="1"/>
             </wp:cNvGraphicFramePr>
@@ -10527,13 +10527,13 @@
               <a:graphicData uri="http://schemas.openxmlformats.org/drawingml/2006/picture">
                 <pic:pic xmlns:pic="http://schemas.openxmlformats.org/drawingml/2006/picture">
                   <pic:nvPicPr>
-                    <pic:cNvPr id="22" name="Picture 11" descr=""/>
+                    <pic:cNvPr id="25" name="Picture 11" descr=""/>
                     <pic:cNvPicPr>
                       <a:picLocks noChangeAspect="1" noChangeArrowheads="1"/>
                     </pic:cNvPicPr>
                   </pic:nvPicPr>
                   <pic:blipFill>
-                    <a:blip r:embed="rId23"/>
+                    <a:blip r:embed="rId26"/>
                     <a:stretch>
                       <a:fillRect/>
                     </a:stretch>
@@ -10826,7 +10826,7 @@
           <wp:inline distT="0" distB="0" distL="0" distR="0">
             <wp:extent cx="4603750" cy="3274695"/>
             <wp:effectExtent l="0" t="0" r="0" b="0"/>
-            <wp:docPr id="23" name="Picture 12" descr=""/>
+            <wp:docPr id="26" name="Picture 12" descr=""/>
             <wp:cNvGraphicFramePr>
               <a:graphicFrameLocks xmlns:a="http://schemas.openxmlformats.org/drawingml/2006/main" noChangeAspect="1"/>
             </wp:cNvGraphicFramePr>
@@ -10834,13 +10834,13 @@
               <a:graphicData uri="http://schemas.openxmlformats.org/drawingml/2006/picture">
                 <pic:pic xmlns:pic="http://schemas.openxmlformats.org/drawingml/2006/picture">
                   <pic:nvPicPr>
-                    <pic:cNvPr id="23" name="Picture 12" descr=""/>
+                    <pic:cNvPr id="26" name="Picture 12" descr=""/>
                     <pic:cNvPicPr>
                       <a:picLocks noChangeAspect="1" noChangeArrowheads="1"/>
                     </pic:cNvPicPr>
                   </pic:nvPicPr>
                   <pic:blipFill>
-                    <a:blip r:embed="rId24"/>
+                    <a:blip r:embed="rId27"/>
                     <a:stretch>
                       <a:fillRect/>
                     </a:stretch>
@@ -10943,7 +10943,7 @@
           <wp:inline distT="0" distB="0" distL="0" distR="0">
             <wp:extent cx="5487035" cy="2795270"/>
             <wp:effectExtent l="0" t="0" r="0" b="0"/>
-            <wp:docPr id="24" name="Picture 13" descr=""/>
+            <wp:docPr id="27" name="Picture 13" descr=""/>
             <wp:cNvGraphicFramePr>
               <a:graphicFrameLocks xmlns:a="http://schemas.openxmlformats.org/drawingml/2006/main" noChangeAspect="1"/>
             </wp:cNvGraphicFramePr>
@@ -10951,13 +10951,13 @@
               <a:graphicData uri="http://schemas.openxmlformats.org/drawingml/2006/picture">
                 <pic:pic xmlns:pic="http://schemas.openxmlformats.org/drawingml/2006/picture">
                   <pic:nvPicPr>
-                    <pic:cNvPr id="24" name="Picture 13" descr=""/>
+                    <pic:cNvPr id="27" name="Picture 13" descr=""/>
                     <pic:cNvPicPr>
                       <a:picLocks noChangeAspect="1" noChangeArrowheads="1"/>
                     </pic:cNvPicPr>
                   </pic:nvPicPr>
                   <pic:blipFill>
-                    <a:blip r:embed="rId25"/>
+                    <a:blip r:embed="rId28"/>
                     <a:stretch>
                       <a:fillRect/>
                     </a:stretch>
@@ -10988,7 +10988,10 @@
         </w:rPr>
       </w:pPr>
       <w:r>
-        <w:rPr/>
+        <w:rPr>
+          <w:sz w:val="24"/>
+          <w:szCs w:val="20"/>
+        </w:rPr>
       </w:r>
     </w:p>
     <w:p>
@@ -11039,7 +11042,7 @@
           <wp:inline distT="0" distB="0" distL="0" distR="0">
             <wp:extent cx="5669280" cy="3592195"/>
             <wp:effectExtent l="0" t="0" r="0" b="0"/>
-            <wp:docPr id="25" name="Picture 14" descr=""/>
+            <wp:docPr id="28" name="Picture 14" descr=""/>
             <wp:cNvGraphicFramePr>
               <a:graphicFrameLocks xmlns:a="http://schemas.openxmlformats.org/drawingml/2006/main" noChangeAspect="1"/>
             </wp:cNvGraphicFramePr>
@@ -11047,13 +11050,13 @@
               <a:graphicData uri="http://schemas.openxmlformats.org/drawingml/2006/picture">
                 <pic:pic xmlns:pic="http://schemas.openxmlformats.org/drawingml/2006/picture">
                   <pic:nvPicPr>
-                    <pic:cNvPr id="25" name="Picture 14" descr=""/>
+                    <pic:cNvPr id="28" name="Picture 14" descr=""/>
                     <pic:cNvPicPr>
                       <a:picLocks noChangeAspect="1" noChangeArrowheads="1"/>
                     </pic:cNvPicPr>
                   </pic:nvPicPr>
                   <pic:blipFill>
-                    <a:blip r:embed="rId26"/>
+                    <a:blip r:embed="rId29"/>
                     <a:stretch>
                       <a:fillRect/>
                     </a:stretch>
@@ -11123,7 +11126,7 @@
           <wp:inline distT="0" distB="0" distL="0" distR="0">
             <wp:extent cx="5669280" cy="3112770"/>
             <wp:effectExtent l="0" t="0" r="0" b="0"/>
-            <wp:docPr id="26" name="Picture 15" descr=""/>
+            <wp:docPr id="29" name="Picture 15" descr=""/>
             <wp:cNvGraphicFramePr>
               <a:graphicFrameLocks xmlns:a="http://schemas.openxmlformats.org/drawingml/2006/main" noChangeAspect="1"/>
             </wp:cNvGraphicFramePr>
@@ -11131,13 +11134,13 @@
               <a:graphicData uri="http://schemas.openxmlformats.org/drawingml/2006/picture">
                 <pic:pic xmlns:pic="http://schemas.openxmlformats.org/drawingml/2006/picture">
                   <pic:nvPicPr>
-                    <pic:cNvPr id="26" name="Picture 15" descr=""/>
+                    <pic:cNvPr id="29" name="Picture 15" descr=""/>
                     <pic:cNvPicPr>
                       <a:picLocks noChangeAspect="1" noChangeArrowheads="1"/>
                     </pic:cNvPicPr>
                   </pic:nvPicPr>
                   <pic:blipFill>
-                    <a:blip r:embed="rId27"/>
+                    <a:blip r:embed="rId30"/>
                     <a:stretch>
                       <a:fillRect/>
                     </a:stretch>
@@ -11262,7 +11265,7 @@
           <wp:inline distT="0" distB="0" distL="0" distR="0">
             <wp:extent cx="5760720" cy="1744345"/>
             <wp:effectExtent l="0" t="0" r="0" b="0"/>
-            <wp:docPr id="27" name="Picture 16" descr=""/>
+            <wp:docPr id="30" name="Picture 16" descr=""/>
             <wp:cNvGraphicFramePr>
               <a:graphicFrameLocks xmlns:a="http://schemas.openxmlformats.org/drawingml/2006/main" noChangeAspect="1"/>
             </wp:cNvGraphicFramePr>
@@ -11270,13 +11273,13 @@
               <a:graphicData uri="http://schemas.openxmlformats.org/drawingml/2006/picture">
                 <pic:pic xmlns:pic="http://schemas.openxmlformats.org/drawingml/2006/picture">
                   <pic:nvPicPr>
-                    <pic:cNvPr id="27" name="Picture 16" descr=""/>
+                    <pic:cNvPr id="30" name="Picture 16" descr=""/>
                     <pic:cNvPicPr>
                       <a:picLocks noChangeAspect="1" noChangeArrowheads="1"/>
                     </pic:cNvPicPr>
                   </pic:nvPicPr>
                   <pic:blipFill>
-                    <a:blip r:embed="rId28"/>
+                    <a:blip r:embed="rId31"/>
                     <a:stretch>
                       <a:fillRect/>
                     </a:stretch>
@@ -11394,7 +11397,7 @@
           <wp:inline distT="0" distB="0" distL="0" distR="0">
             <wp:extent cx="5760720" cy="2609850"/>
             <wp:effectExtent l="0" t="0" r="0" b="0"/>
-            <wp:docPr id="28" name="Picture 17" descr=""/>
+            <wp:docPr id="31" name="Picture 17" descr=""/>
             <wp:cNvGraphicFramePr>
               <a:graphicFrameLocks xmlns:a="http://schemas.openxmlformats.org/drawingml/2006/main" noChangeAspect="1"/>
             </wp:cNvGraphicFramePr>
@@ -11402,13 +11405,13 @@
               <a:graphicData uri="http://schemas.openxmlformats.org/drawingml/2006/picture">
                 <pic:pic xmlns:pic="http://schemas.openxmlformats.org/drawingml/2006/picture">
                   <pic:nvPicPr>
-                    <pic:cNvPr id="28" name="Picture 17" descr=""/>
+                    <pic:cNvPr id="31" name="Picture 17" descr=""/>
                     <pic:cNvPicPr>
                       <a:picLocks noChangeAspect="1" noChangeArrowheads="1"/>
                     </pic:cNvPicPr>
                   </pic:nvPicPr>
                   <pic:blipFill>
-                    <a:blip r:embed="rId29"/>
+                    <a:blip r:embed="rId32"/>
                     <a:stretch>
                       <a:fillRect/>
                     </a:stretch>
@@ -11607,7 +11610,7 @@
           <wp:inline distT="0" distB="0" distL="0" distR="0">
             <wp:extent cx="5760720" cy="1410970"/>
             <wp:effectExtent l="0" t="0" r="0" b="0"/>
-            <wp:docPr id="29" name="Picture 18" descr=""/>
+            <wp:docPr id="32" name="Picture 18" descr=""/>
             <wp:cNvGraphicFramePr>
               <a:graphicFrameLocks xmlns:a="http://schemas.openxmlformats.org/drawingml/2006/main" noChangeAspect="1"/>
             </wp:cNvGraphicFramePr>
@@ -11615,13 +11618,13 @@
               <a:graphicData uri="http://schemas.openxmlformats.org/drawingml/2006/picture">
                 <pic:pic xmlns:pic="http://schemas.openxmlformats.org/drawingml/2006/picture">
                   <pic:nvPicPr>
-                    <pic:cNvPr id="29" name="Picture 18" descr=""/>
+                    <pic:cNvPr id="32" name="Picture 18" descr=""/>
                     <pic:cNvPicPr>
                       <a:picLocks noChangeAspect="1" noChangeArrowheads="1"/>
                     </pic:cNvPicPr>
                   </pic:nvPicPr>
                   <pic:blipFill>
-                    <a:blip r:embed="rId30"/>
+                    <a:blip r:embed="rId33"/>
                     <a:stretch>
                       <a:fillRect/>
                     </a:stretch>
@@ -11739,7 +11742,7 @@
           <wp:inline distT="0" distB="0" distL="0" distR="0">
             <wp:extent cx="5760720" cy="791210"/>
             <wp:effectExtent l="0" t="0" r="0" b="0"/>
-            <wp:docPr id="30" name="Picture 19" descr=""/>
+            <wp:docPr id="33" name="Picture 19" descr=""/>
             <wp:cNvGraphicFramePr>
               <a:graphicFrameLocks xmlns:a="http://schemas.openxmlformats.org/drawingml/2006/main" noChangeAspect="1"/>
             </wp:cNvGraphicFramePr>
@@ -11747,13 +11750,13 @@
               <a:graphicData uri="http://schemas.openxmlformats.org/drawingml/2006/picture">
                 <pic:pic xmlns:pic="http://schemas.openxmlformats.org/drawingml/2006/picture">
                   <pic:nvPicPr>
-                    <pic:cNvPr id="30" name="Picture 19" descr=""/>
+                    <pic:cNvPr id="33" name="Picture 19" descr=""/>
                     <pic:cNvPicPr>
                       <a:picLocks noChangeAspect="1" noChangeArrowheads="1"/>
                     </pic:cNvPicPr>
                   </pic:nvPicPr>
                   <pic:blipFill>
-                    <a:blip r:embed="rId31"/>
+                    <a:blip r:embed="rId34"/>
                     <a:stretch>
                       <a:fillRect/>
                     </a:stretch>
@@ -11998,7 +12001,7 @@
           <wp:inline distT="0" distB="0" distL="0" distR="0">
             <wp:extent cx="1990090" cy="6813550"/>
             <wp:effectExtent l="0" t="0" r="0" b="0"/>
-            <wp:docPr id="31" name="Picture 20" descr=""/>
+            <wp:docPr id="34" name="Picture 20" descr=""/>
             <wp:cNvGraphicFramePr>
               <a:graphicFrameLocks xmlns:a="http://schemas.openxmlformats.org/drawingml/2006/main" noChangeAspect="1"/>
             </wp:cNvGraphicFramePr>
@@ -12006,13 +12009,13 @@
               <a:graphicData uri="http://schemas.openxmlformats.org/drawingml/2006/picture">
                 <pic:pic xmlns:pic="http://schemas.openxmlformats.org/drawingml/2006/picture">
                   <pic:nvPicPr>
-                    <pic:cNvPr id="31" name="Picture 20" descr=""/>
+                    <pic:cNvPr id="34" name="Picture 20" descr=""/>
                     <pic:cNvPicPr>
                       <a:picLocks noChangeAspect="1" noChangeArrowheads="1"/>
                     </pic:cNvPicPr>
                   </pic:nvPicPr>
                   <pic:blipFill>
-                    <a:blip r:embed="rId32"/>
+                    <a:blip r:embed="rId35"/>
                     <a:stretch>
                       <a:fillRect/>
                     </a:stretch>
@@ -13633,7 +13636,7 @@
           <wp:inline distT="0" distB="0" distL="0" distR="0">
             <wp:extent cx="5760720" cy="1419225"/>
             <wp:effectExtent l="0" t="0" r="0" b="0"/>
-            <wp:docPr id="32" name="Picture 21" descr=""/>
+            <wp:docPr id="35" name="Picture 21" descr=""/>
             <wp:cNvGraphicFramePr>
               <a:graphicFrameLocks xmlns:a="http://schemas.openxmlformats.org/drawingml/2006/main" noChangeAspect="1"/>
             </wp:cNvGraphicFramePr>
@@ -13641,13 +13644,13 @@
               <a:graphicData uri="http://schemas.openxmlformats.org/drawingml/2006/picture">
                 <pic:pic xmlns:pic="http://schemas.openxmlformats.org/drawingml/2006/picture">
                   <pic:nvPicPr>
-                    <pic:cNvPr id="32" name="Picture 21" descr=""/>
+                    <pic:cNvPr id="35" name="Picture 21" descr=""/>
                     <pic:cNvPicPr>
                       <a:picLocks noChangeAspect="1" noChangeArrowheads="1"/>
                     </pic:cNvPicPr>
                   </pic:nvPicPr>
                   <pic:blipFill>
-                    <a:blip r:embed="rId33"/>
+                    <a:blip r:embed="rId36"/>
                     <a:stretch>
                       <a:fillRect/>
                     </a:stretch>
@@ -13722,7 +13725,7 @@
           <wp:inline distT="0" distB="0" distL="0" distR="0">
             <wp:extent cx="5760720" cy="1069340"/>
             <wp:effectExtent l="0" t="0" r="0" b="0"/>
-            <wp:docPr id="33" name="Picture 22" descr=""/>
+            <wp:docPr id="36" name="Picture 22" descr=""/>
             <wp:cNvGraphicFramePr>
               <a:graphicFrameLocks xmlns:a="http://schemas.openxmlformats.org/drawingml/2006/main" noChangeAspect="1"/>
             </wp:cNvGraphicFramePr>
@@ -13730,13 +13733,13 @@
               <a:graphicData uri="http://schemas.openxmlformats.org/drawingml/2006/picture">
                 <pic:pic xmlns:pic="http://schemas.openxmlformats.org/drawingml/2006/picture">
                   <pic:nvPicPr>
-                    <pic:cNvPr id="33" name="Picture 22" descr=""/>
+                    <pic:cNvPr id="36" name="Picture 22" descr=""/>
                     <pic:cNvPicPr>
                       <a:picLocks noChangeAspect="1" noChangeArrowheads="1"/>
                     </pic:cNvPicPr>
                   </pic:nvPicPr>
                   <pic:blipFill>
-                    <a:blip r:embed="rId34"/>
+                    <a:blip r:embed="rId37"/>
                     <a:stretch>
                       <a:fillRect/>
                     </a:stretch>
@@ -14073,7 +14076,7 @@
           <wp:inline distT="0" distB="0" distL="0" distR="0">
             <wp:extent cx="5760720" cy="1098550"/>
             <wp:effectExtent l="0" t="0" r="0" b="0"/>
-            <wp:docPr id="34" name="Picture 23" descr=""/>
+            <wp:docPr id="37" name="Picture 23" descr=""/>
             <wp:cNvGraphicFramePr>
               <a:graphicFrameLocks xmlns:a="http://schemas.openxmlformats.org/drawingml/2006/main" noChangeAspect="1"/>
             </wp:cNvGraphicFramePr>
@@ -14081,13 +14084,13 @@
               <a:graphicData uri="http://schemas.openxmlformats.org/drawingml/2006/picture">
                 <pic:pic xmlns:pic="http://schemas.openxmlformats.org/drawingml/2006/picture">
                   <pic:nvPicPr>
-                    <pic:cNvPr id="34" name="Picture 23" descr=""/>
+                    <pic:cNvPr id="37" name="Picture 23" descr=""/>
                     <pic:cNvPicPr>
                       <a:picLocks noChangeAspect="1" noChangeArrowheads="1"/>
                     </pic:cNvPicPr>
                   </pic:nvPicPr>
                   <pic:blipFill>
-                    <a:blip r:embed="rId35"/>
+                    <a:blip r:embed="rId38"/>
                     <a:stretch>
                       <a:fillRect/>
                     </a:stretch>
@@ -14278,7 +14281,7 @@
           <wp:inline distT="0" distB="0" distL="0" distR="0">
             <wp:extent cx="5760720" cy="2900680"/>
             <wp:effectExtent l="0" t="0" r="0" b="0"/>
-            <wp:docPr id="35" name="Picture 24" descr=""/>
+            <wp:docPr id="38" name="Picture 24" descr=""/>
             <wp:cNvGraphicFramePr>
               <a:graphicFrameLocks xmlns:a="http://schemas.openxmlformats.org/drawingml/2006/main" noChangeAspect="1"/>
             </wp:cNvGraphicFramePr>
@@ -14286,336 +14289,7 @@
               <a:graphicData uri="http://schemas.openxmlformats.org/drawingml/2006/picture">
                 <pic:pic xmlns:pic="http://schemas.openxmlformats.org/drawingml/2006/picture">
                   <pic:nvPicPr>
-                    <pic:cNvPr id="35" name="Picture 24" descr=""/>
-                    <pic:cNvPicPr>
-                      <a:picLocks noChangeAspect="1" noChangeArrowheads="1"/>
-                    </pic:cNvPicPr>
-                  </pic:nvPicPr>
-                  <pic:blipFill>
-                    <a:blip r:embed="rId36"/>
-                    <a:stretch>
-                      <a:fillRect/>
-                    </a:stretch>
-                  </pic:blipFill>
-                  <pic:spPr bwMode="auto">
-                    <a:xfrm>
-                      <a:off x="0" y="0"/>
-                      <a:ext cx="5760720" cy="2900680"/>
-                    </a:xfrm>
-                    <a:prstGeom prst="rect">
-                      <a:avLst/>
-                    </a:prstGeom>
-                  </pic:spPr>
-                </pic:pic>
-              </a:graphicData>
-            </a:graphic>
-          </wp:inline>
-        </w:drawing>
-      </w:r>
-    </w:p>
-    <w:p>
-      <w:pPr>
-        <w:pStyle w:val="normal1"/>
-        <w:jc w:val="center"/>
-        <w:rPr>
-          <w:sz w:val="24"/>
-          <w:szCs w:val="20"/>
-        </w:rPr>
-      </w:pPr>
-      <w:r>
-        <w:rPr>
-          <w:sz w:val="24"/>
-          <w:szCs w:val="20"/>
-        </w:rPr>
-      </w:r>
-    </w:p>
-    <w:p>
-      <w:pPr>
-        <w:pStyle w:val="normal1"/>
-        <w:rPr>
-          <w:sz w:val="24"/>
-          <w:szCs w:val="20"/>
-        </w:rPr>
-      </w:pPr>
-      <w:r>
-        <w:rPr>
-          <w:rFonts w:cs="Arial"/>
-          <w:b/>
-          <w:sz w:val="24"/>
-          <w:szCs w:val="20"/>
-        </w:rPr>
-        <w:t>/status — Estado de los servicios</w:t>
-      </w:r>
-    </w:p>
-    <w:p>
-      <w:pPr>
-        <w:pStyle w:val="normal1"/>
-        <w:rPr>
-          <w:rFonts w:ascii="Arial" w:hAnsi="Arial" w:cs="Arial"/>
-          <w:b/>
-        </w:rPr>
-      </w:pPr>
-      <w:r>
-        <w:rPr>
-          <w:rFonts w:cs="Arial"/>
-          <w:b/>
-        </w:rPr>
-      </w:r>
-    </w:p>
-    <w:p>
-      <w:pPr>
-        <w:pStyle w:val="normal1"/>
-        <w:jc w:val="center"/>
-        <w:rPr>
-          <w:sz w:val="24"/>
-          <w:szCs w:val="20"/>
-        </w:rPr>
-      </w:pPr>
-      <w:r>
-        <w:rPr/>
-        <w:drawing>
-          <wp:inline distT="0" distB="0" distL="0" distR="0">
-            <wp:extent cx="5760720" cy="2900680"/>
-            <wp:effectExtent l="0" t="0" r="0" b="0"/>
-            <wp:docPr id="36" name="Picture 25" descr=""/>
-            <wp:cNvGraphicFramePr>
-              <a:graphicFrameLocks xmlns:a="http://schemas.openxmlformats.org/drawingml/2006/main" noChangeAspect="1"/>
-            </wp:cNvGraphicFramePr>
-            <a:graphic xmlns:a="http://schemas.openxmlformats.org/drawingml/2006/main">
-              <a:graphicData uri="http://schemas.openxmlformats.org/drawingml/2006/picture">
-                <pic:pic xmlns:pic="http://schemas.openxmlformats.org/drawingml/2006/picture">
-                  <pic:nvPicPr>
-                    <pic:cNvPr id="36" name="Picture 25" descr=""/>
-                    <pic:cNvPicPr>
-                      <a:picLocks noChangeAspect="1" noChangeArrowheads="1"/>
-                    </pic:cNvPicPr>
-                  </pic:nvPicPr>
-                  <pic:blipFill>
-                    <a:blip r:embed="rId37"/>
-                    <a:stretch>
-                      <a:fillRect/>
-                    </a:stretch>
-                  </pic:blipFill>
-                  <pic:spPr bwMode="auto">
-                    <a:xfrm>
-                      <a:off x="0" y="0"/>
-                      <a:ext cx="5760720" cy="2900680"/>
-                    </a:xfrm>
-                    <a:prstGeom prst="rect">
-                      <a:avLst/>
-                    </a:prstGeom>
-                  </pic:spPr>
-                </pic:pic>
-              </a:graphicData>
-            </a:graphic>
-          </wp:inline>
-        </w:drawing>
-      </w:r>
-    </w:p>
-    <w:p>
-      <w:pPr>
-        <w:pStyle w:val="normal1"/>
-        <w:jc w:val="center"/>
-        <w:rPr>
-          <w:sz w:val="24"/>
-          <w:szCs w:val="20"/>
-        </w:rPr>
-      </w:pPr>
-      <w:r>
-        <w:rPr>
-          <w:sz w:val="24"/>
-          <w:szCs w:val="20"/>
-        </w:rPr>
-      </w:r>
-    </w:p>
-    <w:p>
-      <w:pPr>
-        <w:pStyle w:val="normal1"/>
-        <w:jc w:val="center"/>
-        <w:rPr>
-          <w:sz w:val="24"/>
-          <w:szCs w:val="20"/>
-        </w:rPr>
-      </w:pPr>
-      <w:r>
-        <w:rPr>
-          <w:sz w:val="24"/>
-          <w:szCs w:val="20"/>
-        </w:rPr>
-      </w:r>
-    </w:p>
-    <w:p>
-      <w:pPr>
-        <w:pStyle w:val="normal1"/>
-        <w:jc w:val="center"/>
-        <w:rPr>
-          <w:sz w:val="24"/>
-          <w:szCs w:val="20"/>
-        </w:rPr>
-      </w:pPr>
-      <w:r>
-        <w:rPr>
-          <w:sz w:val="24"/>
-          <w:szCs w:val="20"/>
-        </w:rPr>
-      </w:r>
-    </w:p>
-    <w:p>
-      <w:pPr>
-        <w:pStyle w:val="normal1"/>
-        <w:rPr>
-          <w:sz w:val="24"/>
-          <w:szCs w:val="20"/>
-        </w:rPr>
-      </w:pPr>
-      <w:r>
-        <w:rPr>
-          <w:rFonts w:cs="Arial"/>
-          <w:b/>
-          <w:sz w:val="24"/>
-          <w:szCs w:val="20"/>
-        </w:rPr>
-        <w:t>/tools — Vitrina de herramientas</w:t>
-      </w:r>
-    </w:p>
-    <w:p>
-      <w:pPr>
-        <w:pStyle w:val="normal1"/>
-        <w:rPr>
-          <w:rFonts w:ascii="Arial" w:hAnsi="Arial" w:cs="Arial"/>
-          <w:b/>
-        </w:rPr>
-      </w:pPr>
-      <w:r>
-        <w:rPr>
-          <w:rFonts w:cs="Arial"/>
-          <w:b/>
-        </w:rPr>
-      </w:r>
-    </w:p>
-    <w:p>
-      <w:pPr>
-        <w:pStyle w:val="normal1"/>
-        <w:jc w:val="center"/>
-        <w:rPr>
-          <w:sz w:val="24"/>
-          <w:szCs w:val="20"/>
-        </w:rPr>
-      </w:pPr>
-      <w:r>
-        <w:rPr/>
-        <w:drawing>
-          <wp:inline distT="0" distB="0" distL="0" distR="0">
-            <wp:extent cx="5760720" cy="2900680"/>
-            <wp:effectExtent l="0" t="0" r="0" b="0"/>
-            <wp:docPr id="37" name="Picture 26" descr=""/>
-            <wp:cNvGraphicFramePr>
-              <a:graphicFrameLocks xmlns:a="http://schemas.openxmlformats.org/drawingml/2006/main" noChangeAspect="1"/>
-            </wp:cNvGraphicFramePr>
-            <a:graphic xmlns:a="http://schemas.openxmlformats.org/drawingml/2006/main">
-              <a:graphicData uri="http://schemas.openxmlformats.org/drawingml/2006/picture">
-                <pic:pic xmlns:pic="http://schemas.openxmlformats.org/drawingml/2006/picture">
-                  <pic:nvPicPr>
-                    <pic:cNvPr id="37" name="Picture 26" descr=""/>
-                    <pic:cNvPicPr>
-                      <a:picLocks noChangeAspect="1" noChangeArrowheads="1"/>
-                    </pic:cNvPicPr>
-                  </pic:nvPicPr>
-                  <pic:blipFill>
-                    <a:blip r:embed="rId38"/>
-                    <a:stretch>
-                      <a:fillRect/>
-                    </a:stretch>
-                  </pic:blipFill>
-                  <pic:spPr bwMode="auto">
-                    <a:xfrm>
-                      <a:off x="0" y="0"/>
-                      <a:ext cx="5760720" cy="2900680"/>
-                    </a:xfrm>
-                    <a:prstGeom prst="rect">
-                      <a:avLst/>
-                    </a:prstGeom>
-                  </pic:spPr>
-                </pic:pic>
-              </a:graphicData>
-            </a:graphic>
-          </wp:inline>
-        </w:drawing>
-      </w:r>
-    </w:p>
-    <w:p>
-      <w:pPr>
-        <w:pStyle w:val="normal1"/>
-        <w:jc w:val="center"/>
-        <w:rPr>
-          <w:sz w:val="24"/>
-          <w:szCs w:val="20"/>
-        </w:rPr>
-      </w:pPr>
-      <w:r>
-        <w:rPr>
-          <w:sz w:val="24"/>
-          <w:szCs w:val="20"/>
-        </w:rPr>
-      </w:r>
-    </w:p>
-    <w:p>
-      <w:pPr>
-        <w:pStyle w:val="normal1"/>
-        <w:rPr>
-          <w:sz w:val="24"/>
-          <w:szCs w:val="20"/>
-        </w:rPr>
-      </w:pPr>
-      <w:r>
-        <w:rPr>
-          <w:rFonts w:cs="Arial"/>
-          <w:b/>
-          <w:sz w:val="24"/>
-          <w:szCs w:val="20"/>
-        </w:rPr>
-        <w:t>/docs — Documentación de ingeniería</w:t>
-      </w:r>
-    </w:p>
-    <w:p>
-      <w:pPr>
-        <w:pStyle w:val="normal1"/>
-        <w:rPr>
-          <w:rFonts w:ascii="Arial" w:hAnsi="Arial" w:cs="Arial"/>
-          <w:b/>
-        </w:rPr>
-      </w:pPr>
-      <w:r>
-        <w:rPr>
-          <w:rFonts w:cs="Arial"/>
-          <w:b/>
-        </w:rPr>
-      </w:r>
-    </w:p>
-    <w:p>
-      <w:pPr>
-        <w:pStyle w:val="normal1"/>
-        <w:jc w:val="center"/>
-        <w:rPr>
-          <w:sz w:val="24"/>
-          <w:szCs w:val="20"/>
-        </w:rPr>
-      </w:pPr>
-      <w:r>
-        <w:rPr/>
-        <w:drawing>
-          <wp:inline distT="0" distB="0" distL="0" distR="0">
-            <wp:extent cx="5760720" cy="2900680"/>
-            <wp:effectExtent l="0" t="0" r="0" b="0"/>
-            <wp:docPr id="38" name="Picture 27" descr=""/>
-            <wp:cNvGraphicFramePr>
-              <a:graphicFrameLocks xmlns:a="http://schemas.openxmlformats.org/drawingml/2006/main" noChangeAspect="1"/>
-            </wp:cNvGraphicFramePr>
-            <a:graphic xmlns:a="http://schemas.openxmlformats.org/drawingml/2006/main">
-              <a:graphicData uri="http://schemas.openxmlformats.org/drawingml/2006/picture">
-                <pic:pic xmlns:pic="http://schemas.openxmlformats.org/drawingml/2006/picture">
-                  <pic:nvPicPr>
-                    <pic:cNvPr id="38" name="Picture 27" descr=""/>
+                    <pic:cNvPr id="38" name="Picture 24" descr=""/>
                     <pic:cNvPicPr>
                       <a:picLocks noChangeAspect="1" noChangeArrowheads="1"/>
                     </pic:cNvPicPr>
@@ -14645,44 +14319,40 @@
     <w:p>
       <w:pPr>
         <w:pStyle w:val="normal1"/>
-        <w:rPr>
-          <w:sz w:val="24"/>
-          <w:szCs w:val="20"/>
-        </w:rPr>
-      </w:pPr>
-      <w:r>
-        <w:rPr>
-          <w:sz w:val="24"/>
-          <w:szCs w:val="20"/>
-        </w:rPr>
-      </w:r>
-      <w:r>
-        <w:br w:type="page"/>
-      </w:r>
-    </w:p>
-    <w:p>
-      <w:pPr>
-        <w:pStyle w:val="normal1"/>
-        <w:spacing w:before="0" w:after="0"/>
-        <w:rPr>
-          <w:sz w:val="24"/>
-          <w:szCs w:val="20"/>
-        </w:rPr>
-      </w:pPr>
-      <w:r>
-        <w:rPr>
-          <w:rFonts w:cs="Arial"/>
-          <w:b/>
-          <w:sz w:val="24"/>
-          <w:szCs w:val="20"/>
-        </w:rPr>
-        <w:t>/admin — Dashboard (vía pase de demo)</w:t>
-      </w:r>
-    </w:p>
-    <w:p>
-      <w:pPr>
-        <w:pStyle w:val="normal1"/>
-        <w:spacing w:before="0" w:after="0"/>
+        <w:jc w:val="center"/>
+        <w:rPr>
+          <w:sz w:val="24"/>
+          <w:szCs w:val="20"/>
+        </w:rPr>
+      </w:pPr>
+      <w:r>
+        <w:rPr>
+          <w:sz w:val="24"/>
+          <w:szCs w:val="20"/>
+        </w:rPr>
+      </w:r>
+    </w:p>
+    <w:p>
+      <w:pPr>
+        <w:pStyle w:val="normal1"/>
+        <w:rPr>
+          <w:sz w:val="24"/>
+          <w:szCs w:val="20"/>
+        </w:rPr>
+      </w:pPr>
+      <w:r>
+        <w:rPr>
+          <w:rFonts w:cs="Arial"/>
+          <w:b/>
+          <w:sz w:val="24"/>
+          <w:szCs w:val="20"/>
+        </w:rPr>
+        <w:t>/status — Estado de los servicios</w:t>
+      </w:r>
+    </w:p>
+    <w:p>
+      <w:pPr>
+        <w:pStyle w:val="normal1"/>
         <w:rPr>
           <w:rFonts w:ascii="Arial" w:hAnsi="Arial" w:cs="Arial"/>
           <w:b/>
@@ -14710,7 +14380,7 @@
           <wp:inline distT="0" distB="0" distL="0" distR="0">
             <wp:extent cx="5760720" cy="2900680"/>
             <wp:effectExtent l="0" t="0" r="0" b="0"/>
-            <wp:docPr id="39" name="Picture 28" descr=""/>
+            <wp:docPr id="39" name="Picture 25" descr=""/>
             <wp:cNvGraphicFramePr>
               <a:graphicFrameLocks xmlns:a="http://schemas.openxmlformats.org/drawingml/2006/main" noChangeAspect="1"/>
             </wp:cNvGraphicFramePr>
@@ -14718,7 +14388,7 @@
               <a:graphicData uri="http://schemas.openxmlformats.org/drawingml/2006/picture">
                 <pic:pic xmlns:pic="http://schemas.openxmlformats.org/drawingml/2006/picture">
                   <pic:nvPicPr>
-                    <pic:cNvPr id="39" name="Picture 28" descr=""/>
+                    <pic:cNvPr id="39" name="Picture 25" descr=""/>
                     <pic:cNvPicPr>
                       <a:picLocks noChangeAspect="1" noChangeArrowheads="1"/>
                     </pic:cNvPicPr>
@@ -14764,19 +14434,51 @@
     <w:p>
       <w:pPr>
         <w:pStyle w:val="normal1"/>
-        <w:rPr>
-          <w:sz w:val="24"/>
-          <w:szCs w:val="20"/>
-        </w:rPr>
-      </w:pPr>
-      <w:r>
-        <w:rPr>
-          <w:rFonts w:cs="Arial"/>
-          <w:b/>
-          <w:sz w:val="24"/>
-          <w:szCs w:val="20"/>
-        </w:rPr>
-        <w:t>/admin/costs — Costos y P&amp;L</w:t>
+        <w:jc w:val="center"/>
+        <w:rPr>
+          <w:sz w:val="24"/>
+          <w:szCs w:val="20"/>
+        </w:rPr>
+      </w:pPr>
+      <w:r>
+        <w:rPr>
+          <w:sz w:val="24"/>
+          <w:szCs w:val="20"/>
+        </w:rPr>
+      </w:r>
+    </w:p>
+    <w:p>
+      <w:pPr>
+        <w:pStyle w:val="normal1"/>
+        <w:jc w:val="center"/>
+        <w:rPr>
+          <w:sz w:val="24"/>
+          <w:szCs w:val="20"/>
+        </w:rPr>
+      </w:pPr>
+      <w:r>
+        <w:rPr>
+          <w:sz w:val="24"/>
+          <w:szCs w:val="20"/>
+        </w:rPr>
+      </w:r>
+    </w:p>
+    <w:p>
+      <w:pPr>
+        <w:pStyle w:val="normal1"/>
+        <w:rPr>
+          <w:sz w:val="24"/>
+          <w:szCs w:val="20"/>
+        </w:rPr>
+      </w:pPr>
+      <w:r>
+        <w:rPr>
+          <w:rFonts w:cs="Arial"/>
+          <w:b/>
+          <w:sz w:val="24"/>
+          <w:szCs w:val="20"/>
+        </w:rPr>
+        <w:t>/tools — Vitrina de herramientas</w:t>
       </w:r>
     </w:p>
     <w:p>
@@ -14809,7 +14511,7 @@
           <wp:inline distT="0" distB="0" distL="0" distR="0">
             <wp:extent cx="5760720" cy="2900680"/>
             <wp:effectExtent l="0" t="0" r="0" b="0"/>
-            <wp:docPr id="40" name="Picture 29" descr=""/>
+            <wp:docPr id="40" name="Picture 26" descr=""/>
             <wp:cNvGraphicFramePr>
               <a:graphicFrameLocks xmlns:a="http://schemas.openxmlformats.org/drawingml/2006/main" noChangeAspect="1"/>
             </wp:cNvGraphicFramePr>
@@ -14817,7 +14519,7 @@
               <a:graphicData uri="http://schemas.openxmlformats.org/drawingml/2006/picture">
                 <pic:pic xmlns:pic="http://schemas.openxmlformats.org/drawingml/2006/picture">
                   <pic:nvPicPr>
-                    <pic:cNvPr id="40" name="Picture 29" descr=""/>
+                    <pic:cNvPr id="40" name="Picture 26" descr=""/>
                     <pic:cNvPicPr>
                       <a:picLocks noChangeAspect="1" noChangeArrowheads="1"/>
                     </pic:cNvPicPr>
@@ -14863,115 +14565,19 @@
     <w:p>
       <w:pPr>
         <w:pStyle w:val="normal1"/>
-        <w:jc w:val="center"/>
-        <w:rPr>
-          <w:sz w:val="24"/>
-          <w:szCs w:val="20"/>
-        </w:rPr>
-      </w:pPr>
-      <w:r>
-        <w:rPr>
-          <w:sz w:val="24"/>
-          <w:szCs w:val="20"/>
-        </w:rPr>
-      </w:r>
-    </w:p>
-    <w:p>
-      <w:pPr>
-        <w:pStyle w:val="normal1"/>
-        <w:jc w:val="center"/>
-        <w:rPr>
-          <w:sz w:val="24"/>
-          <w:szCs w:val="20"/>
-        </w:rPr>
-      </w:pPr>
-      <w:r>
-        <w:rPr>
-          <w:sz w:val="24"/>
-          <w:szCs w:val="20"/>
-        </w:rPr>
-      </w:r>
-    </w:p>
-    <w:p>
-      <w:pPr>
-        <w:pStyle w:val="normal1"/>
-        <w:jc w:val="center"/>
-        <w:rPr>
-          <w:sz w:val="24"/>
-          <w:szCs w:val="20"/>
-        </w:rPr>
-      </w:pPr>
-      <w:r>
-        <w:rPr>
-          <w:sz w:val="24"/>
-          <w:szCs w:val="20"/>
-        </w:rPr>
-      </w:r>
-    </w:p>
-    <w:p>
-      <w:pPr>
-        <w:pStyle w:val="normal1"/>
-        <w:jc w:val="center"/>
-        <w:rPr>
-          <w:sz w:val="24"/>
-          <w:szCs w:val="20"/>
-        </w:rPr>
-      </w:pPr>
-      <w:r>
-        <w:rPr>
-          <w:sz w:val="24"/>
-          <w:szCs w:val="20"/>
-        </w:rPr>
-      </w:r>
-    </w:p>
-    <w:p>
-      <w:pPr>
-        <w:pStyle w:val="normal1"/>
-        <w:jc w:val="center"/>
-        <w:rPr>
-          <w:sz w:val="24"/>
-          <w:szCs w:val="20"/>
-        </w:rPr>
-      </w:pPr>
-      <w:r>
-        <w:rPr>
-          <w:sz w:val="24"/>
-          <w:szCs w:val="20"/>
-        </w:rPr>
-      </w:r>
-    </w:p>
-    <w:p>
-      <w:pPr>
-        <w:pStyle w:val="normal1"/>
-        <w:jc w:val="center"/>
-        <w:rPr>
-          <w:sz w:val="24"/>
-          <w:szCs w:val="20"/>
-        </w:rPr>
-      </w:pPr>
-      <w:r>
-        <w:rPr>
-          <w:sz w:val="24"/>
-          <w:szCs w:val="20"/>
-        </w:rPr>
-      </w:r>
-    </w:p>
-    <w:p>
-      <w:pPr>
-        <w:pStyle w:val="normal1"/>
-        <w:rPr>
-          <w:sz w:val="24"/>
-          <w:szCs w:val="20"/>
-        </w:rPr>
-      </w:pPr>
-      <w:r>
-        <w:rPr>
-          <w:rFonts w:cs="Arial"/>
-          <w:b/>
-          <w:sz w:val="24"/>
-          <w:szCs w:val="20"/>
-        </w:rPr>
-        <w:t>/admin/security — Panel del micro-SIEM</w:t>
+        <w:rPr>
+          <w:sz w:val="24"/>
+          <w:szCs w:val="20"/>
+        </w:rPr>
+      </w:pPr>
+      <w:r>
+        <w:rPr>
+          <w:rFonts w:cs="Arial"/>
+          <w:b/>
+          <w:sz w:val="24"/>
+          <w:szCs w:val="20"/>
+        </w:rPr>
+        <w:t>/docs — Documentación de ingeniería</w:t>
       </w:r>
     </w:p>
     <w:p>
@@ -15004,7 +14610,7 @@
           <wp:inline distT="0" distB="0" distL="0" distR="0">
             <wp:extent cx="5760720" cy="2900680"/>
             <wp:effectExtent l="0" t="0" r="0" b="0"/>
-            <wp:docPr id="41" name="Picture 30" descr=""/>
+            <wp:docPr id="41" name="Picture 27" descr=""/>
             <wp:cNvGraphicFramePr>
               <a:graphicFrameLocks xmlns:a="http://schemas.openxmlformats.org/drawingml/2006/main" noChangeAspect="1"/>
             </wp:cNvGraphicFramePr>
@@ -15012,7 +14618,7 @@
               <a:graphicData uri="http://schemas.openxmlformats.org/drawingml/2006/picture">
                 <pic:pic xmlns:pic="http://schemas.openxmlformats.org/drawingml/2006/picture">
                   <pic:nvPicPr>
-                    <pic:cNvPr id="41" name="Picture 30" descr=""/>
+                    <pic:cNvPr id="41" name="Picture 27" descr=""/>
                     <pic:cNvPicPr>
                       <a:picLocks noChangeAspect="1" noChangeArrowheads="1"/>
                     </pic:cNvPicPr>
@@ -15042,36 +14648,38 @@
     <w:p>
       <w:pPr>
         <w:pStyle w:val="normal1"/>
+        <w:rPr>
+          <w:sz w:val="24"/>
+          <w:szCs w:val="20"/>
+        </w:rPr>
+      </w:pPr>
+      <w:r>
+        <w:rPr>
+          <w:sz w:val="24"/>
+          <w:szCs w:val="20"/>
+        </w:rPr>
+      </w:r>
+      <w:r>
+        <w:br w:type="page"/>
+      </w:r>
+    </w:p>
+    <w:p>
+      <w:pPr>
+        <w:pStyle w:val="normal1"/>
         <w:spacing w:before="0" w:after="0"/>
         <w:rPr>
-          <w:rFonts w:ascii="Arial" w:hAnsi="Arial" w:cs="Arial"/>
-          <w:b/>
-        </w:rPr>
-      </w:pPr>
-      <w:r>
-        <w:rPr>
-          <w:rFonts w:cs="Arial"/>
-          <w:b/>
-        </w:rPr>
-      </w:r>
-    </w:p>
-    <w:p>
-      <w:pPr>
-        <w:pStyle w:val="normal1"/>
-        <w:spacing w:before="0" w:after="0"/>
-        <w:rPr>
-          <w:sz w:val="24"/>
-          <w:szCs w:val="20"/>
-        </w:rPr>
-      </w:pPr>
-      <w:r>
-        <w:rPr>
-          <w:rFonts w:cs="Arial"/>
-          <w:b/>
-          <w:sz w:val="24"/>
-          <w:szCs w:val="20"/>
-        </w:rPr>
-        <w:t>/admin/monitors — Monitoreo de disponibilidad</w:t>
+          <w:sz w:val="24"/>
+          <w:szCs w:val="20"/>
+        </w:rPr>
+      </w:pPr>
+      <w:r>
+        <w:rPr>
+          <w:rFonts w:cs="Arial"/>
+          <w:b/>
+          <w:sz w:val="24"/>
+          <w:szCs w:val="20"/>
+        </w:rPr>
+        <w:t>/admin — Dashboard (vía pase de demo)</w:t>
       </w:r>
     </w:p>
     <w:p>
@@ -15105,7 +14713,7 @@
           <wp:inline distT="0" distB="0" distL="0" distR="0">
             <wp:extent cx="5760720" cy="2900680"/>
             <wp:effectExtent l="0" t="0" r="0" b="0"/>
-            <wp:docPr id="42" name="Picture 31" descr=""/>
+            <wp:docPr id="42" name="Picture 28" descr=""/>
             <wp:cNvGraphicFramePr>
               <a:graphicFrameLocks xmlns:a="http://schemas.openxmlformats.org/drawingml/2006/main" noChangeAspect="1"/>
             </wp:cNvGraphicFramePr>
@@ -15113,7 +14721,7 @@
               <a:graphicData uri="http://schemas.openxmlformats.org/drawingml/2006/picture">
                 <pic:pic xmlns:pic="http://schemas.openxmlformats.org/drawingml/2006/picture">
                   <pic:nvPicPr>
-                    <pic:cNvPr id="42" name="Picture 31" descr=""/>
+                    <pic:cNvPr id="42" name="Picture 28" descr=""/>
                     <pic:cNvPicPr>
                       <a:picLocks noChangeAspect="1" noChangeArrowheads="1"/>
                     </pic:cNvPicPr>
@@ -15159,115 +14767,19 @@
     <w:p>
       <w:pPr>
         <w:pStyle w:val="normal1"/>
-        <w:jc w:val="center"/>
-        <w:rPr>
-          <w:sz w:val="24"/>
-          <w:szCs w:val="20"/>
-        </w:rPr>
-      </w:pPr>
-      <w:r>
-        <w:rPr>
-          <w:sz w:val="24"/>
-          <w:szCs w:val="20"/>
-        </w:rPr>
-      </w:r>
-    </w:p>
-    <w:p>
-      <w:pPr>
-        <w:pStyle w:val="normal1"/>
-        <w:jc w:val="center"/>
-        <w:rPr>
-          <w:sz w:val="24"/>
-          <w:szCs w:val="20"/>
-        </w:rPr>
-      </w:pPr>
-      <w:r>
-        <w:rPr>
-          <w:sz w:val="24"/>
-          <w:szCs w:val="20"/>
-        </w:rPr>
-      </w:r>
-    </w:p>
-    <w:p>
-      <w:pPr>
-        <w:pStyle w:val="normal1"/>
-        <w:jc w:val="center"/>
-        <w:rPr>
-          <w:sz w:val="24"/>
-          <w:szCs w:val="20"/>
-        </w:rPr>
-      </w:pPr>
-      <w:r>
-        <w:rPr>
-          <w:sz w:val="24"/>
-          <w:szCs w:val="20"/>
-        </w:rPr>
-      </w:r>
-    </w:p>
-    <w:p>
-      <w:pPr>
-        <w:pStyle w:val="normal1"/>
-        <w:jc w:val="center"/>
-        <w:rPr>
-          <w:sz w:val="24"/>
-          <w:szCs w:val="20"/>
-        </w:rPr>
-      </w:pPr>
-      <w:r>
-        <w:rPr>
-          <w:sz w:val="24"/>
-          <w:szCs w:val="20"/>
-        </w:rPr>
-      </w:r>
-    </w:p>
-    <w:p>
-      <w:pPr>
-        <w:pStyle w:val="normal1"/>
-        <w:jc w:val="center"/>
-        <w:rPr>
-          <w:sz w:val="24"/>
-          <w:szCs w:val="20"/>
-        </w:rPr>
-      </w:pPr>
-      <w:r>
-        <w:rPr>
-          <w:sz w:val="24"/>
-          <w:szCs w:val="20"/>
-        </w:rPr>
-      </w:r>
-    </w:p>
-    <w:p>
-      <w:pPr>
-        <w:pStyle w:val="normal1"/>
-        <w:jc w:val="center"/>
-        <w:rPr>
-          <w:sz w:val="24"/>
-          <w:szCs w:val="20"/>
-        </w:rPr>
-      </w:pPr>
-      <w:r>
-        <w:rPr>
-          <w:sz w:val="24"/>
-          <w:szCs w:val="20"/>
-        </w:rPr>
-      </w:r>
-    </w:p>
-    <w:p>
-      <w:pPr>
-        <w:pStyle w:val="normal1"/>
-        <w:rPr>
-          <w:sz w:val="24"/>
-          <w:szCs w:val="20"/>
-        </w:rPr>
-      </w:pPr>
-      <w:r>
-        <w:rPr>
-          <w:rFonts w:cs="Arial"/>
-          <w:b/>
-          <w:sz w:val="24"/>
-          <w:szCs w:val="20"/>
-        </w:rPr>
-        <w:t>/admin/lab/pipeline — Pipeline CI/CD</w:t>
+        <w:rPr>
+          <w:sz w:val="24"/>
+          <w:szCs w:val="20"/>
+        </w:rPr>
+      </w:pPr>
+      <w:r>
+        <w:rPr>
+          <w:rFonts w:cs="Arial"/>
+          <w:b/>
+          <w:sz w:val="24"/>
+          <w:szCs w:val="20"/>
+        </w:rPr>
+        <w:t>/admin/costs — Costos y P&amp;L</w:t>
       </w:r>
     </w:p>
     <w:p>
@@ -15300,7 +14812,7 @@
           <wp:inline distT="0" distB="0" distL="0" distR="0">
             <wp:extent cx="5760720" cy="2900680"/>
             <wp:effectExtent l="0" t="0" r="0" b="0"/>
-            <wp:docPr id="43" name="Picture 32" descr=""/>
+            <wp:docPr id="43" name="Picture 29" descr=""/>
             <wp:cNvGraphicFramePr>
               <a:graphicFrameLocks xmlns:a="http://schemas.openxmlformats.org/drawingml/2006/main" noChangeAspect="1"/>
             </wp:cNvGraphicFramePr>
@@ -15308,7 +14820,7 @@
               <a:graphicData uri="http://schemas.openxmlformats.org/drawingml/2006/picture">
                 <pic:pic xmlns:pic="http://schemas.openxmlformats.org/drawingml/2006/picture">
                   <pic:nvPicPr>
-                    <pic:cNvPr id="43" name="Picture 32" descr=""/>
+                    <pic:cNvPr id="43" name="Picture 29" descr=""/>
                     <pic:cNvPicPr>
                       <a:picLocks noChangeAspect="1" noChangeArrowheads="1"/>
                     </pic:cNvPicPr>
@@ -15338,42 +14850,136 @@
     <w:p>
       <w:pPr>
         <w:pStyle w:val="normal1"/>
-        <w:spacing w:before="0" w:after="0"/>
-        <w:rPr>
-          <w:rFonts w:ascii="Arial" w:hAnsi="Arial" w:cs="Arial"/>
-          <w:b/>
-        </w:rPr>
-      </w:pPr>
-      <w:r>
-        <w:rPr>
-          <w:rFonts w:cs="Arial"/>
-          <w:b/>
-        </w:rPr>
-      </w:r>
-    </w:p>
-    <w:p>
-      <w:pPr>
-        <w:pStyle w:val="normal1"/>
-        <w:spacing w:before="0" w:after="0"/>
-        <w:rPr>
-          <w:sz w:val="24"/>
-          <w:szCs w:val="20"/>
-        </w:rPr>
-      </w:pPr>
-      <w:r>
-        <w:rPr>
-          <w:rFonts w:cs="Arial"/>
-          <w:b/>
-          <w:sz w:val="24"/>
-          <w:szCs w:val="20"/>
-        </w:rPr>
-        <w:t>/portal/login — Acceso al portal de clientes</w:t>
-      </w:r>
-    </w:p>
-    <w:p>
-      <w:pPr>
-        <w:pStyle w:val="normal1"/>
-        <w:spacing w:before="0" w:after="0"/>
+        <w:jc w:val="center"/>
+        <w:rPr>
+          <w:sz w:val="24"/>
+          <w:szCs w:val="20"/>
+        </w:rPr>
+      </w:pPr>
+      <w:r>
+        <w:rPr>
+          <w:sz w:val="24"/>
+          <w:szCs w:val="20"/>
+        </w:rPr>
+      </w:r>
+    </w:p>
+    <w:p>
+      <w:pPr>
+        <w:pStyle w:val="normal1"/>
+        <w:jc w:val="center"/>
+        <w:rPr>
+          <w:sz w:val="24"/>
+          <w:szCs w:val="20"/>
+        </w:rPr>
+      </w:pPr>
+      <w:r>
+        <w:rPr>
+          <w:sz w:val="24"/>
+          <w:szCs w:val="20"/>
+        </w:rPr>
+      </w:r>
+    </w:p>
+    <w:p>
+      <w:pPr>
+        <w:pStyle w:val="normal1"/>
+        <w:jc w:val="center"/>
+        <w:rPr>
+          <w:sz w:val="24"/>
+          <w:szCs w:val="20"/>
+        </w:rPr>
+      </w:pPr>
+      <w:r>
+        <w:rPr>
+          <w:sz w:val="24"/>
+          <w:szCs w:val="20"/>
+        </w:rPr>
+      </w:r>
+    </w:p>
+    <w:p>
+      <w:pPr>
+        <w:pStyle w:val="normal1"/>
+        <w:jc w:val="center"/>
+        <w:rPr>
+          <w:sz w:val="24"/>
+          <w:szCs w:val="20"/>
+        </w:rPr>
+      </w:pPr>
+      <w:r>
+        <w:rPr>
+          <w:sz w:val="24"/>
+          <w:szCs w:val="20"/>
+        </w:rPr>
+      </w:r>
+    </w:p>
+    <w:p>
+      <w:pPr>
+        <w:pStyle w:val="normal1"/>
+        <w:jc w:val="center"/>
+        <w:rPr>
+          <w:sz w:val="24"/>
+          <w:szCs w:val="20"/>
+        </w:rPr>
+      </w:pPr>
+      <w:r>
+        <w:rPr>
+          <w:sz w:val="24"/>
+          <w:szCs w:val="20"/>
+        </w:rPr>
+      </w:r>
+    </w:p>
+    <w:p>
+      <w:pPr>
+        <w:pStyle w:val="normal1"/>
+        <w:jc w:val="center"/>
+        <w:rPr>
+          <w:sz w:val="24"/>
+          <w:szCs w:val="20"/>
+        </w:rPr>
+      </w:pPr>
+      <w:r>
+        <w:rPr>
+          <w:sz w:val="24"/>
+          <w:szCs w:val="20"/>
+        </w:rPr>
+      </w:r>
+    </w:p>
+    <w:p>
+      <w:pPr>
+        <w:pStyle w:val="normal1"/>
+        <w:jc w:val="center"/>
+        <w:rPr>
+          <w:sz w:val="24"/>
+          <w:szCs w:val="20"/>
+        </w:rPr>
+      </w:pPr>
+      <w:r>
+        <w:rPr>
+          <w:sz w:val="24"/>
+          <w:szCs w:val="20"/>
+        </w:rPr>
+      </w:r>
+    </w:p>
+    <w:p>
+      <w:pPr>
+        <w:pStyle w:val="normal1"/>
+        <w:rPr>
+          <w:sz w:val="24"/>
+          <w:szCs w:val="20"/>
+        </w:rPr>
+      </w:pPr>
+      <w:r>
+        <w:rPr>
+          <w:rFonts w:cs="Arial"/>
+          <w:b/>
+          <w:sz w:val="24"/>
+          <w:szCs w:val="20"/>
+        </w:rPr>
+        <w:t>/admin/security — Panel del micro-SIEM</w:t>
+      </w:r>
+    </w:p>
+    <w:p>
+      <w:pPr>
+        <w:pStyle w:val="normal1"/>
         <w:rPr>
           <w:rFonts w:ascii="Arial" w:hAnsi="Arial" w:cs="Arial"/>
           <w:b/>
@@ -15401,7 +15007,7 @@
           <wp:inline distT="0" distB="0" distL="0" distR="0">
             <wp:extent cx="5760720" cy="2900680"/>
             <wp:effectExtent l="0" t="0" r="0" b="0"/>
-            <wp:docPr id="44" name="Picture 33" descr=""/>
+            <wp:docPr id="44" name="Picture 30" descr=""/>
             <wp:cNvGraphicFramePr>
               <a:graphicFrameLocks xmlns:a="http://schemas.openxmlformats.org/drawingml/2006/main" noChangeAspect="1"/>
             </wp:cNvGraphicFramePr>
@@ -15409,7 +15015,7 @@
               <a:graphicData uri="http://schemas.openxmlformats.org/drawingml/2006/picture">
                 <pic:pic xmlns:pic="http://schemas.openxmlformats.org/drawingml/2006/picture">
                   <pic:nvPicPr>
-                    <pic:cNvPr id="44" name="Picture 33" descr=""/>
+                    <pic:cNvPr id="44" name="Picture 30" descr=""/>
                     <pic:cNvPicPr>
                       <a:picLocks noChangeAspect="1" noChangeArrowheads="1"/>
                     </pic:cNvPicPr>
@@ -15439,136 +15045,42 @@
     <w:p>
       <w:pPr>
         <w:pStyle w:val="normal1"/>
-        <w:jc w:val="center"/>
-        <w:rPr>
-          <w:sz w:val="24"/>
-          <w:szCs w:val="20"/>
-        </w:rPr>
-      </w:pPr>
-      <w:r>
-        <w:rPr>
-          <w:sz w:val="24"/>
-          <w:szCs w:val="20"/>
-        </w:rPr>
-      </w:r>
-    </w:p>
-    <w:p>
-      <w:pPr>
-        <w:pStyle w:val="normal1"/>
-        <w:jc w:val="center"/>
-        <w:rPr>
-          <w:sz w:val="24"/>
-          <w:szCs w:val="20"/>
-        </w:rPr>
-      </w:pPr>
-      <w:r>
-        <w:rPr>
-          <w:sz w:val="24"/>
-          <w:szCs w:val="20"/>
-        </w:rPr>
-      </w:r>
-    </w:p>
-    <w:p>
-      <w:pPr>
-        <w:pStyle w:val="normal1"/>
-        <w:jc w:val="center"/>
-        <w:rPr>
-          <w:sz w:val="24"/>
-          <w:szCs w:val="20"/>
-        </w:rPr>
-      </w:pPr>
-      <w:r>
-        <w:rPr>
-          <w:sz w:val="24"/>
-          <w:szCs w:val="20"/>
-        </w:rPr>
-      </w:r>
-    </w:p>
-    <w:p>
-      <w:pPr>
-        <w:pStyle w:val="normal1"/>
-        <w:jc w:val="center"/>
-        <w:rPr>
-          <w:sz w:val="24"/>
-          <w:szCs w:val="20"/>
-        </w:rPr>
-      </w:pPr>
-      <w:r>
-        <w:rPr>
-          <w:sz w:val="24"/>
-          <w:szCs w:val="20"/>
-        </w:rPr>
-      </w:r>
-    </w:p>
-    <w:p>
-      <w:pPr>
-        <w:pStyle w:val="normal1"/>
-        <w:jc w:val="center"/>
-        <w:rPr>
-          <w:sz w:val="24"/>
-          <w:szCs w:val="20"/>
-        </w:rPr>
-      </w:pPr>
-      <w:r>
-        <w:rPr>
-          <w:sz w:val="24"/>
-          <w:szCs w:val="20"/>
-        </w:rPr>
-      </w:r>
-    </w:p>
-    <w:p>
-      <w:pPr>
-        <w:pStyle w:val="normal1"/>
-        <w:jc w:val="center"/>
-        <w:rPr>
-          <w:sz w:val="24"/>
-          <w:szCs w:val="20"/>
-        </w:rPr>
-      </w:pPr>
-      <w:r>
-        <w:rPr>
-          <w:sz w:val="24"/>
-          <w:szCs w:val="20"/>
-        </w:rPr>
-      </w:r>
-    </w:p>
-    <w:p>
-      <w:pPr>
-        <w:pStyle w:val="normal1"/>
-        <w:jc w:val="center"/>
-        <w:rPr>
-          <w:sz w:val="24"/>
-          <w:szCs w:val="20"/>
-        </w:rPr>
-      </w:pPr>
-      <w:r>
-        <w:rPr>
-          <w:sz w:val="24"/>
-          <w:szCs w:val="20"/>
-        </w:rPr>
-      </w:r>
-    </w:p>
-    <w:p>
-      <w:pPr>
-        <w:pStyle w:val="normal1"/>
-        <w:rPr>
-          <w:sz w:val="24"/>
-          <w:szCs w:val="20"/>
-        </w:rPr>
-      </w:pPr>
-      <w:r>
-        <w:rPr>
-          <w:rFonts w:cs="Arial"/>
-          <w:b/>
-          <w:sz w:val="24"/>
-          <w:szCs w:val="20"/>
-        </w:rPr>
-        <w:t>/portal — Dashboard del cliente (demo pública)</w:t>
-      </w:r>
-    </w:p>
-    <w:p>
-      <w:pPr>
-        <w:pStyle w:val="normal1"/>
+        <w:spacing w:before="0" w:after="0"/>
+        <w:rPr>
+          <w:rFonts w:ascii="Arial" w:hAnsi="Arial" w:cs="Arial"/>
+          <w:b/>
+        </w:rPr>
+      </w:pPr>
+      <w:r>
+        <w:rPr>
+          <w:rFonts w:cs="Arial"/>
+          <w:b/>
+        </w:rPr>
+      </w:r>
+    </w:p>
+    <w:p>
+      <w:pPr>
+        <w:pStyle w:val="normal1"/>
+        <w:spacing w:before="0" w:after="0"/>
+        <w:rPr>
+          <w:sz w:val="24"/>
+          <w:szCs w:val="20"/>
+        </w:rPr>
+      </w:pPr>
+      <w:r>
+        <w:rPr>
+          <w:rFonts w:cs="Arial"/>
+          <w:b/>
+          <w:sz w:val="24"/>
+          <w:szCs w:val="20"/>
+        </w:rPr>
+        <w:t>/admin/monitors — Monitoreo de disponibilidad</w:t>
+      </w:r>
+    </w:p>
+    <w:p>
+      <w:pPr>
+        <w:pStyle w:val="normal1"/>
+        <w:spacing w:before="0" w:after="0"/>
         <w:rPr>
           <w:rFonts w:ascii="Arial" w:hAnsi="Arial" w:cs="Arial"/>
           <w:b/>
@@ -15596,7 +15108,7 @@
           <wp:inline distT="0" distB="0" distL="0" distR="0">
             <wp:extent cx="5760720" cy="2900680"/>
             <wp:effectExtent l="0" t="0" r="0" b="0"/>
-            <wp:docPr id="45" name="Picture 34" descr=""/>
+            <wp:docPr id="45" name="Picture 31" descr=""/>
             <wp:cNvGraphicFramePr>
               <a:graphicFrameLocks xmlns:a="http://schemas.openxmlformats.org/drawingml/2006/main" noChangeAspect="1"/>
             </wp:cNvGraphicFramePr>
@@ -15604,7 +15116,7 @@
               <a:graphicData uri="http://schemas.openxmlformats.org/drawingml/2006/picture">
                 <pic:pic xmlns:pic="http://schemas.openxmlformats.org/drawingml/2006/picture">
                   <pic:nvPicPr>
-                    <pic:cNvPr id="45" name="Picture 34" descr=""/>
+                    <pic:cNvPr id="45" name="Picture 31" descr=""/>
                     <pic:cNvPicPr>
                       <a:picLocks noChangeAspect="1" noChangeArrowheads="1"/>
                     </pic:cNvPicPr>
@@ -15634,6 +15146,497 @@
     <w:p>
       <w:pPr>
         <w:pStyle w:val="normal1"/>
+        <w:jc w:val="center"/>
+        <w:rPr>
+          <w:sz w:val="24"/>
+          <w:szCs w:val="20"/>
+        </w:rPr>
+      </w:pPr>
+      <w:r>
+        <w:rPr>
+          <w:sz w:val="24"/>
+          <w:szCs w:val="20"/>
+        </w:rPr>
+      </w:r>
+    </w:p>
+    <w:p>
+      <w:pPr>
+        <w:pStyle w:val="normal1"/>
+        <w:jc w:val="center"/>
+        <w:rPr>
+          <w:sz w:val="24"/>
+          <w:szCs w:val="20"/>
+        </w:rPr>
+      </w:pPr>
+      <w:r>
+        <w:rPr>
+          <w:sz w:val="24"/>
+          <w:szCs w:val="20"/>
+        </w:rPr>
+      </w:r>
+    </w:p>
+    <w:p>
+      <w:pPr>
+        <w:pStyle w:val="normal1"/>
+        <w:jc w:val="center"/>
+        <w:rPr>
+          <w:sz w:val="24"/>
+          <w:szCs w:val="20"/>
+        </w:rPr>
+      </w:pPr>
+      <w:r>
+        <w:rPr>
+          <w:sz w:val="24"/>
+          <w:szCs w:val="20"/>
+        </w:rPr>
+      </w:r>
+    </w:p>
+    <w:p>
+      <w:pPr>
+        <w:pStyle w:val="normal1"/>
+        <w:jc w:val="center"/>
+        <w:rPr>
+          <w:sz w:val="24"/>
+          <w:szCs w:val="20"/>
+        </w:rPr>
+      </w:pPr>
+      <w:r>
+        <w:rPr>
+          <w:sz w:val="24"/>
+          <w:szCs w:val="20"/>
+        </w:rPr>
+      </w:r>
+    </w:p>
+    <w:p>
+      <w:pPr>
+        <w:pStyle w:val="normal1"/>
+        <w:jc w:val="center"/>
+        <w:rPr>
+          <w:sz w:val="24"/>
+          <w:szCs w:val="20"/>
+        </w:rPr>
+      </w:pPr>
+      <w:r>
+        <w:rPr>
+          <w:sz w:val="24"/>
+          <w:szCs w:val="20"/>
+        </w:rPr>
+      </w:r>
+    </w:p>
+    <w:p>
+      <w:pPr>
+        <w:pStyle w:val="normal1"/>
+        <w:jc w:val="center"/>
+        <w:rPr>
+          <w:sz w:val="24"/>
+          <w:szCs w:val="20"/>
+        </w:rPr>
+      </w:pPr>
+      <w:r>
+        <w:rPr>
+          <w:sz w:val="24"/>
+          <w:szCs w:val="20"/>
+        </w:rPr>
+      </w:r>
+    </w:p>
+    <w:p>
+      <w:pPr>
+        <w:pStyle w:val="normal1"/>
+        <w:jc w:val="center"/>
+        <w:rPr>
+          <w:sz w:val="24"/>
+          <w:szCs w:val="20"/>
+        </w:rPr>
+      </w:pPr>
+      <w:r>
+        <w:rPr>
+          <w:sz w:val="24"/>
+          <w:szCs w:val="20"/>
+        </w:rPr>
+      </w:r>
+    </w:p>
+    <w:p>
+      <w:pPr>
+        <w:pStyle w:val="normal1"/>
+        <w:rPr>
+          <w:sz w:val="24"/>
+          <w:szCs w:val="20"/>
+        </w:rPr>
+      </w:pPr>
+      <w:r>
+        <w:rPr>
+          <w:rFonts w:cs="Arial"/>
+          <w:b/>
+          <w:sz w:val="24"/>
+          <w:szCs w:val="20"/>
+        </w:rPr>
+        <w:t>/admin/lab/pipeline — Pipeline CI/CD</w:t>
+      </w:r>
+    </w:p>
+    <w:p>
+      <w:pPr>
+        <w:pStyle w:val="normal1"/>
+        <w:rPr>
+          <w:rFonts w:ascii="Arial" w:hAnsi="Arial" w:cs="Arial"/>
+          <w:b/>
+        </w:rPr>
+      </w:pPr>
+      <w:r>
+        <w:rPr>
+          <w:rFonts w:cs="Arial"/>
+          <w:b/>
+        </w:rPr>
+      </w:r>
+    </w:p>
+    <w:p>
+      <w:pPr>
+        <w:pStyle w:val="normal1"/>
+        <w:jc w:val="center"/>
+        <w:rPr>
+          <w:sz w:val="24"/>
+          <w:szCs w:val="20"/>
+        </w:rPr>
+      </w:pPr>
+      <w:r>
+        <w:rPr/>
+        <w:drawing>
+          <wp:inline distT="0" distB="0" distL="0" distR="0">
+            <wp:extent cx="5760720" cy="2900680"/>
+            <wp:effectExtent l="0" t="0" r="0" b="0"/>
+            <wp:docPr id="46" name="Picture 32" descr=""/>
+            <wp:cNvGraphicFramePr>
+              <a:graphicFrameLocks xmlns:a="http://schemas.openxmlformats.org/drawingml/2006/main" noChangeAspect="1"/>
+            </wp:cNvGraphicFramePr>
+            <a:graphic xmlns:a="http://schemas.openxmlformats.org/drawingml/2006/main">
+              <a:graphicData uri="http://schemas.openxmlformats.org/drawingml/2006/picture">
+                <pic:pic xmlns:pic="http://schemas.openxmlformats.org/drawingml/2006/picture">
+                  <pic:nvPicPr>
+                    <pic:cNvPr id="46" name="Picture 32" descr=""/>
+                    <pic:cNvPicPr>
+                      <a:picLocks noChangeAspect="1" noChangeArrowheads="1"/>
+                    </pic:cNvPicPr>
+                  </pic:nvPicPr>
+                  <pic:blipFill>
+                    <a:blip r:embed="rId47"/>
+                    <a:stretch>
+                      <a:fillRect/>
+                    </a:stretch>
+                  </pic:blipFill>
+                  <pic:spPr bwMode="auto">
+                    <a:xfrm>
+                      <a:off x="0" y="0"/>
+                      <a:ext cx="5760720" cy="2900680"/>
+                    </a:xfrm>
+                    <a:prstGeom prst="rect">
+                      <a:avLst/>
+                    </a:prstGeom>
+                  </pic:spPr>
+                </pic:pic>
+              </a:graphicData>
+            </a:graphic>
+          </wp:inline>
+        </w:drawing>
+      </w:r>
+    </w:p>
+    <w:p>
+      <w:pPr>
+        <w:pStyle w:val="normal1"/>
+        <w:spacing w:before="0" w:after="0"/>
+        <w:rPr>
+          <w:rFonts w:ascii="Arial" w:hAnsi="Arial" w:cs="Arial"/>
+          <w:b/>
+        </w:rPr>
+      </w:pPr>
+      <w:r>
+        <w:rPr>
+          <w:rFonts w:cs="Arial"/>
+          <w:b/>
+        </w:rPr>
+      </w:r>
+    </w:p>
+    <w:p>
+      <w:pPr>
+        <w:pStyle w:val="normal1"/>
+        <w:spacing w:before="0" w:after="0"/>
+        <w:rPr>
+          <w:sz w:val="24"/>
+          <w:szCs w:val="20"/>
+        </w:rPr>
+      </w:pPr>
+      <w:r>
+        <w:rPr>
+          <w:rFonts w:cs="Arial"/>
+          <w:b/>
+          <w:sz w:val="24"/>
+          <w:szCs w:val="20"/>
+        </w:rPr>
+        <w:t>/portal/login — Acceso al portal de clientes</w:t>
+      </w:r>
+    </w:p>
+    <w:p>
+      <w:pPr>
+        <w:pStyle w:val="normal1"/>
+        <w:spacing w:before="0" w:after="0"/>
+        <w:rPr>
+          <w:rFonts w:ascii="Arial" w:hAnsi="Arial" w:cs="Arial"/>
+          <w:b/>
+        </w:rPr>
+      </w:pPr>
+      <w:r>
+        <w:rPr>
+          <w:rFonts w:cs="Arial"/>
+          <w:b/>
+        </w:rPr>
+      </w:r>
+    </w:p>
+    <w:p>
+      <w:pPr>
+        <w:pStyle w:val="normal1"/>
+        <w:jc w:val="center"/>
+        <w:rPr>
+          <w:sz w:val="24"/>
+          <w:szCs w:val="20"/>
+        </w:rPr>
+      </w:pPr>
+      <w:r>
+        <w:rPr/>
+        <w:drawing>
+          <wp:inline distT="0" distB="0" distL="0" distR="0">
+            <wp:extent cx="5760720" cy="2900680"/>
+            <wp:effectExtent l="0" t="0" r="0" b="0"/>
+            <wp:docPr id="47" name="Picture 33" descr=""/>
+            <wp:cNvGraphicFramePr>
+              <a:graphicFrameLocks xmlns:a="http://schemas.openxmlformats.org/drawingml/2006/main" noChangeAspect="1"/>
+            </wp:cNvGraphicFramePr>
+            <a:graphic xmlns:a="http://schemas.openxmlformats.org/drawingml/2006/main">
+              <a:graphicData uri="http://schemas.openxmlformats.org/drawingml/2006/picture">
+                <pic:pic xmlns:pic="http://schemas.openxmlformats.org/drawingml/2006/picture">
+                  <pic:nvPicPr>
+                    <pic:cNvPr id="47" name="Picture 33" descr=""/>
+                    <pic:cNvPicPr>
+                      <a:picLocks noChangeAspect="1" noChangeArrowheads="1"/>
+                    </pic:cNvPicPr>
+                  </pic:nvPicPr>
+                  <pic:blipFill>
+                    <a:blip r:embed="rId48"/>
+                    <a:stretch>
+                      <a:fillRect/>
+                    </a:stretch>
+                  </pic:blipFill>
+                  <pic:spPr bwMode="auto">
+                    <a:xfrm>
+                      <a:off x="0" y="0"/>
+                      <a:ext cx="5760720" cy="2900680"/>
+                    </a:xfrm>
+                    <a:prstGeom prst="rect">
+                      <a:avLst/>
+                    </a:prstGeom>
+                  </pic:spPr>
+                </pic:pic>
+              </a:graphicData>
+            </a:graphic>
+          </wp:inline>
+        </w:drawing>
+      </w:r>
+    </w:p>
+    <w:p>
+      <w:pPr>
+        <w:pStyle w:val="normal1"/>
+        <w:jc w:val="center"/>
+        <w:rPr>
+          <w:sz w:val="24"/>
+          <w:szCs w:val="20"/>
+        </w:rPr>
+      </w:pPr>
+      <w:r>
+        <w:rPr>
+          <w:sz w:val="24"/>
+          <w:szCs w:val="20"/>
+        </w:rPr>
+      </w:r>
+    </w:p>
+    <w:p>
+      <w:pPr>
+        <w:pStyle w:val="normal1"/>
+        <w:jc w:val="center"/>
+        <w:rPr>
+          <w:sz w:val="24"/>
+          <w:szCs w:val="20"/>
+        </w:rPr>
+      </w:pPr>
+      <w:r>
+        <w:rPr>
+          <w:sz w:val="24"/>
+          <w:szCs w:val="20"/>
+        </w:rPr>
+      </w:r>
+    </w:p>
+    <w:p>
+      <w:pPr>
+        <w:pStyle w:val="normal1"/>
+        <w:jc w:val="center"/>
+        <w:rPr>
+          <w:sz w:val="24"/>
+          <w:szCs w:val="20"/>
+        </w:rPr>
+      </w:pPr>
+      <w:r>
+        <w:rPr>
+          <w:sz w:val="24"/>
+          <w:szCs w:val="20"/>
+        </w:rPr>
+      </w:r>
+    </w:p>
+    <w:p>
+      <w:pPr>
+        <w:pStyle w:val="normal1"/>
+        <w:jc w:val="center"/>
+        <w:rPr>
+          <w:sz w:val="24"/>
+          <w:szCs w:val="20"/>
+        </w:rPr>
+      </w:pPr>
+      <w:r>
+        <w:rPr>
+          <w:sz w:val="24"/>
+          <w:szCs w:val="20"/>
+        </w:rPr>
+      </w:r>
+    </w:p>
+    <w:p>
+      <w:pPr>
+        <w:pStyle w:val="normal1"/>
+        <w:jc w:val="center"/>
+        <w:rPr>
+          <w:sz w:val="24"/>
+          <w:szCs w:val="20"/>
+        </w:rPr>
+      </w:pPr>
+      <w:r>
+        <w:rPr>
+          <w:sz w:val="24"/>
+          <w:szCs w:val="20"/>
+        </w:rPr>
+      </w:r>
+    </w:p>
+    <w:p>
+      <w:pPr>
+        <w:pStyle w:val="normal1"/>
+        <w:jc w:val="center"/>
+        <w:rPr>
+          <w:sz w:val="24"/>
+          <w:szCs w:val="20"/>
+        </w:rPr>
+      </w:pPr>
+      <w:r>
+        <w:rPr>
+          <w:sz w:val="24"/>
+          <w:szCs w:val="20"/>
+        </w:rPr>
+      </w:r>
+    </w:p>
+    <w:p>
+      <w:pPr>
+        <w:pStyle w:val="normal1"/>
+        <w:jc w:val="center"/>
+        <w:rPr>
+          <w:sz w:val="24"/>
+          <w:szCs w:val="20"/>
+        </w:rPr>
+      </w:pPr>
+      <w:r>
+        <w:rPr>
+          <w:sz w:val="24"/>
+          <w:szCs w:val="20"/>
+        </w:rPr>
+      </w:r>
+    </w:p>
+    <w:p>
+      <w:pPr>
+        <w:pStyle w:val="normal1"/>
+        <w:rPr>
+          <w:sz w:val="24"/>
+          <w:szCs w:val="20"/>
+        </w:rPr>
+      </w:pPr>
+      <w:r>
+        <w:rPr>
+          <w:rFonts w:cs="Arial"/>
+          <w:b/>
+          <w:sz w:val="24"/>
+          <w:szCs w:val="20"/>
+        </w:rPr>
+        <w:t>/portal — Dashboard del cliente (demo pública)</w:t>
+      </w:r>
+    </w:p>
+    <w:p>
+      <w:pPr>
+        <w:pStyle w:val="normal1"/>
+        <w:rPr>
+          <w:rFonts w:ascii="Arial" w:hAnsi="Arial" w:cs="Arial"/>
+          <w:b/>
+        </w:rPr>
+      </w:pPr>
+      <w:r>
+        <w:rPr>
+          <w:rFonts w:cs="Arial"/>
+          <w:b/>
+        </w:rPr>
+      </w:r>
+    </w:p>
+    <w:p>
+      <w:pPr>
+        <w:pStyle w:val="normal1"/>
+        <w:jc w:val="center"/>
+        <w:rPr>
+          <w:sz w:val="24"/>
+          <w:szCs w:val="20"/>
+        </w:rPr>
+      </w:pPr>
+      <w:r>
+        <w:rPr/>
+        <w:drawing>
+          <wp:inline distT="0" distB="0" distL="0" distR="0">
+            <wp:extent cx="5760720" cy="2900680"/>
+            <wp:effectExtent l="0" t="0" r="0" b="0"/>
+            <wp:docPr id="48" name="Picture 34" descr=""/>
+            <wp:cNvGraphicFramePr>
+              <a:graphicFrameLocks xmlns:a="http://schemas.openxmlformats.org/drawingml/2006/main" noChangeAspect="1"/>
+            </wp:cNvGraphicFramePr>
+            <a:graphic xmlns:a="http://schemas.openxmlformats.org/drawingml/2006/main">
+              <a:graphicData uri="http://schemas.openxmlformats.org/drawingml/2006/picture">
+                <pic:pic xmlns:pic="http://schemas.openxmlformats.org/drawingml/2006/picture">
+                  <pic:nvPicPr>
+                    <pic:cNvPr id="48" name="Picture 34" descr=""/>
+                    <pic:cNvPicPr>
+                      <a:picLocks noChangeAspect="1" noChangeArrowheads="1"/>
+                    </pic:cNvPicPr>
+                  </pic:nvPicPr>
+                  <pic:blipFill>
+                    <a:blip r:embed="rId49"/>
+                    <a:stretch>
+                      <a:fillRect/>
+                    </a:stretch>
+                  </pic:blipFill>
+                  <pic:spPr bwMode="auto">
+                    <a:xfrm>
+                      <a:off x="0" y="0"/>
+                      <a:ext cx="5760720" cy="2900680"/>
+                    </a:xfrm>
+                    <a:prstGeom prst="rect">
+                      <a:avLst/>
+                    </a:prstGeom>
+                  </pic:spPr>
+                </pic:pic>
+              </a:graphicData>
+            </a:graphic>
+          </wp:inline>
+        </w:drawing>
+      </w:r>
+    </w:p>
+    <w:p>
+      <w:pPr>
+        <w:pStyle w:val="normal1"/>
         <w:spacing w:before="0" w:after="0"/>
         <w:rPr>
           <w:rFonts w:ascii="Arial" w:hAnsi="Arial" w:cs="Arial"/>
@@ -16613,12 +16616,12 @@
       </w:r>
     </w:p>
     <w:sectPr>
-      <w:headerReference w:type="even" r:id="rId47"/>
-      <w:headerReference w:type="default" r:id="rId48"/>
-      <w:headerReference w:type="first" r:id="rId49"/>
-      <w:footerReference w:type="even" r:id="rId50"/>
-      <w:footerReference w:type="default" r:id="rId51"/>
-      <w:footerReference w:type="first" r:id="rId52"/>
+      <w:headerReference w:type="even" r:id="rId50"/>
+      <w:headerReference w:type="default" r:id="rId51"/>
+      <w:headerReference w:type="first" r:id="rId52"/>
+      <w:footerReference w:type="even" r:id="rId53"/>
+      <w:footerReference w:type="default" r:id="rId54"/>
+      <w:footerReference w:type="first" r:id="rId55"/>
       <w:type w:val="nextPage"/>
       <w:pgSz w:w="11906" w:h="16838"/>
       <w:pgMar w:left="1418" w:right="1418" w:gutter="0" w:header="680" w:top="1418" w:footer="327" w:bottom="1135"/>
@@ -16792,7 +16795,7 @@
     </w:r>
     <w:r>
       <w:rPr/>
-      <w:t>43</w:t>
+      <w:t>45</w:t>
     </w:r>
     <w:r>
       <w:rPr/>
@@ -16832,7 +16835,7 @@
     </w:r>
     <w:r>
       <w:rPr/>
-      <w:t>43</w:t>
+      <w:t>45</w:t>
     </w:r>
     <w:r>
       <w:rPr/>
@@ -17025,7 +17028,7 @@
     </w:r>
     <w:r>
       <w:rPr/>
-      <w:t>43</w:t>
+      <w:t>45</w:t>
     </w:r>
     <w:r>
       <w:rPr/>
@@ -17137,9 +17140,9 @@
       <w:tblLook w:val="0400"/>
     </w:tblPr>
     <w:tblGrid>
-      <w:gridCol w:w="1345"/>
+      <w:gridCol w:w="1344"/>
       <w:gridCol w:w="5248"/>
-      <w:gridCol w:w="2332"/>
+      <w:gridCol w:w="2333"/>
     </w:tblGrid>
     <w:tr>
       <w:trPr>
@@ -17147,7 +17150,7 @@
       </w:trPr>
       <w:tc>
         <w:tcPr>
-          <w:tcW w:w="1345" w:type="dxa"/>
+          <w:tcW w:w="1344" w:type="dxa"/>
           <w:vMerge w:val="restart"/>
           <w:tcBorders>
             <w:top w:val="single" w:sz="4" w:space="0" w:color="000000"/>
@@ -17198,7 +17201,7 @@
               <wp:inline distT="0" distB="0" distL="0" distR="0">
                 <wp:extent cx="685800" cy="695325"/>
                 <wp:effectExtent l="0" t="0" r="0" b="0"/>
-                <wp:docPr id="46" name="image23.jpg" descr="Descripción: logo_membrete"/>
+                <wp:docPr id="49" name="image23.jpg" descr="Descripción: logo_membrete"/>
                 <wp:cNvGraphicFramePr>
                   <a:graphicFrameLocks xmlns:a="http://schemas.openxmlformats.org/drawingml/2006/main" noChangeAspect="1"/>
                 </wp:cNvGraphicFramePr>
@@ -17206,7 +17209,7 @@
                   <a:graphicData uri="http://schemas.openxmlformats.org/drawingml/2006/picture">
                     <pic:pic xmlns:pic="http://schemas.openxmlformats.org/drawingml/2006/picture">
                       <pic:nvPicPr>
-                        <pic:cNvPr id="46" name="image23.jpg" descr="Descripción: logo_membrete"/>
+                        <pic:cNvPr id="49" name="image23.jpg" descr="Descripción: logo_membrete"/>
                         <pic:cNvPicPr>
                           <a:picLocks noChangeAspect="1" noChangeArrowheads="1"/>
                         </pic:cNvPicPr>
@@ -17401,7 +17404,7 @@
       </w:tc>
       <w:tc>
         <w:tcPr>
-          <w:tcW w:w="2332" w:type="dxa"/>
+          <w:tcW w:w="2333" w:type="dxa"/>
           <w:tcBorders>
             <w:top w:val="single" w:sz="4" w:space="0" w:color="000000"/>
             <w:left w:val="single" w:sz="4" w:space="0" w:color="000000"/>
@@ -17499,7 +17502,7 @@
       </w:trPr>
       <w:tc>
         <w:tcPr>
-          <w:tcW w:w="1345" w:type="dxa"/>
+          <w:tcW w:w="1344" w:type="dxa"/>
           <w:vMerge w:val="continue"/>
           <w:tcBorders>
             <w:top w:val="single" w:sz="4" w:space="0" w:color="000000"/>
@@ -17573,7 +17576,7 @@
       </w:tc>
       <w:tc>
         <w:tcPr>
-          <w:tcW w:w="2332" w:type="dxa"/>
+          <w:tcW w:w="2333" w:type="dxa"/>
           <w:tcBorders>
             <w:top w:val="single" w:sz="4" w:space="0" w:color="000000"/>
             <w:left w:val="single" w:sz="4" w:space="0" w:color="000000"/>
@@ -17665,8 +17668,8 @@
     </w:tblPr>
     <w:tblGrid>
       <w:gridCol w:w="3226"/>
-      <w:gridCol w:w="3118"/>
-      <w:gridCol w:w="2581"/>
+      <w:gridCol w:w="3117"/>
+      <w:gridCol w:w="2582"/>
     </w:tblGrid>
     <w:tr>
       <w:trPr/>
@@ -17795,7 +17798,7 @@
       </w:tc>
       <w:tc>
         <w:tcPr>
-          <w:tcW w:w="3118" w:type="dxa"/>
+          <w:tcW w:w="3117" w:type="dxa"/>
           <w:tcBorders>
             <w:top w:val="single" w:sz="4" w:space="0" w:color="000000"/>
             <w:left w:val="single" w:sz="4" w:space="0" w:color="000000"/>
@@ -17851,7 +17854,7 @@
       </w:tc>
       <w:tc>
         <w:tcPr>
-          <w:tcW w:w="2581" w:type="dxa"/>
+          <w:tcW w:w="2582" w:type="dxa"/>
           <w:tcBorders>
             <w:top w:val="single" w:sz="4" w:space="0" w:color="000000"/>
             <w:left w:val="single" w:sz="4" w:space="0" w:color="000000"/>
@@ -17953,9 +17956,9 @@
       <w:tblLook w:val="0400"/>
     </w:tblPr>
     <w:tblGrid>
-      <w:gridCol w:w="1345"/>
+      <w:gridCol w:w="1344"/>
       <w:gridCol w:w="5248"/>
-      <w:gridCol w:w="2332"/>
+      <w:gridCol w:w="2333"/>
     </w:tblGrid>
     <w:tr>
       <w:trPr>
@@ -17963,7 +17966,7 @@
       </w:trPr>
       <w:tc>
         <w:tcPr>
-          <w:tcW w:w="1345" w:type="dxa"/>
+          <w:tcW w:w="1344" w:type="dxa"/>
           <w:vMerge w:val="restart"/>
           <w:tcBorders>
             <w:top w:val="single" w:sz="4" w:space="0" w:color="000000"/>
@@ -18014,7 +18017,7 @@
               <wp:inline distT="0" distB="0" distL="0" distR="0">
                 <wp:extent cx="685800" cy="695325"/>
                 <wp:effectExtent l="0" t="0" r="0" b="0"/>
-                <wp:docPr id="47" name="Image2" descr="Descripción: logo_membrete"/>
+                <wp:docPr id="50" name="Image2" descr="Descripción: logo_membrete"/>
                 <wp:cNvGraphicFramePr>
                   <a:graphicFrameLocks xmlns:a="http://schemas.openxmlformats.org/drawingml/2006/main" noChangeAspect="1"/>
                 </wp:cNvGraphicFramePr>
@@ -18022,7 +18025,7 @@
                   <a:graphicData uri="http://schemas.openxmlformats.org/drawingml/2006/picture">
                     <pic:pic xmlns:pic="http://schemas.openxmlformats.org/drawingml/2006/picture">
                       <pic:nvPicPr>
-                        <pic:cNvPr id="47" name="Image2" descr="Descripción: logo_membrete"/>
+                        <pic:cNvPr id="50" name="Image2" descr="Descripción: logo_membrete"/>
                         <pic:cNvPicPr>
                           <a:picLocks noChangeAspect="1" noChangeArrowheads="1"/>
                         </pic:cNvPicPr>
@@ -18234,7 +18237,7 @@
       </w:tc>
       <w:tc>
         <w:tcPr>
-          <w:tcW w:w="2332" w:type="dxa"/>
+          <w:tcW w:w="2333" w:type="dxa"/>
           <w:tcBorders>
             <w:top w:val="single" w:sz="4" w:space="0" w:color="000000"/>
             <w:left w:val="single" w:sz="4" w:space="0" w:color="000000"/>
@@ -18332,7 +18335,7 @@
       </w:trPr>
       <w:tc>
         <w:tcPr>
-          <w:tcW w:w="1345" w:type="dxa"/>
+          <w:tcW w:w="1344" w:type="dxa"/>
           <w:vMerge w:val="continue"/>
           <w:tcBorders>
             <w:top w:val="single" w:sz="4" w:space="0" w:color="000000"/>
@@ -18406,7 +18409,7 @@
       </w:tc>
       <w:tc>
         <w:tcPr>
-          <w:tcW w:w="2332" w:type="dxa"/>
+          <w:tcW w:w="2333" w:type="dxa"/>
           <w:tcBorders>
             <w:top w:val="single" w:sz="4" w:space="0" w:color="000000"/>
             <w:left w:val="single" w:sz="4" w:space="0" w:color="000000"/>
@@ -18498,8 +18501,8 @@
     </w:tblPr>
     <w:tblGrid>
       <w:gridCol w:w="3226"/>
-      <w:gridCol w:w="3118"/>
-      <w:gridCol w:w="2581"/>
+      <w:gridCol w:w="3117"/>
+      <w:gridCol w:w="2582"/>
     </w:tblGrid>
     <w:tr>
       <w:trPr/>
@@ -18626,7 +18629,7 @@
       </w:tc>
       <w:tc>
         <w:tcPr>
-          <w:tcW w:w="3118" w:type="dxa"/>
+          <w:tcW w:w="3117" w:type="dxa"/>
           <w:tcBorders>
             <w:top w:val="single" w:sz="4" w:space="0" w:color="000000"/>
             <w:left w:val="single" w:sz="4" w:space="0" w:color="000000"/>
@@ -18682,7 +18685,7 @@
       </w:tc>
       <w:tc>
         <w:tcPr>
-          <w:tcW w:w="2581" w:type="dxa"/>
+          <w:tcW w:w="2582" w:type="dxa"/>
           <w:tcBorders>
             <w:top w:val="single" w:sz="4" w:space="0" w:color="000000"/>
             <w:left w:val="single" w:sz="4" w:space="0" w:color="000000"/>

</xml_diff>

<commit_message>
feat: enhance localization for lab page with dynamic labels and descriptions
</commit_message>
<xml_diff>
--- a/DEA Formato_Documento_de_Arquitectura.docx
+++ b/DEA Formato_Documento_de_Arquitectura.docx
@@ -9659,7 +9659,7 @@
         <w:rPr/>
         <w:drawing>
           <wp:inline distT="0" distB="0" distL="0" distR="0">
-            <wp:extent cx="5182235" cy="5005705"/>
+            <wp:extent cx="5759450" cy="4945877"/>
             <wp:effectExtent l="0" t="0" r="0" b="0"/>
             <wp:docPr id="20" name="Picture 6" descr=""/>
             <wp:cNvGraphicFramePr>
@@ -9683,7 +9683,7 @@
                   <pic:spPr bwMode="auto">
                     <a:xfrm>
                       <a:off x="0" y="0"/>
-                      <a:ext cx="5182235" cy="5005705"/>
+                      <a:ext cx="5759450" cy="4945877"/>
                     </a:xfrm>
                     <a:prstGeom prst="rect">
                       <a:avLst/>
@@ -9870,7 +9870,7 @@
         <w:rPr/>
         <w:drawing>
           <wp:inline distT="0" distB="0" distL="0" distR="0">
-            <wp:extent cx="3654425" cy="2996565"/>
+            <wp:extent cx="5759450" cy="4218373"/>
             <wp:effectExtent l="0" t="0" r="0" b="0"/>
             <wp:docPr id="21" name="Picture 7" descr=""/>
             <wp:cNvGraphicFramePr>
@@ -9894,7 +9894,7 @@
                   <pic:spPr bwMode="auto">
                     <a:xfrm>
                       <a:off x="0" y="0"/>
-                      <a:ext cx="3654425" cy="2996565"/>
+                      <a:ext cx="5759450" cy="4218373"/>
                     </a:xfrm>
                     <a:prstGeom prst="rect">
                       <a:avLst/>
@@ -9987,7 +9987,7 @@
         <w:rPr/>
         <w:drawing>
           <wp:inline distT="0" distB="0" distL="0" distR="0">
-            <wp:extent cx="3303270" cy="3251835"/>
+            <wp:extent cx="5759450" cy="3408152"/>
             <wp:effectExtent l="0" t="0" r="0" b="0"/>
             <wp:docPr id="22" name="Picture 8" descr=""/>
             <wp:cNvGraphicFramePr>
@@ -10011,7 +10011,7 @@
                   <pic:spPr bwMode="auto">
                     <a:xfrm>
                       <a:off x="0" y="0"/>
-                      <a:ext cx="3303270" cy="3251835"/>
+                      <a:ext cx="5759450" cy="3408152"/>
                     </a:xfrm>
                     <a:prstGeom prst="rect">
                       <a:avLst/>

</xml_diff>

<commit_message>
feat: update documentation and checklist to reflect the completion of the final product document and correct previous inaccuracies
</commit_message>
<xml_diff>
--- a/DEA Formato_Documento_de_Arquitectura.docx
+++ b/DEA Formato_Documento_de_Arquitectura.docx
@@ -3064,7 +3064,7 @@
           <w:sz w:val="24"/>
           <w:szCs w:val="20"/>
         </w:rPr>
-        <w:t>El sistema está construido sobre Astro 6 en modo SSR (Server-Side Rendering) con adaptador de Vercel, Turso/libSQL como base de datos vía Drizzle ORM, Auth.js con GitHub OAuth para el panel administrativo, y Tailwind 4 para la capa visual. Deliberadamente no se usan frameworks de frontend adicionales ni servicios de pago de terceros distintos a Wompi: monitoreo, alertas, SLOs y observabilidad de seguridad son desarrollo propio.</w:t>
+        <w:t>El sistema está construido sobre Astro 7 (SSR) con adaptador de Vercel, Turso/libSQL como base de datos vía Drizzle ORM, Auth.js con GitHub OAuth para el panel administrativo, y Tailwind 4 para la capa visual. Deliberadamente no se usan frameworks de frontend adicionales ni servicios de pago de terceros distintos a Wompi: monitoreo, alertas, SLOs y observabilidad de seguridad son desarrollo propio.</w:t>
       </w:r>
     </w:p>
     <w:p>
@@ -5213,7 +5213,7 @@
           <w:sz w:val="24"/>
           <w:szCs w:val="20"/>
         </w:rPr>
-        <w:t>El sistema se construye como una aplicación Astro 6 con renderizado en servidor (SSR), desplegada en Vercel bajo el dominio codebymike.tech, con Turso (libSQL) como base de datos vía Drizzle ORM. La aplicación expone tres superficies claramente separadas, cada una con su propio sistema de autenticación sin compartir cookies ni lógica entre sí: sitio público, panel administrativo (/admin) y portal de clientes (/portal).</w:t>
+        <w:t>El sistema se construye como una aplicación Astro 7 con renderizado en servidor (SSR), desplegada en Vercel bajo el dominio codebymike.tech, con Turso (libSQL) como base de datos vía Drizzle ORM. La aplicación expone tres superficies claramente separadas, cada una con su propio sistema de autenticación sin compartir cookies ni lógica entre sí: sitio público, panel administrativo (/admin) y portal de clientes (/portal).</w:t>
       </w:r>
     </w:p>
     <w:p>
@@ -6247,7 +6247,7 @@
           <w:sz w:val="24"/>
           <w:szCs w:val="20"/>
         </w:rPr>
-        <w:t>El sistema define 6 actores y 18 casos de uso principales, agrupados en 8 módulos funcionales reales del proyecto. Los actores, casos de uso y requerimientos funcionales relacionados están versionados como código en src/data/documentacion.ts y se navegan en producción en /docs/casos-de-uso.</w:t>
+        <w:t>El sistema define 6 actores y 19 casos de uso principales, agrupados en 9 módulos funcionales reales del proyecto. Los actores, casos de uso y requerimientos funcionales relacionados están versionados como código en src/data/documentacion.ts y se navegan en producción en /docs/casos-de-uso.</w:t>
       </w:r>
     </w:p>
     <w:p>
@@ -10092,7 +10092,7 @@
           <w:sz w:val="24"/>
           <w:szCs w:val="20"/>
         </w:rPr>
-        <w:t>El esquema completo vive en src/db/schema.ts (Drizzle ORM, ~33 tablas). El siguiente diagrama muestra las entidades centrales y sus relaciones principales, agrupadas por los dominios de negocio, pagos, observabilidad, seguridad y portal de clientes.</w:t>
+        <w:t>El esquema completo vive en src/db/schema.ts (Drizzle ORM, 61 tablas). El siguiente diagrama muestra las entidades centrales y sus relaciones principales, agrupadas por los dominios de negocio, pagos, observabilidad, seguridad y portal de clientes.</w:t>
       </w:r>
     </w:p>
     <w:p>
@@ -12253,7 +12253,7 @@
                 <w:sz w:val="24"/>
                 <w:szCs w:val="20"/>
               </w:rPr>
-              <w:t>Astro 6 (componentes .astro), Tailwind 4, reveal.js (presentador de slides)</w:t>
+              <w:t>Astro 7 (componentes .astro), Tailwind 4, reveal.js (presentador de slides)</w:t>
             </w:r>
           </w:p>
         </w:tc>
@@ -13159,7 +13159,7 @@
           <w:sz w:val="24"/>
           <w:szCs w:val="20"/>
         </w:rPr>
-        <w:t>El modelo relacional (Drizzle ORM sobre SQLite/Turso, ~33 tablas) se organiza en siete dominios funcionales.</w:t>
+        <w:t>El modelo relacional (Drizzle ORM sobre SQLite/Turso, 61 tablas) se organiza en siete dominios funcionales.</w:t>
       </w:r>
     </w:p>
     <w:p>

</xml_diff>